<commit_message>
Final submission run with Dataproc results; report and README updated
- Notebook executed end to end in one run with the cross-validation recomputed (no cached step);
  all 83 code cells and 24 figures; models and outputs regenerated from it.
- New Section 20b: laptop (vertical) vs Google Cloud Dataproc cluster (horizontal) for the same Spark job
  (t44_local_vs_cloud, fig24); Dataproc timings with job IDs in outputs/tables/cloud/.
- Report: cluster configuration in the environment table, Section 8.5 on the cloud results, honest note on a
  short laptop sleep during two Stage 1 fits; PDF regenerated (13 pages).
- README: cloud benchmark instructions and results; Stage 2 and scalability numbers from this run.

Co-Authored-By: Claude Opus 5.5 <noreply@anthropic.com>
</commit_message>
<xml_diff>
--- a/DSA5208_Project2_Report.docx
+++ b/DSA5208_Project2_Report.docx
@@ -247,14 +247,14 @@
                 <w:sz w:val="19"/>
                 <w:szCs w:val="19"/>
               </w:rPr>
-              <w:t xml:space="preserve">0.465</w:t>
+              <w:t xml:space="preserve">0.466</w:t>
             </w:r>
             <w:r>
               <w:rPr>
                 <w:sz w:val="19"/>
                 <w:szCs w:val="19"/>
               </w:rPr>
-              <w:t xml:space="preserve"> at the 5 mm threshold (55× the event rate) with ROC-AUC </w:t>
+              <w:t xml:space="preserve"> at the 5 mm threshold (56× the event rate) with ROC-AUC </w:t>
             </w:r>
             <w:r>
               <w:rPr>
@@ -263,14 +263,14 @@
                 <w:sz w:val="19"/>
                 <w:szCs w:val="19"/>
               </w:rPr>
-              <w:t xml:space="preserve">0.968</w:t>
+              <w:t xml:space="preserve">0.969</w:t>
             </w:r>
             <w:r>
               <w:rPr>
                 <w:sz w:val="19"/>
                 <w:szCs w:val="19"/>
               </w:rPr>
-              <w:t xml:space="preserve">, beats the logistic baseline at every threshold on identical rows, and gives calibrated probabilities. The notebook also shows how the Spark job scales with the number of cores.</w:t>
+              <w:t xml:space="preserve">, beats the logistic baseline at every threshold on identical rows, and gives calibrated probabilities. The core Spark job was also run on a Google Cloud Dataproc cluster, where doubling the workers halved its run time.</w:t>
             </w:r>
           </w:p>
         </w:tc>
@@ -748,7 +748,7 @@
                 <w:sz w:val="16"/>
                 <w:szCs w:val="16"/>
               </w:rPr>
-              <w:t xml:space="preserve">0.459</w:t>
+              <w:t xml:space="preserve">0.461</w:t>
             </w:r>
           </w:p>
         </w:tc>
@@ -1253,7 +1253,7 @@
         <w:t xml:space="preserve">what is raining right now, nearby</w:t>
       </w:r>
       <w:r>
-        <w:t xml:space="preserve">: the station's own rain in the last 5–15 minutes, how long it has been dry, and the rain at gauges within 10 km. Time of day and season help, but on their own they are barely better than climatology (Model A, Section 8). A model that cannot see any rain observation is almost useless for this task; a model that can see the neighbourhood is 55 times better than chance at 5 mm.</w:t>
+        <w:t xml:space="preserve">: the station's own rain in the last 5–15 minutes, how long it has been dry, and the rain at gauges within 10 km. Time of day and season help, but on their own they are barely better than climatology (Model A, Section 8). A model that cannot see any rain observation is almost useless for this task; a model that can see the neighbourhood is 56 times better than chance at 5 mm.</w:t>
       </w:r>
     </w:p>
     <w:p>
@@ -2558,7 +2558,17 @@
         <w:jc w:val="both"/>
       </w:pPr>
       <w:r>
-        <w:t xml:space="preserve">Everything runs with Apache Spark in local mode on one laptop. Changing the Spark master URL is the only change needed to run the same notebook on a cluster (for example YARN on Google Cloud Dataproc).</w:t>
+        <w:t xml:space="preserve">The full pipeline runs with Apache Spark in local mode on one laptop. The core Spark job (ingestion and the cleaning stage) was also run on a </w:t>
+      </w:r>
+      <w:r>
+        <w:rPr>
+          <w:b/>
+          <w:bCs/>
+        </w:rPr>
+        <w:t xml:space="preserve">Google Cloud Dataproc</w:t>
+      </w:r>
+      <w:r>
+        <w:t xml:space="preserve"> cluster to measure horizontal scaling (Section 8.5); it is submitted as a PySpark job with no change to the Spark code except the input and output paths.</w:t>
       </w:r>
     </w:p>
     <w:tbl>
@@ -3015,6 +3025,79 @@
           </w:p>
         </w:tc>
       </w:tr>
+      <w:tr>
+        <w:trPr>
+          <w:cantSplit/>
+        </w:trPr>
+        <w:tc>
+          <w:tcPr>
+            <w:tcW w:type="dxa" w:w="2000"/>
+            <w:tcBorders>
+              <w:top w:val="single" w:color="D5DAE3" w:sz="4"/>
+              <w:left w:val="single" w:color="D5DAE3" w:sz="4"/>
+              <w:bottom w:val="single" w:color="D5DAE3" w:sz="4"/>
+              <w:right w:val="single" w:color="D5DAE3" w:sz="4"/>
+            </w:tcBorders>
+            <w:shd w:fill="F4F6FA" w:color="auto" w:val="clear"/>
+            <w:tcMar>
+              <w:top w:type="dxa" w:w="45"/>
+              <w:left w:type="dxa" w:w="80"/>
+              <w:bottom w:type="dxa" w:w="45"/>
+              <w:right w:type="dxa" w:w="80"/>
+            </w:tcMar>
+            <w:vAlign w:val="center"/>
+          </w:tcPr>
+          <w:p>
+            <w:pPr>
+              <w:jc w:val="left"/>
+            </w:pPr>
+            <w:r>
+              <w:rPr>
+                <w:b w:val="false"/>
+                <w:bCs w:val="false"/>
+                <w:color w:val="3C3C3C"/>
+                <w:sz w:val="16"/>
+                <w:szCs w:val="16"/>
+              </w:rPr>
+              <w:t xml:space="preserve">Cloud cluster</w:t>
+            </w:r>
+          </w:p>
+        </w:tc>
+        <w:tc>
+          <w:tcPr>
+            <w:tcW w:type="dxa" w:w="7638"/>
+            <w:tcBorders>
+              <w:top w:val="single" w:color="D5DAE3" w:sz="4"/>
+              <w:left w:val="single" w:color="D5DAE3" w:sz="4"/>
+              <w:bottom w:val="single" w:color="D5DAE3" w:sz="4"/>
+              <w:right w:val="single" w:color="D5DAE3" w:sz="4"/>
+            </w:tcBorders>
+            <w:shd w:fill="F4F6FA" w:color="auto" w:val="clear"/>
+            <w:tcMar>
+              <w:top w:type="dxa" w:w="45"/>
+              <w:left w:type="dxa" w:w="80"/>
+              <w:bottom w:type="dxa" w:w="45"/>
+              <w:right w:type="dxa" w:w="80"/>
+            </w:tcMar>
+            <w:vAlign w:val="center"/>
+          </w:tcPr>
+          <w:p>
+            <w:pPr>
+              <w:jc w:val="left"/>
+            </w:pPr>
+            <w:r>
+              <w:rPr>
+                <w:b w:val="false"/>
+                <w:bCs w:val="false"/>
+                <w:color w:val="3C3C3C"/>
+                <w:sz w:val="16"/>
+                <w:szCs w:val="16"/>
+              </w:rPr>
+              <w:t xml:space="preserve">Google Cloud Dataproc 2.2 (Debian 12, Spark 3.5), region asia-southeast1 (Singapore); master and workers n2-standard-2 (2 vCPU, 8 GB), 50 GB standard disks; 2 and then 4 workers (the education project's quota is 12 vCPUs); data in a Cloud Storage bucket; jobs submitted with gcloud dataproc jobs submit pyspark (cloud/dataproc_benchmark.py)</w:t>
+            </w:r>
+          </w:p>
+        </w:tc>
+      </w:tr>
     </w:tbl>
     <w:p>
       <w:pPr>
@@ -3029,7 +3112,7 @@
           <w:sz w:val="16"/>
           <w:szCs w:val="16"/>
         </w:rPr>
-        <w:t xml:space="preserve">Table 4. Computing environment, recorded by the notebook (t00_environment.csv).</w:t>
+        <w:t xml:space="preserve">Table 4. Computing environment: the laptop as recorded by the notebook (t00_environment.csv), the cluster as configured for the Dataproc jobs.</w:t>
       </w:r>
     </w:p>
     <w:tbl>
@@ -3262,7 +3345,7 @@
                 <w:sz w:val="16"/>
                 <w:szCs w:val="16"/>
               </w:rPr>
-              <w:t xml:space="preserve">0.7</w:t>
+              <w:t xml:space="preserve">0.6</w:t>
             </w:r>
           </w:p>
         </w:tc>
@@ -3408,7 +3491,7 @@
                 <w:sz w:val="16"/>
                 <w:szCs w:val="16"/>
               </w:rPr>
-              <w:t xml:space="preserve">7.8</w:t>
+              <w:t xml:space="preserve">11.2</w:t>
             </w:r>
           </w:p>
         </w:tc>
@@ -3554,7 +3637,7 @@
                 <w:sz w:val="16"/>
                 <w:szCs w:val="16"/>
               </w:rPr>
-              <w:t xml:space="preserve">43.2</w:t>
+              <w:t xml:space="preserve">35.2</w:t>
             </w:r>
           </w:p>
         </w:tc>
@@ -3627,7 +3710,7 @@
                 <w:sz w:val="16"/>
                 <w:szCs w:val="16"/>
               </w:rPr>
-              <w:t xml:space="preserve">25.2</w:t>
+              <w:t xml:space="preserve">25.0</w:t>
             </w:r>
           </w:p>
         </w:tc>
@@ -3700,7 +3783,7 @@
                 <w:sz w:val="16"/>
                 <w:szCs w:val="16"/>
               </w:rPr>
-              <w:t xml:space="preserve">79.0</w:t>
+              <w:t xml:space="preserve">74.3</w:t>
             </w:r>
           </w:p>
         </w:tc>
@@ -3719,7 +3802,7 @@
           <w:sz w:val="16"/>
           <w:szCs w:val="16"/>
         </w:rPr>
-        <w:t xml:space="preserve">Table 5. Wall-clock time of the notebook's stages on this machine (t40_stage_timings.csv).</w:t>
+        <w:t xml:space="preserve">Table 5. Wall-clock time of the notebook's stages on this machine in the submitted run (t40_stage_timings.csv). The laptop slept for about 10 minutes during two of the Stage 1 logistic fits (45 s and 168 s instead of the usual 10–11 s); every other stage ran uninterrupted.</w:t>
       </w:r>
     </w:p>
     <w:p>
@@ -11443,7 +11526,7 @@
                 <w:sz w:val="16"/>
                 <w:szCs w:val="16"/>
               </w:rPr>
-              <w:t xml:space="preserve">0.0394 ± 0.0023</w:t>
+              <w:t xml:space="preserve">0.0392 ± 0.0021</w:t>
             </w:r>
           </w:p>
         </w:tc>
@@ -11584,7 +11667,7 @@
                 <w:sz w:val="16"/>
                 <w:szCs w:val="16"/>
               </w:rPr>
-              <w:t xml:space="preserve">0.0322 ± 0.0019</w:t>
+              <w:t xml:space="preserve">0.0320 ± 0.0018</w:t>
             </w:r>
           </w:p>
         </w:tc>
@@ -11725,7 +11808,7 @@
                 <w:sz w:val="16"/>
                 <w:szCs w:val="16"/>
               </w:rPr>
-              <w:t xml:space="preserve">0.0405 ± 0.0018</w:t>
+              <w:t xml:space="preserve">0.0404 ± 0.0017</w:t>
             </w:r>
           </w:p>
         </w:tc>
@@ -11744,7 +11827,7 @@
           <w:sz w:val="16"/>
           <w:szCs w:val="16"/>
         </w:rPr>
-        <w:t xml:space="preserve">Table 11. Stage 2: best cross-validated setting per model family (4 year-blocked folds, weighted log loss, 22 settings in total). The selector size k was tuned first with logistic regression (k=33: 0.0427, k=16: 0.0452, k=8: 0.0585); all 33 candidates were kept.</w:t>
+        <w:t xml:space="preserve">Table 11. Stage 2: best cross-validated setting per model family (4 year-blocked folds, weighted log loss, 22 settings in total). The selector size k was tuned first with logistic regression (k=33: 0.0425, k=16: 0.0450, k=8: 0.0585); all 33 candidates were kept.</w:t>
       </w:r>
     </w:p>
     <w:p>
@@ -11761,7 +11844,7 @@
         <w:jc w:val="both"/>
       </w:pPr>
       <w:r>
-        <w:t xml:space="preserve">Tree probabilities are not automatically calibrated. A Platt-style calibrator (an MLlib logistic regression on logit p, log h and their product) is fitted on the first half of 2023 and judged on the second half; it is kept only if it lowers the held-out log loss. For the random forest it was kept (held-out log loss 0.0298 → 0.0292); for the GBT it reduced the held-out log loss from 0.0385 to 0.0315. Finally, because a tree model does not guarantee P(&gt; 10 mm) ≤ P(&gt; 5 mm), the probabilities of each station-time are made non-increasing across thresholds with a running minimum, which changed at most 0.026 % of the 2024 predictions. The Stage 1 logistic model is monotone by construction (0 violations in 25,771,260 adjacent pairs).</w:t>
+        <w:t xml:space="preserve">Tree probabilities are not automatically calibrated. A Platt-style calibrator (an MLlib logistic regression on logit p, log h and their product) is fitted on the first half of 2023 and judged on the second half; it is kept only if it lowers the held-out log loss. For the random forest it was kept (held-out log loss 0.0298 → 0.0292); for the GBT it reduced the held-out log loss from 0.0385 to 0.0315. Finally, because a tree model does not guarantee P(&gt; 10 mm) ≤ P(&gt; 5 mm), the probabilities of each station-time are made non-increasing across thresholds with a running minimum, which changed at most 0.062 % of the 2024 predictions. The Stage 1 logistic model is monotone by construction (0 violations in 25,771,260 adjacent pairs).</w:t>
       </w:r>
     </w:p>
     <w:p>
@@ -12304,7 +12387,7 @@
                 <w:sz w:val="16"/>
                 <w:szCs w:val="16"/>
               </w:rPr>
-              <w:t xml:space="preserve">0.965</w:t>
+              <w:t xml:space="preserve">0.964</w:t>
             </w:r>
           </w:p>
         </w:tc>
@@ -12440,7 +12523,7 @@
                 <w:sz w:val="16"/>
                 <w:szCs w:val="16"/>
               </w:rPr>
-              <w:t xml:space="preserve">0.72</w:t>
+              <w:t xml:space="preserve">0.71</w:t>
             </w:r>
           </w:p>
         </w:tc>
@@ -12649,7 +12732,7 @@
                 <w:sz w:val="16"/>
                 <w:szCs w:val="16"/>
               </w:rPr>
-              <w:t xml:space="preserve">0.967</w:t>
+              <w:t xml:space="preserve">0.965</w:t>
             </w:r>
           </w:p>
         </w:tc>
@@ -12683,7 +12766,7 @@
                 <w:sz w:val="16"/>
                 <w:szCs w:val="16"/>
               </w:rPr>
-              <w:t xml:space="preserve">0.0515</w:t>
+              <w:t xml:space="preserve">0.0516</w:t>
             </w:r>
           </w:p>
         </w:tc>
@@ -12717,7 +12800,7 @@
                 <w:sz w:val="16"/>
                 <w:szCs w:val="16"/>
               </w:rPr>
-              <w:t xml:space="preserve">0.449</w:t>
+              <w:t xml:space="preserve">0.448</w:t>
             </w:r>
           </w:p>
         </w:tc>
@@ -12960,7 +13043,7 @@
                 <w:sz w:val="16"/>
                 <w:szCs w:val="16"/>
               </w:rPr>
-              <w:t xml:space="preserve">0.587</w:t>
+              <w:t xml:space="preserve">0.585</w:t>
             </w:r>
           </w:p>
         </w:tc>
@@ -12994,7 +13077,7 @@
                 <w:sz w:val="16"/>
                 <w:szCs w:val="16"/>
               </w:rPr>
-              <w:t xml:space="preserve">0.966</w:t>
+              <w:t xml:space="preserve">0.965</w:t>
             </w:r>
           </w:p>
         </w:tc>
@@ -13028,7 +13111,7 @@
                 <w:sz w:val="16"/>
                 <w:szCs w:val="16"/>
               </w:rPr>
-              <w:t xml:space="preserve">0.0396</w:t>
+              <w:t xml:space="preserve">0.0397</w:t>
             </w:r>
           </w:p>
         </w:tc>
@@ -13062,7 +13145,7 @@
                 <w:sz w:val="16"/>
                 <w:szCs w:val="16"/>
               </w:rPr>
-              <w:t xml:space="preserve">0.385</w:t>
+              <w:t xml:space="preserve">0.383</w:t>
             </w:r>
           </w:p>
         </w:tc>
@@ -13130,7 +13213,7 @@
                 <w:sz w:val="16"/>
                 <w:szCs w:val="16"/>
               </w:rPr>
-              <w:t xml:space="preserve">0.58</w:t>
+              <w:t xml:space="preserve">0.59</w:t>
             </w:r>
           </w:p>
         </w:tc>
@@ -13164,7 +13247,7 @@
                 <w:sz w:val="16"/>
                 <w:szCs w:val="16"/>
               </w:rPr>
-              <w:t xml:space="preserve">0.53</w:t>
+              <w:t xml:space="preserve">0.52</w:t>
             </w:r>
           </w:p>
         </w:tc>
@@ -13305,7 +13388,7 @@
                 <w:sz w:val="16"/>
                 <w:szCs w:val="16"/>
               </w:rPr>
-              <w:t xml:space="preserve">0.465</w:t>
+              <w:t xml:space="preserve">0.466</w:t>
             </w:r>
           </w:p>
         </w:tc>
@@ -13339,7 +13422,7 @@
                 <w:sz w:val="16"/>
                 <w:szCs w:val="16"/>
               </w:rPr>
-              <w:t xml:space="preserve">0.968</w:t>
+              <w:t xml:space="preserve">0.969</w:t>
             </w:r>
           </w:p>
         </w:tc>
@@ -13407,7 +13490,7 @@
                 <w:sz w:val="16"/>
                 <w:szCs w:val="16"/>
               </w:rPr>
-              <w:t xml:space="preserve">0.294</w:t>
+              <w:t xml:space="preserve">0.295</w:t>
             </w:r>
           </w:p>
         </w:tc>
@@ -13650,7 +13733,7 @@
                 <w:sz w:val="16"/>
                 <w:szCs w:val="16"/>
               </w:rPr>
-              <w:t xml:space="preserve">0.350</w:t>
+              <w:t xml:space="preserve">0.349</w:t>
             </w:r>
           </w:p>
         </w:tc>
@@ -13752,7 +13835,7 @@
                 <w:sz w:val="16"/>
                 <w:szCs w:val="16"/>
               </w:rPr>
-              <w:t xml:space="preserve">0.213</w:t>
+              <w:t xml:space="preserve">0.212</w:t>
             </w:r>
           </w:p>
         </w:tc>
@@ -13820,7 +13903,7 @@
                 <w:sz w:val="16"/>
                 <w:szCs w:val="16"/>
               </w:rPr>
-              <w:t xml:space="preserve">0.40</w:t>
+              <w:t xml:space="preserve">0.41</w:t>
             </w:r>
           </w:p>
         </w:tc>
@@ -13854,7 +13937,7 @@
                 <w:sz w:val="16"/>
                 <w:szCs w:val="16"/>
               </w:rPr>
-              <w:t xml:space="preserve">0.40</w:t>
+              <w:t xml:space="preserve">0.39</w:t>
             </w:r>
           </w:p>
         </w:tc>
@@ -13995,7 +14078,7 @@
                 <w:sz w:val="16"/>
                 <w:szCs w:val="16"/>
               </w:rPr>
-              <w:t xml:space="preserve">0.182</w:t>
+              <w:t xml:space="preserve">0.186</w:t>
             </w:r>
           </w:p>
         </w:tc>
@@ -14063,7 +14146,7 @@
                 <w:sz w:val="16"/>
                 <w:szCs w:val="16"/>
               </w:rPr>
-              <w:t xml:space="preserve">0.0045</w:t>
+              <w:t xml:space="preserve">0.0046</w:t>
             </w:r>
           </w:p>
         </w:tc>
@@ -14097,7 +14180,7 @@
                 <w:sz w:val="16"/>
                 <w:szCs w:val="16"/>
               </w:rPr>
-              <w:t xml:space="preserve">0.100</w:t>
+              <w:t xml:space="preserve">0.098</w:t>
             </w:r>
           </w:p>
         </w:tc>
@@ -14268,10 +14351,10 @@
           <w:b/>
           <w:bCs/>
         </w:rPr>
-        <w:t xml:space="preserve">PR-AUC 0.465</w:t>
+        <w:t xml:space="preserve">PR-AUC 0.466</w:t>
       </w:r>
       <w:r>
-        <w:t xml:space="preserve">, 55 times the event rate, with ROC-AUC 0.968, and removes 29 % of the climatology error; at its 2023 cut-off it catches 46 % of the events with 49 % precision. Skill falls as events get rarer (PR-AUC 0.721 at 0.5 mm, 0.182 at 20 mm) while ROC-AUC stays above 0.96 throughout. The probabilities are reliable where it matters: below 10 %, where almost all forecasts lie, the observed frequency matches the forecast within 0.1 points, and the expected calibration error at 5 mm is 0.0015.</w:t>
+        <w:t xml:space="preserve">, 56 times the event rate, with ROC-AUC 0.969, and removes 30 % of the climatology error; at its 2023 cut-off it catches 46 % of the events with 49 % precision. Skill falls as events get rarer (PR-AUC 0.721 at 0.5 mm, 0.186 at 20 mm) while ROC-AUC stays above 0.96 throughout. The probabilities are reliable where it matters: below 10 %, where almost all forecasts lie, the observed frequency matches the forecast within 0.1 points, and the expected calibration error at 5 mm is 0.0014.</w:t>
       </w:r>
     </w:p>
     <w:p>
@@ -15132,7 +15215,7 @@
                 <w:sz w:val="16"/>
                 <w:szCs w:val="16"/>
               </w:rPr>
-              <w:t xml:space="preserve">0.460</w:t>
+              <w:t xml:space="preserve">0.459</w:t>
             </w:r>
           </w:p>
         </w:tc>
@@ -15200,7 +15283,7 @@
                 <w:sz w:val="16"/>
                 <w:szCs w:val="16"/>
               </w:rPr>
-              <w:t xml:space="preserve">0.0264</w:t>
+              <w:t xml:space="preserve">0.0262</w:t>
             </w:r>
           </w:p>
         </w:tc>
@@ -15234,7 +15317,7 @@
                 <w:sz w:val="16"/>
                 <w:szCs w:val="16"/>
               </w:rPr>
-              <w:t xml:space="preserve">0.254</w:t>
+              <w:t xml:space="preserve">0.260</w:t>
             </w:r>
           </w:p>
         </w:tc>
@@ -15307,7 +15390,7 @@
                 <w:sz w:val="16"/>
                 <w:szCs w:val="16"/>
               </w:rPr>
-              <w:t xml:space="preserve">0.465</w:t>
+              <w:t xml:space="preserve">0.466</w:t>
             </w:r>
           </w:p>
         </w:tc>
@@ -15341,7 +15424,7 @@
                 <w:sz w:val="16"/>
                 <w:szCs w:val="16"/>
               </w:rPr>
-              <w:t xml:space="preserve">0.968</w:t>
+              <w:t xml:space="preserve">0.970</w:t>
             </w:r>
           </w:p>
         </w:tc>
@@ -15409,7 +15492,7 @@
                 <w:sz w:val="16"/>
                 <w:szCs w:val="16"/>
               </w:rPr>
-              <w:t xml:space="preserve">0.295</w:t>
+              <w:t xml:space="preserve">0.296</w:t>
             </w:r>
           </w:p>
         </w:tc>
@@ -15482,7 +15565,7 @@
                 <w:sz w:val="16"/>
                 <w:szCs w:val="16"/>
               </w:rPr>
-              <w:t xml:space="preserve">0.465</w:t>
+              <w:t xml:space="preserve">0.466</w:t>
             </w:r>
           </w:p>
         </w:tc>
@@ -15516,7 +15599,7 @@
                 <w:sz w:val="16"/>
                 <w:szCs w:val="16"/>
               </w:rPr>
-              <w:t xml:space="preserve">0.968</w:t>
+              <w:t xml:space="preserve">0.969</w:t>
             </w:r>
           </w:p>
         </w:tc>
@@ -15584,7 +15667,7 @@
                 <w:sz w:val="16"/>
                 <w:szCs w:val="16"/>
               </w:rPr>
-              <w:t xml:space="preserve">0.294</w:t>
+              <w:t xml:space="preserve">0.295</w:t>
             </w:r>
           </w:p>
         </w:tc>
@@ -16127,7 +16210,7 @@
                 <w:sz w:val="16"/>
                 <w:szCs w:val="16"/>
               </w:rPr>
-              <w:t xml:space="preserve">0.662</w:t>
+              <w:t xml:space="preserve">0.663</w:t>
             </w:r>
           </w:p>
         </w:tc>
@@ -16263,7 +16346,7 @@
                 <w:sz w:val="16"/>
                 <w:szCs w:val="16"/>
               </w:rPr>
-              <w:t xml:space="preserve">0.0520</w:t>
+              <w:t xml:space="preserve">0.0521</w:t>
             </w:r>
           </w:p>
         </w:tc>
@@ -16438,7 +16521,7 @@
                 <w:sz w:val="16"/>
                 <w:szCs w:val="16"/>
               </w:rPr>
-              <w:t xml:space="preserve">0.587</w:t>
+              <w:t xml:space="preserve">0.585</w:t>
             </w:r>
           </w:p>
         </w:tc>
@@ -16574,7 +16657,7 @@
                 <w:sz w:val="16"/>
                 <w:szCs w:val="16"/>
               </w:rPr>
-              <w:t xml:space="preserve">0.0396</w:t>
+              <w:t xml:space="preserve">0.0397</w:t>
             </w:r>
           </w:p>
         </w:tc>
@@ -16749,7 +16832,7 @@
                 <w:sz w:val="16"/>
                 <w:szCs w:val="16"/>
               </w:rPr>
-              <w:t xml:space="preserve">0.459</w:t>
+              <w:t xml:space="preserve">0.461</w:t>
             </w:r>
           </w:p>
         </w:tc>
@@ -16885,7 +16968,7 @@
                 <w:sz w:val="16"/>
                 <w:szCs w:val="16"/>
               </w:rPr>
-              <w:t xml:space="preserve">0.0238</w:t>
+              <w:t xml:space="preserve">0.0237</w:t>
             </w:r>
           </w:p>
         </w:tc>
@@ -17060,7 +17143,7 @@
                 <w:sz w:val="16"/>
                 <w:szCs w:val="16"/>
               </w:rPr>
-              <w:t xml:space="preserve">0.351</w:t>
+              <w:t xml:space="preserve">0.350</w:t>
             </w:r>
           </w:p>
         </w:tc>
@@ -17196,7 +17279,7 @@
                 <w:sz w:val="16"/>
                 <w:szCs w:val="16"/>
               </w:rPr>
-              <w:t xml:space="preserve">0.0128</w:t>
+              <w:t xml:space="preserve">0.0129</w:t>
             </w:r>
           </w:p>
         </w:tc>
@@ -17371,7 +17454,7 @@
                 <w:sz w:val="16"/>
                 <w:szCs w:val="16"/>
               </w:rPr>
-              <w:t xml:space="preserve">0.192</w:t>
+              <w:t xml:space="preserve">0.191</w:t>
             </w:r>
           </w:p>
         </w:tc>
@@ -17613,10 +17696,10 @@
           <w:b/>
           <w:bCs/>
         </w:rPr>
-        <w:t xml:space="preserve">4.6× faster than 2</w:t>
+        <w:t xml:space="preserve">4.5× faster than 2</w:t>
       </w:r>
       <w:r>
-        <w:t xml:space="preserve"> (26 s → 6 s), a parallel efficiency of 57 %. The gain flattens at high core counts because the two shuffles and the single SSD are shared, and because 4 of the 16 cores are efficiency cores — the usual Amdahl picture, and the reason a cluster with its own disks per node scales better than one machine.</w:t>
+        <w:t xml:space="preserve"> (26 s → 6 s), a parallel efficiency of 56 %. The gain flattens at high core counts because the two shuffles and the single SSD are shared, and because 4 of the 16 cores are efficiency cores — the usual Amdahl picture, and the reason a cluster with its own disks per node scales better than one machine.</w:t>
       </w:r>
     </w:p>
     <w:tbl>
@@ -17881,7 +17964,7 @@
                 <w:sz w:val="16"/>
                 <w:szCs w:val="16"/>
               </w:rPr>
-              <w:t xml:space="preserve">26.4</w:t>
+              <w:t xml:space="preserve">26.3</w:t>
             </w:r>
           </w:p>
         </w:tc>
@@ -18056,7 +18139,7 @@
                 <w:sz w:val="16"/>
                 <w:szCs w:val="16"/>
               </w:rPr>
-              <w:t xml:space="preserve">13.6</w:t>
+              <w:t xml:space="preserve">13.4</w:t>
             </w:r>
           </w:p>
         </w:tc>
@@ -18090,7 +18173,7 @@
                 <w:sz w:val="16"/>
                 <w:szCs w:val="16"/>
               </w:rPr>
-              <w:t xml:space="preserve">1.94×</w:t>
+              <w:t xml:space="preserve">1.96×</w:t>
             </w:r>
           </w:p>
         </w:tc>
@@ -18158,7 +18241,7 @@
                 <w:sz w:val="16"/>
                 <w:szCs w:val="16"/>
               </w:rPr>
-              <w:t xml:space="preserve">97 %</w:t>
+              <w:t xml:space="preserve">98 %</w:t>
             </w:r>
           </w:p>
         </w:tc>
@@ -18231,7 +18314,7 @@
                 <w:sz w:val="16"/>
                 <w:szCs w:val="16"/>
               </w:rPr>
-              <w:t xml:space="preserve">7.9</w:t>
+              <w:t xml:space="preserve">8.0</w:t>
             </w:r>
           </w:p>
         </w:tc>
@@ -18265,7 +18348,7 @@
                 <w:sz w:val="16"/>
                 <w:szCs w:val="16"/>
               </w:rPr>
-              <w:t xml:space="preserve">3.34×</w:t>
+              <w:t xml:space="preserve">3.29×</w:t>
             </w:r>
           </w:p>
         </w:tc>
@@ -18333,7 +18416,7 @@
                 <w:sz w:val="16"/>
                 <w:szCs w:val="16"/>
               </w:rPr>
-              <w:t xml:space="preserve">84 %</w:t>
+              <w:t xml:space="preserve">82 %</w:t>
             </w:r>
           </w:p>
         </w:tc>
@@ -18406,7 +18489,7 @@
                 <w:sz w:val="16"/>
                 <w:szCs w:val="16"/>
               </w:rPr>
-              <w:t xml:space="preserve">5.8</w:t>
+              <w:t xml:space="preserve">5.9</w:t>
             </w:r>
           </w:p>
         </w:tc>
@@ -18440,7 +18523,7 @@
                 <w:sz w:val="16"/>
                 <w:szCs w:val="16"/>
               </w:rPr>
-              <w:t xml:space="preserve">4.55×</w:t>
+              <w:t xml:space="preserve">4.46×</w:t>
             </w:r>
           </w:p>
         </w:tc>
@@ -18508,7 +18591,7 @@
                 <w:sz w:val="16"/>
                 <w:szCs w:val="16"/>
               </w:rPr>
-              <w:t xml:space="preserve">57 %</w:t>
+              <w:t xml:space="preserve">56 %</w:t>
             </w:r>
           </w:p>
         </w:tc>
@@ -18598,7 +18681,1680 @@
         <w:pStyle w:val="Heading2"/>
       </w:pPr>
       <w:r>
-        <w:t xml:space="preserve">8.5 Verification</w:t>
+        <w:t xml:space="preserve">8.5 The same job on a Google Cloud Dataproc cluster</w:t>
+      </w:r>
+    </w:p>
+    <w:p>
+      <w:pPr>
+        <w:spacing w:after="120" w:line="276"/>
+        <w:jc w:val="both"/>
+      </w:pPr>
+      <w:r>
+        <w:t xml:space="preserve">The identical job was submitted to a Dataproc cluster with 2 and then 4 workers (n2-standard-2), reading the bronze layer from Cloud Storage; it returned exactly the same answer as the laptop. Ingesting the 7.5 GB of CSV from the bucket into bronze Parquet took 328 s on 2 workers. For the cleaning job, </w:t>
+      </w:r>
+      <w:r>
+        <w:rPr>
+          <w:b/>
+          <w:bCs/>
+        </w:rPr>
+        <w:t xml:space="preserve">doubling the workers cut the time from 74.8 s to 37.3 s, a 2.0× speed-up</w:t>
+      </w:r>
+      <w:r>
+        <w:t xml:space="preserve">, whereas on the laptop going from 4 to 8 cores gave 1.7× (13.4 s → 8.0 s).</w:t>
+      </w:r>
+    </w:p>
+    <w:tbl>
+      <w:tblPr>
+        <w:tblW w:type="dxa" w:w="9638"/>
+        <w:tblBorders>
+          <w:top w:val="single" w:color="auto" w:sz="4"/>
+          <w:left w:val="single" w:color="auto" w:sz="4"/>
+          <w:bottom w:val="single" w:color="auto" w:sz="4"/>
+          <w:right w:val="single" w:color="auto" w:sz="4"/>
+          <w:insideH w:val="single" w:color="auto" w:sz="4"/>
+          <w:insideV w:val="single" w:color="auto" w:sz="4"/>
+        </w:tblBorders>
+      </w:tblPr>
+      <w:tblGrid>
+        <w:gridCol w:w="1700"/>
+        <w:gridCol w:w="2600"/>
+        <w:gridCol w:w="900"/>
+        <w:gridCol w:w="1838"/>
+        <w:gridCol w:w="1300"/>
+        <w:gridCol w:w="1300"/>
+      </w:tblGrid>
+      <w:tr>
+        <w:trPr>
+          <w:tblHeader/>
+        </w:trPr>
+        <w:tc>
+          <w:tcPr>
+            <w:tcW w:type="dxa" w:w="1700"/>
+            <w:tcBorders>
+              <w:top w:val="single" w:color="D5DAE3" w:sz="4"/>
+              <w:left w:val="single" w:color="D5DAE3" w:sz="4"/>
+              <w:bottom w:val="single" w:color="D5DAE3" w:sz="4"/>
+              <w:right w:val="single" w:color="D5DAE3" w:sz="4"/>
+            </w:tcBorders>
+            <w:shd w:fill="1B2A4A" w:color="auto" w:val="clear"/>
+            <w:tcMar>
+              <w:top w:type="dxa" w:w="45"/>
+              <w:left w:type="dxa" w:w="80"/>
+              <w:bottom w:type="dxa" w:w="45"/>
+              <w:right w:type="dxa" w:w="80"/>
+            </w:tcMar>
+            <w:vAlign w:val="center"/>
+          </w:tcPr>
+          <w:p>
+            <w:pPr>
+              <w:jc w:val="left"/>
+            </w:pPr>
+            <w:r>
+              <w:rPr>
+                <w:b/>
+                <w:bCs/>
+                <w:color w:val="FFFFFF"/>
+                <w:sz w:val="16"/>
+                <w:szCs w:val="16"/>
+              </w:rPr>
+              <w:t xml:space="preserve">Platform</w:t>
+            </w:r>
+          </w:p>
+        </w:tc>
+        <w:tc>
+          <w:tcPr>
+            <w:tcW w:type="dxa" w:w="2600"/>
+            <w:tcBorders>
+              <w:top w:val="single" w:color="D5DAE3" w:sz="4"/>
+              <w:left w:val="single" w:color="D5DAE3" w:sz="4"/>
+              <w:bottom w:val="single" w:color="D5DAE3" w:sz="4"/>
+              <w:right w:val="single" w:color="D5DAE3" w:sz="4"/>
+            </w:tcBorders>
+            <w:shd w:fill="1B2A4A" w:color="auto" w:val="clear"/>
+            <w:tcMar>
+              <w:top w:type="dxa" w:w="45"/>
+              <w:left w:type="dxa" w:w="80"/>
+              <w:bottom w:type="dxa" w:w="45"/>
+              <w:right w:type="dxa" w:w="80"/>
+            </w:tcMar>
+            <w:vAlign w:val="center"/>
+          </w:tcPr>
+          <w:p>
+            <w:pPr>
+              <w:jc w:val="left"/>
+            </w:pPr>
+            <w:r>
+              <w:rPr>
+                <w:b/>
+                <w:bCs/>
+                <w:color w:val="FFFFFF"/>
+                <w:sz w:val="16"/>
+                <w:szCs w:val="16"/>
+              </w:rPr>
+              <w:t xml:space="preserve">Configuration</w:t>
+            </w:r>
+          </w:p>
+        </w:tc>
+        <w:tc>
+          <w:tcPr>
+            <w:tcW w:type="dxa" w:w="900"/>
+            <w:tcBorders>
+              <w:top w:val="single" w:color="D5DAE3" w:sz="4"/>
+              <w:left w:val="single" w:color="D5DAE3" w:sz="4"/>
+              <w:bottom w:val="single" w:color="D5DAE3" w:sz="4"/>
+              <w:right w:val="single" w:color="D5DAE3" w:sz="4"/>
+            </w:tcBorders>
+            <w:shd w:fill="1B2A4A" w:color="auto" w:val="clear"/>
+            <w:tcMar>
+              <w:top w:type="dxa" w:w="45"/>
+              <w:left w:type="dxa" w:w="80"/>
+              <w:bottom w:type="dxa" w:w="45"/>
+              <w:right w:type="dxa" w:w="80"/>
+            </w:tcMar>
+            <w:vAlign w:val="center"/>
+          </w:tcPr>
+          <w:p>
+            <w:pPr>
+              <w:jc w:val="center"/>
+            </w:pPr>
+            <w:r>
+              <w:rPr>
+                <w:b/>
+                <w:bCs/>
+                <w:color w:val="FFFFFF"/>
+                <w:sz w:val="16"/>
+                <w:szCs w:val="16"/>
+              </w:rPr>
+              <w:t xml:space="preserve">Cores</w:t>
+            </w:r>
+          </w:p>
+        </w:tc>
+        <w:tc>
+          <w:tcPr>
+            <w:tcW w:type="dxa" w:w="1838"/>
+            <w:tcBorders>
+              <w:top w:val="single" w:color="D5DAE3" w:sz="4"/>
+              <w:left w:val="single" w:color="D5DAE3" w:sz="4"/>
+              <w:bottom w:val="single" w:color="D5DAE3" w:sz="4"/>
+              <w:right w:val="single" w:color="D5DAE3" w:sz="4"/>
+            </w:tcBorders>
+            <w:shd w:fill="1B2A4A" w:color="auto" w:val="clear"/>
+            <w:tcMar>
+              <w:top w:type="dxa" w:w="45"/>
+              <w:left w:type="dxa" w:w="80"/>
+              <w:bottom w:type="dxa" w:w="45"/>
+              <w:right w:type="dxa" w:w="80"/>
+            </w:tcMar>
+            <w:vAlign w:val="center"/>
+          </w:tcPr>
+          <w:p>
+            <w:pPr>
+              <w:jc w:val="center"/>
+            </w:pPr>
+            <w:r>
+              <w:rPr>
+                <w:b/>
+                <w:bCs/>
+                <w:color w:val="FFFFFF"/>
+                <w:sz w:val="16"/>
+                <w:szCs w:val="16"/>
+              </w:rPr>
+              <w:t xml:space="preserve">Wall time (s)</w:t>
+            </w:r>
+          </w:p>
+        </w:tc>
+        <w:tc>
+          <w:tcPr>
+            <w:tcW w:type="dxa" w:w="1300"/>
+            <w:tcBorders>
+              <w:top w:val="single" w:color="D5DAE3" w:sz="4"/>
+              <w:left w:val="single" w:color="D5DAE3" w:sz="4"/>
+              <w:bottom w:val="single" w:color="D5DAE3" w:sz="4"/>
+              <w:right w:val="single" w:color="D5DAE3" w:sz="4"/>
+            </w:tcBorders>
+            <w:shd w:fill="1B2A4A" w:color="auto" w:val="clear"/>
+            <w:tcMar>
+              <w:top w:type="dxa" w:w="45"/>
+              <w:left w:type="dxa" w:w="80"/>
+              <w:bottom w:type="dxa" w:w="45"/>
+              <w:right w:type="dxa" w:w="80"/>
+            </w:tcMar>
+            <w:vAlign w:val="center"/>
+          </w:tcPr>
+          <w:p>
+            <w:pPr>
+              <w:jc w:val="center"/>
+            </w:pPr>
+            <w:r>
+              <w:rPr>
+                <w:b/>
+                <w:bCs/>
+                <w:color w:val="FFFFFF"/>
+                <w:sz w:val="16"/>
+                <w:szCs w:val="16"/>
+              </w:rPr>
+              <w:t xml:space="preserve">Speed-up</w:t>
+            </w:r>
+          </w:p>
+        </w:tc>
+        <w:tc>
+          <w:tcPr>
+            <w:tcW w:type="dxa" w:w="1300"/>
+            <w:tcBorders>
+              <w:top w:val="single" w:color="D5DAE3" w:sz="4"/>
+              <w:left w:val="single" w:color="D5DAE3" w:sz="4"/>
+              <w:bottom w:val="single" w:color="D5DAE3" w:sz="4"/>
+              <w:right w:val="single" w:color="D5DAE3" w:sz="4"/>
+            </w:tcBorders>
+            <w:shd w:fill="1B2A4A" w:color="auto" w:val="clear"/>
+            <w:tcMar>
+              <w:top w:type="dxa" w:w="45"/>
+              <w:left w:type="dxa" w:w="80"/>
+              <w:bottom w:type="dxa" w:w="45"/>
+              <w:right w:type="dxa" w:w="80"/>
+            </w:tcMar>
+            <w:vAlign w:val="center"/>
+          </w:tcPr>
+          <w:p>
+            <w:pPr>
+              <w:jc w:val="center"/>
+            </w:pPr>
+            <w:r>
+              <w:rPr>
+                <w:b/>
+                <w:bCs/>
+                <w:color w:val="FFFFFF"/>
+                <w:sz w:val="16"/>
+                <w:szCs w:val="16"/>
+              </w:rPr>
+              <w:t xml:space="preserve">Efficiency</w:t>
+            </w:r>
+          </w:p>
+        </w:tc>
+      </w:tr>
+      <w:tr>
+        <w:trPr>
+          <w:cantSplit/>
+        </w:trPr>
+        <w:tc>
+          <w:tcPr>
+            <w:tcW w:type="dxa" w:w="1700"/>
+            <w:tcBorders>
+              <w:top w:val="single" w:color="D5DAE3" w:sz="4"/>
+              <w:left w:val="single" w:color="D5DAE3" w:sz="4"/>
+              <w:bottom w:val="single" w:color="D5DAE3" w:sz="4"/>
+              <w:right w:val="single" w:color="D5DAE3" w:sz="4"/>
+            </w:tcBorders>
+            <w:shd w:fill="FFFFFF" w:color="auto" w:val="clear"/>
+            <w:tcMar>
+              <w:top w:type="dxa" w:w="45"/>
+              <w:left w:type="dxa" w:w="80"/>
+              <w:bottom w:type="dxa" w:w="45"/>
+              <w:right w:type="dxa" w:w="80"/>
+            </w:tcMar>
+            <w:vAlign w:val="center"/>
+          </w:tcPr>
+          <w:p>
+            <w:pPr>
+              <w:jc w:val="left"/>
+            </w:pPr>
+            <w:r>
+              <w:rPr>
+                <w:b w:val="false"/>
+                <w:bCs w:val="false"/>
+                <w:color w:val="3C3C3C"/>
+                <w:sz w:val="16"/>
+                <w:szCs w:val="16"/>
+              </w:rPr>
+              <w:t xml:space="preserve">Laptop</w:t>
+            </w:r>
+          </w:p>
+        </w:tc>
+        <w:tc>
+          <w:tcPr>
+            <w:tcW w:type="dxa" w:w="2600"/>
+            <w:tcBorders>
+              <w:top w:val="single" w:color="D5DAE3" w:sz="4"/>
+              <w:left w:val="single" w:color="D5DAE3" w:sz="4"/>
+              <w:bottom w:val="single" w:color="D5DAE3" w:sz="4"/>
+              <w:right w:val="single" w:color="D5DAE3" w:sz="4"/>
+            </w:tcBorders>
+            <w:shd w:fill="FFFFFF" w:color="auto" w:val="clear"/>
+            <w:tcMar>
+              <w:top w:type="dxa" w:w="45"/>
+              <w:left w:type="dxa" w:w="80"/>
+              <w:bottom w:type="dxa" w:w="45"/>
+              <w:right w:type="dxa" w:w="80"/>
+            </w:tcMar>
+            <w:vAlign w:val="center"/>
+          </w:tcPr>
+          <w:p>
+            <w:pPr>
+              <w:jc w:val="left"/>
+            </w:pPr>
+            <w:r>
+              <w:rPr>
+                <w:b w:val="false"/>
+                <w:bCs w:val="false"/>
+                <w:color w:val="3C3C3C"/>
+                <w:sz w:val="16"/>
+                <w:szCs w:val="16"/>
+              </w:rPr>
+              <w:t xml:space="preserve">local[2]</w:t>
+            </w:r>
+          </w:p>
+        </w:tc>
+        <w:tc>
+          <w:tcPr>
+            <w:tcW w:type="dxa" w:w="900"/>
+            <w:tcBorders>
+              <w:top w:val="single" w:color="D5DAE3" w:sz="4"/>
+              <w:left w:val="single" w:color="D5DAE3" w:sz="4"/>
+              <w:bottom w:val="single" w:color="D5DAE3" w:sz="4"/>
+              <w:right w:val="single" w:color="D5DAE3" w:sz="4"/>
+            </w:tcBorders>
+            <w:shd w:fill="FFFFFF" w:color="auto" w:val="clear"/>
+            <w:tcMar>
+              <w:top w:type="dxa" w:w="45"/>
+              <w:left w:type="dxa" w:w="80"/>
+              <w:bottom w:type="dxa" w:w="45"/>
+              <w:right w:type="dxa" w:w="80"/>
+            </w:tcMar>
+            <w:vAlign w:val="center"/>
+          </w:tcPr>
+          <w:p>
+            <w:pPr>
+              <w:jc w:val="center"/>
+            </w:pPr>
+            <w:r>
+              <w:rPr>
+                <w:b w:val="false"/>
+                <w:bCs w:val="false"/>
+                <w:color w:val="3C3C3C"/>
+                <w:sz w:val="16"/>
+                <w:szCs w:val="16"/>
+              </w:rPr>
+              <w:t xml:space="preserve">2</w:t>
+            </w:r>
+          </w:p>
+        </w:tc>
+        <w:tc>
+          <w:tcPr>
+            <w:tcW w:type="dxa" w:w="1838"/>
+            <w:tcBorders>
+              <w:top w:val="single" w:color="D5DAE3" w:sz="4"/>
+              <w:left w:val="single" w:color="D5DAE3" w:sz="4"/>
+              <w:bottom w:val="single" w:color="D5DAE3" w:sz="4"/>
+              <w:right w:val="single" w:color="D5DAE3" w:sz="4"/>
+            </w:tcBorders>
+            <w:shd w:fill="FFFFFF" w:color="auto" w:val="clear"/>
+            <w:tcMar>
+              <w:top w:type="dxa" w:w="45"/>
+              <w:left w:type="dxa" w:w="80"/>
+              <w:bottom w:type="dxa" w:w="45"/>
+              <w:right w:type="dxa" w:w="80"/>
+            </w:tcMar>
+            <w:vAlign w:val="center"/>
+          </w:tcPr>
+          <w:p>
+            <w:pPr>
+              <w:jc w:val="center"/>
+            </w:pPr>
+            <w:r>
+              <w:rPr>
+                <w:b w:val="false"/>
+                <w:bCs w:val="false"/>
+                <w:color w:val="3C3C3C"/>
+                <w:sz w:val="16"/>
+                <w:szCs w:val="16"/>
+              </w:rPr>
+              <w:t xml:space="preserve">26.3</w:t>
+            </w:r>
+          </w:p>
+        </w:tc>
+        <w:tc>
+          <w:tcPr>
+            <w:tcW w:type="dxa" w:w="1300"/>
+            <w:tcBorders>
+              <w:top w:val="single" w:color="D5DAE3" w:sz="4"/>
+              <w:left w:val="single" w:color="D5DAE3" w:sz="4"/>
+              <w:bottom w:val="single" w:color="D5DAE3" w:sz="4"/>
+              <w:right w:val="single" w:color="D5DAE3" w:sz="4"/>
+            </w:tcBorders>
+            <w:shd w:fill="FFFFFF" w:color="auto" w:val="clear"/>
+            <w:tcMar>
+              <w:top w:type="dxa" w:w="45"/>
+              <w:left w:type="dxa" w:w="80"/>
+              <w:bottom w:type="dxa" w:w="45"/>
+              <w:right w:type="dxa" w:w="80"/>
+            </w:tcMar>
+            <w:vAlign w:val="center"/>
+          </w:tcPr>
+          <w:p>
+            <w:pPr>
+              <w:jc w:val="center"/>
+            </w:pPr>
+            <w:r>
+              <w:rPr>
+                <w:b w:val="false"/>
+                <w:bCs w:val="false"/>
+                <w:color w:val="3C3C3C"/>
+                <w:sz w:val="16"/>
+                <w:szCs w:val="16"/>
+              </w:rPr>
+              <w:t xml:space="preserve">1.00×</w:t>
+            </w:r>
+          </w:p>
+        </w:tc>
+        <w:tc>
+          <w:tcPr>
+            <w:tcW w:type="dxa" w:w="1300"/>
+            <w:tcBorders>
+              <w:top w:val="single" w:color="D5DAE3" w:sz="4"/>
+              <w:left w:val="single" w:color="D5DAE3" w:sz="4"/>
+              <w:bottom w:val="single" w:color="D5DAE3" w:sz="4"/>
+              <w:right w:val="single" w:color="D5DAE3" w:sz="4"/>
+            </w:tcBorders>
+            <w:shd w:fill="FFFFFF" w:color="auto" w:val="clear"/>
+            <w:tcMar>
+              <w:top w:type="dxa" w:w="45"/>
+              <w:left w:type="dxa" w:w="80"/>
+              <w:bottom w:type="dxa" w:w="45"/>
+              <w:right w:type="dxa" w:w="80"/>
+            </w:tcMar>
+            <w:vAlign w:val="center"/>
+          </w:tcPr>
+          <w:p>
+            <w:pPr>
+              <w:jc w:val="center"/>
+            </w:pPr>
+            <w:r>
+              <w:rPr>
+                <w:b w:val="false"/>
+                <w:bCs w:val="false"/>
+                <w:color w:val="3C3C3C"/>
+                <w:sz w:val="16"/>
+                <w:szCs w:val="16"/>
+              </w:rPr>
+              <w:t xml:space="preserve">100 %</w:t>
+            </w:r>
+          </w:p>
+        </w:tc>
+      </w:tr>
+      <w:tr>
+        <w:trPr>
+          <w:cantSplit/>
+        </w:trPr>
+        <w:tc>
+          <w:tcPr>
+            <w:tcW w:type="dxa" w:w="1700"/>
+            <w:tcBorders>
+              <w:top w:val="single" w:color="D5DAE3" w:sz="4"/>
+              <w:left w:val="single" w:color="D5DAE3" w:sz="4"/>
+              <w:bottom w:val="single" w:color="D5DAE3" w:sz="4"/>
+              <w:right w:val="single" w:color="D5DAE3" w:sz="4"/>
+            </w:tcBorders>
+            <w:shd w:fill="F4F6FA" w:color="auto" w:val="clear"/>
+            <w:tcMar>
+              <w:top w:type="dxa" w:w="45"/>
+              <w:left w:type="dxa" w:w="80"/>
+              <w:bottom w:type="dxa" w:w="45"/>
+              <w:right w:type="dxa" w:w="80"/>
+            </w:tcMar>
+            <w:vAlign w:val="center"/>
+          </w:tcPr>
+          <w:p>
+            <w:pPr>
+              <w:jc w:val="left"/>
+            </w:pPr>
+            <w:r>
+              <w:rPr>
+                <w:b w:val="false"/>
+                <w:bCs w:val="false"/>
+                <w:color w:val="3C3C3C"/>
+                <w:sz w:val="16"/>
+                <w:szCs w:val="16"/>
+              </w:rPr>
+              <w:t xml:space="preserve">Laptop</w:t>
+            </w:r>
+          </w:p>
+        </w:tc>
+        <w:tc>
+          <w:tcPr>
+            <w:tcW w:type="dxa" w:w="2600"/>
+            <w:tcBorders>
+              <w:top w:val="single" w:color="D5DAE3" w:sz="4"/>
+              <w:left w:val="single" w:color="D5DAE3" w:sz="4"/>
+              <w:bottom w:val="single" w:color="D5DAE3" w:sz="4"/>
+              <w:right w:val="single" w:color="D5DAE3" w:sz="4"/>
+            </w:tcBorders>
+            <w:shd w:fill="F4F6FA" w:color="auto" w:val="clear"/>
+            <w:tcMar>
+              <w:top w:type="dxa" w:w="45"/>
+              <w:left w:type="dxa" w:w="80"/>
+              <w:bottom w:type="dxa" w:w="45"/>
+              <w:right w:type="dxa" w:w="80"/>
+            </w:tcMar>
+            <w:vAlign w:val="center"/>
+          </w:tcPr>
+          <w:p>
+            <w:pPr>
+              <w:jc w:val="left"/>
+            </w:pPr>
+            <w:r>
+              <w:rPr>
+                <w:b w:val="false"/>
+                <w:bCs w:val="false"/>
+                <w:color w:val="3C3C3C"/>
+                <w:sz w:val="16"/>
+                <w:szCs w:val="16"/>
+              </w:rPr>
+              <w:t xml:space="preserve">local[4]</w:t>
+            </w:r>
+          </w:p>
+        </w:tc>
+        <w:tc>
+          <w:tcPr>
+            <w:tcW w:type="dxa" w:w="900"/>
+            <w:tcBorders>
+              <w:top w:val="single" w:color="D5DAE3" w:sz="4"/>
+              <w:left w:val="single" w:color="D5DAE3" w:sz="4"/>
+              <w:bottom w:val="single" w:color="D5DAE3" w:sz="4"/>
+              <w:right w:val="single" w:color="D5DAE3" w:sz="4"/>
+            </w:tcBorders>
+            <w:shd w:fill="F4F6FA" w:color="auto" w:val="clear"/>
+            <w:tcMar>
+              <w:top w:type="dxa" w:w="45"/>
+              <w:left w:type="dxa" w:w="80"/>
+              <w:bottom w:type="dxa" w:w="45"/>
+              <w:right w:type="dxa" w:w="80"/>
+            </w:tcMar>
+            <w:vAlign w:val="center"/>
+          </w:tcPr>
+          <w:p>
+            <w:pPr>
+              <w:jc w:val="center"/>
+            </w:pPr>
+            <w:r>
+              <w:rPr>
+                <w:b w:val="false"/>
+                <w:bCs w:val="false"/>
+                <w:color w:val="3C3C3C"/>
+                <w:sz w:val="16"/>
+                <w:szCs w:val="16"/>
+              </w:rPr>
+              <w:t xml:space="preserve">4</w:t>
+            </w:r>
+          </w:p>
+        </w:tc>
+        <w:tc>
+          <w:tcPr>
+            <w:tcW w:type="dxa" w:w="1838"/>
+            <w:tcBorders>
+              <w:top w:val="single" w:color="D5DAE3" w:sz="4"/>
+              <w:left w:val="single" w:color="D5DAE3" w:sz="4"/>
+              <w:bottom w:val="single" w:color="D5DAE3" w:sz="4"/>
+              <w:right w:val="single" w:color="D5DAE3" w:sz="4"/>
+            </w:tcBorders>
+            <w:shd w:fill="F4F6FA" w:color="auto" w:val="clear"/>
+            <w:tcMar>
+              <w:top w:type="dxa" w:w="45"/>
+              <w:left w:type="dxa" w:w="80"/>
+              <w:bottom w:type="dxa" w:w="45"/>
+              <w:right w:type="dxa" w:w="80"/>
+            </w:tcMar>
+            <w:vAlign w:val="center"/>
+          </w:tcPr>
+          <w:p>
+            <w:pPr>
+              <w:jc w:val="center"/>
+            </w:pPr>
+            <w:r>
+              <w:rPr>
+                <w:b w:val="false"/>
+                <w:bCs w:val="false"/>
+                <w:color w:val="3C3C3C"/>
+                <w:sz w:val="16"/>
+                <w:szCs w:val="16"/>
+              </w:rPr>
+              <w:t xml:space="preserve">13.4</w:t>
+            </w:r>
+          </w:p>
+        </w:tc>
+        <w:tc>
+          <w:tcPr>
+            <w:tcW w:type="dxa" w:w="1300"/>
+            <w:tcBorders>
+              <w:top w:val="single" w:color="D5DAE3" w:sz="4"/>
+              <w:left w:val="single" w:color="D5DAE3" w:sz="4"/>
+              <w:bottom w:val="single" w:color="D5DAE3" w:sz="4"/>
+              <w:right w:val="single" w:color="D5DAE3" w:sz="4"/>
+            </w:tcBorders>
+            <w:shd w:fill="F4F6FA" w:color="auto" w:val="clear"/>
+            <w:tcMar>
+              <w:top w:type="dxa" w:w="45"/>
+              <w:left w:type="dxa" w:w="80"/>
+              <w:bottom w:type="dxa" w:w="45"/>
+              <w:right w:type="dxa" w:w="80"/>
+            </w:tcMar>
+            <w:vAlign w:val="center"/>
+          </w:tcPr>
+          <w:p>
+            <w:pPr>
+              <w:jc w:val="center"/>
+            </w:pPr>
+            <w:r>
+              <w:rPr>
+                <w:b w:val="false"/>
+                <w:bCs w:val="false"/>
+                <w:color w:val="3C3C3C"/>
+                <w:sz w:val="16"/>
+                <w:szCs w:val="16"/>
+              </w:rPr>
+              <w:t xml:space="preserve">1.96×</w:t>
+            </w:r>
+          </w:p>
+        </w:tc>
+        <w:tc>
+          <w:tcPr>
+            <w:tcW w:type="dxa" w:w="1300"/>
+            <w:tcBorders>
+              <w:top w:val="single" w:color="D5DAE3" w:sz="4"/>
+              <w:left w:val="single" w:color="D5DAE3" w:sz="4"/>
+              <w:bottom w:val="single" w:color="D5DAE3" w:sz="4"/>
+              <w:right w:val="single" w:color="D5DAE3" w:sz="4"/>
+            </w:tcBorders>
+            <w:shd w:fill="F4F6FA" w:color="auto" w:val="clear"/>
+            <w:tcMar>
+              <w:top w:type="dxa" w:w="45"/>
+              <w:left w:type="dxa" w:w="80"/>
+              <w:bottom w:type="dxa" w:w="45"/>
+              <w:right w:type="dxa" w:w="80"/>
+            </w:tcMar>
+            <w:vAlign w:val="center"/>
+          </w:tcPr>
+          <w:p>
+            <w:pPr>
+              <w:jc w:val="center"/>
+            </w:pPr>
+            <w:r>
+              <w:rPr>
+                <w:b w:val="false"/>
+                <w:bCs w:val="false"/>
+                <w:color w:val="3C3C3C"/>
+                <w:sz w:val="16"/>
+                <w:szCs w:val="16"/>
+              </w:rPr>
+              <w:t xml:space="preserve">98 %</w:t>
+            </w:r>
+          </w:p>
+        </w:tc>
+      </w:tr>
+      <w:tr>
+        <w:trPr>
+          <w:cantSplit/>
+        </w:trPr>
+        <w:tc>
+          <w:tcPr>
+            <w:tcW w:type="dxa" w:w="1700"/>
+            <w:tcBorders>
+              <w:top w:val="single" w:color="D5DAE3" w:sz="4"/>
+              <w:left w:val="single" w:color="D5DAE3" w:sz="4"/>
+              <w:bottom w:val="single" w:color="D5DAE3" w:sz="4"/>
+              <w:right w:val="single" w:color="D5DAE3" w:sz="4"/>
+            </w:tcBorders>
+            <w:shd w:fill="FFFFFF" w:color="auto" w:val="clear"/>
+            <w:tcMar>
+              <w:top w:type="dxa" w:w="45"/>
+              <w:left w:type="dxa" w:w="80"/>
+              <w:bottom w:type="dxa" w:w="45"/>
+              <w:right w:type="dxa" w:w="80"/>
+            </w:tcMar>
+            <w:vAlign w:val="center"/>
+          </w:tcPr>
+          <w:p>
+            <w:pPr>
+              <w:jc w:val="left"/>
+            </w:pPr>
+            <w:r>
+              <w:rPr>
+                <w:b w:val="false"/>
+                <w:bCs w:val="false"/>
+                <w:color w:val="3C3C3C"/>
+                <w:sz w:val="16"/>
+                <w:szCs w:val="16"/>
+              </w:rPr>
+              <w:t xml:space="preserve">Laptop</w:t>
+            </w:r>
+          </w:p>
+        </w:tc>
+        <w:tc>
+          <w:tcPr>
+            <w:tcW w:type="dxa" w:w="2600"/>
+            <w:tcBorders>
+              <w:top w:val="single" w:color="D5DAE3" w:sz="4"/>
+              <w:left w:val="single" w:color="D5DAE3" w:sz="4"/>
+              <w:bottom w:val="single" w:color="D5DAE3" w:sz="4"/>
+              <w:right w:val="single" w:color="D5DAE3" w:sz="4"/>
+            </w:tcBorders>
+            <w:shd w:fill="FFFFFF" w:color="auto" w:val="clear"/>
+            <w:tcMar>
+              <w:top w:type="dxa" w:w="45"/>
+              <w:left w:type="dxa" w:w="80"/>
+              <w:bottom w:type="dxa" w:w="45"/>
+              <w:right w:type="dxa" w:w="80"/>
+            </w:tcMar>
+            <w:vAlign w:val="center"/>
+          </w:tcPr>
+          <w:p>
+            <w:pPr>
+              <w:jc w:val="left"/>
+            </w:pPr>
+            <w:r>
+              <w:rPr>
+                <w:b w:val="false"/>
+                <w:bCs w:val="false"/>
+                <w:color w:val="3C3C3C"/>
+                <w:sz w:val="16"/>
+                <w:szCs w:val="16"/>
+              </w:rPr>
+              <w:t xml:space="preserve">local[8]</w:t>
+            </w:r>
+          </w:p>
+        </w:tc>
+        <w:tc>
+          <w:tcPr>
+            <w:tcW w:type="dxa" w:w="900"/>
+            <w:tcBorders>
+              <w:top w:val="single" w:color="D5DAE3" w:sz="4"/>
+              <w:left w:val="single" w:color="D5DAE3" w:sz="4"/>
+              <w:bottom w:val="single" w:color="D5DAE3" w:sz="4"/>
+              <w:right w:val="single" w:color="D5DAE3" w:sz="4"/>
+            </w:tcBorders>
+            <w:shd w:fill="FFFFFF" w:color="auto" w:val="clear"/>
+            <w:tcMar>
+              <w:top w:type="dxa" w:w="45"/>
+              <w:left w:type="dxa" w:w="80"/>
+              <w:bottom w:type="dxa" w:w="45"/>
+              <w:right w:type="dxa" w:w="80"/>
+            </w:tcMar>
+            <w:vAlign w:val="center"/>
+          </w:tcPr>
+          <w:p>
+            <w:pPr>
+              <w:jc w:val="center"/>
+            </w:pPr>
+            <w:r>
+              <w:rPr>
+                <w:b w:val="false"/>
+                <w:bCs w:val="false"/>
+                <w:color w:val="3C3C3C"/>
+                <w:sz w:val="16"/>
+                <w:szCs w:val="16"/>
+              </w:rPr>
+              <w:t xml:space="preserve">8</w:t>
+            </w:r>
+          </w:p>
+        </w:tc>
+        <w:tc>
+          <w:tcPr>
+            <w:tcW w:type="dxa" w:w="1838"/>
+            <w:tcBorders>
+              <w:top w:val="single" w:color="D5DAE3" w:sz="4"/>
+              <w:left w:val="single" w:color="D5DAE3" w:sz="4"/>
+              <w:bottom w:val="single" w:color="D5DAE3" w:sz="4"/>
+              <w:right w:val="single" w:color="D5DAE3" w:sz="4"/>
+            </w:tcBorders>
+            <w:shd w:fill="FFFFFF" w:color="auto" w:val="clear"/>
+            <w:tcMar>
+              <w:top w:type="dxa" w:w="45"/>
+              <w:left w:type="dxa" w:w="80"/>
+              <w:bottom w:type="dxa" w:w="45"/>
+              <w:right w:type="dxa" w:w="80"/>
+            </w:tcMar>
+            <w:vAlign w:val="center"/>
+          </w:tcPr>
+          <w:p>
+            <w:pPr>
+              <w:jc w:val="center"/>
+            </w:pPr>
+            <w:r>
+              <w:rPr>
+                <w:b w:val="false"/>
+                <w:bCs w:val="false"/>
+                <w:color w:val="3C3C3C"/>
+                <w:sz w:val="16"/>
+                <w:szCs w:val="16"/>
+              </w:rPr>
+              <w:t xml:space="preserve">8.0</w:t>
+            </w:r>
+          </w:p>
+        </w:tc>
+        <w:tc>
+          <w:tcPr>
+            <w:tcW w:type="dxa" w:w="1300"/>
+            <w:tcBorders>
+              <w:top w:val="single" w:color="D5DAE3" w:sz="4"/>
+              <w:left w:val="single" w:color="D5DAE3" w:sz="4"/>
+              <w:bottom w:val="single" w:color="D5DAE3" w:sz="4"/>
+              <w:right w:val="single" w:color="D5DAE3" w:sz="4"/>
+            </w:tcBorders>
+            <w:shd w:fill="FFFFFF" w:color="auto" w:val="clear"/>
+            <w:tcMar>
+              <w:top w:type="dxa" w:w="45"/>
+              <w:left w:type="dxa" w:w="80"/>
+              <w:bottom w:type="dxa" w:w="45"/>
+              <w:right w:type="dxa" w:w="80"/>
+            </w:tcMar>
+            <w:vAlign w:val="center"/>
+          </w:tcPr>
+          <w:p>
+            <w:pPr>
+              <w:jc w:val="center"/>
+            </w:pPr>
+            <w:r>
+              <w:rPr>
+                <w:b w:val="false"/>
+                <w:bCs w:val="false"/>
+                <w:color w:val="3C3C3C"/>
+                <w:sz w:val="16"/>
+                <w:szCs w:val="16"/>
+              </w:rPr>
+              <w:t xml:space="preserve">3.29×</w:t>
+            </w:r>
+          </w:p>
+        </w:tc>
+        <w:tc>
+          <w:tcPr>
+            <w:tcW w:type="dxa" w:w="1300"/>
+            <w:tcBorders>
+              <w:top w:val="single" w:color="D5DAE3" w:sz="4"/>
+              <w:left w:val="single" w:color="D5DAE3" w:sz="4"/>
+              <w:bottom w:val="single" w:color="D5DAE3" w:sz="4"/>
+              <w:right w:val="single" w:color="D5DAE3" w:sz="4"/>
+            </w:tcBorders>
+            <w:shd w:fill="FFFFFF" w:color="auto" w:val="clear"/>
+            <w:tcMar>
+              <w:top w:type="dxa" w:w="45"/>
+              <w:left w:type="dxa" w:w="80"/>
+              <w:bottom w:type="dxa" w:w="45"/>
+              <w:right w:type="dxa" w:w="80"/>
+            </w:tcMar>
+            <w:vAlign w:val="center"/>
+          </w:tcPr>
+          <w:p>
+            <w:pPr>
+              <w:jc w:val="center"/>
+            </w:pPr>
+            <w:r>
+              <w:rPr>
+                <w:b w:val="false"/>
+                <w:bCs w:val="false"/>
+                <w:color w:val="3C3C3C"/>
+                <w:sz w:val="16"/>
+                <w:szCs w:val="16"/>
+              </w:rPr>
+              <w:t xml:space="preserve">82 %</w:t>
+            </w:r>
+          </w:p>
+        </w:tc>
+      </w:tr>
+      <w:tr>
+        <w:trPr>
+          <w:cantSplit/>
+        </w:trPr>
+        <w:tc>
+          <w:tcPr>
+            <w:tcW w:type="dxa" w:w="1700"/>
+            <w:tcBorders>
+              <w:top w:val="single" w:color="D5DAE3" w:sz="4"/>
+              <w:left w:val="single" w:color="D5DAE3" w:sz="4"/>
+              <w:bottom w:val="single" w:color="D5DAE3" w:sz="4"/>
+              <w:right w:val="single" w:color="D5DAE3" w:sz="4"/>
+            </w:tcBorders>
+            <w:shd w:fill="F4F6FA" w:color="auto" w:val="clear"/>
+            <w:tcMar>
+              <w:top w:type="dxa" w:w="45"/>
+              <w:left w:type="dxa" w:w="80"/>
+              <w:bottom w:type="dxa" w:w="45"/>
+              <w:right w:type="dxa" w:w="80"/>
+            </w:tcMar>
+            <w:vAlign w:val="center"/>
+          </w:tcPr>
+          <w:p>
+            <w:pPr>
+              <w:jc w:val="left"/>
+            </w:pPr>
+            <w:r>
+              <w:rPr>
+                <w:b w:val="false"/>
+                <w:bCs w:val="false"/>
+                <w:color w:val="3C3C3C"/>
+                <w:sz w:val="16"/>
+                <w:szCs w:val="16"/>
+              </w:rPr>
+              <w:t xml:space="preserve">Laptop</w:t>
+            </w:r>
+          </w:p>
+        </w:tc>
+        <w:tc>
+          <w:tcPr>
+            <w:tcW w:type="dxa" w:w="2600"/>
+            <w:tcBorders>
+              <w:top w:val="single" w:color="D5DAE3" w:sz="4"/>
+              <w:left w:val="single" w:color="D5DAE3" w:sz="4"/>
+              <w:bottom w:val="single" w:color="D5DAE3" w:sz="4"/>
+              <w:right w:val="single" w:color="D5DAE3" w:sz="4"/>
+            </w:tcBorders>
+            <w:shd w:fill="F4F6FA" w:color="auto" w:val="clear"/>
+            <w:tcMar>
+              <w:top w:type="dxa" w:w="45"/>
+              <w:left w:type="dxa" w:w="80"/>
+              <w:bottom w:type="dxa" w:w="45"/>
+              <w:right w:type="dxa" w:w="80"/>
+            </w:tcMar>
+            <w:vAlign w:val="center"/>
+          </w:tcPr>
+          <w:p>
+            <w:pPr>
+              <w:jc w:val="left"/>
+            </w:pPr>
+            <w:r>
+              <w:rPr>
+                <w:b w:val="false"/>
+                <w:bCs w:val="false"/>
+                <w:color w:val="3C3C3C"/>
+                <w:sz w:val="16"/>
+                <w:szCs w:val="16"/>
+              </w:rPr>
+              <w:t xml:space="preserve">local[16]</w:t>
+            </w:r>
+          </w:p>
+        </w:tc>
+        <w:tc>
+          <w:tcPr>
+            <w:tcW w:type="dxa" w:w="900"/>
+            <w:tcBorders>
+              <w:top w:val="single" w:color="D5DAE3" w:sz="4"/>
+              <w:left w:val="single" w:color="D5DAE3" w:sz="4"/>
+              <w:bottom w:val="single" w:color="D5DAE3" w:sz="4"/>
+              <w:right w:val="single" w:color="D5DAE3" w:sz="4"/>
+            </w:tcBorders>
+            <w:shd w:fill="F4F6FA" w:color="auto" w:val="clear"/>
+            <w:tcMar>
+              <w:top w:type="dxa" w:w="45"/>
+              <w:left w:type="dxa" w:w="80"/>
+              <w:bottom w:type="dxa" w:w="45"/>
+              <w:right w:type="dxa" w:w="80"/>
+            </w:tcMar>
+            <w:vAlign w:val="center"/>
+          </w:tcPr>
+          <w:p>
+            <w:pPr>
+              <w:jc w:val="center"/>
+            </w:pPr>
+            <w:r>
+              <w:rPr>
+                <w:b w:val="false"/>
+                <w:bCs w:val="false"/>
+                <w:color w:val="3C3C3C"/>
+                <w:sz w:val="16"/>
+                <w:szCs w:val="16"/>
+              </w:rPr>
+              <w:t xml:space="preserve">16</w:t>
+            </w:r>
+          </w:p>
+        </w:tc>
+        <w:tc>
+          <w:tcPr>
+            <w:tcW w:type="dxa" w:w="1838"/>
+            <w:tcBorders>
+              <w:top w:val="single" w:color="D5DAE3" w:sz="4"/>
+              <w:left w:val="single" w:color="D5DAE3" w:sz="4"/>
+              <w:bottom w:val="single" w:color="D5DAE3" w:sz="4"/>
+              <w:right w:val="single" w:color="D5DAE3" w:sz="4"/>
+            </w:tcBorders>
+            <w:shd w:fill="F4F6FA" w:color="auto" w:val="clear"/>
+            <w:tcMar>
+              <w:top w:type="dxa" w:w="45"/>
+              <w:left w:type="dxa" w:w="80"/>
+              <w:bottom w:type="dxa" w:w="45"/>
+              <w:right w:type="dxa" w:w="80"/>
+            </w:tcMar>
+            <w:vAlign w:val="center"/>
+          </w:tcPr>
+          <w:p>
+            <w:pPr>
+              <w:jc w:val="center"/>
+            </w:pPr>
+            <w:r>
+              <w:rPr>
+                <w:b w:val="false"/>
+                <w:bCs w:val="false"/>
+                <w:color w:val="3C3C3C"/>
+                <w:sz w:val="16"/>
+                <w:szCs w:val="16"/>
+              </w:rPr>
+              <w:t xml:space="preserve">5.9</w:t>
+            </w:r>
+          </w:p>
+        </w:tc>
+        <w:tc>
+          <w:tcPr>
+            <w:tcW w:type="dxa" w:w="1300"/>
+            <w:tcBorders>
+              <w:top w:val="single" w:color="D5DAE3" w:sz="4"/>
+              <w:left w:val="single" w:color="D5DAE3" w:sz="4"/>
+              <w:bottom w:val="single" w:color="D5DAE3" w:sz="4"/>
+              <w:right w:val="single" w:color="D5DAE3" w:sz="4"/>
+            </w:tcBorders>
+            <w:shd w:fill="F4F6FA" w:color="auto" w:val="clear"/>
+            <w:tcMar>
+              <w:top w:type="dxa" w:w="45"/>
+              <w:left w:type="dxa" w:w="80"/>
+              <w:bottom w:type="dxa" w:w="45"/>
+              <w:right w:type="dxa" w:w="80"/>
+            </w:tcMar>
+            <w:vAlign w:val="center"/>
+          </w:tcPr>
+          <w:p>
+            <w:pPr>
+              <w:jc w:val="center"/>
+            </w:pPr>
+            <w:r>
+              <w:rPr>
+                <w:b w:val="false"/>
+                <w:bCs w:val="false"/>
+                <w:color w:val="3C3C3C"/>
+                <w:sz w:val="16"/>
+                <w:szCs w:val="16"/>
+              </w:rPr>
+              <w:t xml:space="preserve">4.46×</w:t>
+            </w:r>
+          </w:p>
+        </w:tc>
+        <w:tc>
+          <w:tcPr>
+            <w:tcW w:type="dxa" w:w="1300"/>
+            <w:tcBorders>
+              <w:top w:val="single" w:color="D5DAE3" w:sz="4"/>
+              <w:left w:val="single" w:color="D5DAE3" w:sz="4"/>
+              <w:bottom w:val="single" w:color="D5DAE3" w:sz="4"/>
+              <w:right w:val="single" w:color="D5DAE3" w:sz="4"/>
+            </w:tcBorders>
+            <w:shd w:fill="F4F6FA" w:color="auto" w:val="clear"/>
+            <w:tcMar>
+              <w:top w:type="dxa" w:w="45"/>
+              <w:left w:type="dxa" w:w="80"/>
+              <w:bottom w:type="dxa" w:w="45"/>
+              <w:right w:type="dxa" w:w="80"/>
+            </w:tcMar>
+            <w:vAlign w:val="center"/>
+          </w:tcPr>
+          <w:p>
+            <w:pPr>
+              <w:jc w:val="center"/>
+            </w:pPr>
+            <w:r>
+              <w:rPr>
+                <w:b w:val="false"/>
+                <w:bCs w:val="false"/>
+                <w:color w:val="3C3C3C"/>
+                <w:sz w:val="16"/>
+                <w:szCs w:val="16"/>
+              </w:rPr>
+              <w:t xml:space="preserve">56 %</w:t>
+            </w:r>
+          </w:p>
+        </w:tc>
+      </w:tr>
+      <w:tr>
+        <w:trPr>
+          <w:cantSplit/>
+        </w:trPr>
+        <w:tc>
+          <w:tcPr>
+            <w:tcW w:type="dxa" w:w="1700"/>
+            <w:tcBorders>
+              <w:top w:val="single" w:color="D5DAE3" w:sz="4"/>
+              <w:left w:val="single" w:color="D5DAE3" w:sz="4"/>
+              <w:bottom w:val="single" w:color="D5DAE3" w:sz="4"/>
+              <w:right w:val="single" w:color="D5DAE3" w:sz="4"/>
+            </w:tcBorders>
+            <w:shd w:fill="FFFFFF" w:color="auto" w:val="clear"/>
+            <w:tcMar>
+              <w:top w:type="dxa" w:w="45"/>
+              <w:left w:type="dxa" w:w="80"/>
+              <w:bottom w:type="dxa" w:w="45"/>
+              <w:right w:type="dxa" w:w="80"/>
+            </w:tcMar>
+            <w:vAlign w:val="center"/>
+          </w:tcPr>
+          <w:p>
+            <w:pPr>
+              <w:jc w:val="left"/>
+            </w:pPr>
+            <w:r>
+              <w:rPr>
+                <w:b w:val="false"/>
+                <w:bCs w:val="false"/>
+                <w:color w:val="3C3C3C"/>
+                <w:sz w:val="16"/>
+                <w:szCs w:val="16"/>
+              </w:rPr>
+              <w:t xml:space="preserve">Dataproc cluster</w:t>
+            </w:r>
+          </w:p>
+        </w:tc>
+        <w:tc>
+          <w:tcPr>
+            <w:tcW w:type="dxa" w:w="2600"/>
+            <w:tcBorders>
+              <w:top w:val="single" w:color="D5DAE3" w:sz="4"/>
+              <w:left w:val="single" w:color="D5DAE3" w:sz="4"/>
+              <w:bottom w:val="single" w:color="D5DAE3" w:sz="4"/>
+              <w:right w:val="single" w:color="D5DAE3" w:sz="4"/>
+            </w:tcBorders>
+            <w:shd w:fill="FFFFFF" w:color="auto" w:val="clear"/>
+            <w:tcMar>
+              <w:top w:type="dxa" w:w="45"/>
+              <w:left w:type="dxa" w:w="80"/>
+              <w:bottom w:type="dxa" w:w="45"/>
+              <w:right w:type="dxa" w:w="80"/>
+            </w:tcMar>
+            <w:vAlign w:val="center"/>
+          </w:tcPr>
+          <w:p>
+            <w:pPr>
+              <w:jc w:val="left"/>
+            </w:pPr>
+            <w:r>
+              <w:rPr>
+                <w:b w:val="false"/>
+                <w:bCs w:val="false"/>
+                <w:color w:val="3C3C3C"/>
+                <w:sz w:val="16"/>
+                <w:szCs w:val="16"/>
+              </w:rPr>
+              <w:t xml:space="preserve">2 workers x n2-standard-2</w:t>
+            </w:r>
+          </w:p>
+        </w:tc>
+        <w:tc>
+          <w:tcPr>
+            <w:tcW w:type="dxa" w:w="900"/>
+            <w:tcBorders>
+              <w:top w:val="single" w:color="D5DAE3" w:sz="4"/>
+              <w:left w:val="single" w:color="D5DAE3" w:sz="4"/>
+              <w:bottom w:val="single" w:color="D5DAE3" w:sz="4"/>
+              <w:right w:val="single" w:color="D5DAE3" w:sz="4"/>
+            </w:tcBorders>
+            <w:shd w:fill="FFFFFF" w:color="auto" w:val="clear"/>
+            <w:tcMar>
+              <w:top w:type="dxa" w:w="45"/>
+              <w:left w:type="dxa" w:w="80"/>
+              <w:bottom w:type="dxa" w:w="45"/>
+              <w:right w:type="dxa" w:w="80"/>
+            </w:tcMar>
+            <w:vAlign w:val="center"/>
+          </w:tcPr>
+          <w:p>
+            <w:pPr>
+              <w:jc w:val="center"/>
+            </w:pPr>
+            <w:r>
+              <w:rPr>
+                <w:b w:val="false"/>
+                <w:bCs w:val="false"/>
+                <w:color w:val="3C3C3C"/>
+                <w:sz w:val="16"/>
+                <w:szCs w:val="16"/>
+              </w:rPr>
+              <w:t xml:space="preserve">4</w:t>
+            </w:r>
+          </w:p>
+        </w:tc>
+        <w:tc>
+          <w:tcPr>
+            <w:tcW w:type="dxa" w:w="1838"/>
+            <w:tcBorders>
+              <w:top w:val="single" w:color="D5DAE3" w:sz="4"/>
+              <w:left w:val="single" w:color="D5DAE3" w:sz="4"/>
+              <w:bottom w:val="single" w:color="D5DAE3" w:sz="4"/>
+              <w:right w:val="single" w:color="D5DAE3" w:sz="4"/>
+            </w:tcBorders>
+            <w:shd w:fill="FFFFFF" w:color="auto" w:val="clear"/>
+            <w:tcMar>
+              <w:top w:type="dxa" w:w="45"/>
+              <w:left w:type="dxa" w:w="80"/>
+              <w:bottom w:type="dxa" w:w="45"/>
+              <w:right w:type="dxa" w:w="80"/>
+            </w:tcMar>
+            <w:vAlign w:val="center"/>
+          </w:tcPr>
+          <w:p>
+            <w:pPr>
+              <w:jc w:val="center"/>
+            </w:pPr>
+            <w:r>
+              <w:rPr>
+                <w:b w:val="false"/>
+                <w:bCs w:val="false"/>
+                <w:color w:val="3C3C3C"/>
+                <w:sz w:val="16"/>
+                <w:szCs w:val="16"/>
+              </w:rPr>
+              <w:t xml:space="preserve">74.8 (73.4-76.1)</w:t>
+            </w:r>
+          </w:p>
+        </w:tc>
+        <w:tc>
+          <w:tcPr>
+            <w:tcW w:type="dxa" w:w="1300"/>
+            <w:tcBorders>
+              <w:top w:val="single" w:color="D5DAE3" w:sz="4"/>
+              <w:left w:val="single" w:color="D5DAE3" w:sz="4"/>
+              <w:bottom w:val="single" w:color="D5DAE3" w:sz="4"/>
+              <w:right w:val="single" w:color="D5DAE3" w:sz="4"/>
+            </w:tcBorders>
+            <w:shd w:fill="FFFFFF" w:color="auto" w:val="clear"/>
+            <w:tcMar>
+              <w:top w:type="dxa" w:w="45"/>
+              <w:left w:type="dxa" w:w="80"/>
+              <w:bottom w:type="dxa" w:w="45"/>
+              <w:right w:type="dxa" w:w="80"/>
+            </w:tcMar>
+            <w:vAlign w:val="center"/>
+          </w:tcPr>
+          <w:p>
+            <w:pPr>
+              <w:jc w:val="center"/>
+            </w:pPr>
+            <w:r>
+              <w:rPr>
+                <w:b w:val="false"/>
+                <w:bCs w:val="false"/>
+                <w:color w:val="3C3C3C"/>
+                <w:sz w:val="16"/>
+                <w:szCs w:val="16"/>
+              </w:rPr>
+              <w:t xml:space="preserve">1.00×</w:t>
+            </w:r>
+          </w:p>
+        </w:tc>
+        <w:tc>
+          <w:tcPr>
+            <w:tcW w:type="dxa" w:w="1300"/>
+            <w:tcBorders>
+              <w:top w:val="single" w:color="D5DAE3" w:sz="4"/>
+              <w:left w:val="single" w:color="D5DAE3" w:sz="4"/>
+              <w:bottom w:val="single" w:color="D5DAE3" w:sz="4"/>
+              <w:right w:val="single" w:color="D5DAE3" w:sz="4"/>
+            </w:tcBorders>
+            <w:shd w:fill="FFFFFF" w:color="auto" w:val="clear"/>
+            <w:tcMar>
+              <w:top w:type="dxa" w:w="45"/>
+              <w:left w:type="dxa" w:w="80"/>
+              <w:bottom w:type="dxa" w:w="45"/>
+              <w:right w:type="dxa" w:w="80"/>
+            </w:tcMar>
+            <w:vAlign w:val="center"/>
+          </w:tcPr>
+          <w:p>
+            <w:pPr>
+              <w:jc w:val="center"/>
+            </w:pPr>
+            <w:r>
+              <w:rPr>
+                <w:b w:val="false"/>
+                <w:bCs w:val="false"/>
+                <w:color w:val="3C3C3C"/>
+                <w:sz w:val="16"/>
+                <w:szCs w:val="16"/>
+              </w:rPr>
+              <w:t xml:space="preserve">100 %</w:t>
+            </w:r>
+          </w:p>
+        </w:tc>
+      </w:tr>
+      <w:tr>
+        <w:trPr>
+          <w:cantSplit/>
+        </w:trPr>
+        <w:tc>
+          <w:tcPr>
+            <w:tcW w:type="dxa" w:w="1700"/>
+            <w:tcBorders>
+              <w:top w:val="single" w:color="D5DAE3" w:sz="4"/>
+              <w:left w:val="single" w:color="D5DAE3" w:sz="4"/>
+              <w:bottom w:val="single" w:color="D5DAE3" w:sz="4"/>
+              <w:right w:val="single" w:color="D5DAE3" w:sz="4"/>
+            </w:tcBorders>
+            <w:shd w:fill="F4F6FA" w:color="auto" w:val="clear"/>
+            <w:tcMar>
+              <w:top w:type="dxa" w:w="45"/>
+              <w:left w:type="dxa" w:w="80"/>
+              <w:bottom w:type="dxa" w:w="45"/>
+              <w:right w:type="dxa" w:w="80"/>
+            </w:tcMar>
+            <w:vAlign w:val="center"/>
+          </w:tcPr>
+          <w:p>
+            <w:pPr>
+              <w:jc w:val="left"/>
+            </w:pPr>
+            <w:r>
+              <w:rPr>
+                <w:b w:val="false"/>
+                <w:bCs w:val="false"/>
+                <w:color w:val="3C3C3C"/>
+                <w:sz w:val="16"/>
+                <w:szCs w:val="16"/>
+              </w:rPr>
+              <w:t xml:space="preserve">Dataproc cluster</w:t>
+            </w:r>
+          </w:p>
+        </w:tc>
+        <w:tc>
+          <w:tcPr>
+            <w:tcW w:type="dxa" w:w="2600"/>
+            <w:tcBorders>
+              <w:top w:val="single" w:color="D5DAE3" w:sz="4"/>
+              <w:left w:val="single" w:color="D5DAE3" w:sz="4"/>
+              <w:bottom w:val="single" w:color="D5DAE3" w:sz="4"/>
+              <w:right w:val="single" w:color="D5DAE3" w:sz="4"/>
+            </w:tcBorders>
+            <w:shd w:fill="F4F6FA" w:color="auto" w:val="clear"/>
+            <w:tcMar>
+              <w:top w:type="dxa" w:w="45"/>
+              <w:left w:type="dxa" w:w="80"/>
+              <w:bottom w:type="dxa" w:w="45"/>
+              <w:right w:type="dxa" w:w="80"/>
+            </w:tcMar>
+            <w:vAlign w:val="center"/>
+          </w:tcPr>
+          <w:p>
+            <w:pPr>
+              <w:jc w:val="left"/>
+            </w:pPr>
+            <w:r>
+              <w:rPr>
+                <w:b w:val="false"/>
+                <w:bCs w:val="false"/>
+                <w:color w:val="3C3C3C"/>
+                <w:sz w:val="16"/>
+                <w:szCs w:val="16"/>
+              </w:rPr>
+              <w:t xml:space="preserve">4 workers x n2-standard-2</w:t>
+            </w:r>
+          </w:p>
+        </w:tc>
+        <w:tc>
+          <w:tcPr>
+            <w:tcW w:type="dxa" w:w="900"/>
+            <w:tcBorders>
+              <w:top w:val="single" w:color="D5DAE3" w:sz="4"/>
+              <w:left w:val="single" w:color="D5DAE3" w:sz="4"/>
+              <w:bottom w:val="single" w:color="D5DAE3" w:sz="4"/>
+              <w:right w:val="single" w:color="D5DAE3" w:sz="4"/>
+            </w:tcBorders>
+            <w:shd w:fill="F4F6FA" w:color="auto" w:val="clear"/>
+            <w:tcMar>
+              <w:top w:type="dxa" w:w="45"/>
+              <w:left w:type="dxa" w:w="80"/>
+              <w:bottom w:type="dxa" w:w="45"/>
+              <w:right w:type="dxa" w:w="80"/>
+            </w:tcMar>
+            <w:vAlign w:val="center"/>
+          </w:tcPr>
+          <w:p>
+            <w:pPr>
+              <w:jc w:val="center"/>
+            </w:pPr>
+            <w:r>
+              <w:rPr>
+                <w:b w:val="false"/>
+                <w:bCs w:val="false"/>
+                <w:color w:val="3C3C3C"/>
+                <w:sz w:val="16"/>
+                <w:szCs w:val="16"/>
+              </w:rPr>
+              <w:t xml:space="preserve">8</w:t>
+            </w:r>
+          </w:p>
+        </w:tc>
+        <w:tc>
+          <w:tcPr>
+            <w:tcW w:type="dxa" w:w="1838"/>
+            <w:tcBorders>
+              <w:top w:val="single" w:color="D5DAE3" w:sz="4"/>
+              <w:left w:val="single" w:color="D5DAE3" w:sz="4"/>
+              <w:bottom w:val="single" w:color="D5DAE3" w:sz="4"/>
+              <w:right w:val="single" w:color="D5DAE3" w:sz="4"/>
+            </w:tcBorders>
+            <w:shd w:fill="F4F6FA" w:color="auto" w:val="clear"/>
+            <w:tcMar>
+              <w:top w:type="dxa" w:w="45"/>
+              <w:left w:type="dxa" w:w="80"/>
+              <w:bottom w:type="dxa" w:w="45"/>
+              <w:right w:type="dxa" w:w="80"/>
+            </w:tcMar>
+            <w:vAlign w:val="center"/>
+          </w:tcPr>
+          <w:p>
+            <w:pPr>
+              <w:jc w:val="center"/>
+            </w:pPr>
+            <w:r>
+              <w:rPr>
+                <w:b w:val="false"/>
+                <w:bCs w:val="false"/>
+                <w:color w:val="3C3C3C"/>
+                <w:sz w:val="16"/>
+                <w:szCs w:val="16"/>
+              </w:rPr>
+              <w:t xml:space="preserve">37.3 (33.9-43.7)</w:t>
+            </w:r>
+          </w:p>
+        </w:tc>
+        <w:tc>
+          <w:tcPr>
+            <w:tcW w:type="dxa" w:w="1300"/>
+            <w:tcBorders>
+              <w:top w:val="single" w:color="D5DAE3" w:sz="4"/>
+              <w:left w:val="single" w:color="D5DAE3" w:sz="4"/>
+              <w:bottom w:val="single" w:color="D5DAE3" w:sz="4"/>
+              <w:right w:val="single" w:color="D5DAE3" w:sz="4"/>
+            </w:tcBorders>
+            <w:shd w:fill="F4F6FA" w:color="auto" w:val="clear"/>
+            <w:tcMar>
+              <w:top w:type="dxa" w:w="45"/>
+              <w:left w:type="dxa" w:w="80"/>
+              <w:bottom w:type="dxa" w:w="45"/>
+              <w:right w:type="dxa" w:w="80"/>
+            </w:tcMar>
+            <w:vAlign w:val="center"/>
+          </w:tcPr>
+          <w:p>
+            <w:pPr>
+              <w:jc w:val="center"/>
+            </w:pPr>
+            <w:r>
+              <w:rPr>
+                <w:b w:val="false"/>
+                <w:bCs w:val="false"/>
+                <w:color w:val="3C3C3C"/>
+                <w:sz w:val="16"/>
+                <w:szCs w:val="16"/>
+              </w:rPr>
+              <w:t xml:space="preserve">2.01×</w:t>
+            </w:r>
+          </w:p>
+        </w:tc>
+        <w:tc>
+          <w:tcPr>
+            <w:tcW w:type="dxa" w:w="1300"/>
+            <w:tcBorders>
+              <w:top w:val="single" w:color="D5DAE3" w:sz="4"/>
+              <w:left w:val="single" w:color="D5DAE3" w:sz="4"/>
+              <w:bottom w:val="single" w:color="D5DAE3" w:sz="4"/>
+              <w:right w:val="single" w:color="D5DAE3" w:sz="4"/>
+            </w:tcBorders>
+            <w:shd w:fill="F4F6FA" w:color="auto" w:val="clear"/>
+            <w:tcMar>
+              <w:top w:type="dxa" w:w="45"/>
+              <w:left w:type="dxa" w:w="80"/>
+              <w:bottom w:type="dxa" w:w="45"/>
+              <w:right w:type="dxa" w:w="80"/>
+            </w:tcMar>
+            <w:vAlign w:val="center"/>
+          </w:tcPr>
+          <w:p>
+            <w:pPr>
+              <w:jc w:val="center"/>
+            </w:pPr>
+            <w:r>
+              <w:rPr>
+                <w:b w:val="false"/>
+                <w:bCs w:val="false"/>
+                <w:color w:val="3C3C3C"/>
+                <w:sz w:val="16"/>
+                <w:szCs w:val="16"/>
+              </w:rPr>
+              <w:t xml:space="preserve">100 %</w:t>
+            </w:r>
+          </w:p>
+        </w:tc>
+      </w:tr>
+    </w:tbl>
+    <w:p>
+      <w:pPr>
+        <w:spacing w:after="200" w:before="60"/>
+        <w:jc w:val="center"/>
+      </w:pPr>
+      <w:r>
+        <w:rPr>
+          <w:i/>
+          <w:iCs/>
+          <w:color w:val="7A8094"/>
+          <w:sz w:val="16"/>
+          <w:szCs w:val="16"/>
+        </w:rPr>
+        <w:t xml:space="preserve">Table 16. The cleaning job on the laptop and on the Dataproc cluster (cluster: mean of three timed runs, range in brackets; t44_local_vs_cloud.csv).</w:t>
+      </w:r>
+    </w:p>
+    <w:p>
+      <w:pPr>
+        <w:keepNext/>
+        <w:spacing w:after="40" w:before="120"/>
+        <w:jc w:val="center"/>
+      </w:pPr>
+      <w:r>
+        <w:drawing>
+          <wp:inline distT="0" distB="0" distL="0" distR="0">
+            <wp:extent cx="5505450" cy="2657475"/>
+            <wp:effectExtent t="0" r="0" b="0" l="0"/>
+            <wp:docPr id="8" name="fig24_local_vs_cloud.png" descr="Wall time (a) and speed-up when resources double (b): laptop cores against Dataproc workers for the same job." title="Fig 7"/>
+            <wp:cNvGraphicFramePr>
+              <a:graphicFrameLocks xmlns:a="http://schemas.openxmlformats.org/drawingml/2006/main" noChangeAspect="1"/>
+            </wp:cNvGraphicFramePr>
+            <a:graphic xmlns:a="http://schemas.openxmlformats.org/drawingml/2006/main">
+              <a:graphicData uri="http://schemas.openxmlformats.org/drawingml/2006/picture">
+                <pic:pic xmlns:pic="http://schemas.openxmlformats.org/drawingml/2006/picture">
+                  <pic:nvPicPr>
+                    <pic:cNvPr id="0" name="" descr=""/>
+                    <pic:cNvPicPr>
+                      <a:picLocks noChangeAspect="1" noChangeArrowheads="1"/>
+                    </pic:cNvPicPr>
+                  </pic:nvPicPr>
+                  <pic:blipFill>
+                    <a:blip r:embed="rId18" cstate="none"/>
+                    <a:srcRect/>
+                    <a:stretch>
+                      <a:fillRect/>
+                    </a:stretch>
+                  </pic:blipFill>
+                  <pic:spPr bwMode="auto">
+                    <a:xfrm>
+                      <a:off x="0" y="0"/>
+                      <a:ext cx="5505450" cy="2657475"/>
+                    </a:xfrm>
+                    <a:prstGeom prst="rect">
+                      <a:avLst/>
+                    </a:prstGeom>
+                  </pic:spPr>
+                </pic:pic>
+              </a:graphicData>
+            </a:graphic>
+          </wp:inline>
+        </w:drawing>
+      </w:r>
+    </w:p>
+    <w:p>
+      <w:pPr>
+        <w:spacing w:after="200"/>
+        <w:jc w:val="center"/>
+      </w:pPr>
+      <w:r>
+        <w:rPr>
+          <w:i/>
+          <w:iCs/>
+          <w:color w:val="7A8094"/>
+          <w:sz w:val="16"/>
+          <w:szCs w:val="16"/>
+        </w:rPr>
+        <w:t xml:space="preserve">Fig 7 – Wall time (a) and speed-up when resources double (b): laptop cores against Dataproc workers for the same job.</w:t>
+      </w:r>
+    </w:p>
+    <w:tbl>
+      <w:tblPr>
+        <w:tblW w:type="dxa" w:w="9638"/>
+        <w:tblBorders>
+          <w:top w:val="single" w:color="auto" w:sz="4"/>
+          <w:left w:val="single" w:color="auto" w:sz="4"/>
+          <w:bottom w:val="single" w:color="auto" w:sz="4"/>
+          <w:right w:val="single" w:color="auto" w:sz="4"/>
+          <w:insideH w:val="single" w:color="auto" w:sz="4"/>
+          <w:insideV w:val="single" w:color="auto" w:sz="4"/>
+        </w:tblBorders>
+      </w:tblPr>
+      <w:tblGrid>
+        <w:gridCol w:w="9638"/>
+      </w:tblGrid>
+      <w:tr>
+        <w:tc>
+          <w:tcPr>
+            <w:tcW w:type="dxa" w:w="9638"/>
+            <w:tcBorders>
+              <w:top w:val="single" w:color="D5DAE3" w:sz="4"/>
+              <w:left w:val="single" w:color="1D7874" w:sz="24"/>
+              <w:bottom w:val="single" w:color="D5DAE3" w:sz="4"/>
+              <w:right w:val="single" w:color="D5DAE3" w:sz="4"/>
+            </w:tcBorders>
+            <w:shd w:fill="E8F3F2" w:color="auto" w:val="clear"/>
+            <w:tcMar>
+              <w:top w:type="dxa" w:w="90"/>
+              <w:left w:type="dxa" w:w="160"/>
+              <w:bottom w:type="dxa" w:w="90"/>
+              <w:right w:type="dxa" w:w="160"/>
+            </w:tcMar>
+          </w:tcPr>
+          <w:p>
+            <w:pPr>
+              <w:spacing w:after="60" w:line="264"/>
+            </w:pPr>
+            <w:r>
+              <w:rPr>
+                <w:b/>
+                <w:bCs/>
+                <w:sz w:val="19"/>
+                <w:szCs w:val="19"/>
+              </w:rPr>
+              <w:t xml:space="preserve">What this shows.</w:t>
+            </w:r>
+            <w:r>
+              <w:rPr>
+                <w:sz w:val="19"/>
+                <w:szCs w:val="19"/>
+              </w:rPr>
+              <w:t xml:space="preserve"> The laptop is about 5× faster than the cluster at the same core count: it has fast cores, 128 GB of memory and a local SSD, while each n2-standard-2 worker has 2 vCPUs, reads its input from Cloud Storage over the network (each request took 0.3–0.5 s in the job logs) and spills shuffles to standard disks. But adding cores to one machine shares one memory bus and one disk, so its efficiency falls (82 % at 8 cores, 56 % at 16), while adding workers adds CPU, memory and disk together, so the cluster scaled almost perfectly from 2 to 4 workers.</w:t>
+            </w:r>
+          </w:p>
+          <w:p>
+            <w:pPr>
+              <w:spacing w:after="60" w:line="264"/>
+            </w:pPr>
+            <w:r>
+              <w:rPr>
+                <w:b/>
+                <w:bCs/>
+                <w:sz w:val="19"/>
+                <w:szCs w:val="19"/>
+              </w:rPr>
+              <w:t xml:space="preserve">Takeaway:</w:t>
+            </w:r>
+            <w:r>
+              <w:rPr>
+                <w:sz w:val="19"/>
+                <w:szCs w:val="19"/>
+              </w:rPr>
+              <w:t xml:space="preserve"> at 7.5 GB a single strong machine is the fastest and cheapest option; a cluster pays off once the data or the model no longer fits on one machine, and its near-linear scaling is what lets it grow. The education project's 12-vCPU quota limited the experiment to 4 workers.</w:t>
+            </w:r>
+          </w:p>
+        </w:tc>
+      </w:tr>
+    </w:tbl>
+    <w:p>
+      <w:pPr>
+        <w:spacing w:after="160"/>
+      </w:pPr>
+    </w:p>
+    <w:p>
+      <w:pPr>
+        <w:pStyle w:val="Heading2"/>
+      </w:pPr>
+      <w:r>
+        <w:t xml:space="preserve">8.6 Verification</w:t>
       </w:r>
     </w:p>
     <w:p>
@@ -18938,7 +20694,7 @@
                 <w:sz w:val="16"/>
                 <w:szCs w:val="16"/>
               </w:rPr>
-              <w:t xml:space="preserve">0.200</w:t>
+              <w:t xml:space="preserve">0.191</w:t>
             </w:r>
           </w:p>
         </w:tc>
@@ -19079,7 +20835,7 @@
                 <w:sz w:val="16"/>
                 <w:szCs w:val="16"/>
               </w:rPr>
-              <w:t xml:space="preserve">0.158</w:t>
+              <w:t xml:space="preserve">0.166</w:t>
             </w:r>
           </w:p>
         </w:tc>
@@ -19220,7 +20976,7 @@
                 <w:sz w:val="16"/>
                 <w:szCs w:val="16"/>
               </w:rPr>
-              <w:t xml:space="preserve">0.143</w:t>
+              <w:t xml:space="preserve">0.149</w:t>
             </w:r>
           </w:p>
         </w:tc>
@@ -19293,7 +21049,7 @@
                 <w:sz w:val="16"/>
                 <w:szCs w:val="16"/>
               </w:rPr>
-              <w:t xml:space="preserve">min_since_rain</w:t>
+              <w:t xml:space="preserve">r15</w:t>
             </w:r>
           </w:p>
         </w:tc>
@@ -19361,7 +21117,7 @@
                 <w:sz w:val="16"/>
                 <w:szCs w:val="16"/>
               </w:rPr>
-              <w:t xml:space="preserve">0.068</w:t>
+              <w:t xml:space="preserve">0.073</w:t>
             </w:r>
           </w:p>
         </w:tc>
@@ -19395,7 +21151,7 @@
                 <w:sz w:val="16"/>
                 <w:szCs w:val="16"/>
               </w:rPr>
-              <w:t xml:space="preserve">Minutes since the gauge last saw rain (capped at 24 h). A long dry spell makes rain in the next 30 minutes unlikely.</w:t>
+              <w:t xml:space="preserve">Rain in the last 15 minutes: is it a passing shower or a storm?</w:t>
             </w:r>
           </w:p>
         </w:tc>
@@ -19502,7 +21258,7 @@
                 <w:sz w:val="16"/>
                 <w:szCs w:val="16"/>
               </w:rPr>
-              <w:t xml:space="preserve">0.066</w:t>
+              <w:t xml:space="preserve">0.069</w:t>
             </w:r>
           </w:p>
         </w:tc>
@@ -19575,7 +21331,7 @@
                 <w:sz w:val="16"/>
                 <w:szCs w:val="16"/>
               </w:rPr>
-              <w:t xml:space="preserve">r15</w:t>
+              <w:t xml:space="preserve">min_since_rain</w:t>
             </w:r>
           </w:p>
         </w:tc>
@@ -19643,7 +21399,7 @@
                 <w:sz w:val="16"/>
                 <w:szCs w:val="16"/>
               </w:rPr>
-              <w:t xml:space="preserve">0.066</w:t>
+              <w:t xml:space="preserve">0.055</w:t>
             </w:r>
           </w:p>
         </w:tc>
@@ -19677,7 +21433,7 @@
                 <w:sz w:val="16"/>
                 <w:szCs w:val="16"/>
               </w:rPr>
-              <w:t xml:space="preserve">Rain in the last 15 minutes: is it a passing shower or a storm?</w:t>
+              <w:t xml:space="preserve">Minutes since the gauge last saw rain (capped at 24 h). A long dry spell makes rain in the next 30 minutes unlikely.</w:t>
             </w:r>
           </w:p>
         </w:tc>
@@ -19784,7 +21540,7 @@
                 <w:sz w:val="16"/>
                 <w:szCs w:val="16"/>
               </w:rPr>
-              <w:t xml:space="preserve">0.044</w:t>
+              <w:t xml:space="preserve">0.041</w:t>
             </w:r>
           </w:p>
         </w:tc>
@@ -19925,7 +21681,7 @@
                 <w:sz w:val="16"/>
                 <w:szCs w:val="16"/>
               </w:rPr>
-              <w:t xml:space="preserve">0.037</w:t>
+              <w:t xml:space="preserve">0.036</w:t>
             </w:r>
           </w:p>
         </w:tc>
@@ -20066,7 +21822,7 @@
                 <w:sz w:val="16"/>
                 <w:szCs w:val="16"/>
               </w:rPr>
-              <w:t xml:space="preserve">0.035</w:t>
+              <w:t xml:space="preserve">0.034</w:t>
             </w:r>
           </w:p>
         </w:tc>
@@ -20207,7 +21963,7 @@
                 <w:sz w:val="16"/>
                 <w:szCs w:val="16"/>
               </w:rPr>
-              <w:t xml:space="preserve">0.034</w:t>
+              <w:t xml:space="preserve">0.032</w:t>
             </w:r>
           </w:p>
         </w:tc>
@@ -20260,7 +22016,7 @@
           <w:sz w:val="16"/>
           <w:szCs w:val="16"/>
         </w:rPr>
-        <w:t xml:space="preserve">Table 16. Most important features of the final model (mean decrease in impurity) with a plain-English reading.</w:t>
+        <w:t xml:space="preserve">Table 17. Most important features of the final model (mean decrease in impurity) with a plain-English reading.</w:t>
       </w:r>
     </w:p>
     <w:p>
@@ -20279,7 +22035,7 @@
         <w:t xml:space="preserve">recent-rain</w:t>
       </w:r>
       <w:r>
-        <w:t xml:space="preserve"> features raises the log loss by +7.9 %, removing the </w:t>
+        <w:t xml:space="preserve"> features raises the log loss by +8.0 %, removing the </w:t>
       </w:r>
       <w:r>
         <w:rPr>
@@ -20299,7 +22055,7 @@
         <w:t xml:space="preserve">island-wide</w:t>
       </w:r>
       <w:r>
-        <w:t xml:space="preserve"> signal by +1.0 %, whereas removing time costs +0.3 % and removing latitude/longitude nothing (the station index already carries location). Model A, with no rain observation at all, is +87.0 % worse.</w:t>
+        <w:t xml:space="preserve"> signal by +0.8 %, whereas removing time costs +0.3 % and removing latitude/longitude nothing (the station index already carries location). Model A, with no rain observation at all, is +86.6 % worse.</w:t>
       </w:r>
     </w:p>
     <w:p>
@@ -20367,7 +22123,7 @@
         <w:t xml:space="preserve">Heavy thresholds are hardest:</w:t>
       </w:r>
       <w:r>
-        <w:t xml:space="preserve"> at 20 mm (0.1 % of half-hours) PR-AUC is 0.182; ROC-AUC stays high, so the model still ranks the risky half-hours well, but it cannot say *how* heavy a storm will be.</w:t>
+        <w:t xml:space="preserve"> at 20 mm (0.1 % of half-hours) PR-AUC is 0.186; ROC-AUC stays high, so the model still ranks the risky half-hours well, but it cannot say *how* heavy a storm will be.</w:t>
       </w:r>
     </w:p>
     <w:p>
@@ -20921,7 +22677,7 @@
                 <w:sz w:val="16"/>
                 <w:szCs w:val="16"/>
               </w:rPr>
-              <w:t xml:space="preserve">Local mode</w:t>
+              <w:t xml:space="preserve">Cluster size</w:t>
             </w:r>
           </w:p>
         </w:tc>
@@ -20955,7 +22711,7 @@
                 <w:sz w:val="16"/>
                 <w:szCs w:val="16"/>
               </w:rPr>
-              <w:t xml:space="preserve">Spark ran on one machine; the code is cluster-ready but was not benchmarked on a multi-node cluster.</w:t>
+              <w:t xml:space="preserve">The cloud experiment was limited to 4 small workers by the 12-vCPU quota and covers the ingestion and cleaning job only; the model training ran on the laptop.</w:t>
             </w:r>
           </w:p>
         </w:tc>
@@ -21047,7 +22803,7 @@
           <w:sz w:val="16"/>
           <w:szCs w:val="16"/>
         </w:rPr>
-        <w:t xml:space="preserve">Table 17. Data and model limitations.</w:t>
+        <w:t xml:space="preserve">Table 18. Data and model limitations.</w:t>
       </w:r>
     </w:p>
     <w:p>
@@ -21063,7 +22819,7 @@
         <w:t xml:space="preserve">Future work:</w:t>
       </w:r>
       <w:r>
-        <w:t xml:space="preserve"> add radar or satellite inputs; tune beyond the grid edges; evaluate on a Dataproc cluster to measure multi-node scaling; and recalibrate the model each season as the gauge network changes.</w:t>
+        <w:t xml:space="preserve"> add radar or satellite inputs; tune beyond the grid edges; run the model training on a larger Dataproc cluster with local SSDs; and recalibrate the model each season as the gauge network changes.</w:t>
       </w:r>
     </w:p>
     <w:p>
@@ -21080,7 +22836,7 @@
         <w:jc w:val="both"/>
       </w:pPr>
       <w:r>
-        <w:t xml:space="preserve">Starting from 7.5 GB of raw five-minute readings, a disciplined Spark pipeline — explicit schema, Parquet layers, neighbour-based gauge-fault detection and completeness rules — produced a clean, trustworthy record of Singapore's rainfall. Task 1 showed two wet seasons, two daily rhythms, a 2× west–east gradient and dry years caused by fewer events. Task 2 turned those findings into features and delivered a single Spark MLlib model for any station, time and threshold: a random forest chosen by year-blocked cross-validation that reaches a PR-AUC of 0.465 at 5 mm on the untouched 2024 year, beats the interpretable logistic baseline at every threshold on identical rows, and gives probabilities one can act on.</w:t>
+        <w:t xml:space="preserve">Starting from 7.5 GB of raw five-minute readings, a disciplined Spark pipeline — explicit schema, Parquet layers, neighbour-based gauge-fault detection and completeness rules — produced a clean, trustworthy record of Singapore's rainfall. Task 1 showed two wet seasons, two daily rhythms, a 2× west–east gradient and dry years caused by fewer events. Task 2 turned those findings into features and delivered a single Spark MLlib model for any station, time and threshold: a random forest chosen by year-blocked cross-validation that reaches a PR-AUC of 0.466 at 5 mm on the untouched 2024 year, beats the interpretable logistic baseline at every threshold on identical rows, and gives probabilities one can act on.</w:t>
       </w:r>
     </w:p>
     <w:p>
@@ -21128,7 +22884,7 @@
           <w:sz w:val="18"/>
           <w:szCs w:val="18"/>
         </w:rPr>
-        <w:t xml:space="preserve"> – Generative AI (Claude, Anthropic) was used as a coding assistant for the PySpark pipeline, figures and debugging; to discuss design choices (the threshold-as-input formulation, label-independent sampling, leakage checks, evaluation metrics); to review and consolidate the group's two pipelines into one notebook; and to draft the README and this report from the pipeline's outputs. All numbers in this report are produced by the submitted notebook. The authors reviewed the code, the results and the text, and take responsibility for the submission.</w:t>
+        <w:t xml:space="preserve"> – Generative AI (Claude, Anthropic) was used as a coding assistant for the PySpark pipeline, the Dataproc benchmark, figures and debugging; to discuss design choices (the threshold-as-input formulation, label-independent sampling, leakage checks, evaluation metrics); to review and consolidate the group's two pipelines into one notebook; and to draft the README and this report from the pipeline's outputs. All numbers in this report are produced by the submitted notebook. The authors reviewed the code, the results and the text, and take responsibility for the submission.</w:t>
       </w:r>
     </w:p>
     <w:p>
@@ -21174,7 +22930,7 @@
           <w:sz w:val="16"/>
           <w:szCs w:val="16"/>
         </w:rPr>
-        <w:t xml:space="preserve"> Source code: DSA5208_Project2.ipynb (one notebook, run top to bottom, every output kept) with README.md and environment.yml. Trained model: models/task2_final_rf/ (Spark PipelineModel + calibrator + feature_spec.json); Stage 1 baseline in models/task2_baseline_lr/. Figures and tables: outputs/.</w:t>
+        <w:t xml:space="preserve"> Source code: DSA5208_Project2.ipynb (one notebook, run top to bottom, every output kept) with README.md and environment.yml. Trained model: models/task2_final_rf/ (Spark PipelineModel + calibrator + feature_spec.json); Stage 1 baseline in models/task2_baseline_lr/. Cloud benchmark: cloud/ (job script and gcloud commands). Figures and tables: outputs/.</w:t>
       </w:r>
     </w:p>
     <w:sectPr>

</xml_diff>

<commit_message>
Complete notebook executed on Google Cloud Dataproc; report section 8.6 and README
- cloud/full_run/: the notebook executed on a Dataproc 2.2 cluster (master + 2 workers n2-highmem-4,
  Spark 3.5.3 on YARN, HDFS), with its outputs, logs, HDFS sizes and the YARN application record.
  It ran without errors in 290 min and reproduced the laptop results (deterministic tables identical,
  same cross-validation choices, tree metrics within the third decimal).
- Report: Section 8.6 (stage times laptop vs cluster, agreement table), cluster configurations in the
  environment table, abstract and limitations updated; PDF regenerated (14 pages).
- README: complete cloud run, how to repeat it, results.
- master_run.sh: copy the Spark models from HDFS with a quoted glob (they were not retrieved in this run).

Co-Authored-By: Claude Opus 5.5 <noreply@anthropic.com>
</commit_message>
<xml_diff>
--- a/DSA5208_Project2_Report.docx
+++ b/DSA5208_Project2_Report.docx
@@ -270,7 +270,7 @@
                 <w:sz w:val="19"/>
                 <w:szCs w:val="19"/>
               </w:rPr>
-              <w:t xml:space="preserve">, beats the logistic baseline at every threshold on identical rows, and gives calibrated probabilities. The core Spark job was also run on a Google Cloud Dataproc cluster, where doubling the workers halved its run time.</w:t>
+              <w:t xml:space="preserve">, beats the logistic baseline at every threshold on identical rows, and gives calibrated probabilities. The complete notebook was also executed on a Google Cloud Dataproc cluster with identical conclusions, and doubling the cluster's workers halved the run time of the core Spark job.</w:t>
             </w:r>
           </w:p>
         </w:tc>
@@ -2558,7 +2558,7 @@
         <w:jc w:val="both"/>
       </w:pPr>
       <w:r>
-        <w:t xml:space="preserve">The full pipeline runs with Apache Spark in local mode on one laptop. The core Spark job (ingestion and the cleaning stage) was also run on a </w:t>
+        <w:t xml:space="preserve">The submitted run uses Apache Spark in local mode on one laptop. On </w:t>
       </w:r>
       <w:r>
         <w:rPr>
@@ -2568,7 +2568,7 @@
         <w:t xml:space="preserve">Google Cloud Dataproc</w:t>
       </w:r>
       <w:r>
-        <w:t xml:space="preserve"> cluster to measure horizontal scaling (Section 8.5); it is submitted as a PySpark job with no change to the Spark code except the input and output paths.</w:t>
+        <w:t xml:space="preserve">, the core Spark job was timed on 2 and 4 workers to measure horizontal scaling (Section 8.5), and the complete notebook was executed on a 2-worker cluster with Spark on YARN and the data on HDFS (Section 8.6).</w:t>
       </w:r>
     </w:p>
     <w:tbl>
@@ -3059,7 +3059,7 @@
                 <w:sz w:val="16"/>
                 <w:szCs w:val="16"/>
               </w:rPr>
-              <w:t xml:space="preserve">Cloud cluster</w:t>
+              <w:t xml:space="preserve">Cloud: scaling runs</w:t>
             </w:r>
           </w:p>
         </w:tc>
@@ -3093,7 +3093,80 @@
                 <w:sz w:val="16"/>
                 <w:szCs w:val="16"/>
               </w:rPr>
-              <w:t xml:space="preserve">Google Cloud Dataproc 2.2 (Debian 12, Spark 3.5), region asia-southeast1 (Singapore); master and workers n2-standard-2 (2 vCPU, 8 GB), 50 GB standard disks; 2 and then 4 workers (the education project's quota is 12 vCPUs); data in a Cloud Storage bucket; jobs submitted with gcloud dataproc jobs submit pyspark (cloud/dataproc_benchmark.py)</w:t>
+              <w:t xml:space="preserve">Google Cloud Dataproc 2.2 (Debian 12, Spark 3.5), region asia-southeast1 (Singapore); master and workers n2-standard-2 (2 vCPU, 8 GB), 50 GB standard disks; 2 and then 4 workers; data in a Cloud Storage bucket; gcloud dataproc jobs submit pyspark (cloud/dataproc_benchmark.py)</w:t>
+            </w:r>
+          </w:p>
+        </w:tc>
+      </w:tr>
+      <w:tr>
+        <w:trPr>
+          <w:cantSplit/>
+        </w:trPr>
+        <w:tc>
+          <w:tcPr>
+            <w:tcW w:type="dxa" w:w="2000"/>
+            <w:tcBorders>
+              <w:top w:val="single" w:color="D5DAE3" w:sz="4"/>
+              <w:left w:val="single" w:color="D5DAE3" w:sz="4"/>
+              <w:bottom w:val="single" w:color="D5DAE3" w:sz="4"/>
+              <w:right w:val="single" w:color="D5DAE3" w:sz="4"/>
+            </w:tcBorders>
+            <w:shd w:fill="FFFFFF" w:color="auto" w:val="clear"/>
+            <w:tcMar>
+              <w:top w:type="dxa" w:w="45"/>
+              <w:left w:type="dxa" w:w="80"/>
+              <w:bottom w:type="dxa" w:w="45"/>
+              <w:right w:type="dxa" w:w="80"/>
+            </w:tcMar>
+            <w:vAlign w:val="center"/>
+          </w:tcPr>
+          <w:p>
+            <w:pPr>
+              <w:jc w:val="left"/>
+            </w:pPr>
+            <w:r>
+              <w:rPr>
+                <w:b w:val="false"/>
+                <w:bCs w:val="false"/>
+                <w:color w:val="3C3C3C"/>
+                <w:sz w:val="16"/>
+                <w:szCs w:val="16"/>
+              </w:rPr>
+              <w:t xml:space="preserve">Cloud: complete run</w:t>
+            </w:r>
+          </w:p>
+        </w:tc>
+        <w:tc>
+          <w:tcPr>
+            <w:tcW w:type="dxa" w:w="7638"/>
+            <w:tcBorders>
+              <w:top w:val="single" w:color="D5DAE3" w:sz="4"/>
+              <w:left w:val="single" w:color="D5DAE3" w:sz="4"/>
+              <w:bottom w:val="single" w:color="D5DAE3" w:sz="4"/>
+              <w:right w:val="single" w:color="D5DAE3" w:sz="4"/>
+            </w:tcBorders>
+            <w:shd w:fill="FFFFFF" w:color="auto" w:val="clear"/>
+            <w:tcMar>
+              <w:top w:type="dxa" w:w="45"/>
+              <w:left w:type="dxa" w:w="80"/>
+              <w:bottom w:type="dxa" w:w="45"/>
+              <w:right w:type="dxa" w:w="80"/>
+            </w:tcMar>
+            <w:vAlign w:val="center"/>
+          </w:tcPr>
+          <w:p>
+            <w:pPr>
+              <w:jc w:val="left"/>
+            </w:pPr>
+            <w:r>
+              <w:rPr>
+                <w:b w:val="false"/>
+                <w:bCs w:val="false"/>
+                <w:color w:val="3C3C3C"/>
+                <w:sz w:val="16"/>
+                <w:szCs w:val="16"/>
+              </w:rPr>
+              <w:t xml:space="preserve">Dataproc 2.2, master + 2 workers n2-highmem-4 (4 vCPU, 32 GB, Intel Xeon 2.8 GHz), 100/75/75 GB balanced persistent disks (the education project's quotas: 12 vCPUs, 250 GB SSD); Spark 3.5.3 on YARN, data layers on HDFS, driver 16 GB; Cloud NAT for package installation</w:t>
             </w:r>
           </w:p>
         </w:tc>
@@ -20354,7 +20427,2130 @@
         <w:pStyle w:val="Heading2"/>
       </w:pPr>
       <w:r>
-        <w:t xml:space="preserve">8.6 Verification</w:t>
+        <w:t xml:space="preserve">8.6 The complete pipeline on the Dataproc cluster</w:t>
+      </w:r>
+    </w:p>
+    <w:p>
+      <w:pPr>
+        <w:spacing w:after="120" w:line="276"/>
+        <w:jc w:val="both"/>
+      </w:pPr>
+      <w:r>
+        <w:t xml:space="preserve">Finally the </w:t>
+      </w:r>
+      <w:r>
+        <w:rPr>
+          <w:b/>
+          <w:bCs/>
+        </w:rPr>
+        <w:t xml:space="preserve">whole notebook</w:t>
+      </w:r>
+      <w:r>
+        <w:t xml:space="preserve"> — cleaning, Task 1, both stages of Task 2 with the full cross-validation, the 2024 evaluation and predict() — was executed on a Dataproc cluster: a master and 2 workers n2-highmem-4 (4 vCPU, 32 GB; the 12-vCPU quota), Spark 3.5.3 on YARN, the data layers on HDFS. The code is the submitted notebook with only the Spark master, the storage and the laptop core benchmark changed (cloud/make_dataproc_notebook.py); the executed copy is in cloud/full_run/. It ran without errors in 290 minutes of timed work against 74 on the laptop, 3.9× slower, for the same reasons as in Section 8.5: 8 executor cores on 2.8 GHz Xeons whose shuffles cross the network, against 14 fast cores that share one memory.</w:t>
+      </w:r>
+    </w:p>
+    <w:tbl>
+      <w:tblPr>
+        <w:tblW w:type="dxa" w:w="9638"/>
+        <w:tblBorders>
+          <w:top w:val="single" w:color="auto" w:sz="4"/>
+          <w:left w:val="single" w:color="auto" w:sz="4"/>
+          <w:bottom w:val="single" w:color="auto" w:sz="4"/>
+          <w:right w:val="single" w:color="auto" w:sz="4"/>
+          <w:insideH w:val="single" w:color="auto" w:sz="4"/>
+          <w:insideV w:val="single" w:color="auto" w:sz="4"/>
+        </w:tblBorders>
+      </w:tblPr>
+      <w:tblGrid>
+        <w:gridCol w:w="5638"/>
+        <w:gridCol w:w="1300"/>
+        <w:gridCol w:w="1400"/>
+        <w:gridCol w:w="1300"/>
+      </w:tblGrid>
+      <w:tr>
+        <w:trPr>
+          <w:tblHeader/>
+        </w:trPr>
+        <w:tc>
+          <w:tcPr>
+            <w:tcW w:type="dxa" w:w="5638"/>
+            <w:tcBorders>
+              <w:top w:val="single" w:color="D5DAE3" w:sz="4"/>
+              <w:left w:val="single" w:color="D5DAE3" w:sz="4"/>
+              <w:bottom w:val="single" w:color="D5DAE3" w:sz="4"/>
+              <w:right w:val="single" w:color="D5DAE3" w:sz="4"/>
+            </w:tcBorders>
+            <w:shd w:fill="1B2A4A" w:color="auto" w:val="clear"/>
+            <w:tcMar>
+              <w:top w:type="dxa" w:w="45"/>
+              <w:left w:type="dxa" w:w="80"/>
+              <w:bottom w:type="dxa" w:w="45"/>
+              <w:right w:type="dxa" w:w="80"/>
+            </w:tcMar>
+            <w:vAlign w:val="center"/>
+          </w:tcPr>
+          <w:p>
+            <w:pPr>
+              <w:jc w:val="left"/>
+            </w:pPr>
+            <w:r>
+              <w:rPr>
+                <w:b/>
+                <w:bCs/>
+                <w:color w:val="FFFFFF"/>
+                <w:sz w:val="16"/>
+                <w:szCs w:val="16"/>
+              </w:rPr>
+              <w:t xml:space="preserve">Stage</w:t>
+            </w:r>
+          </w:p>
+        </w:tc>
+        <w:tc>
+          <w:tcPr>
+            <w:tcW w:type="dxa" w:w="1300"/>
+            <w:tcBorders>
+              <w:top w:val="single" w:color="D5DAE3" w:sz="4"/>
+              <w:left w:val="single" w:color="D5DAE3" w:sz="4"/>
+              <w:bottom w:val="single" w:color="D5DAE3" w:sz="4"/>
+              <w:right w:val="single" w:color="D5DAE3" w:sz="4"/>
+            </w:tcBorders>
+            <w:shd w:fill="1B2A4A" w:color="auto" w:val="clear"/>
+            <w:tcMar>
+              <w:top w:type="dxa" w:w="45"/>
+              <w:left w:type="dxa" w:w="80"/>
+              <w:bottom w:type="dxa" w:w="45"/>
+              <w:right w:type="dxa" w:w="80"/>
+            </w:tcMar>
+            <w:vAlign w:val="center"/>
+          </w:tcPr>
+          <w:p>
+            <w:pPr>
+              <w:jc w:val="center"/>
+            </w:pPr>
+            <w:r>
+              <w:rPr>
+                <w:b/>
+                <w:bCs/>
+                <w:color w:val="FFFFFF"/>
+                <w:sz w:val="16"/>
+                <w:szCs w:val="16"/>
+              </w:rPr>
+              <w:t xml:space="preserve">Laptop (min)</w:t>
+            </w:r>
+          </w:p>
+        </w:tc>
+        <w:tc>
+          <w:tcPr>
+            <w:tcW w:type="dxa" w:w="1400"/>
+            <w:tcBorders>
+              <w:top w:val="single" w:color="D5DAE3" w:sz="4"/>
+              <w:left w:val="single" w:color="D5DAE3" w:sz="4"/>
+              <w:bottom w:val="single" w:color="D5DAE3" w:sz="4"/>
+              <w:right w:val="single" w:color="D5DAE3" w:sz="4"/>
+            </w:tcBorders>
+            <w:shd w:fill="1B2A4A" w:color="auto" w:val="clear"/>
+            <w:tcMar>
+              <w:top w:type="dxa" w:w="45"/>
+              <w:left w:type="dxa" w:w="80"/>
+              <w:bottom w:type="dxa" w:w="45"/>
+              <w:right w:type="dxa" w:w="80"/>
+            </w:tcMar>
+            <w:vAlign w:val="center"/>
+          </w:tcPr>
+          <w:p>
+            <w:pPr>
+              <w:jc w:val="center"/>
+            </w:pPr>
+            <w:r>
+              <w:rPr>
+                <w:b/>
+                <w:bCs/>
+                <w:color w:val="FFFFFF"/>
+                <w:sz w:val="16"/>
+                <w:szCs w:val="16"/>
+              </w:rPr>
+              <w:t xml:space="preserve">Cluster (min)</w:t>
+            </w:r>
+          </w:p>
+        </w:tc>
+        <w:tc>
+          <w:tcPr>
+            <w:tcW w:type="dxa" w:w="1300"/>
+            <w:tcBorders>
+              <w:top w:val="single" w:color="D5DAE3" w:sz="4"/>
+              <w:left w:val="single" w:color="D5DAE3" w:sz="4"/>
+              <w:bottom w:val="single" w:color="D5DAE3" w:sz="4"/>
+              <w:right w:val="single" w:color="D5DAE3" w:sz="4"/>
+            </w:tcBorders>
+            <w:shd w:fill="1B2A4A" w:color="auto" w:val="clear"/>
+            <w:tcMar>
+              <w:top w:type="dxa" w:w="45"/>
+              <w:left w:type="dxa" w:w="80"/>
+              <w:bottom w:type="dxa" w:w="45"/>
+              <w:right w:type="dxa" w:w="80"/>
+            </w:tcMar>
+            <w:vAlign w:val="center"/>
+          </w:tcPr>
+          <w:p>
+            <w:pPr>
+              <w:jc w:val="center"/>
+            </w:pPr>
+            <w:r>
+              <w:rPr>
+                <w:b/>
+                <w:bCs/>
+                <w:color w:val="FFFFFF"/>
+                <w:sz w:val="16"/>
+                <w:szCs w:val="16"/>
+              </w:rPr>
+              <w:t xml:space="preserve">Cluster / laptop</w:t>
+            </w:r>
+          </w:p>
+        </w:tc>
+      </w:tr>
+      <w:tr>
+        <w:trPr>
+          <w:cantSplit/>
+        </w:trPr>
+        <w:tc>
+          <w:tcPr>
+            <w:tcW w:type="dxa" w:w="5638"/>
+            <w:tcBorders>
+              <w:top w:val="single" w:color="D5DAE3" w:sz="4"/>
+              <w:left w:val="single" w:color="D5DAE3" w:sz="4"/>
+              <w:bottom w:val="single" w:color="D5DAE3" w:sz="4"/>
+              <w:right w:val="single" w:color="D5DAE3" w:sz="4"/>
+            </w:tcBorders>
+            <w:shd w:fill="FFFFFF" w:color="auto" w:val="clear"/>
+            <w:tcMar>
+              <w:top w:type="dxa" w:w="45"/>
+              <w:left w:type="dxa" w:w="80"/>
+              <w:bottom w:type="dxa" w:w="45"/>
+              <w:right w:type="dxa" w:w="80"/>
+            </w:tcMar>
+            <w:vAlign w:val="center"/>
+          </w:tcPr>
+          <w:p>
+            <w:pPr>
+              <w:jc w:val="left"/>
+            </w:pPr>
+            <w:r>
+              <w:rPr>
+                <w:b w:val="false"/>
+                <w:bCs w:val="false"/>
+                <w:color w:val="3C3C3C"/>
+                <w:sz w:val="16"/>
+                <w:szCs w:val="16"/>
+              </w:rPr>
+              <w:t xml:space="preserve">Ingestion and data-quality audit</w:t>
+            </w:r>
+          </w:p>
+        </w:tc>
+        <w:tc>
+          <w:tcPr>
+            <w:tcW w:type="dxa" w:w="1300"/>
+            <w:tcBorders>
+              <w:top w:val="single" w:color="D5DAE3" w:sz="4"/>
+              <w:left w:val="single" w:color="D5DAE3" w:sz="4"/>
+              <w:bottom w:val="single" w:color="D5DAE3" w:sz="4"/>
+              <w:right w:val="single" w:color="D5DAE3" w:sz="4"/>
+            </w:tcBorders>
+            <w:shd w:fill="FFFFFF" w:color="auto" w:val="clear"/>
+            <w:tcMar>
+              <w:top w:type="dxa" w:w="45"/>
+              <w:left w:type="dxa" w:w="80"/>
+              <w:bottom w:type="dxa" w:w="45"/>
+              <w:right w:type="dxa" w:w="80"/>
+            </w:tcMar>
+            <w:vAlign w:val="center"/>
+          </w:tcPr>
+          <w:p>
+            <w:pPr>
+              <w:jc w:val="center"/>
+            </w:pPr>
+            <w:r>
+              <w:rPr>
+                <w:b w:val="false"/>
+                <w:bCs w:val="false"/>
+                <w:color w:val="3C3C3C"/>
+                <w:sz w:val="16"/>
+                <w:szCs w:val="16"/>
+              </w:rPr>
+              <w:t xml:space="preserve">0.4</w:t>
+            </w:r>
+          </w:p>
+        </w:tc>
+        <w:tc>
+          <w:tcPr>
+            <w:tcW w:type="dxa" w:w="1400"/>
+            <w:tcBorders>
+              <w:top w:val="single" w:color="D5DAE3" w:sz="4"/>
+              <w:left w:val="single" w:color="D5DAE3" w:sz="4"/>
+              <w:bottom w:val="single" w:color="D5DAE3" w:sz="4"/>
+              <w:right w:val="single" w:color="D5DAE3" w:sz="4"/>
+            </w:tcBorders>
+            <w:shd w:fill="FFFFFF" w:color="auto" w:val="clear"/>
+            <w:tcMar>
+              <w:top w:type="dxa" w:w="45"/>
+              <w:left w:type="dxa" w:w="80"/>
+              <w:bottom w:type="dxa" w:w="45"/>
+              <w:right w:type="dxa" w:w="80"/>
+            </w:tcMar>
+            <w:vAlign w:val="center"/>
+          </w:tcPr>
+          <w:p>
+            <w:pPr>
+              <w:jc w:val="center"/>
+            </w:pPr>
+            <w:r>
+              <w:rPr>
+                <w:b w:val="false"/>
+                <w:bCs w:val="false"/>
+                <w:color w:val="3C3C3C"/>
+                <w:sz w:val="16"/>
+                <w:szCs w:val="16"/>
+              </w:rPr>
+              <w:t xml:space="preserve">2.6</w:t>
+            </w:r>
+          </w:p>
+        </w:tc>
+        <w:tc>
+          <w:tcPr>
+            <w:tcW w:type="dxa" w:w="1300"/>
+            <w:tcBorders>
+              <w:top w:val="single" w:color="D5DAE3" w:sz="4"/>
+              <w:left w:val="single" w:color="D5DAE3" w:sz="4"/>
+              <w:bottom w:val="single" w:color="D5DAE3" w:sz="4"/>
+              <w:right w:val="single" w:color="D5DAE3" w:sz="4"/>
+            </w:tcBorders>
+            <w:shd w:fill="FFFFFF" w:color="auto" w:val="clear"/>
+            <w:tcMar>
+              <w:top w:type="dxa" w:w="45"/>
+              <w:left w:type="dxa" w:w="80"/>
+              <w:bottom w:type="dxa" w:w="45"/>
+              <w:right w:type="dxa" w:w="80"/>
+            </w:tcMar>
+            <w:vAlign w:val="center"/>
+          </w:tcPr>
+          <w:p>
+            <w:pPr>
+              <w:jc w:val="center"/>
+            </w:pPr>
+            <w:r>
+              <w:rPr>
+                <w:b w:val="false"/>
+                <w:bCs w:val="false"/>
+                <w:color w:val="3C3C3C"/>
+                <w:sz w:val="16"/>
+                <w:szCs w:val="16"/>
+              </w:rPr>
+              <w:t xml:space="preserve">6.1×</w:t>
+            </w:r>
+          </w:p>
+        </w:tc>
+      </w:tr>
+      <w:tr>
+        <w:trPr>
+          <w:cantSplit/>
+        </w:trPr>
+        <w:tc>
+          <w:tcPr>
+            <w:tcW w:type="dxa" w:w="5638"/>
+            <w:tcBorders>
+              <w:top w:val="single" w:color="D5DAE3" w:sz="4"/>
+              <w:left w:val="single" w:color="D5DAE3" w:sz="4"/>
+              <w:bottom w:val="single" w:color="D5DAE3" w:sz="4"/>
+              <w:right w:val="single" w:color="D5DAE3" w:sz="4"/>
+            </w:tcBorders>
+            <w:shd w:fill="F4F6FA" w:color="auto" w:val="clear"/>
+            <w:tcMar>
+              <w:top w:type="dxa" w:w="45"/>
+              <w:left w:type="dxa" w:w="80"/>
+              <w:bottom w:type="dxa" w:w="45"/>
+              <w:right w:type="dxa" w:w="80"/>
+            </w:tcMar>
+            <w:vAlign w:val="center"/>
+          </w:tcPr>
+          <w:p>
+            <w:pPr>
+              <w:jc w:val="left"/>
+            </w:pPr>
+            <w:r>
+              <w:rPr>
+                <w:b w:val="false"/>
+                <w:bCs w:val="false"/>
+                <w:color w:val="3C3C3C"/>
+                <w:sz w:val="16"/>
+                <w:szCs w:val="16"/>
+              </w:rPr>
+              <w:t xml:space="preserve">Cleaning and pre-processing</w:t>
+            </w:r>
+          </w:p>
+        </w:tc>
+        <w:tc>
+          <w:tcPr>
+            <w:tcW w:type="dxa" w:w="1300"/>
+            <w:tcBorders>
+              <w:top w:val="single" w:color="D5DAE3" w:sz="4"/>
+              <w:left w:val="single" w:color="D5DAE3" w:sz="4"/>
+              <w:bottom w:val="single" w:color="D5DAE3" w:sz="4"/>
+              <w:right w:val="single" w:color="D5DAE3" w:sz="4"/>
+            </w:tcBorders>
+            <w:shd w:fill="F4F6FA" w:color="auto" w:val="clear"/>
+            <w:tcMar>
+              <w:top w:type="dxa" w:w="45"/>
+              <w:left w:type="dxa" w:w="80"/>
+              <w:bottom w:type="dxa" w:w="45"/>
+              <w:right w:type="dxa" w:w="80"/>
+            </w:tcMar>
+            <w:vAlign w:val="center"/>
+          </w:tcPr>
+          <w:p>
+            <w:pPr>
+              <w:jc w:val="center"/>
+            </w:pPr>
+            <w:r>
+              <w:rPr>
+                <w:b w:val="false"/>
+                <w:bCs w:val="false"/>
+                <w:color w:val="3C3C3C"/>
+                <w:sz w:val="16"/>
+                <w:szCs w:val="16"/>
+              </w:rPr>
+              <w:t xml:space="preserve">0.6</w:t>
+            </w:r>
+          </w:p>
+        </w:tc>
+        <w:tc>
+          <w:tcPr>
+            <w:tcW w:type="dxa" w:w="1400"/>
+            <w:tcBorders>
+              <w:top w:val="single" w:color="D5DAE3" w:sz="4"/>
+              <w:left w:val="single" w:color="D5DAE3" w:sz="4"/>
+              <w:bottom w:val="single" w:color="D5DAE3" w:sz="4"/>
+              <w:right w:val="single" w:color="D5DAE3" w:sz="4"/>
+            </w:tcBorders>
+            <w:shd w:fill="F4F6FA" w:color="auto" w:val="clear"/>
+            <w:tcMar>
+              <w:top w:type="dxa" w:w="45"/>
+              <w:left w:type="dxa" w:w="80"/>
+              <w:bottom w:type="dxa" w:w="45"/>
+              <w:right w:type="dxa" w:w="80"/>
+            </w:tcMar>
+            <w:vAlign w:val="center"/>
+          </w:tcPr>
+          <w:p>
+            <w:pPr>
+              <w:jc w:val="center"/>
+            </w:pPr>
+            <w:r>
+              <w:rPr>
+                <w:b w:val="false"/>
+                <w:bCs w:val="false"/>
+                <w:color w:val="3C3C3C"/>
+                <w:sz w:val="16"/>
+                <w:szCs w:val="16"/>
+              </w:rPr>
+              <w:t xml:space="preserve">2.5</w:t>
+            </w:r>
+          </w:p>
+        </w:tc>
+        <w:tc>
+          <w:tcPr>
+            <w:tcW w:type="dxa" w:w="1300"/>
+            <w:tcBorders>
+              <w:top w:val="single" w:color="D5DAE3" w:sz="4"/>
+              <w:left w:val="single" w:color="D5DAE3" w:sz="4"/>
+              <w:bottom w:val="single" w:color="D5DAE3" w:sz="4"/>
+              <w:right w:val="single" w:color="D5DAE3" w:sz="4"/>
+            </w:tcBorders>
+            <w:shd w:fill="F4F6FA" w:color="auto" w:val="clear"/>
+            <w:tcMar>
+              <w:top w:type="dxa" w:w="45"/>
+              <w:left w:type="dxa" w:w="80"/>
+              <w:bottom w:type="dxa" w:w="45"/>
+              <w:right w:type="dxa" w:w="80"/>
+            </w:tcMar>
+            <w:vAlign w:val="center"/>
+          </w:tcPr>
+          <w:p>
+            <w:pPr>
+              <w:jc w:val="center"/>
+            </w:pPr>
+            <w:r>
+              <w:rPr>
+                <w:b w:val="false"/>
+                <w:bCs w:val="false"/>
+                <w:color w:val="3C3C3C"/>
+                <w:sz w:val="16"/>
+                <w:szCs w:val="16"/>
+              </w:rPr>
+              <w:t xml:space="preserve">4.0×</w:t>
+            </w:r>
+          </w:p>
+        </w:tc>
+      </w:tr>
+      <w:tr>
+        <w:trPr>
+          <w:cantSplit/>
+        </w:trPr>
+        <w:tc>
+          <w:tcPr>
+            <w:tcW w:type="dxa" w:w="5638"/>
+            <w:tcBorders>
+              <w:top w:val="single" w:color="D5DAE3" w:sz="4"/>
+              <w:left w:val="single" w:color="D5DAE3" w:sz="4"/>
+              <w:bottom w:val="single" w:color="D5DAE3" w:sz="4"/>
+              <w:right w:val="single" w:color="D5DAE3" w:sz="4"/>
+            </w:tcBorders>
+            <w:shd w:fill="FFFFFF" w:color="auto" w:val="clear"/>
+            <w:tcMar>
+              <w:top w:type="dxa" w:w="45"/>
+              <w:left w:type="dxa" w:w="80"/>
+              <w:bottom w:type="dxa" w:w="45"/>
+              <w:right w:type="dxa" w:w="80"/>
+            </w:tcMar>
+            <w:vAlign w:val="center"/>
+          </w:tcPr>
+          <w:p>
+            <w:pPr>
+              <w:jc w:val="left"/>
+            </w:pPr>
+            <w:r>
+              <w:rPr>
+                <w:b w:val="false"/>
+                <w:bCs w:val="false"/>
+                <w:color w:val="3C3C3C"/>
+                <w:sz w:val="16"/>
+                <w:szCs w:val="16"/>
+              </w:rPr>
+              <w:t xml:space="preserve">Task 1 analyses</w:t>
+            </w:r>
+          </w:p>
+        </w:tc>
+        <w:tc>
+          <w:tcPr>
+            <w:tcW w:type="dxa" w:w="1300"/>
+            <w:tcBorders>
+              <w:top w:val="single" w:color="D5DAE3" w:sz="4"/>
+              <w:left w:val="single" w:color="D5DAE3" w:sz="4"/>
+              <w:bottom w:val="single" w:color="D5DAE3" w:sz="4"/>
+              <w:right w:val="single" w:color="D5DAE3" w:sz="4"/>
+            </w:tcBorders>
+            <w:shd w:fill="FFFFFF" w:color="auto" w:val="clear"/>
+            <w:tcMar>
+              <w:top w:type="dxa" w:w="45"/>
+              <w:left w:type="dxa" w:w="80"/>
+              <w:bottom w:type="dxa" w:w="45"/>
+              <w:right w:type="dxa" w:w="80"/>
+            </w:tcMar>
+            <w:vAlign w:val="center"/>
+          </w:tcPr>
+          <w:p>
+            <w:pPr>
+              <w:jc w:val="center"/>
+            </w:pPr>
+            <w:r>
+              <w:rPr>
+                <w:b w:val="false"/>
+                <w:bCs w:val="false"/>
+                <w:color w:val="3C3C3C"/>
+                <w:sz w:val="16"/>
+                <w:szCs w:val="16"/>
+              </w:rPr>
+              <w:t xml:space="preserve">0.5</w:t>
+            </w:r>
+          </w:p>
+        </w:tc>
+        <w:tc>
+          <w:tcPr>
+            <w:tcW w:type="dxa" w:w="1400"/>
+            <w:tcBorders>
+              <w:top w:val="single" w:color="D5DAE3" w:sz="4"/>
+              <w:left w:val="single" w:color="D5DAE3" w:sz="4"/>
+              <w:bottom w:val="single" w:color="D5DAE3" w:sz="4"/>
+              <w:right w:val="single" w:color="D5DAE3" w:sz="4"/>
+            </w:tcBorders>
+            <w:shd w:fill="FFFFFF" w:color="auto" w:val="clear"/>
+            <w:tcMar>
+              <w:top w:type="dxa" w:w="45"/>
+              <w:left w:type="dxa" w:w="80"/>
+              <w:bottom w:type="dxa" w:w="45"/>
+              <w:right w:type="dxa" w:w="80"/>
+            </w:tcMar>
+            <w:vAlign w:val="center"/>
+          </w:tcPr>
+          <w:p>
+            <w:pPr>
+              <w:jc w:val="center"/>
+            </w:pPr>
+            <w:r>
+              <w:rPr>
+                <w:b w:val="false"/>
+                <w:bCs w:val="false"/>
+                <w:color w:val="3C3C3C"/>
+                <w:sz w:val="16"/>
+                <w:szCs w:val="16"/>
+              </w:rPr>
+              <w:t xml:space="preserve">2.5</w:t>
+            </w:r>
+          </w:p>
+        </w:tc>
+        <w:tc>
+          <w:tcPr>
+            <w:tcW w:type="dxa" w:w="1300"/>
+            <w:tcBorders>
+              <w:top w:val="single" w:color="D5DAE3" w:sz="4"/>
+              <w:left w:val="single" w:color="D5DAE3" w:sz="4"/>
+              <w:bottom w:val="single" w:color="D5DAE3" w:sz="4"/>
+              <w:right w:val="single" w:color="D5DAE3" w:sz="4"/>
+            </w:tcBorders>
+            <w:shd w:fill="FFFFFF" w:color="auto" w:val="clear"/>
+            <w:tcMar>
+              <w:top w:type="dxa" w:w="45"/>
+              <w:left w:type="dxa" w:w="80"/>
+              <w:bottom w:type="dxa" w:w="45"/>
+              <w:right w:type="dxa" w:w="80"/>
+            </w:tcMar>
+            <w:vAlign w:val="center"/>
+          </w:tcPr>
+          <w:p>
+            <w:pPr>
+              <w:jc w:val="center"/>
+            </w:pPr>
+            <w:r>
+              <w:rPr>
+                <w:b w:val="false"/>
+                <w:bCs w:val="false"/>
+                <w:color w:val="3C3C3C"/>
+                <w:sz w:val="16"/>
+                <w:szCs w:val="16"/>
+              </w:rPr>
+              <w:t xml:space="preserve">4.8×</w:t>
+            </w:r>
+          </w:p>
+        </w:tc>
+      </w:tr>
+      <w:tr>
+        <w:trPr>
+          <w:cantSplit/>
+        </w:trPr>
+        <w:tc>
+          <w:tcPr>
+            <w:tcW w:type="dxa" w:w="5638"/>
+            <w:tcBorders>
+              <w:top w:val="single" w:color="D5DAE3" w:sz="4"/>
+              <w:left w:val="single" w:color="D5DAE3" w:sz="4"/>
+              <w:bottom w:val="single" w:color="D5DAE3" w:sz="4"/>
+              <w:right w:val="single" w:color="D5DAE3" w:sz="4"/>
+            </w:tcBorders>
+            <w:shd w:fill="F4F6FA" w:color="auto" w:val="clear"/>
+            <w:tcMar>
+              <w:top w:type="dxa" w:w="45"/>
+              <w:left w:type="dxa" w:w="80"/>
+              <w:bottom w:type="dxa" w:w="45"/>
+              <w:right w:type="dxa" w:w="80"/>
+            </w:tcMar>
+            <w:vAlign w:val="center"/>
+          </w:tcPr>
+          <w:p>
+            <w:pPr>
+              <w:jc w:val="left"/>
+            </w:pPr>
+            <w:r>
+              <w:rPr>
+                <w:b w:val="false"/>
+                <w:bCs w:val="false"/>
+                <w:color w:val="3C3C3C"/>
+                <w:sz w:val="16"/>
+                <w:szCs w:val="16"/>
+              </w:rPr>
+              <w:t xml:space="preserve">Stage 1: features, sets, baselines and models</w:t>
+            </w:r>
+          </w:p>
+        </w:tc>
+        <w:tc>
+          <w:tcPr>
+            <w:tcW w:type="dxa" w:w="1300"/>
+            <w:tcBorders>
+              <w:top w:val="single" w:color="D5DAE3" w:sz="4"/>
+              <w:left w:val="single" w:color="D5DAE3" w:sz="4"/>
+              <w:bottom w:val="single" w:color="D5DAE3" w:sz="4"/>
+              <w:right w:val="single" w:color="D5DAE3" w:sz="4"/>
+            </w:tcBorders>
+            <w:shd w:fill="F4F6FA" w:color="auto" w:val="clear"/>
+            <w:tcMar>
+              <w:top w:type="dxa" w:w="45"/>
+              <w:left w:type="dxa" w:w="80"/>
+              <w:bottom w:type="dxa" w:w="45"/>
+              <w:right w:type="dxa" w:w="80"/>
+            </w:tcMar>
+            <w:vAlign w:val="center"/>
+          </w:tcPr>
+          <w:p>
+            <w:pPr>
+              <w:jc w:val="center"/>
+            </w:pPr>
+            <w:r>
+              <w:rPr>
+                <w:b w:val="false"/>
+                <w:bCs w:val="false"/>
+                <w:color w:val="3C3C3C"/>
+                <w:sz w:val="16"/>
+                <w:szCs w:val="16"/>
+              </w:rPr>
+              <w:t xml:space="preserve">11.2</w:t>
+            </w:r>
+          </w:p>
+        </w:tc>
+        <w:tc>
+          <w:tcPr>
+            <w:tcW w:type="dxa" w:w="1400"/>
+            <w:tcBorders>
+              <w:top w:val="single" w:color="D5DAE3" w:sz="4"/>
+              <w:left w:val="single" w:color="D5DAE3" w:sz="4"/>
+              <w:bottom w:val="single" w:color="D5DAE3" w:sz="4"/>
+              <w:right w:val="single" w:color="D5DAE3" w:sz="4"/>
+            </w:tcBorders>
+            <w:shd w:fill="F4F6FA" w:color="auto" w:val="clear"/>
+            <w:tcMar>
+              <w:top w:type="dxa" w:w="45"/>
+              <w:left w:type="dxa" w:w="80"/>
+              <w:bottom w:type="dxa" w:w="45"/>
+              <w:right w:type="dxa" w:w="80"/>
+            </w:tcMar>
+            <w:vAlign w:val="center"/>
+          </w:tcPr>
+          <w:p>
+            <w:pPr>
+              <w:jc w:val="center"/>
+            </w:pPr>
+            <w:r>
+              <w:rPr>
+                <w:b w:val="false"/>
+                <w:bCs w:val="false"/>
+                <w:color w:val="3C3C3C"/>
+                <w:sz w:val="16"/>
+                <w:szCs w:val="16"/>
+              </w:rPr>
+              <w:t xml:space="preserve">30.2</w:t>
+            </w:r>
+          </w:p>
+        </w:tc>
+        <w:tc>
+          <w:tcPr>
+            <w:tcW w:type="dxa" w:w="1300"/>
+            <w:tcBorders>
+              <w:top w:val="single" w:color="D5DAE3" w:sz="4"/>
+              <w:left w:val="single" w:color="D5DAE3" w:sz="4"/>
+              <w:bottom w:val="single" w:color="D5DAE3" w:sz="4"/>
+              <w:right w:val="single" w:color="D5DAE3" w:sz="4"/>
+            </w:tcBorders>
+            <w:shd w:fill="F4F6FA" w:color="auto" w:val="clear"/>
+            <w:tcMar>
+              <w:top w:type="dxa" w:w="45"/>
+              <w:left w:type="dxa" w:w="80"/>
+              <w:bottom w:type="dxa" w:w="45"/>
+              <w:right w:type="dxa" w:w="80"/>
+            </w:tcMar>
+            <w:vAlign w:val="center"/>
+          </w:tcPr>
+          <w:p>
+            <w:pPr>
+              <w:jc w:val="center"/>
+            </w:pPr>
+            <w:r>
+              <w:rPr>
+                <w:b w:val="false"/>
+                <w:bCs w:val="false"/>
+                <w:color w:val="3C3C3C"/>
+                <w:sz w:val="16"/>
+                <w:szCs w:val="16"/>
+              </w:rPr>
+              <w:t xml:space="preserve">2.7×</w:t>
+            </w:r>
+          </w:p>
+        </w:tc>
+      </w:tr>
+      <w:tr>
+        <w:trPr>
+          <w:cantSplit/>
+        </w:trPr>
+        <w:tc>
+          <w:tcPr>
+            <w:tcW w:type="dxa" w:w="5638"/>
+            <w:tcBorders>
+              <w:top w:val="single" w:color="D5DAE3" w:sz="4"/>
+              <w:left w:val="single" w:color="D5DAE3" w:sz="4"/>
+              <w:bottom w:val="single" w:color="D5DAE3" w:sz="4"/>
+              <w:right w:val="single" w:color="D5DAE3" w:sz="4"/>
+            </w:tcBorders>
+            <w:shd w:fill="FFFFFF" w:color="auto" w:val="clear"/>
+            <w:tcMar>
+              <w:top w:type="dxa" w:w="45"/>
+              <w:left w:type="dxa" w:w="80"/>
+              <w:bottom w:type="dxa" w:w="45"/>
+              <w:right w:type="dxa" w:w="80"/>
+            </w:tcMar>
+            <w:vAlign w:val="center"/>
+          </w:tcPr>
+          <w:p>
+            <w:pPr>
+              <w:jc w:val="left"/>
+            </w:pPr>
+            <w:r>
+              <w:rPr>
+                <w:b w:val="false"/>
+                <w:bCs w:val="false"/>
+                <w:color w:val="3C3C3C"/>
+                <w:sz w:val="16"/>
+                <w:szCs w:val="16"/>
+              </w:rPr>
+              <w:t xml:space="preserve">Stage 2: features and screening</w:t>
+            </w:r>
+          </w:p>
+        </w:tc>
+        <w:tc>
+          <w:tcPr>
+            <w:tcW w:type="dxa" w:w="1300"/>
+            <w:tcBorders>
+              <w:top w:val="single" w:color="D5DAE3" w:sz="4"/>
+              <w:left w:val="single" w:color="D5DAE3" w:sz="4"/>
+              <w:bottom w:val="single" w:color="D5DAE3" w:sz="4"/>
+              <w:right w:val="single" w:color="D5DAE3" w:sz="4"/>
+            </w:tcBorders>
+            <w:shd w:fill="FFFFFF" w:color="auto" w:val="clear"/>
+            <w:tcMar>
+              <w:top w:type="dxa" w:w="45"/>
+              <w:left w:type="dxa" w:w="80"/>
+              <w:bottom w:type="dxa" w:w="45"/>
+              <w:right w:type="dxa" w:w="80"/>
+            </w:tcMar>
+            <w:vAlign w:val="center"/>
+          </w:tcPr>
+          <w:p>
+            <w:pPr>
+              <w:jc w:val="center"/>
+            </w:pPr>
+            <w:r>
+              <w:rPr>
+                <w:b w:val="false"/>
+                <w:bCs w:val="false"/>
+                <w:color w:val="3C3C3C"/>
+                <w:sz w:val="16"/>
+                <w:szCs w:val="16"/>
+              </w:rPr>
+              <w:t xml:space="preserve">1.2</w:t>
+            </w:r>
+          </w:p>
+        </w:tc>
+        <w:tc>
+          <w:tcPr>
+            <w:tcW w:type="dxa" w:w="1400"/>
+            <w:tcBorders>
+              <w:top w:val="single" w:color="D5DAE3" w:sz="4"/>
+              <w:left w:val="single" w:color="D5DAE3" w:sz="4"/>
+              <w:bottom w:val="single" w:color="D5DAE3" w:sz="4"/>
+              <w:right w:val="single" w:color="D5DAE3" w:sz="4"/>
+            </w:tcBorders>
+            <w:shd w:fill="FFFFFF" w:color="auto" w:val="clear"/>
+            <w:tcMar>
+              <w:top w:type="dxa" w:w="45"/>
+              <w:left w:type="dxa" w:w="80"/>
+              <w:bottom w:type="dxa" w:w="45"/>
+              <w:right w:type="dxa" w:w="80"/>
+            </w:tcMar>
+            <w:vAlign w:val="center"/>
+          </w:tcPr>
+          <w:p>
+            <w:pPr>
+              <w:jc w:val="center"/>
+            </w:pPr>
+            <w:r>
+              <w:rPr>
+                <w:b w:val="false"/>
+                <w:bCs w:val="false"/>
+                <w:color w:val="3C3C3C"/>
+                <w:sz w:val="16"/>
+                <w:szCs w:val="16"/>
+              </w:rPr>
+              <w:t xml:space="preserve">5.1</w:t>
+            </w:r>
+          </w:p>
+        </w:tc>
+        <w:tc>
+          <w:tcPr>
+            <w:tcW w:type="dxa" w:w="1300"/>
+            <w:tcBorders>
+              <w:top w:val="single" w:color="D5DAE3" w:sz="4"/>
+              <w:left w:val="single" w:color="D5DAE3" w:sz="4"/>
+              <w:bottom w:val="single" w:color="D5DAE3" w:sz="4"/>
+              <w:right w:val="single" w:color="D5DAE3" w:sz="4"/>
+            </w:tcBorders>
+            <w:shd w:fill="FFFFFF" w:color="auto" w:val="clear"/>
+            <w:tcMar>
+              <w:top w:type="dxa" w:w="45"/>
+              <w:left w:type="dxa" w:w="80"/>
+              <w:bottom w:type="dxa" w:w="45"/>
+              <w:right w:type="dxa" w:w="80"/>
+            </w:tcMar>
+            <w:vAlign w:val="center"/>
+          </w:tcPr>
+          <w:p>
+            <w:pPr>
+              <w:jc w:val="center"/>
+            </w:pPr>
+            <w:r>
+              <w:rPr>
+                <w:b w:val="false"/>
+                <w:bCs w:val="false"/>
+                <w:color w:val="3C3C3C"/>
+                <w:sz w:val="16"/>
+                <w:szCs w:val="16"/>
+              </w:rPr>
+              <w:t xml:space="preserve">4.1×</w:t>
+            </w:r>
+          </w:p>
+        </w:tc>
+      </w:tr>
+      <w:tr>
+        <w:trPr>
+          <w:cantSplit/>
+        </w:trPr>
+        <w:tc>
+          <w:tcPr>
+            <w:tcW w:type="dxa" w:w="5638"/>
+            <w:tcBorders>
+              <w:top w:val="single" w:color="D5DAE3" w:sz="4"/>
+              <w:left w:val="single" w:color="D5DAE3" w:sz="4"/>
+              <w:bottom w:val="single" w:color="D5DAE3" w:sz="4"/>
+              <w:right w:val="single" w:color="D5DAE3" w:sz="4"/>
+            </w:tcBorders>
+            <w:shd w:fill="F4F6FA" w:color="auto" w:val="clear"/>
+            <w:tcMar>
+              <w:top w:type="dxa" w:w="45"/>
+              <w:left w:type="dxa" w:w="80"/>
+              <w:bottom w:type="dxa" w:w="45"/>
+              <w:right w:type="dxa" w:w="80"/>
+            </w:tcMar>
+            <w:vAlign w:val="center"/>
+          </w:tcPr>
+          <w:p>
+            <w:pPr>
+              <w:jc w:val="left"/>
+            </w:pPr>
+            <w:r>
+              <w:rPr>
+                <w:b w:val="false"/>
+                <w:bCs w:val="false"/>
+                <w:color w:val="3C3C3C"/>
+                <w:sz w:val="16"/>
+                <w:szCs w:val="16"/>
+              </w:rPr>
+              <w:t xml:space="preserve">Stage 2: cross-validation (100 fits)</w:t>
+            </w:r>
+          </w:p>
+        </w:tc>
+        <w:tc>
+          <w:tcPr>
+            <w:tcW w:type="dxa" w:w="1300"/>
+            <w:tcBorders>
+              <w:top w:val="single" w:color="D5DAE3" w:sz="4"/>
+              <w:left w:val="single" w:color="D5DAE3" w:sz="4"/>
+              <w:bottom w:val="single" w:color="D5DAE3" w:sz="4"/>
+              <w:right w:val="single" w:color="D5DAE3" w:sz="4"/>
+            </w:tcBorders>
+            <w:shd w:fill="F4F6FA" w:color="auto" w:val="clear"/>
+            <w:tcMar>
+              <w:top w:type="dxa" w:w="45"/>
+              <w:left w:type="dxa" w:w="80"/>
+              <w:bottom w:type="dxa" w:w="45"/>
+              <w:right w:type="dxa" w:w="80"/>
+            </w:tcMar>
+            <w:vAlign w:val="center"/>
+          </w:tcPr>
+          <w:p>
+            <w:pPr>
+              <w:jc w:val="center"/>
+            </w:pPr>
+            <w:r>
+              <w:rPr>
+                <w:b w:val="false"/>
+                <w:bCs w:val="false"/>
+                <w:color w:val="3C3C3C"/>
+                <w:sz w:val="16"/>
+                <w:szCs w:val="16"/>
+              </w:rPr>
+              <w:t xml:space="preserve">35.2</w:t>
+            </w:r>
+          </w:p>
+        </w:tc>
+        <w:tc>
+          <w:tcPr>
+            <w:tcW w:type="dxa" w:w="1400"/>
+            <w:tcBorders>
+              <w:top w:val="single" w:color="D5DAE3" w:sz="4"/>
+              <w:left w:val="single" w:color="D5DAE3" w:sz="4"/>
+              <w:bottom w:val="single" w:color="D5DAE3" w:sz="4"/>
+              <w:right w:val="single" w:color="D5DAE3" w:sz="4"/>
+            </w:tcBorders>
+            <w:shd w:fill="F4F6FA" w:color="auto" w:val="clear"/>
+            <w:tcMar>
+              <w:top w:type="dxa" w:w="45"/>
+              <w:left w:type="dxa" w:w="80"/>
+              <w:bottom w:type="dxa" w:w="45"/>
+              <w:right w:type="dxa" w:w="80"/>
+            </w:tcMar>
+            <w:vAlign w:val="center"/>
+          </w:tcPr>
+          <w:p>
+            <w:pPr>
+              <w:jc w:val="center"/>
+            </w:pPr>
+            <w:r>
+              <w:rPr>
+                <w:b w:val="false"/>
+                <w:bCs w:val="false"/>
+                <w:color w:val="3C3C3C"/>
+                <w:sz w:val="16"/>
+                <w:szCs w:val="16"/>
+              </w:rPr>
+              <w:t xml:space="preserve">161.9</w:t>
+            </w:r>
+          </w:p>
+        </w:tc>
+        <w:tc>
+          <w:tcPr>
+            <w:tcW w:type="dxa" w:w="1300"/>
+            <w:tcBorders>
+              <w:top w:val="single" w:color="D5DAE3" w:sz="4"/>
+              <w:left w:val="single" w:color="D5DAE3" w:sz="4"/>
+              <w:bottom w:val="single" w:color="D5DAE3" w:sz="4"/>
+              <w:right w:val="single" w:color="D5DAE3" w:sz="4"/>
+            </w:tcBorders>
+            <w:shd w:fill="F4F6FA" w:color="auto" w:val="clear"/>
+            <w:tcMar>
+              <w:top w:type="dxa" w:w="45"/>
+              <w:left w:type="dxa" w:w="80"/>
+              <w:bottom w:type="dxa" w:w="45"/>
+              <w:right w:type="dxa" w:w="80"/>
+            </w:tcMar>
+            <w:vAlign w:val="center"/>
+          </w:tcPr>
+          <w:p>
+            <w:pPr>
+              <w:jc w:val="center"/>
+            </w:pPr>
+            <w:r>
+              <w:rPr>
+                <w:b w:val="false"/>
+                <w:bCs w:val="false"/>
+                <w:color w:val="3C3C3C"/>
+                <w:sz w:val="16"/>
+                <w:szCs w:val="16"/>
+              </w:rPr>
+              <w:t xml:space="preserve">4.6×</w:t>
+            </w:r>
+          </w:p>
+        </w:tc>
+      </w:tr>
+      <w:tr>
+        <w:trPr>
+          <w:cantSplit/>
+        </w:trPr>
+        <w:tc>
+          <w:tcPr>
+            <w:tcW w:type="dxa" w:w="5638"/>
+            <w:tcBorders>
+              <w:top w:val="single" w:color="D5DAE3" w:sz="4"/>
+              <w:left w:val="single" w:color="D5DAE3" w:sz="4"/>
+              <w:bottom w:val="single" w:color="D5DAE3" w:sz="4"/>
+              <w:right w:val="single" w:color="D5DAE3" w:sz="4"/>
+            </w:tcBorders>
+            <w:shd w:fill="FFFFFF" w:color="auto" w:val="clear"/>
+            <w:tcMar>
+              <w:top w:type="dxa" w:w="45"/>
+              <w:left w:type="dxa" w:w="80"/>
+              <w:bottom w:type="dxa" w:w="45"/>
+              <w:right w:type="dxa" w:w="80"/>
+            </w:tcMar>
+            <w:vAlign w:val="center"/>
+          </w:tcPr>
+          <w:p>
+            <w:pPr>
+              <w:jc w:val="left"/>
+            </w:pPr>
+            <w:r>
+              <w:rPr>
+                <w:b w:val="false"/>
+                <w:bCs w:val="false"/>
+                <w:color w:val="3C3C3C"/>
+                <w:sz w:val="16"/>
+                <w:szCs w:val="16"/>
+              </w:rPr>
+              <w:t xml:space="preserve">Stage 2: ablation, calibration, refit, 2024 test, head-to-head</w:t>
+            </w:r>
+          </w:p>
+        </w:tc>
+        <w:tc>
+          <w:tcPr>
+            <w:tcW w:type="dxa" w:w="1300"/>
+            <w:tcBorders>
+              <w:top w:val="single" w:color="D5DAE3" w:sz="4"/>
+              <w:left w:val="single" w:color="D5DAE3" w:sz="4"/>
+              <w:bottom w:val="single" w:color="D5DAE3" w:sz="4"/>
+              <w:right w:val="single" w:color="D5DAE3" w:sz="4"/>
+            </w:tcBorders>
+            <w:shd w:fill="FFFFFF" w:color="auto" w:val="clear"/>
+            <w:tcMar>
+              <w:top w:type="dxa" w:w="45"/>
+              <w:left w:type="dxa" w:w="80"/>
+              <w:bottom w:type="dxa" w:w="45"/>
+              <w:right w:type="dxa" w:w="80"/>
+            </w:tcMar>
+            <w:vAlign w:val="center"/>
+          </w:tcPr>
+          <w:p>
+            <w:pPr>
+              <w:jc w:val="center"/>
+            </w:pPr>
+            <w:r>
+              <w:rPr>
+                <w:b w:val="false"/>
+                <w:bCs w:val="false"/>
+                <w:color w:val="3C3C3C"/>
+                <w:sz w:val="16"/>
+                <w:szCs w:val="16"/>
+              </w:rPr>
+              <w:t xml:space="preserve">25.0</w:t>
+            </w:r>
+          </w:p>
+        </w:tc>
+        <w:tc>
+          <w:tcPr>
+            <w:tcW w:type="dxa" w:w="1400"/>
+            <w:tcBorders>
+              <w:top w:val="single" w:color="D5DAE3" w:sz="4"/>
+              <w:left w:val="single" w:color="D5DAE3" w:sz="4"/>
+              <w:bottom w:val="single" w:color="D5DAE3" w:sz="4"/>
+              <w:right w:val="single" w:color="D5DAE3" w:sz="4"/>
+            </w:tcBorders>
+            <w:shd w:fill="FFFFFF" w:color="auto" w:val="clear"/>
+            <w:tcMar>
+              <w:top w:type="dxa" w:w="45"/>
+              <w:left w:type="dxa" w:w="80"/>
+              <w:bottom w:type="dxa" w:w="45"/>
+              <w:right w:type="dxa" w:w="80"/>
+            </w:tcMar>
+            <w:vAlign w:val="center"/>
+          </w:tcPr>
+          <w:p>
+            <w:pPr>
+              <w:jc w:val="center"/>
+            </w:pPr>
+            <w:r>
+              <w:rPr>
+                <w:b w:val="false"/>
+                <w:bCs w:val="false"/>
+                <w:color w:val="3C3C3C"/>
+                <w:sz w:val="16"/>
+                <w:szCs w:val="16"/>
+              </w:rPr>
+              <w:t xml:space="preserve">84.8</w:t>
+            </w:r>
+          </w:p>
+        </w:tc>
+        <w:tc>
+          <w:tcPr>
+            <w:tcW w:type="dxa" w:w="1300"/>
+            <w:tcBorders>
+              <w:top w:val="single" w:color="D5DAE3" w:sz="4"/>
+              <w:left w:val="single" w:color="D5DAE3" w:sz="4"/>
+              <w:bottom w:val="single" w:color="D5DAE3" w:sz="4"/>
+              <w:right w:val="single" w:color="D5DAE3" w:sz="4"/>
+            </w:tcBorders>
+            <w:shd w:fill="FFFFFF" w:color="auto" w:val="clear"/>
+            <w:tcMar>
+              <w:top w:type="dxa" w:w="45"/>
+              <w:left w:type="dxa" w:w="80"/>
+              <w:bottom w:type="dxa" w:w="45"/>
+              <w:right w:type="dxa" w:w="80"/>
+            </w:tcMar>
+            <w:vAlign w:val="center"/>
+          </w:tcPr>
+          <w:p>
+            <w:pPr>
+              <w:jc w:val="center"/>
+            </w:pPr>
+            <w:r>
+              <w:rPr>
+                <w:b w:val="false"/>
+                <w:bCs w:val="false"/>
+                <w:color w:val="3C3C3C"/>
+                <w:sz w:val="16"/>
+                <w:szCs w:val="16"/>
+              </w:rPr>
+              <w:t xml:space="preserve">3.4×</w:t>
+            </w:r>
+          </w:p>
+        </w:tc>
+      </w:tr>
+      <w:tr>
+        <w:trPr>
+          <w:cantSplit/>
+        </w:trPr>
+        <w:tc>
+          <w:tcPr>
+            <w:tcW w:type="dxa" w:w="5638"/>
+            <w:tcBorders>
+              <w:top w:val="single" w:color="D5DAE3" w:sz="4"/>
+              <w:left w:val="single" w:color="D5DAE3" w:sz="4"/>
+              <w:bottom w:val="single" w:color="D5DAE3" w:sz="4"/>
+              <w:right w:val="single" w:color="D5DAE3" w:sz="4"/>
+            </w:tcBorders>
+            <w:shd w:fill="F4F6FA" w:color="auto" w:val="clear"/>
+            <w:tcMar>
+              <w:top w:type="dxa" w:w="45"/>
+              <w:left w:type="dxa" w:w="80"/>
+              <w:bottom w:type="dxa" w:w="45"/>
+              <w:right w:type="dxa" w:w="80"/>
+            </w:tcMar>
+            <w:vAlign w:val="center"/>
+          </w:tcPr>
+          <w:p>
+            <w:pPr>
+              <w:jc w:val="left"/>
+            </w:pPr>
+            <w:r>
+              <w:rPr>
+                <w:b/>
+                <w:bCs/>
+                <w:color w:val="3C3C3C"/>
+                <w:sz w:val="16"/>
+                <w:szCs w:val="16"/>
+              </w:rPr>
+              <w:t xml:space="preserve">Total</w:t>
+            </w:r>
+          </w:p>
+        </w:tc>
+        <w:tc>
+          <w:tcPr>
+            <w:tcW w:type="dxa" w:w="1300"/>
+            <w:tcBorders>
+              <w:top w:val="single" w:color="D5DAE3" w:sz="4"/>
+              <w:left w:val="single" w:color="D5DAE3" w:sz="4"/>
+              <w:bottom w:val="single" w:color="D5DAE3" w:sz="4"/>
+              <w:right w:val="single" w:color="D5DAE3" w:sz="4"/>
+            </w:tcBorders>
+            <w:shd w:fill="F4F6FA" w:color="auto" w:val="clear"/>
+            <w:tcMar>
+              <w:top w:type="dxa" w:w="45"/>
+              <w:left w:type="dxa" w:w="80"/>
+              <w:bottom w:type="dxa" w:w="45"/>
+              <w:right w:type="dxa" w:w="80"/>
+            </w:tcMar>
+            <w:vAlign w:val="center"/>
+          </w:tcPr>
+          <w:p>
+            <w:pPr>
+              <w:jc w:val="center"/>
+            </w:pPr>
+            <w:r>
+              <w:rPr>
+                <w:b/>
+                <w:bCs/>
+                <w:color w:val="3C3C3C"/>
+                <w:sz w:val="16"/>
+                <w:szCs w:val="16"/>
+              </w:rPr>
+              <w:t xml:space="preserve">74</w:t>
+            </w:r>
+          </w:p>
+        </w:tc>
+        <w:tc>
+          <w:tcPr>
+            <w:tcW w:type="dxa" w:w="1400"/>
+            <w:tcBorders>
+              <w:top w:val="single" w:color="D5DAE3" w:sz="4"/>
+              <w:left w:val="single" w:color="D5DAE3" w:sz="4"/>
+              <w:bottom w:val="single" w:color="D5DAE3" w:sz="4"/>
+              <w:right w:val="single" w:color="D5DAE3" w:sz="4"/>
+            </w:tcBorders>
+            <w:shd w:fill="F4F6FA" w:color="auto" w:val="clear"/>
+            <w:tcMar>
+              <w:top w:type="dxa" w:w="45"/>
+              <w:left w:type="dxa" w:w="80"/>
+              <w:bottom w:type="dxa" w:w="45"/>
+              <w:right w:type="dxa" w:w="80"/>
+            </w:tcMar>
+            <w:vAlign w:val="center"/>
+          </w:tcPr>
+          <w:p>
+            <w:pPr>
+              <w:jc w:val="center"/>
+            </w:pPr>
+            <w:r>
+              <w:rPr>
+                <w:b/>
+                <w:bCs/>
+                <w:color w:val="3C3C3C"/>
+                <w:sz w:val="16"/>
+                <w:szCs w:val="16"/>
+              </w:rPr>
+              <w:t xml:space="preserve">290</w:t>
+            </w:r>
+          </w:p>
+        </w:tc>
+        <w:tc>
+          <w:tcPr>
+            <w:tcW w:type="dxa" w:w="1300"/>
+            <w:tcBorders>
+              <w:top w:val="single" w:color="D5DAE3" w:sz="4"/>
+              <w:left w:val="single" w:color="D5DAE3" w:sz="4"/>
+              <w:bottom w:val="single" w:color="D5DAE3" w:sz="4"/>
+              <w:right w:val="single" w:color="D5DAE3" w:sz="4"/>
+            </w:tcBorders>
+            <w:shd w:fill="F4F6FA" w:color="auto" w:val="clear"/>
+            <w:tcMar>
+              <w:top w:type="dxa" w:w="45"/>
+              <w:left w:type="dxa" w:w="80"/>
+              <w:bottom w:type="dxa" w:w="45"/>
+              <w:right w:type="dxa" w:w="80"/>
+            </w:tcMar>
+            <w:vAlign w:val="center"/>
+          </w:tcPr>
+          <w:p>
+            <w:pPr>
+              <w:jc w:val="center"/>
+            </w:pPr>
+            <w:r>
+              <w:rPr>
+                <w:b/>
+                <w:bCs/>
+                <w:color w:val="3C3C3C"/>
+                <w:sz w:val="16"/>
+                <w:szCs w:val="16"/>
+              </w:rPr>
+              <w:t xml:space="preserve">3.9×</w:t>
+            </w:r>
+          </w:p>
+        </w:tc>
+      </w:tr>
+    </w:tbl>
+    <w:p>
+      <w:pPr>
+        <w:spacing w:after="200" w:before="60"/>
+        <w:jc w:val="center"/>
+      </w:pPr>
+      <w:r>
+        <w:rPr>
+          <w:i/>
+          <w:iCs/>
+          <w:color w:val="7A8094"/>
+          <w:sz w:val="16"/>
+          <w:szCs w:val="16"/>
+        </w:rPr>
+        <w:t xml:space="preserve">Table 17. The same notebook on the laptop and on the Dataproc cluster: minutes per stage (t40_stage_timings.csv of each run).</w:t>
+      </w:r>
+    </w:p>
+    <w:tbl>
+      <w:tblPr>
+        <w:tblW w:type="dxa" w:w="9638"/>
+        <w:tblBorders>
+          <w:top w:val="single" w:color="auto" w:sz="4"/>
+          <w:left w:val="single" w:color="auto" w:sz="4"/>
+          <w:bottom w:val="single" w:color="auto" w:sz="4"/>
+          <w:right w:val="single" w:color="auto" w:sz="4"/>
+          <w:insideH w:val="single" w:color="auto" w:sz="4"/>
+          <w:insideV w:val="single" w:color="auto" w:sz="4"/>
+        </w:tblBorders>
+      </w:tblPr>
+      <w:tblGrid>
+        <w:gridCol w:w="4638"/>
+        <w:gridCol w:w="2500"/>
+        <w:gridCol w:w="2500"/>
+      </w:tblGrid>
+      <w:tr>
+        <w:trPr>
+          <w:tblHeader/>
+        </w:trPr>
+        <w:tc>
+          <w:tcPr>
+            <w:tcW w:type="dxa" w:w="4638"/>
+            <w:tcBorders>
+              <w:top w:val="single" w:color="D5DAE3" w:sz="4"/>
+              <w:left w:val="single" w:color="D5DAE3" w:sz="4"/>
+              <w:bottom w:val="single" w:color="D5DAE3" w:sz="4"/>
+              <w:right w:val="single" w:color="D5DAE3" w:sz="4"/>
+            </w:tcBorders>
+            <w:shd w:fill="1B2A4A" w:color="auto" w:val="clear"/>
+            <w:tcMar>
+              <w:top w:type="dxa" w:w="45"/>
+              <w:left w:type="dxa" w:w="80"/>
+              <w:bottom w:type="dxa" w:w="45"/>
+              <w:right w:type="dxa" w:w="80"/>
+            </w:tcMar>
+            <w:vAlign w:val="center"/>
+          </w:tcPr>
+          <w:p>
+            <w:pPr>
+              <w:jc w:val="left"/>
+            </w:pPr>
+            <w:r>
+              <w:rPr>
+                <w:b/>
+                <w:bCs/>
+                <w:color w:val="FFFFFF"/>
+                <w:sz w:val="16"/>
+                <w:szCs w:val="16"/>
+              </w:rPr>
+              <w:t xml:space="preserve">Result</w:t>
+            </w:r>
+          </w:p>
+        </w:tc>
+        <w:tc>
+          <w:tcPr>
+            <w:tcW w:type="dxa" w:w="2500"/>
+            <w:tcBorders>
+              <w:top w:val="single" w:color="D5DAE3" w:sz="4"/>
+              <w:left w:val="single" w:color="D5DAE3" w:sz="4"/>
+              <w:bottom w:val="single" w:color="D5DAE3" w:sz="4"/>
+              <w:right w:val="single" w:color="D5DAE3" w:sz="4"/>
+            </w:tcBorders>
+            <w:shd w:fill="1B2A4A" w:color="auto" w:val="clear"/>
+            <w:tcMar>
+              <w:top w:type="dxa" w:w="45"/>
+              <w:left w:type="dxa" w:w="80"/>
+              <w:bottom w:type="dxa" w:w="45"/>
+              <w:right w:type="dxa" w:w="80"/>
+            </w:tcMar>
+            <w:vAlign w:val="center"/>
+          </w:tcPr>
+          <w:p>
+            <w:pPr>
+              <w:jc w:val="center"/>
+            </w:pPr>
+            <w:r>
+              <w:rPr>
+                <w:b/>
+                <w:bCs/>
+                <w:color w:val="FFFFFF"/>
+                <w:sz w:val="16"/>
+                <w:szCs w:val="16"/>
+              </w:rPr>
+              <w:t xml:space="preserve">Laptop</w:t>
+            </w:r>
+          </w:p>
+        </w:tc>
+        <w:tc>
+          <w:tcPr>
+            <w:tcW w:type="dxa" w:w="2500"/>
+            <w:tcBorders>
+              <w:top w:val="single" w:color="D5DAE3" w:sz="4"/>
+              <w:left w:val="single" w:color="D5DAE3" w:sz="4"/>
+              <w:bottom w:val="single" w:color="D5DAE3" w:sz="4"/>
+              <w:right w:val="single" w:color="D5DAE3" w:sz="4"/>
+            </w:tcBorders>
+            <w:shd w:fill="1B2A4A" w:color="auto" w:val="clear"/>
+            <w:tcMar>
+              <w:top w:type="dxa" w:w="45"/>
+              <w:left w:type="dxa" w:w="80"/>
+              <w:bottom w:type="dxa" w:w="45"/>
+              <w:right w:type="dxa" w:w="80"/>
+            </w:tcMar>
+            <w:vAlign w:val="center"/>
+          </w:tcPr>
+          <w:p>
+            <w:pPr>
+              <w:jc w:val="center"/>
+            </w:pPr>
+            <w:r>
+              <w:rPr>
+                <w:b/>
+                <w:bCs/>
+                <w:color w:val="FFFFFF"/>
+                <w:sz w:val="16"/>
+                <w:szCs w:val="16"/>
+              </w:rPr>
+              <w:t xml:space="preserve">Cluster</w:t>
+            </w:r>
+          </w:p>
+        </w:tc>
+      </w:tr>
+      <w:tr>
+        <w:trPr>
+          <w:cantSplit/>
+        </w:trPr>
+        <w:tc>
+          <w:tcPr>
+            <w:tcW w:type="dxa" w:w="4638"/>
+            <w:tcBorders>
+              <w:top w:val="single" w:color="D5DAE3" w:sz="4"/>
+              <w:left w:val="single" w:color="D5DAE3" w:sz="4"/>
+              <w:bottom w:val="single" w:color="D5DAE3" w:sz="4"/>
+              <w:right w:val="single" w:color="D5DAE3" w:sz="4"/>
+            </w:tcBorders>
+            <w:shd w:fill="FFFFFF" w:color="auto" w:val="clear"/>
+            <w:tcMar>
+              <w:top w:type="dxa" w:w="45"/>
+              <w:left w:type="dxa" w:w="80"/>
+              <w:bottom w:type="dxa" w:w="45"/>
+              <w:right w:type="dxa" w:w="80"/>
+            </w:tcMar>
+            <w:vAlign w:val="center"/>
+          </w:tcPr>
+          <w:p>
+            <w:pPr>
+              <w:jc w:val="left"/>
+            </w:pPr>
+            <w:r>
+              <w:rPr>
+                <w:b w:val="false"/>
+                <w:bCs w:val="false"/>
+                <w:color w:val="3C3C3C"/>
+                <w:sz w:val="16"/>
+                <w:szCs w:val="16"/>
+              </w:rPr>
+              <w:t xml:space="preserve">Cleaning, Task 1 tables and Stage 1 data sets (9 tables)</w:t>
+            </w:r>
+          </w:p>
+        </w:tc>
+        <w:tc>
+          <w:tcPr>
+            <w:tcW w:type="dxa" w:w="2500"/>
+            <w:tcBorders>
+              <w:top w:val="single" w:color="D5DAE3" w:sz="4"/>
+              <w:left w:val="single" w:color="D5DAE3" w:sz="4"/>
+              <w:bottom w:val="single" w:color="D5DAE3" w:sz="4"/>
+              <w:right w:val="single" w:color="D5DAE3" w:sz="4"/>
+            </w:tcBorders>
+            <w:shd w:fill="FFFFFF" w:color="auto" w:val="clear"/>
+            <w:tcMar>
+              <w:top w:type="dxa" w:w="45"/>
+              <w:left w:type="dxa" w:w="80"/>
+              <w:bottom w:type="dxa" w:w="45"/>
+              <w:right w:type="dxa" w:w="80"/>
+            </w:tcMar>
+            <w:vAlign w:val="center"/>
+          </w:tcPr>
+          <w:p>
+            <w:pPr>
+              <w:jc w:val="center"/>
+            </w:pPr>
+            <w:r>
+              <w:rPr>
+                <w:b w:val="false"/>
+                <w:bCs w:val="false"/>
+                <w:color w:val="3C3C3C"/>
+                <w:sz w:val="16"/>
+                <w:szCs w:val="16"/>
+              </w:rPr>
+              <w:t xml:space="preserve">identical</w:t>
+            </w:r>
+          </w:p>
+        </w:tc>
+        <w:tc>
+          <w:tcPr>
+            <w:tcW w:type="dxa" w:w="2500"/>
+            <w:tcBorders>
+              <w:top w:val="single" w:color="D5DAE3" w:sz="4"/>
+              <w:left w:val="single" w:color="D5DAE3" w:sz="4"/>
+              <w:bottom w:val="single" w:color="D5DAE3" w:sz="4"/>
+              <w:right w:val="single" w:color="D5DAE3" w:sz="4"/>
+            </w:tcBorders>
+            <w:shd w:fill="FFFFFF" w:color="auto" w:val="clear"/>
+            <w:tcMar>
+              <w:top w:type="dxa" w:w="45"/>
+              <w:left w:type="dxa" w:w="80"/>
+              <w:bottom w:type="dxa" w:w="45"/>
+              <w:right w:type="dxa" w:w="80"/>
+            </w:tcMar>
+            <w:vAlign w:val="center"/>
+          </w:tcPr>
+          <w:p>
+            <w:pPr>
+              <w:jc w:val="center"/>
+            </w:pPr>
+            <w:r>
+              <w:rPr>
+                <w:b w:val="false"/>
+                <w:bCs w:val="false"/>
+                <w:color w:val="3C3C3C"/>
+                <w:sz w:val="16"/>
+                <w:szCs w:val="16"/>
+              </w:rPr>
+              <w:t xml:space="preserve">identical (largest difference 1e-12)</w:t>
+            </w:r>
+          </w:p>
+        </w:tc>
+      </w:tr>
+      <w:tr>
+        <w:trPr>
+          <w:cantSplit/>
+        </w:trPr>
+        <w:tc>
+          <w:tcPr>
+            <w:tcW w:type="dxa" w:w="4638"/>
+            <w:tcBorders>
+              <w:top w:val="single" w:color="D5DAE3" w:sz="4"/>
+              <w:left w:val="single" w:color="D5DAE3" w:sz="4"/>
+              <w:bottom w:val="single" w:color="D5DAE3" w:sz="4"/>
+              <w:right w:val="single" w:color="D5DAE3" w:sz="4"/>
+            </w:tcBorders>
+            <w:shd w:fill="F4F6FA" w:color="auto" w:val="clear"/>
+            <w:tcMar>
+              <w:top w:type="dxa" w:w="45"/>
+              <w:left w:type="dxa" w:w="80"/>
+              <w:bottom w:type="dxa" w:w="45"/>
+              <w:right w:type="dxa" w:w="80"/>
+            </w:tcMar>
+            <w:vAlign w:val="center"/>
+          </w:tcPr>
+          <w:p>
+            <w:pPr>
+              <w:jc w:val="left"/>
+            </w:pPr>
+            <w:r>
+              <w:rPr>
+                <w:b w:val="false"/>
+                <w:bCs w:val="false"/>
+                <w:color w:val="3C3C3C"/>
+                <w:sz w:val="16"/>
+                <w:szCs w:val="16"/>
+              </w:rPr>
+              <w:t xml:space="preserve">Stage 1 logistic model: 2024 macro PR-AUC</w:t>
+            </w:r>
+          </w:p>
+        </w:tc>
+        <w:tc>
+          <w:tcPr>
+            <w:tcW w:type="dxa" w:w="2500"/>
+            <w:tcBorders>
+              <w:top w:val="single" w:color="D5DAE3" w:sz="4"/>
+              <w:left w:val="single" w:color="D5DAE3" w:sz="4"/>
+              <w:bottom w:val="single" w:color="D5DAE3" w:sz="4"/>
+              <w:right w:val="single" w:color="D5DAE3" w:sz="4"/>
+            </w:tcBorders>
+            <w:shd w:fill="F4F6FA" w:color="auto" w:val="clear"/>
+            <w:tcMar>
+              <w:top w:type="dxa" w:w="45"/>
+              <w:left w:type="dxa" w:w="80"/>
+              <w:bottom w:type="dxa" w:w="45"/>
+              <w:right w:type="dxa" w:w="80"/>
+            </w:tcMar>
+            <w:vAlign w:val="center"/>
+          </w:tcPr>
+          <w:p>
+            <w:pPr>
+              <w:jc w:val="center"/>
+            </w:pPr>
+            <w:r>
+              <w:rPr>
+                <w:b w:val="false"/>
+                <w:bCs w:val="false"/>
+                <w:color w:val="3C3C3C"/>
+                <w:sz w:val="16"/>
+                <w:szCs w:val="16"/>
+              </w:rPr>
+              <w:t xml:space="preserve">0.4462</w:t>
+            </w:r>
+          </w:p>
+        </w:tc>
+        <w:tc>
+          <w:tcPr>
+            <w:tcW w:type="dxa" w:w="2500"/>
+            <w:tcBorders>
+              <w:top w:val="single" w:color="D5DAE3" w:sz="4"/>
+              <w:left w:val="single" w:color="D5DAE3" w:sz="4"/>
+              <w:bottom w:val="single" w:color="D5DAE3" w:sz="4"/>
+              <w:right w:val="single" w:color="D5DAE3" w:sz="4"/>
+            </w:tcBorders>
+            <w:shd w:fill="F4F6FA" w:color="auto" w:val="clear"/>
+            <w:tcMar>
+              <w:top w:type="dxa" w:w="45"/>
+              <w:left w:type="dxa" w:w="80"/>
+              <w:bottom w:type="dxa" w:w="45"/>
+              <w:right w:type="dxa" w:w="80"/>
+            </w:tcMar>
+            <w:vAlign w:val="center"/>
+          </w:tcPr>
+          <w:p>
+            <w:pPr>
+              <w:jc w:val="center"/>
+            </w:pPr>
+            <w:r>
+              <w:rPr>
+                <w:b w:val="false"/>
+                <w:bCs w:val="false"/>
+                <w:color w:val="3C3C3C"/>
+                <w:sz w:val="16"/>
+                <w:szCs w:val="16"/>
+              </w:rPr>
+              <w:t xml:space="preserve">0.4462</w:t>
+            </w:r>
+          </w:p>
+        </w:tc>
+      </w:tr>
+      <w:tr>
+        <w:trPr>
+          <w:cantSplit/>
+        </w:trPr>
+        <w:tc>
+          <w:tcPr>
+            <w:tcW w:type="dxa" w:w="4638"/>
+            <w:tcBorders>
+              <w:top w:val="single" w:color="D5DAE3" w:sz="4"/>
+              <w:left w:val="single" w:color="D5DAE3" w:sz="4"/>
+              <w:bottom w:val="single" w:color="D5DAE3" w:sz="4"/>
+              <w:right w:val="single" w:color="D5DAE3" w:sz="4"/>
+            </w:tcBorders>
+            <w:shd w:fill="FFFFFF" w:color="auto" w:val="clear"/>
+            <w:tcMar>
+              <w:top w:type="dxa" w:w="45"/>
+              <w:left w:type="dxa" w:w="80"/>
+              <w:bottom w:type="dxa" w:w="45"/>
+              <w:right w:type="dxa" w:w="80"/>
+            </w:tcMar>
+            <w:vAlign w:val="center"/>
+          </w:tcPr>
+          <w:p>
+            <w:pPr>
+              <w:jc w:val="left"/>
+            </w:pPr>
+            <w:r>
+              <w:rPr>
+                <w:b w:val="false"/>
+                <w:bCs w:val="false"/>
+                <w:color w:val="3C3C3C"/>
+                <w:sz w:val="16"/>
+                <w:szCs w:val="16"/>
+              </w:rPr>
+              <w:t xml:space="preserve">Cross-validation: best setting of all four grids</w:t>
+            </w:r>
+          </w:p>
+        </w:tc>
+        <w:tc>
+          <w:tcPr>
+            <w:tcW w:type="dxa" w:w="2500"/>
+            <w:tcBorders>
+              <w:top w:val="single" w:color="D5DAE3" w:sz="4"/>
+              <w:left w:val="single" w:color="D5DAE3" w:sz="4"/>
+              <w:bottom w:val="single" w:color="D5DAE3" w:sz="4"/>
+              <w:right w:val="single" w:color="D5DAE3" w:sz="4"/>
+            </w:tcBorders>
+            <w:shd w:fill="FFFFFF" w:color="auto" w:val="clear"/>
+            <w:tcMar>
+              <w:top w:type="dxa" w:w="45"/>
+              <w:left w:type="dxa" w:w="80"/>
+              <w:bottom w:type="dxa" w:w="45"/>
+              <w:right w:type="dxa" w:w="80"/>
+            </w:tcMar>
+            <w:vAlign w:val="center"/>
+          </w:tcPr>
+          <w:p>
+            <w:pPr>
+              <w:jc w:val="center"/>
+            </w:pPr>
+            <w:r>
+              <w:rPr>
+                <w:b w:val="false"/>
+                <w:bCs w:val="false"/>
+                <w:color w:val="3C3C3C"/>
+                <w:sz w:val="16"/>
+                <w:szCs w:val="16"/>
+              </w:rPr>
+              <w:t xml:space="preserve">—</w:t>
+            </w:r>
+          </w:p>
+        </w:tc>
+        <w:tc>
+          <w:tcPr>
+            <w:tcW w:type="dxa" w:w="2500"/>
+            <w:tcBorders>
+              <w:top w:val="single" w:color="D5DAE3" w:sz="4"/>
+              <w:left w:val="single" w:color="D5DAE3" w:sz="4"/>
+              <w:bottom w:val="single" w:color="D5DAE3" w:sz="4"/>
+              <w:right w:val="single" w:color="D5DAE3" w:sz="4"/>
+            </w:tcBorders>
+            <w:shd w:fill="FFFFFF" w:color="auto" w:val="clear"/>
+            <w:tcMar>
+              <w:top w:type="dxa" w:w="45"/>
+              <w:left w:type="dxa" w:w="80"/>
+              <w:bottom w:type="dxa" w:w="45"/>
+              <w:right w:type="dxa" w:w="80"/>
+            </w:tcMar>
+            <w:vAlign w:val="center"/>
+          </w:tcPr>
+          <w:p>
+            <w:pPr>
+              <w:jc w:val="center"/>
+            </w:pPr>
+            <w:r>
+              <w:rPr>
+                <w:b w:val="false"/>
+                <w:bCs w:val="false"/>
+                <w:color w:val="3C3C3C"/>
+                <w:sz w:val="16"/>
+                <w:szCs w:val="16"/>
+              </w:rPr>
+              <w:t xml:space="preserve">same settings</w:t>
+            </w:r>
+          </w:p>
+        </w:tc>
+      </w:tr>
+      <w:tr>
+        <w:trPr>
+          <w:cantSplit/>
+        </w:trPr>
+        <w:tc>
+          <w:tcPr>
+            <w:tcW w:type="dxa" w:w="4638"/>
+            <w:tcBorders>
+              <w:top w:val="single" w:color="D5DAE3" w:sz="4"/>
+              <w:left w:val="single" w:color="D5DAE3" w:sz="4"/>
+              <w:bottom w:val="single" w:color="D5DAE3" w:sz="4"/>
+              <w:right w:val="single" w:color="D5DAE3" w:sz="4"/>
+            </w:tcBorders>
+            <w:shd w:fill="F4F6FA" w:color="auto" w:val="clear"/>
+            <w:tcMar>
+              <w:top w:type="dxa" w:w="45"/>
+              <w:left w:type="dxa" w:w="80"/>
+              <w:bottom w:type="dxa" w:w="45"/>
+              <w:right w:type="dxa" w:w="80"/>
+            </w:tcMar>
+            <w:vAlign w:val="center"/>
+          </w:tcPr>
+          <w:p>
+            <w:pPr>
+              <w:jc w:val="left"/>
+            </w:pPr>
+            <w:r>
+              <w:rPr>
+                <w:b w:val="false"/>
+                <w:bCs w:val="false"/>
+                <w:color w:val="3C3C3C"/>
+                <w:sz w:val="16"/>
+                <w:szCs w:val="16"/>
+              </w:rPr>
+              <w:t xml:space="preserve">Cross-validation: random-forest log loss</w:t>
+            </w:r>
+          </w:p>
+        </w:tc>
+        <w:tc>
+          <w:tcPr>
+            <w:tcW w:type="dxa" w:w="2500"/>
+            <w:tcBorders>
+              <w:top w:val="single" w:color="D5DAE3" w:sz="4"/>
+              <w:left w:val="single" w:color="D5DAE3" w:sz="4"/>
+              <w:bottom w:val="single" w:color="D5DAE3" w:sz="4"/>
+              <w:right w:val="single" w:color="D5DAE3" w:sz="4"/>
+            </w:tcBorders>
+            <w:shd w:fill="F4F6FA" w:color="auto" w:val="clear"/>
+            <w:tcMar>
+              <w:top w:type="dxa" w:w="45"/>
+              <w:left w:type="dxa" w:w="80"/>
+              <w:bottom w:type="dxa" w:w="45"/>
+              <w:right w:type="dxa" w:w="80"/>
+            </w:tcMar>
+            <w:vAlign w:val="center"/>
+          </w:tcPr>
+          <w:p>
+            <w:pPr>
+              <w:jc w:val="center"/>
+            </w:pPr>
+            <w:r>
+              <w:rPr>
+                <w:b w:val="false"/>
+                <w:bCs w:val="false"/>
+                <w:color w:val="3C3C3C"/>
+                <w:sz w:val="16"/>
+                <w:szCs w:val="16"/>
+              </w:rPr>
+              <w:t xml:space="preserve">0.0320</w:t>
+            </w:r>
+          </w:p>
+        </w:tc>
+        <w:tc>
+          <w:tcPr>
+            <w:tcW w:type="dxa" w:w="2500"/>
+            <w:tcBorders>
+              <w:top w:val="single" w:color="D5DAE3" w:sz="4"/>
+              <w:left w:val="single" w:color="D5DAE3" w:sz="4"/>
+              <w:bottom w:val="single" w:color="D5DAE3" w:sz="4"/>
+              <w:right w:val="single" w:color="D5DAE3" w:sz="4"/>
+            </w:tcBorders>
+            <w:shd w:fill="F4F6FA" w:color="auto" w:val="clear"/>
+            <w:tcMar>
+              <w:top w:type="dxa" w:w="45"/>
+              <w:left w:type="dxa" w:w="80"/>
+              <w:bottom w:type="dxa" w:w="45"/>
+              <w:right w:type="dxa" w:w="80"/>
+            </w:tcMar>
+            <w:vAlign w:val="center"/>
+          </w:tcPr>
+          <w:p>
+            <w:pPr>
+              <w:jc w:val="center"/>
+            </w:pPr>
+            <w:r>
+              <w:rPr>
+                <w:b w:val="false"/>
+                <w:bCs w:val="false"/>
+                <w:color w:val="3C3C3C"/>
+                <w:sz w:val="16"/>
+                <w:szCs w:val="16"/>
+              </w:rPr>
+              <w:t xml:space="preserve">0.0319</w:t>
+            </w:r>
+          </w:p>
+        </w:tc>
+      </w:tr>
+      <w:tr>
+        <w:trPr>
+          <w:cantSplit/>
+        </w:trPr>
+        <w:tc>
+          <w:tcPr>
+            <w:tcW w:type="dxa" w:w="4638"/>
+            <w:tcBorders>
+              <w:top w:val="single" w:color="D5DAE3" w:sz="4"/>
+              <w:left w:val="single" w:color="D5DAE3" w:sz="4"/>
+              <w:bottom w:val="single" w:color="D5DAE3" w:sz="4"/>
+              <w:right w:val="single" w:color="D5DAE3" w:sz="4"/>
+            </w:tcBorders>
+            <w:shd w:fill="FFFFFF" w:color="auto" w:val="clear"/>
+            <w:tcMar>
+              <w:top w:type="dxa" w:w="45"/>
+              <w:left w:type="dxa" w:w="80"/>
+              <w:bottom w:type="dxa" w:w="45"/>
+              <w:right w:type="dxa" w:w="80"/>
+            </w:tcMar>
+            <w:vAlign w:val="center"/>
+          </w:tcPr>
+          <w:p>
+            <w:pPr>
+              <w:jc w:val="left"/>
+            </w:pPr>
+            <w:r>
+              <w:rPr>
+                <w:b w:val="false"/>
+                <w:bCs w:val="false"/>
+                <w:color w:val="3C3C3C"/>
+                <w:sz w:val="16"/>
+                <w:szCs w:val="16"/>
+              </w:rPr>
+              <w:t xml:space="preserve">Final random forest on 2024: PR-AUC at 1 / 5 / 20 mm</w:t>
+            </w:r>
+          </w:p>
+        </w:tc>
+        <w:tc>
+          <w:tcPr>
+            <w:tcW w:type="dxa" w:w="2500"/>
+            <w:tcBorders>
+              <w:top w:val="single" w:color="D5DAE3" w:sz="4"/>
+              <w:left w:val="single" w:color="D5DAE3" w:sz="4"/>
+              <w:bottom w:val="single" w:color="D5DAE3" w:sz="4"/>
+              <w:right w:val="single" w:color="D5DAE3" w:sz="4"/>
+            </w:tcBorders>
+            <w:shd w:fill="FFFFFF" w:color="auto" w:val="clear"/>
+            <w:tcMar>
+              <w:top w:type="dxa" w:w="45"/>
+              <w:left w:type="dxa" w:w="80"/>
+              <w:bottom w:type="dxa" w:w="45"/>
+              <w:right w:type="dxa" w:w="80"/>
+            </w:tcMar>
+            <w:vAlign w:val="center"/>
+          </w:tcPr>
+          <w:p>
+            <w:pPr>
+              <w:jc w:val="center"/>
+            </w:pPr>
+            <w:r>
+              <w:rPr>
+                <w:b w:val="false"/>
+                <w:bCs w:val="false"/>
+                <w:color w:val="3C3C3C"/>
+                <w:sz w:val="16"/>
+                <w:szCs w:val="16"/>
+              </w:rPr>
+              <w:t xml:space="preserve">0.667 / 0.466 / 0.186</w:t>
+            </w:r>
+          </w:p>
+        </w:tc>
+        <w:tc>
+          <w:tcPr>
+            <w:tcW w:type="dxa" w:w="2500"/>
+            <w:tcBorders>
+              <w:top w:val="single" w:color="D5DAE3" w:sz="4"/>
+              <w:left w:val="single" w:color="D5DAE3" w:sz="4"/>
+              <w:bottom w:val="single" w:color="D5DAE3" w:sz="4"/>
+              <w:right w:val="single" w:color="D5DAE3" w:sz="4"/>
+            </w:tcBorders>
+            <w:shd w:fill="FFFFFF" w:color="auto" w:val="clear"/>
+            <w:tcMar>
+              <w:top w:type="dxa" w:w="45"/>
+              <w:left w:type="dxa" w:w="80"/>
+              <w:bottom w:type="dxa" w:w="45"/>
+              <w:right w:type="dxa" w:w="80"/>
+            </w:tcMar>
+            <w:vAlign w:val="center"/>
+          </w:tcPr>
+          <w:p>
+            <w:pPr>
+              <w:jc w:val="center"/>
+            </w:pPr>
+            <w:r>
+              <w:rPr>
+                <w:b w:val="false"/>
+                <w:bCs w:val="false"/>
+                <w:color w:val="3C3C3C"/>
+                <w:sz w:val="16"/>
+                <w:szCs w:val="16"/>
+              </w:rPr>
+              <w:t xml:space="preserve">0.666 / 0.465 / 0.189</w:t>
+            </w:r>
+          </w:p>
+        </w:tc>
+      </w:tr>
+      <w:tr>
+        <w:trPr>
+          <w:cantSplit/>
+        </w:trPr>
+        <w:tc>
+          <w:tcPr>
+            <w:tcW w:type="dxa" w:w="4638"/>
+            <w:tcBorders>
+              <w:top w:val="single" w:color="D5DAE3" w:sz="4"/>
+              <w:left w:val="single" w:color="D5DAE3" w:sz="4"/>
+              <w:bottom w:val="single" w:color="D5DAE3" w:sz="4"/>
+              <w:right w:val="single" w:color="D5DAE3" w:sz="4"/>
+            </w:tcBorders>
+            <w:shd w:fill="F4F6FA" w:color="auto" w:val="clear"/>
+            <w:tcMar>
+              <w:top w:type="dxa" w:w="45"/>
+              <w:left w:type="dxa" w:w="80"/>
+              <w:bottom w:type="dxa" w:w="45"/>
+              <w:right w:type="dxa" w:w="80"/>
+            </w:tcMar>
+            <w:vAlign w:val="center"/>
+          </w:tcPr>
+          <w:p>
+            <w:pPr>
+              <w:jc w:val="left"/>
+            </w:pPr>
+            <w:r>
+              <w:rPr>
+                <w:b w:val="false"/>
+                <w:bCs w:val="false"/>
+                <w:color w:val="3C3C3C"/>
+                <w:sz w:val="16"/>
+                <w:szCs w:val="16"/>
+              </w:rPr>
+              <w:t xml:space="preserve">Head-to-head at 5 mm: final vs Stage 1 PR-AUC</w:t>
+            </w:r>
+          </w:p>
+        </w:tc>
+        <w:tc>
+          <w:tcPr>
+            <w:tcW w:type="dxa" w:w="2500"/>
+            <w:tcBorders>
+              <w:top w:val="single" w:color="D5DAE3" w:sz="4"/>
+              <w:left w:val="single" w:color="D5DAE3" w:sz="4"/>
+              <w:bottom w:val="single" w:color="D5DAE3" w:sz="4"/>
+              <w:right w:val="single" w:color="D5DAE3" w:sz="4"/>
+            </w:tcBorders>
+            <w:shd w:fill="F4F6FA" w:color="auto" w:val="clear"/>
+            <w:tcMar>
+              <w:top w:type="dxa" w:w="45"/>
+              <w:left w:type="dxa" w:w="80"/>
+              <w:bottom w:type="dxa" w:w="45"/>
+              <w:right w:type="dxa" w:w="80"/>
+            </w:tcMar>
+            <w:vAlign w:val="center"/>
+          </w:tcPr>
+          <w:p>
+            <w:pPr>
+              <w:jc w:val="center"/>
+            </w:pPr>
+            <w:r>
+              <w:rPr>
+                <w:b w:val="false"/>
+                <w:bCs w:val="false"/>
+                <w:color w:val="3C3C3C"/>
+                <w:sz w:val="16"/>
+                <w:szCs w:val="16"/>
+              </w:rPr>
+              <w:t xml:space="preserve">0.461 vs 0.418</w:t>
+            </w:r>
+          </w:p>
+        </w:tc>
+        <w:tc>
+          <w:tcPr>
+            <w:tcW w:type="dxa" w:w="2500"/>
+            <w:tcBorders>
+              <w:top w:val="single" w:color="D5DAE3" w:sz="4"/>
+              <w:left w:val="single" w:color="D5DAE3" w:sz="4"/>
+              <w:bottom w:val="single" w:color="D5DAE3" w:sz="4"/>
+              <w:right w:val="single" w:color="D5DAE3" w:sz="4"/>
+            </w:tcBorders>
+            <w:shd w:fill="F4F6FA" w:color="auto" w:val="clear"/>
+            <w:tcMar>
+              <w:top w:type="dxa" w:w="45"/>
+              <w:left w:type="dxa" w:w="80"/>
+              <w:bottom w:type="dxa" w:w="45"/>
+              <w:right w:type="dxa" w:w="80"/>
+            </w:tcMar>
+            <w:vAlign w:val="center"/>
+          </w:tcPr>
+          <w:p>
+            <w:pPr>
+              <w:jc w:val="center"/>
+            </w:pPr>
+            <w:r>
+              <w:rPr>
+                <w:b w:val="false"/>
+                <w:bCs w:val="false"/>
+                <w:color w:val="3C3C3C"/>
+                <w:sz w:val="16"/>
+                <w:szCs w:val="16"/>
+              </w:rPr>
+              <w:t xml:space="preserve">0.460 vs 0.418</w:t>
+            </w:r>
+          </w:p>
+        </w:tc>
+      </w:tr>
+    </w:tbl>
+    <w:p>
+      <w:pPr>
+        <w:spacing w:after="200" w:before="60"/>
+        <w:jc w:val="center"/>
+      </w:pPr>
+      <w:r>
+        <w:rPr>
+          <w:i/>
+          <w:iCs/>
+          <w:color w:val="7A8094"/>
+          <w:sz w:val="16"/>
+          <w:szCs w:val="16"/>
+        </w:rPr>
+        <w:t xml:space="preserve">Table 18. Results of the two runs. Everything deterministic is identical; the tree models differ only in the third decimal because their row subsampling depends on partitioning.</w:t>
+      </w:r>
+    </w:p>
+    <w:p>
+      <w:pPr>
+        <w:spacing w:after="120" w:line="276"/>
+        <w:jc w:val="both"/>
+      </w:pPr>
+      <w:r>
+        <w:t xml:space="preserve">The only Task 1 value that differs is the 99th-percentile event depth (by 0.26 mm), computed with Spark's approximate percentile, whose answer depends on how the data are partitioned. The cluster run therefore confirms that the pipeline is portable: the same code gives the same conclusions on one machine and on a YARN cluster.</w:t>
+      </w:r>
+    </w:p>
+    <w:p>
+      <w:pPr>
+        <w:pStyle w:val="Heading2"/>
+      </w:pPr>
+      <w:r>
+        <w:t xml:space="preserve">8.7 Verification</w:t>
       </w:r>
     </w:p>
     <w:p>
@@ -22016,7 +24212,7 @@
           <w:sz w:val="16"/>
           <w:szCs w:val="16"/>
         </w:rPr>
-        <w:t xml:space="preserve">Table 17. Most important features of the final model (mean decrease in impurity) with a plain-English reading.</w:t>
+        <w:t xml:space="preserve">Table 19. Most important features of the final model (mean decrease in impurity) with a plain-English reading.</w:t>
       </w:r>
     </w:p>
     <w:p>
@@ -22711,7 +24907,7 @@
                 <w:sz w:val="16"/>
                 <w:szCs w:val="16"/>
               </w:rPr>
-              <w:t xml:space="preserve">The cloud experiment was limited to 4 small workers by the 12-vCPU quota and covers the ingestion and cleaning job only; the model training ran on the laptop.</w:t>
+              <w:t xml:space="preserve">The 12-vCPU quota limited the cluster to 2–4 small workers, so the cluster ran slower than the laptop; the submitted model is the laptop-trained one (the complete cluster run reproduced its results).</w:t>
             </w:r>
           </w:p>
         </w:tc>
@@ -22803,7 +24999,7 @@
           <w:sz w:val="16"/>
           <w:szCs w:val="16"/>
         </w:rPr>
-        <w:t xml:space="preserve">Table 18. Data and model limitations.</w:t>
+        <w:t xml:space="preserve">Table 20. Data and model limitations.</w:t>
       </w:r>
     </w:p>
     <w:p>

</xml_diff>

<commit_message>
Cloud run commit and updated teh report based on the cloud output
</commit_message>
<xml_diff>
--- a/DSA5208_Project2_Report.docx
+++ b/DSA5208_Project2_Report.docx
@@ -263,14 +263,14 @@
                 <w:sz w:val="19"/>
                 <w:szCs w:val="19"/>
               </w:rPr>
-              <w:t xml:space="preserve">0.969</w:t>
+              <w:t xml:space="preserve">0.968</w:t>
             </w:r>
             <w:r>
               <w:rPr>
                 <w:sz w:val="19"/>
                 <w:szCs w:val="19"/>
               </w:rPr>
-              <w:t xml:space="preserve">, beats the logistic baseline at every threshold on identical rows, and gives calibrated probabilities. The complete notebook was also executed on a Google Cloud Dataproc cluster with identical conclusions, and doubling the cluster's workers halved the run time of the core Spark job.</w:t>
+              <w:t xml:space="preserve">, beats the logistic baseline on identical rows in ranking and log loss at every threshold, and in PR-AUC at all but the rarest, and gives calibrated probabilities. The complete notebook was also executed on a Google Cloud Dataproc cluster with identical conclusions, and doubling the cluster's workers halved the run time of the core Spark job.</w:t>
             </w:r>
           </w:p>
         </w:tc>
@@ -346,7 +346,7 @@
         <w:t xml:space="preserve">random forest</w:t>
       </w:r>
       <w:r>
-        <w:t xml:space="preserve"> chosen by year-blocked cross-validation; on identical 2024 rows it beats the Stage 1 logistic model on PR-AUC, ROC-AUC and log loss at every threshold.</w:t>
+        <w:t xml:space="preserve"> chosen by year-blocked cross-validation; on identical 2024 rows it beats the Stage 1 logistic model on ROC-AUC and log loss at every threshold and on PR-AUC at 4 of 5, with the PR-AUCs practically tied at 20 mm (0.1856 vs 0.1858).</w:t>
       </w:r>
     </w:p>
     <w:tbl>
@@ -646,7 +646,7 @@
                 <w:sz w:val="16"/>
                 <w:szCs w:val="16"/>
               </w:rPr>
-              <w:t xml:space="preserve">0.450</w:t>
+              <w:t xml:space="preserve">0.449</w:t>
             </w:r>
           </w:p>
         </w:tc>
@@ -748,7 +748,7 @@
                 <w:sz w:val="16"/>
                 <w:szCs w:val="16"/>
               </w:rPr>
-              <w:t xml:space="preserve">0.461</w:t>
+              <w:t xml:space="preserve">0.462</w:t>
             </w:r>
           </w:p>
         </w:tc>
@@ -3020,7 +3020,7 @@
                 <w:sz w:val="16"/>
                 <w:szCs w:val="16"/>
               </w:rPr>
-              <w:t xml:space="preserve">final random forest 11.5 MB; Stage 1 logistic baseline 13 KB</w:t>
+              <w:t xml:space="preserve">final random forest 11.3 MB; Stage 1 logistic baseline 13 KB</w:t>
             </w:r>
           </w:p>
         </w:tc>
@@ -3564,7 +3564,7 @@
                 <w:sz w:val="16"/>
                 <w:szCs w:val="16"/>
               </w:rPr>
-              <w:t xml:space="preserve">11.2</w:t>
+              <w:t xml:space="preserve">7.9</w:t>
             </w:r>
           </w:p>
         </w:tc>
@@ -3637,7 +3637,7 @@
                 <w:sz w:val="16"/>
                 <w:szCs w:val="16"/>
               </w:rPr>
-              <w:t xml:space="preserve">1.2</w:t>
+              <w:t xml:space="preserve">1.3</w:t>
             </w:r>
           </w:p>
         </w:tc>
@@ -3710,7 +3710,7 @@
                 <w:sz w:val="16"/>
                 <w:szCs w:val="16"/>
               </w:rPr>
-              <w:t xml:space="preserve">35.2</w:t>
+              <w:t xml:space="preserve">37.1</w:t>
             </w:r>
           </w:p>
         </w:tc>
@@ -3783,7 +3783,7 @@
                 <w:sz w:val="16"/>
                 <w:szCs w:val="16"/>
               </w:rPr>
-              <w:t xml:space="preserve">25.0</w:t>
+              <w:t xml:space="preserve">25.4</w:t>
             </w:r>
           </w:p>
         </w:tc>
@@ -3856,7 +3856,7 @@
                 <w:sz w:val="16"/>
                 <w:szCs w:val="16"/>
               </w:rPr>
-              <w:t xml:space="preserve">74.3</w:t>
+              <w:t xml:space="preserve">73.2</w:t>
             </w:r>
           </w:p>
         </w:tc>
@@ -11599,7 +11599,7 @@
                 <w:sz w:val="16"/>
                 <w:szCs w:val="16"/>
               </w:rPr>
-              <w:t xml:space="preserve">0.0392 ± 0.0021</w:t>
+              <w:t xml:space="preserve">0.0392 ± 0.0019</w:t>
             </w:r>
           </w:p>
         </w:tc>
@@ -11740,7 +11740,7 @@
                 <w:sz w:val="16"/>
                 <w:szCs w:val="16"/>
               </w:rPr>
-              <w:t xml:space="preserve">0.0320 ± 0.0018</w:t>
+              <w:t xml:space="preserve">0.0320 ± 0.0016</w:t>
             </w:r>
           </w:p>
         </w:tc>
@@ -11881,7 +11881,7 @@
                 <w:sz w:val="16"/>
                 <w:szCs w:val="16"/>
               </w:rPr>
-              <w:t xml:space="preserve">0.0404 ± 0.0017</w:t>
+              <w:t xml:space="preserve">0.0404 ± 0.0016</w:t>
             </w:r>
           </w:p>
         </w:tc>
@@ -11900,7 +11900,7 @@
           <w:sz w:val="16"/>
           <w:szCs w:val="16"/>
         </w:rPr>
-        <w:t xml:space="preserve">Table 11. Stage 2: best cross-validated setting per model family (4 year-blocked folds, weighted log loss, 22 settings in total). The selector size k was tuned first with logistic regression (k=33: 0.0425, k=16: 0.0450, k=8: 0.0585); all 33 candidates were kept.</w:t>
+        <w:t xml:space="preserve">Table 11. Stage 2: best cross-validated setting per model family (4 year-blocked folds, weighted log loss, 22 settings in total). The selector size k was tuned first with logistic regression (k=33: 0.0426, k=16: 0.0451, k=8: 0.0586); all 33 candidates were kept.</w:t>
       </w:r>
     </w:p>
     <w:p>
@@ -11917,7 +11917,7 @@
         <w:jc w:val="both"/>
       </w:pPr>
       <w:r>
-        <w:t xml:space="preserve">Tree probabilities are not automatically calibrated. A Platt-style calibrator (an MLlib logistic regression on logit p, log h and their product) is fitted on the first half of 2023 and judged on the second half; it is kept only if it lowers the held-out log loss. For the random forest it was kept (held-out log loss 0.0298 → 0.0292); for the GBT it reduced the held-out log loss from 0.0385 to 0.0315. Finally, because a tree model does not guarantee P(&gt; 10 mm) ≤ P(&gt; 5 mm), the probabilities of each station-time are made non-increasing across thresholds with a running minimum, which changed at most 0.062 % of the 2024 predictions. The Stage 1 logistic model is monotone by construction (0 violations in 25,771,260 adjacent pairs).</w:t>
+        <w:t xml:space="preserve">Tree probabilities are not automatically calibrated. A Platt-style calibrator (an MLlib logistic regression on logit p, log h and their product) is fitted on the first half of 2023 and judged on the second half; it is kept only if it lowers the held-out log loss. For the random forest it was kept (held-out log loss 0.0298 → 0.0292); for the GBT it reduced the held-out log loss from 0.0385 to 0.0315. Finally, because a tree model does not guarantee P(&gt; 10 mm) ≤ P(&gt; 5 mm), the probabilities of each station-time are made non-increasing across thresholds with a running minimum, which changed at most 0.023 % of the 2024 predictions. The Stage 1 logistic model is monotone by construction (0 violations in 25,771,260 adjacent pairs).</w:t>
       </w:r>
     </w:p>
     <w:p>
@@ -12596,7 +12596,7 @@
                 <w:sz w:val="16"/>
                 <w:szCs w:val="16"/>
               </w:rPr>
-              <w:t xml:space="preserve">0.71</w:t>
+              <w:t xml:space="preserve">0.72</w:t>
             </w:r>
           </w:p>
         </w:tc>
@@ -12630,7 +12630,7 @@
                 <w:sz w:val="16"/>
                 <w:szCs w:val="16"/>
               </w:rPr>
-              <w:t xml:space="preserve">0.59</w:t>
+              <w:t xml:space="preserve">0.58</w:t>
             </w:r>
           </w:p>
         </w:tc>
@@ -12771,7 +12771,7 @@
                 <w:sz w:val="16"/>
                 <w:szCs w:val="16"/>
               </w:rPr>
-              <w:t xml:space="preserve">0.667</w:t>
+              <w:t xml:space="preserve">0.666</w:t>
             </w:r>
           </w:p>
         </w:tc>
@@ -12839,7 +12839,7 @@
                 <w:sz w:val="16"/>
                 <w:szCs w:val="16"/>
               </w:rPr>
-              <w:t xml:space="preserve">0.0516</w:t>
+              <w:t xml:space="preserve">0.0515</w:t>
             </w:r>
           </w:p>
         </w:tc>
@@ -12873,7 +12873,7 @@
                 <w:sz w:val="16"/>
                 <w:szCs w:val="16"/>
               </w:rPr>
-              <w:t xml:space="preserve">0.448</w:t>
+              <w:t xml:space="preserve">0.450</w:t>
             </w:r>
           </w:p>
         </w:tc>
@@ -12941,7 +12941,7 @@
                 <w:sz w:val="16"/>
                 <w:szCs w:val="16"/>
               </w:rPr>
-              <w:t xml:space="preserve">0.65</w:t>
+              <w:t xml:space="preserve">0.66</w:t>
             </w:r>
           </w:p>
         </w:tc>
@@ -12975,7 +12975,7 @@
                 <w:sz w:val="16"/>
                 <w:szCs w:val="16"/>
               </w:rPr>
-              <w:t xml:space="preserve">0.58</w:t>
+              <w:t xml:space="preserve">0.57</w:t>
             </w:r>
           </w:p>
         </w:tc>
@@ -13116,7 +13116,7 @@
                 <w:sz w:val="16"/>
                 <w:szCs w:val="16"/>
               </w:rPr>
-              <w:t xml:space="preserve">0.585</w:t>
+              <w:t xml:space="preserve">0.586</w:t>
             </w:r>
           </w:p>
         </w:tc>
@@ -13495,7 +13495,7 @@
                 <w:sz w:val="16"/>
                 <w:szCs w:val="16"/>
               </w:rPr>
-              <w:t xml:space="preserve">0.969</w:t>
+              <w:t xml:space="preserve">0.968</w:t>
             </w:r>
           </w:p>
         </w:tc>
@@ -13563,7 +13563,7 @@
                 <w:sz w:val="16"/>
                 <w:szCs w:val="16"/>
               </w:rPr>
-              <w:t xml:space="preserve">0.295</w:t>
+              <w:t xml:space="preserve">0.294</w:t>
             </w:r>
           </w:p>
         </w:tc>
@@ -13631,7 +13631,7 @@
                 <w:sz w:val="16"/>
                 <w:szCs w:val="16"/>
               </w:rPr>
-              <w:t xml:space="preserve">0.49</w:t>
+              <w:t xml:space="preserve">0.50</w:t>
             </w:r>
           </w:p>
         </w:tc>
@@ -13665,7 +13665,7 @@
                 <w:sz w:val="16"/>
                 <w:szCs w:val="16"/>
               </w:rPr>
-              <w:t xml:space="preserve">0.46</w:t>
+              <w:t xml:space="preserve">0.45</w:t>
             </w:r>
           </w:p>
         </w:tc>
@@ -13840,7 +13840,7 @@
                 <w:sz w:val="16"/>
                 <w:szCs w:val="16"/>
               </w:rPr>
-              <w:t xml:space="preserve">0.973</w:t>
+              <w:t xml:space="preserve">0.975</w:t>
             </w:r>
           </w:p>
         </w:tc>
@@ -13908,7 +13908,7 @@
                 <w:sz w:val="16"/>
                 <w:szCs w:val="16"/>
               </w:rPr>
-              <w:t xml:space="preserve">0.212</w:t>
+              <w:t xml:space="preserve">0.213</w:t>
             </w:r>
           </w:p>
         </w:tc>
@@ -13976,7 +13976,7 @@
                 <w:sz w:val="16"/>
                 <w:szCs w:val="16"/>
               </w:rPr>
-              <w:t xml:space="preserve">0.41</w:t>
+              <w:t xml:space="preserve">0.40</w:t>
             </w:r>
           </w:p>
         </w:tc>
@@ -14151,7 +14151,7 @@
                 <w:sz w:val="16"/>
                 <w:szCs w:val="16"/>
               </w:rPr>
-              <w:t xml:space="preserve">0.186</w:t>
+              <w:t xml:space="preserve">0.185</w:t>
             </w:r>
           </w:p>
         </w:tc>
@@ -14253,7 +14253,7 @@
                 <w:sz w:val="16"/>
                 <w:szCs w:val="16"/>
               </w:rPr>
-              <w:t xml:space="preserve">0.098</w:t>
+              <w:t xml:space="preserve">0.095</w:t>
             </w:r>
           </w:p>
         </w:tc>
@@ -14355,7 +14355,7 @@
                 <w:sz w:val="16"/>
                 <w:szCs w:val="16"/>
               </w:rPr>
-              <w:t xml:space="preserve">0.28</w:t>
+              <w:t xml:space="preserve">0.26</w:t>
             </w:r>
           </w:p>
         </w:tc>
@@ -14389,7 +14389,7 @@
                 <w:sz w:val="16"/>
                 <w:szCs w:val="16"/>
               </w:rPr>
-              <w:t xml:space="preserve">0.28</w:t>
+              <w:t xml:space="preserve">0.27</w:t>
             </w:r>
           </w:p>
         </w:tc>
@@ -14427,7 +14427,7 @@
         <w:t xml:space="preserve">PR-AUC 0.466</w:t>
       </w:r>
       <w:r>
-        <w:t xml:space="preserve">, 56 times the event rate, with ROC-AUC 0.969, and removes 30 % of the climatology error; at its 2023 cut-off it catches 46 % of the events with 49 % precision. Skill falls as events get rarer (PR-AUC 0.721 at 0.5 mm, 0.186 at 20 mm) while ROC-AUC stays above 0.96 throughout. The probabilities are reliable where it matters: below 10 %, where almost all forecasts lie, the observed frequency matches the forecast within 0.1 points, and the expected calibration error at 5 mm is 0.0014.</w:t>
+        <w:t xml:space="preserve">, 56 times the event rate, with ROC-AUC 0.968, and removes 29 % of the climatology error; at its 2023 cut-off it catches 45 % of the events with 50 % precision. Skill falls as events get rarer (PR-AUC 0.721 at 0.5 mm, 0.185 at 20 mm) while ROC-AUC stays above 0.96 throughout. The probabilities are reliable where it matters: below 10 %, where almost all forecasts lie, the observed frequency matches the forecast within 0.1 points, and the expected calibration error at 5 mm is 0.0016.</w:t>
       </w:r>
     </w:p>
     <w:p>
@@ -15288,7 +15288,7 @@
                 <w:sz w:val="16"/>
                 <w:szCs w:val="16"/>
               </w:rPr>
-              <w:t xml:space="preserve">0.459</w:t>
+              <w:t xml:space="preserve">0.460</w:t>
             </w:r>
           </w:p>
         </w:tc>
@@ -15322,7 +15322,7 @@
                 <w:sz w:val="16"/>
                 <w:szCs w:val="16"/>
               </w:rPr>
-              <w:t xml:space="preserve">0.966</w:t>
+              <w:t xml:space="preserve">0.964</w:t>
             </w:r>
           </w:p>
         </w:tc>
@@ -15356,7 +15356,7 @@
                 <w:sz w:val="16"/>
                 <w:szCs w:val="16"/>
               </w:rPr>
-              <w:t xml:space="preserve">0.0262</w:t>
+              <w:t xml:space="preserve">0.0263</w:t>
             </w:r>
           </w:p>
         </w:tc>
@@ -15390,7 +15390,7 @@
                 <w:sz w:val="16"/>
                 <w:szCs w:val="16"/>
               </w:rPr>
-              <w:t xml:space="preserve">0.260</w:t>
+              <w:t xml:space="preserve">0.264</w:t>
             </w:r>
           </w:p>
         </w:tc>
@@ -15497,7 +15497,7 @@
                 <w:sz w:val="16"/>
                 <w:szCs w:val="16"/>
               </w:rPr>
-              <w:t xml:space="preserve">0.970</w:t>
+              <w:t xml:space="preserve">0.968</w:t>
             </w:r>
           </w:p>
         </w:tc>
@@ -15672,7 +15672,7 @@
                 <w:sz w:val="16"/>
                 <w:szCs w:val="16"/>
               </w:rPr>
-              <w:t xml:space="preserve">0.969</w:t>
+              <w:t xml:space="preserve">0.968</w:t>
             </w:r>
           </w:p>
         </w:tc>
@@ -15740,7 +15740,7 @@
                 <w:sz w:val="16"/>
                 <w:szCs w:val="16"/>
               </w:rPr>
-              <w:t xml:space="preserve">0.295</w:t>
+              <w:t xml:space="preserve">0.294</w:t>
             </w:r>
           </w:p>
         </w:tc>
@@ -15776,7 +15776,7 @@
         <w:jc w:val="both"/>
       </w:pPr>
       <w:r>
-        <w:t xml:space="preserve">The two stages evaluate different row sets, so for a like-for-like comparison both models were scored on the 1,255,003 Stage 1 evaluation rows per threshold, matched on station, time and threshold; the matched labels agree exactly. The final model wins on PR-AUC at 5 of 5 thresholds, on ROC-AUC at 5 of 5 and on log loss at 5 of 5. The largest gain is in ranking: knowing how long it has been dry, whether it is raining elsewhere on the island and whether a storm is building tells the model in advance which dry half-hours will turn wet.</w:t>
+        <w:t xml:space="preserve">The two stages evaluate different row sets, so for a like-for-like comparison both models were scored on the 1,255,003 Stage 1 evaluation rows per threshold, matched on station, time and threshold; the matched labels agree exactly. The final model wins on PR-AUC at 4 of 5 thresholds, on ROC-AUC at 5 of 5 and on log loss at 5 of 5. The largest gain is in ranking: knowing how long it has been dry, whether it is raining elsewhere on the island and whether a storm is building tells the model in advance which dry half-hours will turn wet.</w:t>
       </w:r>
     </w:p>
     <w:tbl>
@@ -16283,7 +16283,7 @@
                 <w:sz w:val="16"/>
                 <w:szCs w:val="16"/>
               </w:rPr>
-              <w:t xml:space="preserve">0.663</w:t>
+              <w:t xml:space="preserve">0.662</w:t>
             </w:r>
           </w:p>
         </w:tc>
@@ -16419,7 +16419,7 @@
                 <w:sz w:val="16"/>
                 <w:szCs w:val="16"/>
               </w:rPr>
-              <w:t xml:space="preserve">0.0521</w:t>
+              <w:t xml:space="preserve">0.0520</w:t>
             </w:r>
           </w:p>
         </w:tc>
@@ -16594,7 +16594,7 @@
                 <w:sz w:val="16"/>
                 <w:szCs w:val="16"/>
               </w:rPr>
-              <w:t xml:space="preserve">0.585</w:t>
+              <w:t xml:space="preserve">0.586</w:t>
             </w:r>
           </w:p>
         </w:tc>
@@ -16905,7 +16905,7 @@
                 <w:sz w:val="16"/>
                 <w:szCs w:val="16"/>
               </w:rPr>
-              <w:t xml:space="preserve">0.461</w:t>
+              <w:t xml:space="preserve">0.462</w:t>
             </w:r>
           </w:p>
         </w:tc>
@@ -17216,7 +17216,7 @@
                 <w:sz w:val="16"/>
                 <w:szCs w:val="16"/>
               </w:rPr>
-              <w:t xml:space="preserve">0.350</w:t>
+              <w:t xml:space="preserve">0.351</w:t>
             </w:r>
           </w:p>
         </w:tc>
@@ -17352,7 +17352,7 @@
                 <w:sz w:val="16"/>
                 <w:szCs w:val="16"/>
               </w:rPr>
-              <w:t xml:space="preserve">0.0129</w:t>
+              <w:t xml:space="preserve">0.0128</w:t>
             </w:r>
           </w:p>
         </w:tc>
@@ -17527,7 +17527,7 @@
                 <w:sz w:val="16"/>
                 <w:szCs w:val="16"/>
               </w:rPr>
-              <w:t xml:space="preserve">0.191</w:t>
+              <w:t xml:space="preserve">0.186</w:t>
             </w:r>
           </w:p>
         </w:tc>
@@ -17663,7 +17663,7 @@
                 <w:sz w:val="16"/>
                 <w:szCs w:val="16"/>
               </w:rPr>
-              <w:t xml:space="preserve">0.0046</w:t>
+              <w:t xml:space="preserve">0.0047</w:t>
             </w:r>
           </w:p>
         </w:tc>
@@ -17753,7 +17753,7 @@
         <w:pStyle w:val="Heading2"/>
       </w:pPr>
       <w:r>
-        <w:t xml:space="preserve">8.4 Scalability: the same Spark job on 2 to 16 cores</w:t>
+        <w:t xml:space="preserve">8.4 Strong and weak scaling on the laptop</w:t>
       </w:r>
     </w:p>
     <w:p>
@@ -17762,7 +17762,17 @@
         <w:jc w:val="both"/>
       </w:pPr>
       <w:r>
-        <w:t xml:space="preserve">To see how the work divides across cores, the heart of the cleaning stage — read the 48.5 million bronze rows, snap the timestamps, de-duplicate (one shuffle), aggregate to station-days (a second shuffle) — was run in a fresh Spark session with local[2], local[4], local[8] and local[16]. 16 cores run it </w:t>
+        <w:t xml:space="preserve">The heart of the cleaning stage — read the bronze rows, snap the timestamps, de-duplicate (one shuffle), aggregate to station-days (a second shuffle) — was timed in a fresh Spark session per configuration, as the median of three runs after a warm-up. </w:t>
+      </w:r>
+      <w:r>
+        <w:rPr>
+          <w:b/>
+          <w:bCs/>
+        </w:rPr>
+        <w:t xml:space="preserve">Strong scaling</w:t>
+      </w:r>
+      <w:r>
+        <w:t xml:space="preserve"> keeps the problem fixed (all 8 years) and adds cores: 16 cores run the job </w:t>
       </w:r>
       <w:r>
         <w:rPr>
@@ -17772,7 +17782,27 @@
         <w:t xml:space="preserve">4.5× faster than 2</w:t>
       </w:r>
       <w:r>
-        <w:t xml:space="preserve"> (26 s → 6 s), a parallel efficiency of 56 %. The gain flattens at high core counts because the two shuffles and the single SSD are shared, and because 4 of the 16 cores are efficiency cores — the usual Amdahl picture, and the reason a cluster with its own disks per node scales better than one machine.</w:t>
+        <w:t xml:space="preserve"> (26 s → 6 s), a parallel efficiency of 56 %. </w:t>
+      </w:r>
+      <w:r>
+        <w:rPr>
+          <w:b/>
+          <w:bCs/>
+        </w:rPr>
+        <w:t xml:space="preserve">Amdahl's law</w:t>
+      </w:r>
+      <w:r>
+        <w:t xml:space="preserve">, Speedup = 1 / (S + P/n), explains why the gain flattens: fitting T(n) = a + b/n to the timings gives T(n) = 2.40 + 47.2/n seconds, so the serial part S — work that does not divide across cores, such as task scheduling, the shuffle exchange and the final single-row result — is </w:t>
+      </w:r>
+      <w:r>
+        <w:rPr>
+          <w:b/>
+          <w:bCs/>
+        </w:rPr>
+        <w:t xml:space="preserve">4.8 %</w:t>
+      </w:r>
+      <w:r>
+        <w:t xml:space="preserve"> of the one-core time. No number of cores could then make this job more than 21× faster than one core (10.8× faster than two).</w:t>
       </w:r>
     </w:p>
     <w:tbl>
@@ -17788,11 +17818,12 @@
         </w:tblBorders>
       </w:tblPr>
       <w:tblGrid>
+        <w:gridCol w:w="1300"/>
+        <w:gridCol w:w="1700"/>
+        <w:gridCol w:w="1900"/>
         <w:gridCol w:w="1600"/>
-        <w:gridCol w:w="2000"/>
-        <w:gridCol w:w="2200"/>
-        <w:gridCol w:w="1600"/>
-        <w:gridCol w:w="2238"/>
+        <w:gridCol w:w="1300"/>
+        <w:gridCol w:w="1838"/>
       </w:tblGrid>
       <w:tr>
         <w:trPr>
@@ -17800,7 +17831,7 @@
         </w:trPr>
         <w:tc>
           <w:tcPr>
-            <w:tcW w:type="dxa" w:w="1600"/>
+            <w:tcW w:type="dxa" w:w="1300"/>
             <w:tcBorders>
               <w:top w:val="single" w:color="D5DAE3" w:sz="4"/>
               <w:left w:val="single" w:color="D5DAE3" w:sz="4"/>
@@ -17834,7 +17865,7 @@
         </w:tc>
         <w:tc>
           <w:tcPr>
-            <w:tcW w:type="dxa" w:w="2000"/>
+            <w:tcW w:type="dxa" w:w="1700"/>
             <w:tcBorders>
               <w:top w:val="single" w:color="D5DAE3" w:sz="4"/>
               <w:left w:val="single" w:color="D5DAE3" w:sz="4"/>
@@ -17868,7 +17899,7 @@
         </w:tc>
         <w:tc>
           <w:tcPr>
-            <w:tcW w:type="dxa" w:w="2200"/>
+            <w:tcW w:type="dxa" w:w="1900"/>
             <w:tcBorders>
               <w:top w:val="single" w:color="D5DAE3" w:sz="4"/>
               <w:left w:val="single" w:color="D5DAE3" w:sz="4"/>
@@ -17930,13 +17961,47 @@
                 <w:sz w:val="16"/>
                 <w:szCs w:val="16"/>
               </w:rPr>
+              <w:t xml:space="preserve">Amdahl fit</w:t>
+            </w:r>
+          </w:p>
+        </w:tc>
+        <w:tc>
+          <w:tcPr>
+            <w:tcW w:type="dxa" w:w="1300"/>
+            <w:tcBorders>
+              <w:top w:val="single" w:color="D5DAE3" w:sz="4"/>
+              <w:left w:val="single" w:color="D5DAE3" w:sz="4"/>
+              <w:bottom w:val="single" w:color="D5DAE3" w:sz="4"/>
+              <w:right w:val="single" w:color="D5DAE3" w:sz="4"/>
+            </w:tcBorders>
+            <w:shd w:fill="1B2A4A" w:color="auto" w:val="clear"/>
+            <w:tcMar>
+              <w:top w:type="dxa" w:w="45"/>
+              <w:left w:type="dxa" w:w="80"/>
+              <w:bottom w:type="dxa" w:w="45"/>
+              <w:right w:type="dxa" w:w="80"/>
+            </w:tcMar>
+            <w:vAlign w:val="center"/>
+          </w:tcPr>
+          <w:p>
+            <w:pPr>
+              <w:jc w:val="center"/>
+            </w:pPr>
+            <w:r>
+              <w:rPr>
+                <w:b/>
+                <w:bCs/>
+                <w:color w:val="FFFFFF"/>
+                <w:sz w:val="16"/>
+                <w:szCs w:val="16"/>
+              </w:rPr>
               <w:t xml:space="preserve">Ideal</w:t>
             </w:r>
           </w:p>
         </w:tc>
         <w:tc>
           <w:tcPr>
-            <w:tcW w:type="dxa" w:w="2238"/>
+            <w:tcW w:type="dxa" w:w="1838"/>
             <w:tcBorders>
               <w:top w:val="single" w:color="D5DAE3" w:sz="4"/>
               <w:left w:val="single" w:color="D5DAE3" w:sz="4"/>
@@ -17975,6 +18040,108 @@
         </w:trPr>
         <w:tc>
           <w:tcPr>
+            <w:tcW w:type="dxa" w:w="1300"/>
+            <w:tcBorders>
+              <w:top w:val="single" w:color="D5DAE3" w:sz="4"/>
+              <w:left w:val="single" w:color="D5DAE3" w:sz="4"/>
+              <w:bottom w:val="single" w:color="D5DAE3" w:sz="4"/>
+              <w:right w:val="single" w:color="D5DAE3" w:sz="4"/>
+            </w:tcBorders>
+            <w:shd w:fill="FFFFFF" w:color="auto" w:val="clear"/>
+            <w:tcMar>
+              <w:top w:type="dxa" w:w="45"/>
+              <w:left w:type="dxa" w:w="80"/>
+              <w:bottom w:type="dxa" w:w="45"/>
+              <w:right w:type="dxa" w:w="80"/>
+            </w:tcMar>
+            <w:vAlign w:val="center"/>
+          </w:tcPr>
+          <w:p>
+            <w:pPr>
+              <w:jc w:val="left"/>
+            </w:pPr>
+            <w:r>
+              <w:rPr>
+                <w:b w:val="false"/>
+                <w:bCs w:val="false"/>
+                <w:color w:val="3C3C3C"/>
+                <w:sz w:val="16"/>
+                <w:szCs w:val="16"/>
+              </w:rPr>
+              <w:t xml:space="preserve">2</w:t>
+            </w:r>
+          </w:p>
+        </w:tc>
+        <w:tc>
+          <w:tcPr>
+            <w:tcW w:type="dxa" w:w="1700"/>
+            <w:tcBorders>
+              <w:top w:val="single" w:color="D5DAE3" w:sz="4"/>
+              <w:left w:val="single" w:color="D5DAE3" w:sz="4"/>
+              <w:bottom w:val="single" w:color="D5DAE3" w:sz="4"/>
+              <w:right w:val="single" w:color="D5DAE3" w:sz="4"/>
+            </w:tcBorders>
+            <w:shd w:fill="FFFFFF" w:color="auto" w:val="clear"/>
+            <w:tcMar>
+              <w:top w:type="dxa" w:w="45"/>
+              <w:left w:type="dxa" w:w="80"/>
+              <w:bottom w:type="dxa" w:w="45"/>
+              <w:right w:type="dxa" w:w="80"/>
+            </w:tcMar>
+            <w:vAlign w:val="center"/>
+          </w:tcPr>
+          <w:p>
+            <w:pPr>
+              <w:jc w:val="center"/>
+            </w:pPr>
+            <w:r>
+              <w:rPr>
+                <w:b w:val="false"/>
+                <w:bCs w:val="false"/>
+                <w:color w:val="3C3C3C"/>
+                <w:sz w:val="16"/>
+                <w:szCs w:val="16"/>
+              </w:rPr>
+              <w:t xml:space="preserve">26.3</w:t>
+            </w:r>
+          </w:p>
+        </w:tc>
+        <w:tc>
+          <w:tcPr>
+            <w:tcW w:type="dxa" w:w="1900"/>
+            <w:tcBorders>
+              <w:top w:val="single" w:color="D5DAE3" w:sz="4"/>
+              <w:left w:val="single" w:color="D5DAE3" w:sz="4"/>
+              <w:bottom w:val="single" w:color="D5DAE3" w:sz="4"/>
+              <w:right w:val="single" w:color="D5DAE3" w:sz="4"/>
+            </w:tcBorders>
+            <w:shd w:fill="FFFFFF" w:color="auto" w:val="clear"/>
+            <w:tcMar>
+              <w:top w:type="dxa" w:w="45"/>
+              <w:left w:type="dxa" w:w="80"/>
+              <w:bottom w:type="dxa" w:w="45"/>
+              <w:right w:type="dxa" w:w="80"/>
+            </w:tcMar>
+            <w:vAlign w:val="center"/>
+          </w:tcPr>
+          <w:p>
+            <w:pPr>
+              <w:jc w:val="center"/>
+            </w:pPr>
+            <w:r>
+              <w:rPr>
+                <w:b w:val="false"/>
+                <w:bCs w:val="false"/>
+                <w:color w:val="3C3C3C"/>
+                <w:sz w:val="16"/>
+                <w:szCs w:val="16"/>
+              </w:rPr>
+              <w:t xml:space="preserve">1.00×</w:t>
+            </w:r>
+          </w:p>
+        </w:tc>
+        <w:tc>
+          <w:tcPr>
             <w:tcW w:type="dxa" w:w="1600"/>
             <w:tcBorders>
               <w:top w:val="single" w:color="D5DAE3" w:sz="4"/>
@@ -17993,23 +18160,23 @@
           </w:tcPr>
           <w:p>
             <w:pPr>
-              <w:jc w:val="left"/>
-            </w:pPr>
-            <w:r>
-              <w:rPr>
-                <w:b w:val="false"/>
-                <w:bCs w:val="false"/>
-                <w:color w:val="3C3C3C"/>
-                <w:sz w:val="16"/>
-                <w:szCs w:val="16"/>
-              </w:rPr>
-              <w:t xml:space="preserve">2</w:t>
-            </w:r>
-          </w:p>
-        </w:tc>
-        <w:tc>
-          <w:tcPr>
-            <w:tcW w:type="dxa" w:w="2000"/>
+              <w:jc w:val="center"/>
+            </w:pPr>
+            <w:r>
+              <w:rPr>
+                <w:b w:val="false"/>
+                <w:bCs w:val="false"/>
+                <w:color w:val="3C3C3C"/>
+                <w:sz w:val="16"/>
+                <w:szCs w:val="16"/>
+              </w:rPr>
+              <w:t xml:space="preserve">1.00×</w:t>
+            </w:r>
+          </w:p>
+        </w:tc>
+        <w:tc>
+          <w:tcPr>
+            <w:tcW w:type="dxa" w:w="1300"/>
             <w:tcBorders>
               <w:top w:val="single" w:color="D5DAE3" w:sz="4"/>
               <w:left w:val="single" w:color="D5DAE3" w:sz="4"/>
@@ -18037,81 +18204,13 @@
                 <w:sz w:val="16"/>
                 <w:szCs w:val="16"/>
               </w:rPr>
-              <w:t xml:space="preserve">26.3</w:t>
-            </w:r>
-          </w:p>
-        </w:tc>
-        <w:tc>
-          <w:tcPr>
-            <w:tcW w:type="dxa" w:w="2200"/>
-            <w:tcBorders>
-              <w:top w:val="single" w:color="D5DAE3" w:sz="4"/>
-              <w:left w:val="single" w:color="D5DAE3" w:sz="4"/>
-              <w:bottom w:val="single" w:color="D5DAE3" w:sz="4"/>
-              <w:right w:val="single" w:color="D5DAE3" w:sz="4"/>
-            </w:tcBorders>
-            <w:shd w:fill="FFFFFF" w:color="auto" w:val="clear"/>
-            <w:tcMar>
-              <w:top w:type="dxa" w:w="45"/>
-              <w:left w:type="dxa" w:w="80"/>
-              <w:bottom w:type="dxa" w:w="45"/>
-              <w:right w:type="dxa" w:w="80"/>
-            </w:tcMar>
-            <w:vAlign w:val="center"/>
-          </w:tcPr>
-          <w:p>
-            <w:pPr>
-              <w:jc w:val="center"/>
-            </w:pPr>
-            <w:r>
-              <w:rPr>
-                <w:b w:val="false"/>
-                <w:bCs w:val="false"/>
-                <w:color w:val="3C3C3C"/>
-                <w:sz w:val="16"/>
-                <w:szCs w:val="16"/>
-              </w:rPr>
-              <w:t xml:space="preserve">1.00×</w:t>
-            </w:r>
-          </w:p>
-        </w:tc>
-        <w:tc>
-          <w:tcPr>
-            <w:tcW w:type="dxa" w:w="1600"/>
-            <w:tcBorders>
-              <w:top w:val="single" w:color="D5DAE3" w:sz="4"/>
-              <w:left w:val="single" w:color="D5DAE3" w:sz="4"/>
-              <w:bottom w:val="single" w:color="D5DAE3" w:sz="4"/>
-              <w:right w:val="single" w:color="D5DAE3" w:sz="4"/>
-            </w:tcBorders>
-            <w:shd w:fill="FFFFFF" w:color="auto" w:val="clear"/>
-            <w:tcMar>
-              <w:top w:type="dxa" w:w="45"/>
-              <w:left w:type="dxa" w:w="80"/>
-              <w:bottom w:type="dxa" w:w="45"/>
-              <w:right w:type="dxa" w:w="80"/>
-            </w:tcMar>
-            <w:vAlign w:val="center"/>
-          </w:tcPr>
-          <w:p>
-            <w:pPr>
-              <w:jc w:val="center"/>
-            </w:pPr>
-            <w:r>
-              <w:rPr>
-                <w:b w:val="false"/>
-                <w:bCs w:val="false"/>
-                <w:color w:val="3C3C3C"/>
-                <w:sz w:val="16"/>
-                <w:szCs w:val="16"/>
-              </w:rPr>
               <w:t xml:space="preserve">1×</w:t>
             </w:r>
           </w:p>
         </w:tc>
         <w:tc>
           <w:tcPr>
-            <w:tcW w:type="dxa" w:w="2238"/>
+            <w:tcW w:type="dxa" w:w="1838"/>
             <w:tcBorders>
               <w:top w:val="single" w:color="D5DAE3" w:sz="4"/>
               <w:left w:val="single" w:color="D5DAE3" w:sz="4"/>
@@ -18150,6 +18249,108 @@
         </w:trPr>
         <w:tc>
           <w:tcPr>
+            <w:tcW w:type="dxa" w:w="1300"/>
+            <w:tcBorders>
+              <w:top w:val="single" w:color="D5DAE3" w:sz="4"/>
+              <w:left w:val="single" w:color="D5DAE3" w:sz="4"/>
+              <w:bottom w:val="single" w:color="D5DAE3" w:sz="4"/>
+              <w:right w:val="single" w:color="D5DAE3" w:sz="4"/>
+            </w:tcBorders>
+            <w:shd w:fill="F4F6FA" w:color="auto" w:val="clear"/>
+            <w:tcMar>
+              <w:top w:type="dxa" w:w="45"/>
+              <w:left w:type="dxa" w:w="80"/>
+              <w:bottom w:type="dxa" w:w="45"/>
+              <w:right w:type="dxa" w:w="80"/>
+            </w:tcMar>
+            <w:vAlign w:val="center"/>
+          </w:tcPr>
+          <w:p>
+            <w:pPr>
+              <w:jc w:val="left"/>
+            </w:pPr>
+            <w:r>
+              <w:rPr>
+                <w:b w:val="false"/>
+                <w:bCs w:val="false"/>
+                <w:color w:val="3C3C3C"/>
+                <w:sz w:val="16"/>
+                <w:szCs w:val="16"/>
+              </w:rPr>
+              <w:t xml:space="preserve">4</w:t>
+            </w:r>
+          </w:p>
+        </w:tc>
+        <w:tc>
+          <w:tcPr>
+            <w:tcW w:type="dxa" w:w="1700"/>
+            <w:tcBorders>
+              <w:top w:val="single" w:color="D5DAE3" w:sz="4"/>
+              <w:left w:val="single" w:color="D5DAE3" w:sz="4"/>
+              <w:bottom w:val="single" w:color="D5DAE3" w:sz="4"/>
+              <w:right w:val="single" w:color="D5DAE3" w:sz="4"/>
+            </w:tcBorders>
+            <w:shd w:fill="F4F6FA" w:color="auto" w:val="clear"/>
+            <w:tcMar>
+              <w:top w:type="dxa" w:w="45"/>
+              <w:left w:type="dxa" w:w="80"/>
+              <w:bottom w:type="dxa" w:w="45"/>
+              <w:right w:type="dxa" w:w="80"/>
+            </w:tcMar>
+            <w:vAlign w:val="center"/>
+          </w:tcPr>
+          <w:p>
+            <w:pPr>
+              <w:jc w:val="center"/>
+            </w:pPr>
+            <w:r>
+              <w:rPr>
+                <w:b w:val="false"/>
+                <w:bCs w:val="false"/>
+                <w:color w:val="3C3C3C"/>
+                <w:sz w:val="16"/>
+                <w:szCs w:val="16"/>
+              </w:rPr>
+              <w:t xml:space="preserve">13.5</w:t>
+            </w:r>
+          </w:p>
+        </w:tc>
+        <w:tc>
+          <w:tcPr>
+            <w:tcW w:type="dxa" w:w="1900"/>
+            <w:tcBorders>
+              <w:top w:val="single" w:color="D5DAE3" w:sz="4"/>
+              <w:left w:val="single" w:color="D5DAE3" w:sz="4"/>
+              <w:bottom w:val="single" w:color="D5DAE3" w:sz="4"/>
+              <w:right w:val="single" w:color="D5DAE3" w:sz="4"/>
+            </w:tcBorders>
+            <w:shd w:fill="F4F6FA" w:color="auto" w:val="clear"/>
+            <w:tcMar>
+              <w:top w:type="dxa" w:w="45"/>
+              <w:left w:type="dxa" w:w="80"/>
+              <w:bottom w:type="dxa" w:w="45"/>
+              <w:right w:type="dxa" w:w="80"/>
+            </w:tcMar>
+            <w:vAlign w:val="center"/>
+          </w:tcPr>
+          <w:p>
+            <w:pPr>
+              <w:jc w:val="center"/>
+            </w:pPr>
+            <w:r>
+              <w:rPr>
+                <w:b w:val="false"/>
+                <w:bCs w:val="false"/>
+                <w:color w:val="3C3C3C"/>
+                <w:sz w:val="16"/>
+                <w:szCs w:val="16"/>
+              </w:rPr>
+              <w:t xml:space="preserve">1.95×</w:t>
+            </w:r>
+          </w:p>
+        </w:tc>
+        <w:tc>
+          <w:tcPr>
             <w:tcW w:type="dxa" w:w="1600"/>
             <w:tcBorders>
               <w:top w:val="single" w:color="D5DAE3" w:sz="4"/>
@@ -18168,23 +18369,23 @@
           </w:tcPr>
           <w:p>
             <w:pPr>
-              <w:jc w:val="left"/>
-            </w:pPr>
-            <w:r>
-              <w:rPr>
-                <w:b w:val="false"/>
-                <w:bCs w:val="false"/>
-                <w:color w:val="3C3C3C"/>
-                <w:sz w:val="16"/>
-                <w:szCs w:val="16"/>
-              </w:rPr>
-              <w:t xml:space="preserve">4</w:t>
-            </w:r>
-          </w:p>
-        </w:tc>
-        <w:tc>
-          <w:tcPr>
-            <w:tcW w:type="dxa" w:w="2000"/>
+              <w:jc w:val="center"/>
+            </w:pPr>
+            <w:r>
+              <w:rPr>
+                <w:b w:val="false"/>
+                <w:bCs w:val="false"/>
+                <w:color w:val="3C3C3C"/>
+                <w:sz w:val="16"/>
+                <w:szCs w:val="16"/>
+              </w:rPr>
+              <w:t xml:space="preserve">1.83×</w:t>
+            </w:r>
+          </w:p>
+        </w:tc>
+        <w:tc>
+          <w:tcPr>
+            <w:tcW w:type="dxa" w:w="1300"/>
             <w:tcBorders>
               <w:top w:val="single" w:color="D5DAE3" w:sz="4"/>
               <w:left w:val="single" w:color="D5DAE3" w:sz="4"/>
@@ -18212,13 +18413,13 @@
                 <w:sz w:val="16"/>
                 <w:szCs w:val="16"/>
               </w:rPr>
-              <w:t xml:space="preserve">13.4</w:t>
-            </w:r>
-          </w:p>
-        </w:tc>
-        <w:tc>
-          <w:tcPr>
-            <w:tcW w:type="dxa" w:w="2200"/>
+              <w:t xml:space="preserve">2×</w:t>
+            </w:r>
+          </w:p>
+        </w:tc>
+        <w:tc>
+          <w:tcPr>
+            <w:tcW w:type="dxa" w:w="1838"/>
             <w:tcBorders>
               <w:top w:val="single" w:color="D5DAE3" w:sz="4"/>
               <w:left w:val="single" w:color="D5DAE3" w:sz="4"/>
@@ -18246,75 +18447,7 @@
                 <w:sz w:val="16"/>
                 <w:szCs w:val="16"/>
               </w:rPr>
-              <w:t xml:space="preserve">1.96×</w:t>
-            </w:r>
-          </w:p>
-        </w:tc>
-        <w:tc>
-          <w:tcPr>
-            <w:tcW w:type="dxa" w:w="1600"/>
-            <w:tcBorders>
-              <w:top w:val="single" w:color="D5DAE3" w:sz="4"/>
-              <w:left w:val="single" w:color="D5DAE3" w:sz="4"/>
-              <w:bottom w:val="single" w:color="D5DAE3" w:sz="4"/>
-              <w:right w:val="single" w:color="D5DAE3" w:sz="4"/>
-            </w:tcBorders>
-            <w:shd w:fill="F4F6FA" w:color="auto" w:val="clear"/>
-            <w:tcMar>
-              <w:top w:type="dxa" w:w="45"/>
-              <w:left w:type="dxa" w:w="80"/>
-              <w:bottom w:type="dxa" w:w="45"/>
-              <w:right w:type="dxa" w:w="80"/>
-            </w:tcMar>
-            <w:vAlign w:val="center"/>
-          </w:tcPr>
-          <w:p>
-            <w:pPr>
-              <w:jc w:val="center"/>
-            </w:pPr>
-            <w:r>
-              <w:rPr>
-                <w:b w:val="false"/>
-                <w:bCs w:val="false"/>
-                <w:color w:val="3C3C3C"/>
-                <w:sz w:val="16"/>
-                <w:szCs w:val="16"/>
-              </w:rPr>
-              <w:t xml:space="preserve">2×</w:t>
-            </w:r>
-          </w:p>
-        </w:tc>
-        <w:tc>
-          <w:tcPr>
-            <w:tcW w:type="dxa" w:w="2238"/>
-            <w:tcBorders>
-              <w:top w:val="single" w:color="D5DAE3" w:sz="4"/>
-              <w:left w:val="single" w:color="D5DAE3" w:sz="4"/>
-              <w:bottom w:val="single" w:color="D5DAE3" w:sz="4"/>
-              <w:right w:val="single" w:color="D5DAE3" w:sz="4"/>
-            </w:tcBorders>
-            <w:shd w:fill="F4F6FA" w:color="auto" w:val="clear"/>
-            <w:tcMar>
-              <w:top w:type="dxa" w:w="45"/>
-              <w:left w:type="dxa" w:w="80"/>
-              <w:bottom w:type="dxa" w:w="45"/>
-              <w:right w:type="dxa" w:w="80"/>
-            </w:tcMar>
-            <w:vAlign w:val="center"/>
-          </w:tcPr>
-          <w:p>
-            <w:pPr>
-              <w:jc w:val="center"/>
-            </w:pPr>
-            <w:r>
-              <w:rPr>
-                <w:b w:val="false"/>
-                <w:bCs w:val="false"/>
-                <w:color w:val="3C3C3C"/>
-                <w:sz w:val="16"/>
-                <w:szCs w:val="16"/>
-              </w:rPr>
-              <w:t xml:space="preserve">98 %</w:t>
+              <w:t xml:space="preserve">97 %</w:t>
             </w:r>
           </w:p>
         </w:tc>
@@ -18325,6 +18458,108 @@
         </w:trPr>
         <w:tc>
           <w:tcPr>
+            <w:tcW w:type="dxa" w:w="1300"/>
+            <w:tcBorders>
+              <w:top w:val="single" w:color="D5DAE3" w:sz="4"/>
+              <w:left w:val="single" w:color="D5DAE3" w:sz="4"/>
+              <w:bottom w:val="single" w:color="D5DAE3" w:sz="4"/>
+              <w:right w:val="single" w:color="D5DAE3" w:sz="4"/>
+            </w:tcBorders>
+            <w:shd w:fill="FFFFFF" w:color="auto" w:val="clear"/>
+            <w:tcMar>
+              <w:top w:type="dxa" w:w="45"/>
+              <w:left w:type="dxa" w:w="80"/>
+              <w:bottom w:type="dxa" w:w="45"/>
+              <w:right w:type="dxa" w:w="80"/>
+            </w:tcMar>
+            <w:vAlign w:val="center"/>
+          </w:tcPr>
+          <w:p>
+            <w:pPr>
+              <w:jc w:val="left"/>
+            </w:pPr>
+            <w:r>
+              <w:rPr>
+                <w:b w:val="false"/>
+                <w:bCs w:val="false"/>
+                <w:color w:val="3C3C3C"/>
+                <w:sz w:val="16"/>
+                <w:szCs w:val="16"/>
+              </w:rPr>
+              <w:t xml:space="preserve">8</w:t>
+            </w:r>
+          </w:p>
+        </w:tc>
+        <w:tc>
+          <w:tcPr>
+            <w:tcW w:type="dxa" w:w="1700"/>
+            <w:tcBorders>
+              <w:top w:val="single" w:color="D5DAE3" w:sz="4"/>
+              <w:left w:val="single" w:color="D5DAE3" w:sz="4"/>
+              <w:bottom w:val="single" w:color="D5DAE3" w:sz="4"/>
+              <w:right w:val="single" w:color="D5DAE3" w:sz="4"/>
+            </w:tcBorders>
+            <w:shd w:fill="FFFFFF" w:color="auto" w:val="clear"/>
+            <w:tcMar>
+              <w:top w:type="dxa" w:w="45"/>
+              <w:left w:type="dxa" w:w="80"/>
+              <w:bottom w:type="dxa" w:w="45"/>
+              <w:right w:type="dxa" w:w="80"/>
+            </w:tcMar>
+            <w:vAlign w:val="center"/>
+          </w:tcPr>
+          <w:p>
+            <w:pPr>
+              <w:jc w:val="center"/>
+            </w:pPr>
+            <w:r>
+              <w:rPr>
+                <w:b w:val="false"/>
+                <w:bCs w:val="false"/>
+                <w:color w:val="3C3C3C"/>
+                <w:sz w:val="16"/>
+                <w:szCs w:val="16"/>
+              </w:rPr>
+              <w:t xml:space="preserve">8.1</w:t>
+            </w:r>
+          </w:p>
+        </w:tc>
+        <w:tc>
+          <w:tcPr>
+            <w:tcW w:type="dxa" w:w="1900"/>
+            <w:tcBorders>
+              <w:top w:val="single" w:color="D5DAE3" w:sz="4"/>
+              <w:left w:val="single" w:color="D5DAE3" w:sz="4"/>
+              <w:bottom w:val="single" w:color="D5DAE3" w:sz="4"/>
+              <w:right w:val="single" w:color="D5DAE3" w:sz="4"/>
+            </w:tcBorders>
+            <w:shd w:fill="FFFFFF" w:color="auto" w:val="clear"/>
+            <w:tcMar>
+              <w:top w:type="dxa" w:w="45"/>
+              <w:left w:type="dxa" w:w="80"/>
+              <w:bottom w:type="dxa" w:w="45"/>
+              <w:right w:type="dxa" w:w="80"/>
+            </w:tcMar>
+            <w:vAlign w:val="center"/>
+          </w:tcPr>
+          <w:p>
+            <w:pPr>
+              <w:jc w:val="center"/>
+            </w:pPr>
+            <w:r>
+              <w:rPr>
+                <w:b w:val="false"/>
+                <w:bCs w:val="false"/>
+                <w:color w:val="3C3C3C"/>
+                <w:sz w:val="16"/>
+                <w:szCs w:val="16"/>
+              </w:rPr>
+              <w:t xml:space="preserve">3.25×</w:t>
+            </w:r>
+          </w:p>
+        </w:tc>
+        <w:tc>
+          <w:tcPr>
             <w:tcW w:type="dxa" w:w="1600"/>
             <w:tcBorders>
               <w:top w:val="single" w:color="D5DAE3" w:sz="4"/>
@@ -18343,23 +18578,23 @@
           </w:tcPr>
           <w:p>
             <w:pPr>
-              <w:jc w:val="left"/>
-            </w:pPr>
-            <w:r>
-              <w:rPr>
-                <w:b w:val="false"/>
-                <w:bCs w:val="false"/>
-                <w:color w:val="3C3C3C"/>
-                <w:sz w:val="16"/>
-                <w:szCs w:val="16"/>
-              </w:rPr>
-              <w:t xml:space="preserve">8</w:t>
-            </w:r>
-          </w:p>
-        </w:tc>
-        <w:tc>
-          <w:tcPr>
-            <w:tcW w:type="dxa" w:w="2000"/>
+              <w:jc w:val="center"/>
+            </w:pPr>
+            <w:r>
+              <w:rPr>
+                <w:b w:val="false"/>
+                <w:bCs w:val="false"/>
+                <w:color w:val="3C3C3C"/>
+                <w:sz w:val="16"/>
+                <w:szCs w:val="16"/>
+              </w:rPr>
+              <w:t xml:space="preserve">3.13×</w:t>
+            </w:r>
+          </w:p>
+        </w:tc>
+        <w:tc>
+          <w:tcPr>
+            <w:tcW w:type="dxa" w:w="1300"/>
             <w:tcBorders>
               <w:top w:val="single" w:color="D5DAE3" w:sz="4"/>
               <w:left w:val="single" w:color="D5DAE3" w:sz="4"/>
@@ -18387,13 +18622,13 @@
                 <w:sz w:val="16"/>
                 <w:szCs w:val="16"/>
               </w:rPr>
-              <w:t xml:space="preserve">8.0</w:t>
-            </w:r>
-          </w:p>
-        </w:tc>
-        <w:tc>
-          <w:tcPr>
-            <w:tcW w:type="dxa" w:w="2200"/>
+              <w:t xml:space="preserve">4×</w:t>
+            </w:r>
+          </w:p>
+        </w:tc>
+        <w:tc>
+          <w:tcPr>
+            <w:tcW w:type="dxa" w:w="1838"/>
             <w:tcBorders>
               <w:top w:val="single" w:color="D5DAE3" w:sz="4"/>
               <w:left w:val="single" w:color="D5DAE3" w:sz="4"/>
@@ -18421,75 +18656,7 @@
                 <w:sz w:val="16"/>
                 <w:szCs w:val="16"/>
               </w:rPr>
-              <w:t xml:space="preserve">3.29×</w:t>
-            </w:r>
-          </w:p>
-        </w:tc>
-        <w:tc>
-          <w:tcPr>
-            <w:tcW w:type="dxa" w:w="1600"/>
-            <w:tcBorders>
-              <w:top w:val="single" w:color="D5DAE3" w:sz="4"/>
-              <w:left w:val="single" w:color="D5DAE3" w:sz="4"/>
-              <w:bottom w:val="single" w:color="D5DAE3" w:sz="4"/>
-              <w:right w:val="single" w:color="D5DAE3" w:sz="4"/>
-            </w:tcBorders>
-            <w:shd w:fill="FFFFFF" w:color="auto" w:val="clear"/>
-            <w:tcMar>
-              <w:top w:type="dxa" w:w="45"/>
-              <w:left w:type="dxa" w:w="80"/>
-              <w:bottom w:type="dxa" w:w="45"/>
-              <w:right w:type="dxa" w:w="80"/>
-            </w:tcMar>
-            <w:vAlign w:val="center"/>
-          </w:tcPr>
-          <w:p>
-            <w:pPr>
-              <w:jc w:val="center"/>
-            </w:pPr>
-            <w:r>
-              <w:rPr>
-                <w:b w:val="false"/>
-                <w:bCs w:val="false"/>
-                <w:color w:val="3C3C3C"/>
-                <w:sz w:val="16"/>
-                <w:szCs w:val="16"/>
-              </w:rPr>
-              <w:t xml:space="preserve">4×</w:t>
-            </w:r>
-          </w:p>
-        </w:tc>
-        <w:tc>
-          <w:tcPr>
-            <w:tcW w:type="dxa" w:w="2238"/>
-            <w:tcBorders>
-              <w:top w:val="single" w:color="D5DAE3" w:sz="4"/>
-              <w:left w:val="single" w:color="D5DAE3" w:sz="4"/>
-              <w:bottom w:val="single" w:color="D5DAE3" w:sz="4"/>
-              <w:right w:val="single" w:color="D5DAE3" w:sz="4"/>
-            </w:tcBorders>
-            <w:shd w:fill="FFFFFF" w:color="auto" w:val="clear"/>
-            <w:tcMar>
-              <w:top w:type="dxa" w:w="45"/>
-              <w:left w:type="dxa" w:w="80"/>
-              <w:bottom w:type="dxa" w:w="45"/>
-              <w:right w:type="dxa" w:w="80"/>
-            </w:tcMar>
-            <w:vAlign w:val="center"/>
-          </w:tcPr>
-          <w:p>
-            <w:pPr>
-              <w:jc w:val="center"/>
-            </w:pPr>
-            <w:r>
-              <w:rPr>
-                <w:b w:val="false"/>
-                <w:bCs w:val="false"/>
-                <w:color w:val="3C3C3C"/>
-                <w:sz w:val="16"/>
-                <w:szCs w:val="16"/>
-              </w:rPr>
-              <w:t xml:space="preserve">82 %</w:t>
+              <w:t xml:space="preserve">81 %</w:t>
             </w:r>
           </w:p>
         </w:tc>
@@ -18500,6 +18667,108 @@
         </w:trPr>
         <w:tc>
           <w:tcPr>
+            <w:tcW w:type="dxa" w:w="1300"/>
+            <w:tcBorders>
+              <w:top w:val="single" w:color="D5DAE3" w:sz="4"/>
+              <w:left w:val="single" w:color="D5DAE3" w:sz="4"/>
+              <w:bottom w:val="single" w:color="D5DAE3" w:sz="4"/>
+              <w:right w:val="single" w:color="D5DAE3" w:sz="4"/>
+            </w:tcBorders>
+            <w:shd w:fill="F4F6FA" w:color="auto" w:val="clear"/>
+            <w:tcMar>
+              <w:top w:type="dxa" w:w="45"/>
+              <w:left w:type="dxa" w:w="80"/>
+              <w:bottom w:type="dxa" w:w="45"/>
+              <w:right w:type="dxa" w:w="80"/>
+            </w:tcMar>
+            <w:vAlign w:val="center"/>
+          </w:tcPr>
+          <w:p>
+            <w:pPr>
+              <w:jc w:val="left"/>
+            </w:pPr>
+            <w:r>
+              <w:rPr>
+                <w:b w:val="false"/>
+                <w:bCs w:val="false"/>
+                <w:color w:val="3C3C3C"/>
+                <w:sz w:val="16"/>
+                <w:szCs w:val="16"/>
+              </w:rPr>
+              <w:t xml:space="preserve">16</w:t>
+            </w:r>
+          </w:p>
+        </w:tc>
+        <w:tc>
+          <w:tcPr>
+            <w:tcW w:type="dxa" w:w="1700"/>
+            <w:tcBorders>
+              <w:top w:val="single" w:color="D5DAE3" w:sz="4"/>
+              <w:left w:val="single" w:color="D5DAE3" w:sz="4"/>
+              <w:bottom w:val="single" w:color="D5DAE3" w:sz="4"/>
+              <w:right w:val="single" w:color="D5DAE3" w:sz="4"/>
+            </w:tcBorders>
+            <w:shd w:fill="F4F6FA" w:color="auto" w:val="clear"/>
+            <w:tcMar>
+              <w:top w:type="dxa" w:w="45"/>
+              <w:left w:type="dxa" w:w="80"/>
+              <w:bottom w:type="dxa" w:w="45"/>
+              <w:right w:type="dxa" w:w="80"/>
+            </w:tcMar>
+            <w:vAlign w:val="center"/>
+          </w:tcPr>
+          <w:p>
+            <w:pPr>
+              <w:jc w:val="center"/>
+            </w:pPr>
+            <w:r>
+              <w:rPr>
+                <w:b w:val="false"/>
+                <w:bCs w:val="false"/>
+                <w:color w:val="3C3C3C"/>
+                <w:sz w:val="16"/>
+                <w:szCs w:val="16"/>
+              </w:rPr>
+              <w:t xml:space="preserve">5.9</w:t>
+            </w:r>
+          </w:p>
+        </w:tc>
+        <w:tc>
+          <w:tcPr>
+            <w:tcW w:type="dxa" w:w="1900"/>
+            <w:tcBorders>
+              <w:top w:val="single" w:color="D5DAE3" w:sz="4"/>
+              <w:left w:val="single" w:color="D5DAE3" w:sz="4"/>
+              <w:bottom w:val="single" w:color="D5DAE3" w:sz="4"/>
+              <w:right w:val="single" w:color="D5DAE3" w:sz="4"/>
+            </w:tcBorders>
+            <w:shd w:fill="F4F6FA" w:color="auto" w:val="clear"/>
+            <w:tcMar>
+              <w:top w:type="dxa" w:w="45"/>
+              <w:left w:type="dxa" w:w="80"/>
+              <w:bottom w:type="dxa" w:w="45"/>
+              <w:right w:type="dxa" w:w="80"/>
+            </w:tcMar>
+            <w:vAlign w:val="center"/>
+          </w:tcPr>
+          <w:p>
+            <w:pPr>
+              <w:jc w:val="center"/>
+            </w:pPr>
+            <w:r>
+              <w:rPr>
+                <w:b w:val="false"/>
+                <w:bCs w:val="false"/>
+                <w:color w:val="3C3C3C"/>
+                <w:sz w:val="16"/>
+                <w:szCs w:val="16"/>
+              </w:rPr>
+              <w:t xml:space="preserve">4.46×</w:t>
+            </w:r>
+          </w:p>
+        </w:tc>
+        <w:tc>
+          <w:tcPr>
             <w:tcW w:type="dxa" w:w="1600"/>
             <w:tcBorders>
               <w:top w:val="single" w:color="D5DAE3" w:sz="4"/>
@@ -18518,23 +18787,23 @@
           </w:tcPr>
           <w:p>
             <w:pPr>
-              <w:jc w:val="left"/>
-            </w:pPr>
-            <w:r>
-              <w:rPr>
-                <w:b w:val="false"/>
-                <w:bCs w:val="false"/>
-                <w:color w:val="3C3C3C"/>
-                <w:sz w:val="16"/>
-                <w:szCs w:val="16"/>
-              </w:rPr>
-              <w:t xml:space="preserve">16</w:t>
-            </w:r>
-          </w:p>
-        </w:tc>
-        <w:tc>
-          <w:tcPr>
-            <w:tcW w:type="dxa" w:w="2000"/>
+              <w:jc w:val="center"/>
+            </w:pPr>
+            <w:r>
+              <w:rPr>
+                <w:b w:val="false"/>
+                <w:bCs w:val="false"/>
+                <w:color w:val="3C3C3C"/>
+                <w:sz w:val="16"/>
+                <w:szCs w:val="16"/>
+              </w:rPr>
+              <w:t xml:space="preserve">4.86×</w:t>
+            </w:r>
+          </w:p>
+        </w:tc>
+        <w:tc>
+          <w:tcPr>
+            <w:tcW w:type="dxa" w:w="1300"/>
             <w:tcBorders>
               <w:top w:val="single" w:color="D5DAE3" w:sz="4"/>
               <w:left w:val="single" w:color="D5DAE3" w:sz="4"/>
@@ -18562,81 +18831,13 @@
                 <w:sz w:val="16"/>
                 <w:szCs w:val="16"/>
               </w:rPr>
-              <w:t xml:space="preserve">5.9</w:t>
-            </w:r>
-          </w:p>
-        </w:tc>
-        <w:tc>
-          <w:tcPr>
-            <w:tcW w:type="dxa" w:w="2200"/>
-            <w:tcBorders>
-              <w:top w:val="single" w:color="D5DAE3" w:sz="4"/>
-              <w:left w:val="single" w:color="D5DAE3" w:sz="4"/>
-              <w:bottom w:val="single" w:color="D5DAE3" w:sz="4"/>
-              <w:right w:val="single" w:color="D5DAE3" w:sz="4"/>
-            </w:tcBorders>
-            <w:shd w:fill="F4F6FA" w:color="auto" w:val="clear"/>
-            <w:tcMar>
-              <w:top w:type="dxa" w:w="45"/>
-              <w:left w:type="dxa" w:w="80"/>
-              <w:bottom w:type="dxa" w:w="45"/>
-              <w:right w:type="dxa" w:w="80"/>
-            </w:tcMar>
-            <w:vAlign w:val="center"/>
-          </w:tcPr>
-          <w:p>
-            <w:pPr>
-              <w:jc w:val="center"/>
-            </w:pPr>
-            <w:r>
-              <w:rPr>
-                <w:b w:val="false"/>
-                <w:bCs w:val="false"/>
-                <w:color w:val="3C3C3C"/>
-                <w:sz w:val="16"/>
-                <w:szCs w:val="16"/>
-              </w:rPr>
-              <w:t xml:space="preserve">4.46×</w:t>
-            </w:r>
-          </w:p>
-        </w:tc>
-        <w:tc>
-          <w:tcPr>
-            <w:tcW w:type="dxa" w:w="1600"/>
-            <w:tcBorders>
-              <w:top w:val="single" w:color="D5DAE3" w:sz="4"/>
-              <w:left w:val="single" w:color="D5DAE3" w:sz="4"/>
-              <w:bottom w:val="single" w:color="D5DAE3" w:sz="4"/>
-              <w:right w:val="single" w:color="D5DAE3" w:sz="4"/>
-            </w:tcBorders>
-            <w:shd w:fill="F4F6FA" w:color="auto" w:val="clear"/>
-            <w:tcMar>
-              <w:top w:type="dxa" w:w="45"/>
-              <w:left w:type="dxa" w:w="80"/>
-              <w:bottom w:type="dxa" w:w="45"/>
-              <w:right w:type="dxa" w:w="80"/>
-            </w:tcMar>
-            <w:vAlign w:val="center"/>
-          </w:tcPr>
-          <w:p>
-            <w:pPr>
-              <w:jc w:val="center"/>
-            </w:pPr>
-            <w:r>
-              <w:rPr>
-                <w:b w:val="false"/>
-                <w:bCs w:val="false"/>
-                <w:color w:val="3C3C3C"/>
-                <w:sz w:val="16"/>
-                <w:szCs w:val="16"/>
-              </w:rPr>
               <w:t xml:space="preserve">8×</w:t>
             </w:r>
           </w:p>
         </w:tc>
         <w:tc>
           <w:tcPr>
-            <w:tcW w:type="dxa" w:w="2238"/>
+            <w:tcW w:type="dxa" w:w="1838"/>
             <w:tcBorders>
               <w:top w:val="single" w:color="D5DAE3" w:sz="4"/>
               <w:left w:val="single" w:color="D5DAE3" w:sz="4"/>
@@ -18683,7 +18884,1286 @@
           <w:sz w:val="16"/>
           <w:szCs w:val="16"/>
         </w:rPr>
-        <w:t xml:space="preserve">Table 15. Wall time and speed-up of the cleaning job against the number of cores (t42_scaling.csv).</w:t>
+        <w:t xml:space="preserve">Table 15. Strong scaling: all 8 years on 2–16 cores (median of three runs; t42_scaling.csv, t47_amdahl_fit.csv).</w:t>
+      </w:r>
+    </w:p>
+    <w:p>
+      <w:pPr>
+        <w:spacing w:after="120" w:line="276"/>
+        <w:jc w:val="both"/>
+      </w:pPr>
+      <w:r>
+        <w:rPr>
+          <w:b/>
+          <w:bCs/>
+        </w:rPr>
+        <w:t xml:space="preserve">Weak scaling</w:t>
+      </w:r>
+      <w:r>
+        <w:t xml:space="preserve"> grows the problem with the cores — 1 year on 2 cores, 2 on 4, 4 on 8, 8 on 16 — so ideally the time stays constant and the throughput grows linearly with the cores (</w:t>
+      </w:r>
+      <w:r>
+        <w:rPr>
+          <w:b/>
+          <w:bCs/>
+        </w:rPr>
+        <w:t xml:space="preserve">Gustafson's law</w:t>
+      </w:r>
+      <w:r>
+        <w:t xml:space="preserve">). The time rises only from 3.3 s to 5.8 s while the data grows 9.2-fold, a scaled speed-up of 5.3× on 16 cores (ideal 8×, efficiency 66 %). Both experiments point to the same limit: the cores of one machine share one memory bus and one SSD, and 4 of the 16 are slower efficiency cores — which is what a cluster, with its own CPU, memory and disk per node, avoids (Section 8.5).</w:t>
+      </w:r>
+    </w:p>
+    <w:tbl>
+      <w:tblPr>
+        <w:tblW w:type="dxa" w:w="9638"/>
+        <w:tblBorders>
+          <w:top w:val="single" w:color="auto" w:sz="4"/>
+          <w:left w:val="single" w:color="auto" w:sz="4"/>
+          <w:bottom w:val="single" w:color="auto" w:sz="4"/>
+          <w:right w:val="single" w:color="auto" w:sz="4"/>
+          <w:insideH w:val="single" w:color="auto" w:sz="4"/>
+          <w:insideV w:val="single" w:color="auto" w:sz="4"/>
+        </w:tblBorders>
+      </w:tblPr>
+      <w:tblGrid>
+        <w:gridCol w:w="1100"/>
+        <w:gridCol w:w="1500"/>
+        <w:gridCol w:w="1300"/>
+        <w:gridCol w:w="1500"/>
+        <w:gridCol w:w="1638"/>
+        <w:gridCol w:w="1100"/>
+        <w:gridCol w:w="1500"/>
+      </w:tblGrid>
+      <w:tr>
+        <w:trPr>
+          <w:tblHeader/>
+        </w:trPr>
+        <w:tc>
+          <w:tcPr>
+            <w:tcW w:type="dxa" w:w="1100"/>
+            <w:tcBorders>
+              <w:top w:val="single" w:color="D5DAE3" w:sz="4"/>
+              <w:left w:val="single" w:color="D5DAE3" w:sz="4"/>
+              <w:bottom w:val="single" w:color="D5DAE3" w:sz="4"/>
+              <w:right w:val="single" w:color="D5DAE3" w:sz="4"/>
+            </w:tcBorders>
+            <w:shd w:fill="1B2A4A" w:color="auto" w:val="clear"/>
+            <w:tcMar>
+              <w:top w:type="dxa" w:w="45"/>
+              <w:left w:type="dxa" w:w="80"/>
+              <w:bottom w:type="dxa" w:w="45"/>
+              <w:right w:type="dxa" w:w="80"/>
+            </w:tcMar>
+            <w:vAlign w:val="center"/>
+          </w:tcPr>
+          <w:p>
+            <w:pPr>
+              <w:jc w:val="left"/>
+            </w:pPr>
+            <w:r>
+              <w:rPr>
+                <w:b/>
+                <w:bCs/>
+                <w:color w:val="FFFFFF"/>
+                <w:sz w:val="16"/>
+                <w:szCs w:val="16"/>
+              </w:rPr>
+              <w:t xml:space="preserve">Cores</w:t>
+            </w:r>
+          </w:p>
+        </w:tc>
+        <w:tc>
+          <w:tcPr>
+            <w:tcW w:type="dxa" w:w="1500"/>
+            <w:tcBorders>
+              <w:top w:val="single" w:color="D5DAE3" w:sz="4"/>
+              <w:left w:val="single" w:color="D5DAE3" w:sz="4"/>
+              <w:bottom w:val="single" w:color="D5DAE3" w:sz="4"/>
+              <w:right w:val="single" w:color="D5DAE3" w:sz="4"/>
+            </w:tcBorders>
+            <w:shd w:fill="1B2A4A" w:color="auto" w:val="clear"/>
+            <w:tcMar>
+              <w:top w:type="dxa" w:w="45"/>
+              <w:left w:type="dxa" w:w="80"/>
+              <w:bottom w:type="dxa" w:w="45"/>
+              <w:right w:type="dxa" w:w="80"/>
+            </w:tcMar>
+            <w:vAlign w:val="center"/>
+          </w:tcPr>
+          <w:p>
+            <w:pPr>
+              <w:jc w:val="center"/>
+            </w:pPr>
+            <w:r>
+              <w:rPr>
+                <w:b/>
+                <w:bCs/>
+                <w:color w:val="FFFFFF"/>
+                <w:sz w:val="16"/>
+                <w:szCs w:val="16"/>
+              </w:rPr>
+              <w:t xml:space="preserve">Years</w:t>
+            </w:r>
+          </w:p>
+        </w:tc>
+        <w:tc>
+          <w:tcPr>
+            <w:tcW w:type="dxa" w:w="1300"/>
+            <w:tcBorders>
+              <w:top w:val="single" w:color="D5DAE3" w:sz="4"/>
+              <w:left w:val="single" w:color="D5DAE3" w:sz="4"/>
+              <w:bottom w:val="single" w:color="D5DAE3" w:sz="4"/>
+              <w:right w:val="single" w:color="D5DAE3" w:sz="4"/>
+            </w:tcBorders>
+            <w:shd w:fill="1B2A4A" w:color="auto" w:val="clear"/>
+            <w:tcMar>
+              <w:top w:type="dxa" w:w="45"/>
+              <w:left w:type="dxa" w:w="80"/>
+              <w:bottom w:type="dxa" w:w="45"/>
+              <w:right w:type="dxa" w:w="80"/>
+            </w:tcMar>
+            <w:vAlign w:val="center"/>
+          </w:tcPr>
+          <w:p>
+            <w:pPr>
+              <w:jc w:val="center"/>
+            </w:pPr>
+            <w:r>
+              <w:rPr>
+                <w:b/>
+                <w:bCs/>
+                <w:color w:val="FFFFFF"/>
+                <w:sz w:val="16"/>
+                <w:szCs w:val="16"/>
+              </w:rPr>
+              <w:t xml:space="preserve">Rows (M)</w:t>
+            </w:r>
+          </w:p>
+        </w:tc>
+        <w:tc>
+          <w:tcPr>
+            <w:tcW w:type="dxa" w:w="1500"/>
+            <w:tcBorders>
+              <w:top w:val="single" w:color="D5DAE3" w:sz="4"/>
+              <w:left w:val="single" w:color="D5DAE3" w:sz="4"/>
+              <w:bottom w:val="single" w:color="D5DAE3" w:sz="4"/>
+              <w:right w:val="single" w:color="D5DAE3" w:sz="4"/>
+            </w:tcBorders>
+            <w:shd w:fill="1B2A4A" w:color="auto" w:val="clear"/>
+            <w:tcMar>
+              <w:top w:type="dxa" w:w="45"/>
+              <w:left w:type="dxa" w:w="80"/>
+              <w:bottom w:type="dxa" w:w="45"/>
+              <w:right w:type="dxa" w:w="80"/>
+            </w:tcMar>
+            <w:vAlign w:val="center"/>
+          </w:tcPr>
+          <w:p>
+            <w:pPr>
+              <w:jc w:val="center"/>
+            </w:pPr>
+            <w:r>
+              <w:rPr>
+                <w:b/>
+                <w:bCs/>
+                <w:color w:val="FFFFFF"/>
+                <w:sz w:val="16"/>
+                <w:szCs w:val="16"/>
+              </w:rPr>
+              <w:t xml:space="preserve">Wall time (s)</w:t>
+            </w:r>
+          </w:p>
+        </w:tc>
+        <w:tc>
+          <w:tcPr>
+            <w:tcW w:type="dxa" w:w="1638"/>
+            <w:tcBorders>
+              <w:top w:val="single" w:color="D5DAE3" w:sz="4"/>
+              <w:left w:val="single" w:color="D5DAE3" w:sz="4"/>
+              <w:bottom w:val="single" w:color="D5DAE3" w:sz="4"/>
+              <w:right w:val="single" w:color="D5DAE3" w:sz="4"/>
+            </w:tcBorders>
+            <w:shd w:fill="1B2A4A" w:color="auto" w:val="clear"/>
+            <w:tcMar>
+              <w:top w:type="dxa" w:w="45"/>
+              <w:left w:type="dxa" w:w="80"/>
+              <w:bottom w:type="dxa" w:w="45"/>
+              <w:right w:type="dxa" w:w="80"/>
+            </w:tcMar>
+            <w:vAlign w:val="center"/>
+          </w:tcPr>
+          <w:p>
+            <w:pPr>
+              <w:jc w:val="center"/>
+            </w:pPr>
+            <w:r>
+              <w:rPr>
+                <w:b/>
+                <w:bCs/>
+                <w:color w:val="FFFFFF"/>
+                <w:sz w:val="16"/>
+                <w:szCs w:val="16"/>
+              </w:rPr>
+              <w:t xml:space="preserve">Scaled speed-up</w:t>
+            </w:r>
+          </w:p>
+        </w:tc>
+        <w:tc>
+          <w:tcPr>
+            <w:tcW w:type="dxa" w:w="1100"/>
+            <w:tcBorders>
+              <w:top w:val="single" w:color="D5DAE3" w:sz="4"/>
+              <w:left w:val="single" w:color="D5DAE3" w:sz="4"/>
+              <w:bottom w:val="single" w:color="D5DAE3" w:sz="4"/>
+              <w:right w:val="single" w:color="D5DAE3" w:sz="4"/>
+            </w:tcBorders>
+            <w:shd w:fill="1B2A4A" w:color="auto" w:val="clear"/>
+            <w:tcMar>
+              <w:top w:type="dxa" w:w="45"/>
+              <w:left w:type="dxa" w:w="80"/>
+              <w:bottom w:type="dxa" w:w="45"/>
+              <w:right w:type="dxa" w:w="80"/>
+            </w:tcMar>
+            <w:vAlign w:val="center"/>
+          </w:tcPr>
+          <w:p>
+            <w:pPr>
+              <w:jc w:val="center"/>
+            </w:pPr>
+            <w:r>
+              <w:rPr>
+                <w:b/>
+                <w:bCs/>
+                <w:color w:val="FFFFFF"/>
+                <w:sz w:val="16"/>
+                <w:szCs w:val="16"/>
+              </w:rPr>
+              <w:t xml:space="preserve">Ideal</w:t>
+            </w:r>
+          </w:p>
+        </w:tc>
+        <w:tc>
+          <w:tcPr>
+            <w:tcW w:type="dxa" w:w="1500"/>
+            <w:tcBorders>
+              <w:top w:val="single" w:color="D5DAE3" w:sz="4"/>
+              <w:left w:val="single" w:color="D5DAE3" w:sz="4"/>
+              <w:bottom w:val="single" w:color="D5DAE3" w:sz="4"/>
+              <w:right w:val="single" w:color="D5DAE3" w:sz="4"/>
+            </w:tcBorders>
+            <w:shd w:fill="1B2A4A" w:color="auto" w:val="clear"/>
+            <w:tcMar>
+              <w:top w:type="dxa" w:w="45"/>
+              <w:left w:type="dxa" w:w="80"/>
+              <w:bottom w:type="dxa" w:w="45"/>
+              <w:right w:type="dxa" w:w="80"/>
+            </w:tcMar>
+            <w:vAlign w:val="center"/>
+          </w:tcPr>
+          <w:p>
+            <w:pPr>
+              <w:jc w:val="center"/>
+            </w:pPr>
+            <w:r>
+              <w:rPr>
+                <w:b/>
+                <w:bCs/>
+                <w:color w:val="FFFFFF"/>
+                <w:sz w:val="16"/>
+                <w:szCs w:val="16"/>
+              </w:rPr>
+              <w:t xml:space="preserve">Efficiency</w:t>
+            </w:r>
+          </w:p>
+        </w:tc>
+      </w:tr>
+      <w:tr>
+        <w:trPr>
+          <w:cantSplit/>
+        </w:trPr>
+        <w:tc>
+          <w:tcPr>
+            <w:tcW w:type="dxa" w:w="1100"/>
+            <w:tcBorders>
+              <w:top w:val="single" w:color="D5DAE3" w:sz="4"/>
+              <w:left w:val="single" w:color="D5DAE3" w:sz="4"/>
+              <w:bottom w:val="single" w:color="D5DAE3" w:sz="4"/>
+              <w:right w:val="single" w:color="D5DAE3" w:sz="4"/>
+            </w:tcBorders>
+            <w:shd w:fill="FFFFFF" w:color="auto" w:val="clear"/>
+            <w:tcMar>
+              <w:top w:type="dxa" w:w="45"/>
+              <w:left w:type="dxa" w:w="80"/>
+              <w:bottom w:type="dxa" w:w="45"/>
+              <w:right w:type="dxa" w:w="80"/>
+            </w:tcMar>
+            <w:vAlign w:val="center"/>
+          </w:tcPr>
+          <w:p>
+            <w:pPr>
+              <w:jc w:val="left"/>
+            </w:pPr>
+            <w:r>
+              <w:rPr>
+                <w:b w:val="false"/>
+                <w:bCs w:val="false"/>
+                <w:color w:val="3C3C3C"/>
+                <w:sz w:val="16"/>
+                <w:szCs w:val="16"/>
+              </w:rPr>
+              <w:t xml:space="preserve">2</w:t>
+            </w:r>
+          </w:p>
+        </w:tc>
+        <w:tc>
+          <w:tcPr>
+            <w:tcW w:type="dxa" w:w="1500"/>
+            <w:tcBorders>
+              <w:top w:val="single" w:color="D5DAE3" w:sz="4"/>
+              <w:left w:val="single" w:color="D5DAE3" w:sz="4"/>
+              <w:bottom w:val="single" w:color="D5DAE3" w:sz="4"/>
+              <w:right w:val="single" w:color="D5DAE3" w:sz="4"/>
+            </w:tcBorders>
+            <w:shd w:fill="FFFFFF" w:color="auto" w:val="clear"/>
+            <w:tcMar>
+              <w:top w:type="dxa" w:w="45"/>
+              <w:left w:type="dxa" w:w="80"/>
+              <w:bottom w:type="dxa" w:w="45"/>
+              <w:right w:type="dxa" w:w="80"/>
+            </w:tcMar>
+            <w:vAlign w:val="center"/>
+          </w:tcPr>
+          <w:p>
+            <w:pPr>
+              <w:jc w:val="center"/>
+            </w:pPr>
+            <w:r>
+              <w:rPr>
+                <w:b w:val="false"/>
+                <w:bCs w:val="false"/>
+                <w:color w:val="3C3C3C"/>
+                <w:sz w:val="16"/>
+                <w:szCs w:val="16"/>
+              </w:rPr>
+              <w:t xml:space="preserve">2017</w:t>
+            </w:r>
+          </w:p>
+        </w:tc>
+        <w:tc>
+          <w:tcPr>
+            <w:tcW w:type="dxa" w:w="1300"/>
+            <w:tcBorders>
+              <w:top w:val="single" w:color="D5DAE3" w:sz="4"/>
+              <w:left w:val="single" w:color="D5DAE3" w:sz="4"/>
+              <w:bottom w:val="single" w:color="D5DAE3" w:sz="4"/>
+              <w:right w:val="single" w:color="D5DAE3" w:sz="4"/>
+            </w:tcBorders>
+            <w:shd w:fill="FFFFFF" w:color="auto" w:val="clear"/>
+            <w:tcMar>
+              <w:top w:type="dxa" w:w="45"/>
+              <w:left w:type="dxa" w:w="80"/>
+              <w:bottom w:type="dxa" w:w="45"/>
+              <w:right w:type="dxa" w:w="80"/>
+            </w:tcMar>
+            <w:vAlign w:val="center"/>
+          </w:tcPr>
+          <w:p>
+            <w:pPr>
+              <w:jc w:val="center"/>
+            </w:pPr>
+            <w:r>
+              <w:rPr>
+                <w:b w:val="false"/>
+                <w:bCs w:val="false"/>
+                <w:color w:val="3C3C3C"/>
+                <w:sz w:val="16"/>
+                <w:szCs w:val="16"/>
+              </w:rPr>
+              <w:t xml:space="preserve">5.3</w:t>
+            </w:r>
+          </w:p>
+        </w:tc>
+        <w:tc>
+          <w:tcPr>
+            <w:tcW w:type="dxa" w:w="1500"/>
+            <w:tcBorders>
+              <w:top w:val="single" w:color="D5DAE3" w:sz="4"/>
+              <w:left w:val="single" w:color="D5DAE3" w:sz="4"/>
+              <w:bottom w:val="single" w:color="D5DAE3" w:sz="4"/>
+              <w:right w:val="single" w:color="D5DAE3" w:sz="4"/>
+            </w:tcBorders>
+            <w:shd w:fill="FFFFFF" w:color="auto" w:val="clear"/>
+            <w:tcMar>
+              <w:top w:type="dxa" w:w="45"/>
+              <w:left w:type="dxa" w:w="80"/>
+              <w:bottom w:type="dxa" w:w="45"/>
+              <w:right w:type="dxa" w:w="80"/>
+            </w:tcMar>
+            <w:vAlign w:val="center"/>
+          </w:tcPr>
+          <w:p>
+            <w:pPr>
+              <w:jc w:val="center"/>
+            </w:pPr>
+            <w:r>
+              <w:rPr>
+                <w:b w:val="false"/>
+                <w:bCs w:val="false"/>
+                <w:color w:val="3C3C3C"/>
+                <w:sz w:val="16"/>
+                <w:szCs w:val="16"/>
+              </w:rPr>
+              <w:t xml:space="preserve">3.3</w:t>
+            </w:r>
+          </w:p>
+        </w:tc>
+        <w:tc>
+          <w:tcPr>
+            <w:tcW w:type="dxa" w:w="1638"/>
+            <w:tcBorders>
+              <w:top w:val="single" w:color="D5DAE3" w:sz="4"/>
+              <w:left w:val="single" w:color="D5DAE3" w:sz="4"/>
+              <w:bottom w:val="single" w:color="D5DAE3" w:sz="4"/>
+              <w:right w:val="single" w:color="D5DAE3" w:sz="4"/>
+            </w:tcBorders>
+            <w:shd w:fill="FFFFFF" w:color="auto" w:val="clear"/>
+            <w:tcMar>
+              <w:top w:type="dxa" w:w="45"/>
+              <w:left w:type="dxa" w:w="80"/>
+              <w:bottom w:type="dxa" w:w="45"/>
+              <w:right w:type="dxa" w:w="80"/>
+            </w:tcMar>
+            <w:vAlign w:val="center"/>
+          </w:tcPr>
+          <w:p>
+            <w:pPr>
+              <w:jc w:val="center"/>
+            </w:pPr>
+            <w:r>
+              <w:rPr>
+                <w:b w:val="false"/>
+                <w:bCs w:val="false"/>
+                <w:color w:val="3C3C3C"/>
+                <w:sz w:val="16"/>
+                <w:szCs w:val="16"/>
+              </w:rPr>
+              <w:t xml:space="preserve">1.00×</w:t>
+            </w:r>
+          </w:p>
+        </w:tc>
+        <w:tc>
+          <w:tcPr>
+            <w:tcW w:type="dxa" w:w="1100"/>
+            <w:tcBorders>
+              <w:top w:val="single" w:color="D5DAE3" w:sz="4"/>
+              <w:left w:val="single" w:color="D5DAE3" w:sz="4"/>
+              <w:bottom w:val="single" w:color="D5DAE3" w:sz="4"/>
+              <w:right w:val="single" w:color="D5DAE3" w:sz="4"/>
+            </w:tcBorders>
+            <w:shd w:fill="FFFFFF" w:color="auto" w:val="clear"/>
+            <w:tcMar>
+              <w:top w:type="dxa" w:w="45"/>
+              <w:left w:type="dxa" w:w="80"/>
+              <w:bottom w:type="dxa" w:w="45"/>
+              <w:right w:type="dxa" w:w="80"/>
+            </w:tcMar>
+            <w:vAlign w:val="center"/>
+          </w:tcPr>
+          <w:p>
+            <w:pPr>
+              <w:jc w:val="center"/>
+            </w:pPr>
+            <w:r>
+              <w:rPr>
+                <w:b w:val="false"/>
+                <w:bCs w:val="false"/>
+                <w:color w:val="3C3C3C"/>
+                <w:sz w:val="16"/>
+                <w:szCs w:val="16"/>
+              </w:rPr>
+              <w:t xml:space="preserve">1×</w:t>
+            </w:r>
+          </w:p>
+        </w:tc>
+        <w:tc>
+          <w:tcPr>
+            <w:tcW w:type="dxa" w:w="1500"/>
+            <w:tcBorders>
+              <w:top w:val="single" w:color="D5DAE3" w:sz="4"/>
+              <w:left w:val="single" w:color="D5DAE3" w:sz="4"/>
+              <w:bottom w:val="single" w:color="D5DAE3" w:sz="4"/>
+              <w:right w:val="single" w:color="D5DAE3" w:sz="4"/>
+            </w:tcBorders>
+            <w:shd w:fill="FFFFFF" w:color="auto" w:val="clear"/>
+            <w:tcMar>
+              <w:top w:type="dxa" w:w="45"/>
+              <w:left w:type="dxa" w:w="80"/>
+              <w:bottom w:type="dxa" w:w="45"/>
+              <w:right w:type="dxa" w:w="80"/>
+            </w:tcMar>
+            <w:vAlign w:val="center"/>
+          </w:tcPr>
+          <w:p>
+            <w:pPr>
+              <w:jc w:val="center"/>
+            </w:pPr>
+            <w:r>
+              <w:rPr>
+                <w:b w:val="false"/>
+                <w:bCs w:val="false"/>
+                <w:color w:val="3C3C3C"/>
+                <w:sz w:val="16"/>
+                <w:szCs w:val="16"/>
+              </w:rPr>
+              <w:t xml:space="preserve">100 %</w:t>
+            </w:r>
+          </w:p>
+        </w:tc>
+      </w:tr>
+      <w:tr>
+        <w:trPr>
+          <w:cantSplit/>
+        </w:trPr>
+        <w:tc>
+          <w:tcPr>
+            <w:tcW w:type="dxa" w:w="1100"/>
+            <w:tcBorders>
+              <w:top w:val="single" w:color="D5DAE3" w:sz="4"/>
+              <w:left w:val="single" w:color="D5DAE3" w:sz="4"/>
+              <w:bottom w:val="single" w:color="D5DAE3" w:sz="4"/>
+              <w:right w:val="single" w:color="D5DAE3" w:sz="4"/>
+            </w:tcBorders>
+            <w:shd w:fill="F4F6FA" w:color="auto" w:val="clear"/>
+            <w:tcMar>
+              <w:top w:type="dxa" w:w="45"/>
+              <w:left w:type="dxa" w:w="80"/>
+              <w:bottom w:type="dxa" w:w="45"/>
+              <w:right w:type="dxa" w:w="80"/>
+            </w:tcMar>
+            <w:vAlign w:val="center"/>
+          </w:tcPr>
+          <w:p>
+            <w:pPr>
+              <w:jc w:val="left"/>
+            </w:pPr>
+            <w:r>
+              <w:rPr>
+                <w:b w:val="false"/>
+                <w:bCs w:val="false"/>
+                <w:color w:val="3C3C3C"/>
+                <w:sz w:val="16"/>
+                <w:szCs w:val="16"/>
+              </w:rPr>
+              <w:t xml:space="preserve">4</w:t>
+            </w:r>
+          </w:p>
+        </w:tc>
+        <w:tc>
+          <w:tcPr>
+            <w:tcW w:type="dxa" w:w="1500"/>
+            <w:tcBorders>
+              <w:top w:val="single" w:color="D5DAE3" w:sz="4"/>
+              <w:left w:val="single" w:color="D5DAE3" w:sz="4"/>
+              <w:bottom w:val="single" w:color="D5DAE3" w:sz="4"/>
+              <w:right w:val="single" w:color="D5DAE3" w:sz="4"/>
+            </w:tcBorders>
+            <w:shd w:fill="F4F6FA" w:color="auto" w:val="clear"/>
+            <w:tcMar>
+              <w:top w:type="dxa" w:w="45"/>
+              <w:left w:type="dxa" w:w="80"/>
+              <w:bottom w:type="dxa" w:w="45"/>
+              <w:right w:type="dxa" w:w="80"/>
+            </w:tcMar>
+            <w:vAlign w:val="center"/>
+          </w:tcPr>
+          <w:p>
+            <w:pPr>
+              <w:jc w:val="center"/>
+            </w:pPr>
+            <w:r>
+              <w:rPr>
+                <w:b w:val="false"/>
+                <w:bCs w:val="false"/>
+                <w:color w:val="3C3C3C"/>
+                <w:sz w:val="16"/>
+                <w:szCs w:val="16"/>
+              </w:rPr>
+              <w:t xml:space="preserve">2017-2018</w:t>
+            </w:r>
+          </w:p>
+        </w:tc>
+        <w:tc>
+          <w:tcPr>
+            <w:tcW w:type="dxa" w:w="1300"/>
+            <w:tcBorders>
+              <w:top w:val="single" w:color="D5DAE3" w:sz="4"/>
+              <w:left w:val="single" w:color="D5DAE3" w:sz="4"/>
+              <w:bottom w:val="single" w:color="D5DAE3" w:sz="4"/>
+              <w:right w:val="single" w:color="D5DAE3" w:sz="4"/>
+            </w:tcBorders>
+            <w:shd w:fill="F4F6FA" w:color="auto" w:val="clear"/>
+            <w:tcMar>
+              <w:top w:type="dxa" w:w="45"/>
+              <w:left w:type="dxa" w:w="80"/>
+              <w:bottom w:type="dxa" w:w="45"/>
+              <w:right w:type="dxa" w:w="80"/>
+            </w:tcMar>
+            <w:vAlign w:val="center"/>
+          </w:tcPr>
+          <w:p>
+            <w:pPr>
+              <w:jc w:val="center"/>
+            </w:pPr>
+            <w:r>
+              <w:rPr>
+                <w:b w:val="false"/>
+                <w:bCs w:val="false"/>
+                <w:color w:val="3C3C3C"/>
+                <w:sz w:val="16"/>
+                <w:szCs w:val="16"/>
+              </w:rPr>
+              <w:t xml:space="preserve">9.9</w:t>
+            </w:r>
+          </w:p>
+        </w:tc>
+        <w:tc>
+          <w:tcPr>
+            <w:tcW w:type="dxa" w:w="1500"/>
+            <w:tcBorders>
+              <w:top w:val="single" w:color="D5DAE3" w:sz="4"/>
+              <w:left w:val="single" w:color="D5DAE3" w:sz="4"/>
+              <w:bottom w:val="single" w:color="D5DAE3" w:sz="4"/>
+              <w:right w:val="single" w:color="D5DAE3" w:sz="4"/>
+            </w:tcBorders>
+            <w:shd w:fill="F4F6FA" w:color="auto" w:val="clear"/>
+            <w:tcMar>
+              <w:top w:type="dxa" w:w="45"/>
+              <w:left w:type="dxa" w:w="80"/>
+              <w:bottom w:type="dxa" w:w="45"/>
+              <w:right w:type="dxa" w:w="80"/>
+            </w:tcMar>
+            <w:vAlign w:val="center"/>
+          </w:tcPr>
+          <w:p>
+            <w:pPr>
+              <w:jc w:val="center"/>
+            </w:pPr>
+            <w:r>
+              <w:rPr>
+                <w:b w:val="false"/>
+                <w:bCs w:val="false"/>
+                <w:color w:val="3C3C3C"/>
+                <w:sz w:val="16"/>
+                <w:szCs w:val="16"/>
+              </w:rPr>
+              <w:t xml:space="preserve">3.4</w:t>
+            </w:r>
+          </w:p>
+        </w:tc>
+        <w:tc>
+          <w:tcPr>
+            <w:tcW w:type="dxa" w:w="1638"/>
+            <w:tcBorders>
+              <w:top w:val="single" w:color="D5DAE3" w:sz="4"/>
+              <w:left w:val="single" w:color="D5DAE3" w:sz="4"/>
+              <w:bottom w:val="single" w:color="D5DAE3" w:sz="4"/>
+              <w:right w:val="single" w:color="D5DAE3" w:sz="4"/>
+            </w:tcBorders>
+            <w:shd w:fill="F4F6FA" w:color="auto" w:val="clear"/>
+            <w:tcMar>
+              <w:top w:type="dxa" w:w="45"/>
+              <w:left w:type="dxa" w:w="80"/>
+              <w:bottom w:type="dxa" w:w="45"/>
+              <w:right w:type="dxa" w:w="80"/>
+            </w:tcMar>
+            <w:vAlign w:val="center"/>
+          </w:tcPr>
+          <w:p>
+            <w:pPr>
+              <w:jc w:val="center"/>
+            </w:pPr>
+            <w:r>
+              <w:rPr>
+                <w:b w:val="false"/>
+                <w:bCs w:val="false"/>
+                <w:color w:val="3C3C3C"/>
+                <w:sz w:val="16"/>
+                <w:szCs w:val="16"/>
+              </w:rPr>
+              <w:t xml:space="preserve">1.82×</w:t>
+            </w:r>
+          </w:p>
+        </w:tc>
+        <w:tc>
+          <w:tcPr>
+            <w:tcW w:type="dxa" w:w="1100"/>
+            <w:tcBorders>
+              <w:top w:val="single" w:color="D5DAE3" w:sz="4"/>
+              <w:left w:val="single" w:color="D5DAE3" w:sz="4"/>
+              <w:bottom w:val="single" w:color="D5DAE3" w:sz="4"/>
+              <w:right w:val="single" w:color="D5DAE3" w:sz="4"/>
+            </w:tcBorders>
+            <w:shd w:fill="F4F6FA" w:color="auto" w:val="clear"/>
+            <w:tcMar>
+              <w:top w:type="dxa" w:w="45"/>
+              <w:left w:type="dxa" w:w="80"/>
+              <w:bottom w:type="dxa" w:w="45"/>
+              <w:right w:type="dxa" w:w="80"/>
+            </w:tcMar>
+            <w:vAlign w:val="center"/>
+          </w:tcPr>
+          <w:p>
+            <w:pPr>
+              <w:jc w:val="center"/>
+            </w:pPr>
+            <w:r>
+              <w:rPr>
+                <w:b w:val="false"/>
+                <w:bCs w:val="false"/>
+                <w:color w:val="3C3C3C"/>
+                <w:sz w:val="16"/>
+                <w:szCs w:val="16"/>
+              </w:rPr>
+              <w:t xml:space="preserve">2×</w:t>
+            </w:r>
+          </w:p>
+        </w:tc>
+        <w:tc>
+          <w:tcPr>
+            <w:tcW w:type="dxa" w:w="1500"/>
+            <w:tcBorders>
+              <w:top w:val="single" w:color="D5DAE3" w:sz="4"/>
+              <w:left w:val="single" w:color="D5DAE3" w:sz="4"/>
+              <w:bottom w:val="single" w:color="D5DAE3" w:sz="4"/>
+              <w:right w:val="single" w:color="D5DAE3" w:sz="4"/>
+            </w:tcBorders>
+            <w:shd w:fill="F4F6FA" w:color="auto" w:val="clear"/>
+            <w:tcMar>
+              <w:top w:type="dxa" w:w="45"/>
+              <w:left w:type="dxa" w:w="80"/>
+              <w:bottom w:type="dxa" w:w="45"/>
+              <w:right w:type="dxa" w:w="80"/>
+            </w:tcMar>
+            <w:vAlign w:val="center"/>
+          </w:tcPr>
+          <w:p>
+            <w:pPr>
+              <w:jc w:val="center"/>
+            </w:pPr>
+            <w:r>
+              <w:rPr>
+                <w:b w:val="false"/>
+                <w:bCs w:val="false"/>
+                <w:color w:val="3C3C3C"/>
+                <w:sz w:val="16"/>
+                <w:szCs w:val="16"/>
+              </w:rPr>
+              <w:t xml:space="preserve">91 %</w:t>
+            </w:r>
+          </w:p>
+        </w:tc>
+      </w:tr>
+      <w:tr>
+        <w:trPr>
+          <w:cantSplit/>
+        </w:trPr>
+        <w:tc>
+          <w:tcPr>
+            <w:tcW w:type="dxa" w:w="1100"/>
+            <w:tcBorders>
+              <w:top w:val="single" w:color="D5DAE3" w:sz="4"/>
+              <w:left w:val="single" w:color="D5DAE3" w:sz="4"/>
+              <w:bottom w:val="single" w:color="D5DAE3" w:sz="4"/>
+              <w:right w:val="single" w:color="D5DAE3" w:sz="4"/>
+            </w:tcBorders>
+            <w:shd w:fill="FFFFFF" w:color="auto" w:val="clear"/>
+            <w:tcMar>
+              <w:top w:type="dxa" w:w="45"/>
+              <w:left w:type="dxa" w:w="80"/>
+              <w:bottom w:type="dxa" w:w="45"/>
+              <w:right w:type="dxa" w:w="80"/>
+            </w:tcMar>
+            <w:vAlign w:val="center"/>
+          </w:tcPr>
+          <w:p>
+            <w:pPr>
+              <w:jc w:val="left"/>
+            </w:pPr>
+            <w:r>
+              <w:rPr>
+                <w:b w:val="false"/>
+                <w:bCs w:val="false"/>
+                <w:color w:val="3C3C3C"/>
+                <w:sz w:val="16"/>
+                <w:szCs w:val="16"/>
+              </w:rPr>
+              <w:t xml:space="preserve">8</w:t>
+            </w:r>
+          </w:p>
+        </w:tc>
+        <w:tc>
+          <w:tcPr>
+            <w:tcW w:type="dxa" w:w="1500"/>
+            <w:tcBorders>
+              <w:top w:val="single" w:color="D5DAE3" w:sz="4"/>
+              <w:left w:val="single" w:color="D5DAE3" w:sz="4"/>
+              <w:bottom w:val="single" w:color="D5DAE3" w:sz="4"/>
+              <w:right w:val="single" w:color="D5DAE3" w:sz="4"/>
+            </w:tcBorders>
+            <w:shd w:fill="FFFFFF" w:color="auto" w:val="clear"/>
+            <w:tcMar>
+              <w:top w:type="dxa" w:w="45"/>
+              <w:left w:type="dxa" w:w="80"/>
+              <w:bottom w:type="dxa" w:w="45"/>
+              <w:right w:type="dxa" w:w="80"/>
+            </w:tcMar>
+            <w:vAlign w:val="center"/>
+          </w:tcPr>
+          <w:p>
+            <w:pPr>
+              <w:jc w:val="center"/>
+            </w:pPr>
+            <w:r>
+              <w:rPr>
+                <w:b w:val="false"/>
+                <w:bCs w:val="false"/>
+                <w:color w:val="3C3C3C"/>
+                <w:sz w:val="16"/>
+                <w:szCs w:val="16"/>
+              </w:rPr>
+              <w:t xml:space="preserve">2017-2020</w:t>
+            </w:r>
+          </w:p>
+        </w:tc>
+        <w:tc>
+          <w:tcPr>
+            <w:tcW w:type="dxa" w:w="1300"/>
+            <w:tcBorders>
+              <w:top w:val="single" w:color="D5DAE3" w:sz="4"/>
+              <w:left w:val="single" w:color="D5DAE3" w:sz="4"/>
+              <w:bottom w:val="single" w:color="D5DAE3" w:sz="4"/>
+              <w:right w:val="single" w:color="D5DAE3" w:sz="4"/>
+            </w:tcBorders>
+            <w:shd w:fill="FFFFFF" w:color="auto" w:val="clear"/>
+            <w:tcMar>
+              <w:top w:type="dxa" w:w="45"/>
+              <w:left w:type="dxa" w:w="80"/>
+              <w:bottom w:type="dxa" w:w="45"/>
+              <w:right w:type="dxa" w:w="80"/>
+            </w:tcMar>
+            <w:vAlign w:val="center"/>
+          </w:tcPr>
+          <w:p>
+            <w:pPr>
+              <w:jc w:val="center"/>
+            </w:pPr>
+            <w:r>
+              <w:rPr>
+                <w:b w:val="false"/>
+                <w:bCs w:val="false"/>
+                <w:color w:val="3C3C3C"/>
+                <w:sz w:val="16"/>
+                <w:szCs w:val="16"/>
+              </w:rPr>
+              <w:t xml:space="preserve">21.2</w:t>
+            </w:r>
+          </w:p>
+        </w:tc>
+        <w:tc>
+          <w:tcPr>
+            <w:tcW w:type="dxa" w:w="1500"/>
+            <w:tcBorders>
+              <w:top w:val="single" w:color="D5DAE3" w:sz="4"/>
+              <w:left w:val="single" w:color="D5DAE3" w:sz="4"/>
+              <w:bottom w:val="single" w:color="D5DAE3" w:sz="4"/>
+              <w:right w:val="single" w:color="D5DAE3" w:sz="4"/>
+            </w:tcBorders>
+            <w:shd w:fill="FFFFFF" w:color="auto" w:val="clear"/>
+            <w:tcMar>
+              <w:top w:type="dxa" w:w="45"/>
+              <w:left w:type="dxa" w:w="80"/>
+              <w:bottom w:type="dxa" w:w="45"/>
+              <w:right w:type="dxa" w:w="80"/>
+            </w:tcMar>
+            <w:vAlign w:val="center"/>
+          </w:tcPr>
+          <w:p>
+            <w:pPr>
+              <w:jc w:val="center"/>
+            </w:pPr>
+            <w:r>
+              <w:rPr>
+                <w:b w:val="false"/>
+                <w:bCs w:val="false"/>
+                <w:color w:val="3C3C3C"/>
+                <w:sz w:val="16"/>
+                <w:szCs w:val="16"/>
+              </w:rPr>
+              <w:t xml:space="preserve">3.7</w:t>
+            </w:r>
+          </w:p>
+        </w:tc>
+        <w:tc>
+          <w:tcPr>
+            <w:tcW w:type="dxa" w:w="1638"/>
+            <w:tcBorders>
+              <w:top w:val="single" w:color="D5DAE3" w:sz="4"/>
+              <w:left w:val="single" w:color="D5DAE3" w:sz="4"/>
+              <w:bottom w:val="single" w:color="D5DAE3" w:sz="4"/>
+              <w:right w:val="single" w:color="D5DAE3" w:sz="4"/>
+            </w:tcBorders>
+            <w:shd w:fill="FFFFFF" w:color="auto" w:val="clear"/>
+            <w:tcMar>
+              <w:top w:type="dxa" w:w="45"/>
+              <w:left w:type="dxa" w:w="80"/>
+              <w:bottom w:type="dxa" w:w="45"/>
+              <w:right w:type="dxa" w:w="80"/>
+            </w:tcMar>
+            <w:vAlign w:val="center"/>
+          </w:tcPr>
+          <w:p>
+            <w:pPr>
+              <w:jc w:val="center"/>
+            </w:pPr>
+            <w:r>
+              <w:rPr>
+                <w:b w:val="false"/>
+                <w:bCs w:val="false"/>
+                <w:color w:val="3C3C3C"/>
+                <w:sz w:val="16"/>
+                <w:szCs w:val="16"/>
+              </w:rPr>
+              <w:t xml:space="preserve">3.60×</w:t>
+            </w:r>
+          </w:p>
+        </w:tc>
+        <w:tc>
+          <w:tcPr>
+            <w:tcW w:type="dxa" w:w="1100"/>
+            <w:tcBorders>
+              <w:top w:val="single" w:color="D5DAE3" w:sz="4"/>
+              <w:left w:val="single" w:color="D5DAE3" w:sz="4"/>
+              <w:bottom w:val="single" w:color="D5DAE3" w:sz="4"/>
+              <w:right w:val="single" w:color="D5DAE3" w:sz="4"/>
+            </w:tcBorders>
+            <w:shd w:fill="FFFFFF" w:color="auto" w:val="clear"/>
+            <w:tcMar>
+              <w:top w:type="dxa" w:w="45"/>
+              <w:left w:type="dxa" w:w="80"/>
+              <w:bottom w:type="dxa" w:w="45"/>
+              <w:right w:type="dxa" w:w="80"/>
+            </w:tcMar>
+            <w:vAlign w:val="center"/>
+          </w:tcPr>
+          <w:p>
+            <w:pPr>
+              <w:jc w:val="center"/>
+            </w:pPr>
+            <w:r>
+              <w:rPr>
+                <w:b w:val="false"/>
+                <w:bCs w:val="false"/>
+                <w:color w:val="3C3C3C"/>
+                <w:sz w:val="16"/>
+                <w:szCs w:val="16"/>
+              </w:rPr>
+              <w:t xml:space="preserve">4×</w:t>
+            </w:r>
+          </w:p>
+        </w:tc>
+        <w:tc>
+          <w:tcPr>
+            <w:tcW w:type="dxa" w:w="1500"/>
+            <w:tcBorders>
+              <w:top w:val="single" w:color="D5DAE3" w:sz="4"/>
+              <w:left w:val="single" w:color="D5DAE3" w:sz="4"/>
+              <w:bottom w:val="single" w:color="D5DAE3" w:sz="4"/>
+              <w:right w:val="single" w:color="D5DAE3" w:sz="4"/>
+            </w:tcBorders>
+            <w:shd w:fill="FFFFFF" w:color="auto" w:val="clear"/>
+            <w:tcMar>
+              <w:top w:type="dxa" w:w="45"/>
+              <w:left w:type="dxa" w:w="80"/>
+              <w:bottom w:type="dxa" w:w="45"/>
+              <w:right w:type="dxa" w:w="80"/>
+            </w:tcMar>
+            <w:vAlign w:val="center"/>
+          </w:tcPr>
+          <w:p>
+            <w:pPr>
+              <w:jc w:val="center"/>
+            </w:pPr>
+            <w:r>
+              <w:rPr>
+                <w:b w:val="false"/>
+                <w:bCs w:val="false"/>
+                <w:color w:val="3C3C3C"/>
+                <w:sz w:val="16"/>
+                <w:szCs w:val="16"/>
+              </w:rPr>
+              <w:t xml:space="preserve">90 %</w:t>
+            </w:r>
+          </w:p>
+        </w:tc>
+      </w:tr>
+      <w:tr>
+        <w:trPr>
+          <w:cantSplit/>
+        </w:trPr>
+        <w:tc>
+          <w:tcPr>
+            <w:tcW w:type="dxa" w:w="1100"/>
+            <w:tcBorders>
+              <w:top w:val="single" w:color="D5DAE3" w:sz="4"/>
+              <w:left w:val="single" w:color="D5DAE3" w:sz="4"/>
+              <w:bottom w:val="single" w:color="D5DAE3" w:sz="4"/>
+              <w:right w:val="single" w:color="D5DAE3" w:sz="4"/>
+            </w:tcBorders>
+            <w:shd w:fill="F4F6FA" w:color="auto" w:val="clear"/>
+            <w:tcMar>
+              <w:top w:type="dxa" w:w="45"/>
+              <w:left w:type="dxa" w:w="80"/>
+              <w:bottom w:type="dxa" w:w="45"/>
+              <w:right w:type="dxa" w:w="80"/>
+            </w:tcMar>
+            <w:vAlign w:val="center"/>
+          </w:tcPr>
+          <w:p>
+            <w:pPr>
+              <w:jc w:val="left"/>
+            </w:pPr>
+            <w:r>
+              <w:rPr>
+                <w:b w:val="false"/>
+                <w:bCs w:val="false"/>
+                <w:color w:val="3C3C3C"/>
+                <w:sz w:val="16"/>
+                <w:szCs w:val="16"/>
+              </w:rPr>
+              <w:t xml:space="preserve">16</w:t>
+            </w:r>
+          </w:p>
+        </w:tc>
+        <w:tc>
+          <w:tcPr>
+            <w:tcW w:type="dxa" w:w="1500"/>
+            <w:tcBorders>
+              <w:top w:val="single" w:color="D5DAE3" w:sz="4"/>
+              <w:left w:val="single" w:color="D5DAE3" w:sz="4"/>
+              <w:bottom w:val="single" w:color="D5DAE3" w:sz="4"/>
+              <w:right w:val="single" w:color="D5DAE3" w:sz="4"/>
+            </w:tcBorders>
+            <w:shd w:fill="F4F6FA" w:color="auto" w:val="clear"/>
+            <w:tcMar>
+              <w:top w:type="dxa" w:w="45"/>
+              <w:left w:type="dxa" w:w="80"/>
+              <w:bottom w:type="dxa" w:w="45"/>
+              <w:right w:type="dxa" w:w="80"/>
+            </w:tcMar>
+            <w:vAlign w:val="center"/>
+          </w:tcPr>
+          <w:p>
+            <w:pPr>
+              <w:jc w:val="center"/>
+            </w:pPr>
+            <w:r>
+              <w:rPr>
+                <w:b w:val="false"/>
+                <w:bCs w:val="false"/>
+                <w:color w:val="3C3C3C"/>
+                <w:sz w:val="16"/>
+                <w:szCs w:val="16"/>
+              </w:rPr>
+              <w:t xml:space="preserve">2017-2024</w:t>
+            </w:r>
+          </w:p>
+        </w:tc>
+        <w:tc>
+          <w:tcPr>
+            <w:tcW w:type="dxa" w:w="1300"/>
+            <w:tcBorders>
+              <w:top w:val="single" w:color="D5DAE3" w:sz="4"/>
+              <w:left w:val="single" w:color="D5DAE3" w:sz="4"/>
+              <w:bottom w:val="single" w:color="D5DAE3" w:sz="4"/>
+              <w:right w:val="single" w:color="D5DAE3" w:sz="4"/>
+            </w:tcBorders>
+            <w:shd w:fill="F4F6FA" w:color="auto" w:val="clear"/>
+            <w:tcMar>
+              <w:top w:type="dxa" w:w="45"/>
+              <w:left w:type="dxa" w:w="80"/>
+              <w:bottom w:type="dxa" w:w="45"/>
+              <w:right w:type="dxa" w:w="80"/>
+            </w:tcMar>
+            <w:vAlign w:val="center"/>
+          </w:tcPr>
+          <w:p>
+            <w:pPr>
+              <w:jc w:val="center"/>
+            </w:pPr>
+            <w:r>
+              <w:rPr>
+                <w:b w:val="false"/>
+                <w:bCs w:val="false"/>
+                <w:color w:val="3C3C3C"/>
+                <w:sz w:val="16"/>
+                <w:szCs w:val="16"/>
+              </w:rPr>
+              <w:t xml:space="preserve">48.5</w:t>
+            </w:r>
+          </w:p>
+        </w:tc>
+        <w:tc>
+          <w:tcPr>
+            <w:tcW w:type="dxa" w:w="1500"/>
+            <w:tcBorders>
+              <w:top w:val="single" w:color="D5DAE3" w:sz="4"/>
+              <w:left w:val="single" w:color="D5DAE3" w:sz="4"/>
+              <w:bottom w:val="single" w:color="D5DAE3" w:sz="4"/>
+              <w:right w:val="single" w:color="D5DAE3" w:sz="4"/>
+            </w:tcBorders>
+            <w:shd w:fill="F4F6FA" w:color="auto" w:val="clear"/>
+            <w:tcMar>
+              <w:top w:type="dxa" w:w="45"/>
+              <w:left w:type="dxa" w:w="80"/>
+              <w:bottom w:type="dxa" w:w="45"/>
+              <w:right w:type="dxa" w:w="80"/>
+            </w:tcMar>
+            <w:vAlign w:val="center"/>
+          </w:tcPr>
+          <w:p>
+            <w:pPr>
+              <w:jc w:val="center"/>
+            </w:pPr>
+            <w:r>
+              <w:rPr>
+                <w:b w:val="false"/>
+                <w:bCs w:val="false"/>
+                <w:color w:val="3C3C3C"/>
+                <w:sz w:val="16"/>
+                <w:szCs w:val="16"/>
+              </w:rPr>
+              <w:t xml:space="preserve">5.8</w:t>
+            </w:r>
+          </w:p>
+        </w:tc>
+        <w:tc>
+          <w:tcPr>
+            <w:tcW w:type="dxa" w:w="1638"/>
+            <w:tcBorders>
+              <w:top w:val="single" w:color="D5DAE3" w:sz="4"/>
+              <w:left w:val="single" w:color="D5DAE3" w:sz="4"/>
+              <w:bottom w:val="single" w:color="D5DAE3" w:sz="4"/>
+              <w:right w:val="single" w:color="D5DAE3" w:sz="4"/>
+            </w:tcBorders>
+            <w:shd w:fill="F4F6FA" w:color="auto" w:val="clear"/>
+            <w:tcMar>
+              <w:top w:type="dxa" w:w="45"/>
+              <w:left w:type="dxa" w:w="80"/>
+              <w:bottom w:type="dxa" w:w="45"/>
+              <w:right w:type="dxa" w:w="80"/>
+            </w:tcMar>
+            <w:vAlign w:val="center"/>
+          </w:tcPr>
+          <w:p>
+            <w:pPr>
+              <w:jc w:val="center"/>
+            </w:pPr>
+            <w:r>
+              <w:rPr>
+                <w:b w:val="false"/>
+                <w:bCs w:val="false"/>
+                <w:color w:val="3C3C3C"/>
+                <w:sz w:val="16"/>
+                <w:szCs w:val="16"/>
+              </w:rPr>
+              <w:t xml:space="preserve">5.25×</w:t>
+            </w:r>
+          </w:p>
+        </w:tc>
+        <w:tc>
+          <w:tcPr>
+            <w:tcW w:type="dxa" w:w="1100"/>
+            <w:tcBorders>
+              <w:top w:val="single" w:color="D5DAE3" w:sz="4"/>
+              <w:left w:val="single" w:color="D5DAE3" w:sz="4"/>
+              <w:bottom w:val="single" w:color="D5DAE3" w:sz="4"/>
+              <w:right w:val="single" w:color="D5DAE3" w:sz="4"/>
+            </w:tcBorders>
+            <w:shd w:fill="F4F6FA" w:color="auto" w:val="clear"/>
+            <w:tcMar>
+              <w:top w:type="dxa" w:w="45"/>
+              <w:left w:type="dxa" w:w="80"/>
+              <w:bottom w:type="dxa" w:w="45"/>
+              <w:right w:type="dxa" w:w="80"/>
+            </w:tcMar>
+            <w:vAlign w:val="center"/>
+          </w:tcPr>
+          <w:p>
+            <w:pPr>
+              <w:jc w:val="center"/>
+            </w:pPr>
+            <w:r>
+              <w:rPr>
+                <w:b w:val="false"/>
+                <w:bCs w:val="false"/>
+                <w:color w:val="3C3C3C"/>
+                <w:sz w:val="16"/>
+                <w:szCs w:val="16"/>
+              </w:rPr>
+              <w:t xml:space="preserve">8×</w:t>
+            </w:r>
+          </w:p>
+        </w:tc>
+        <w:tc>
+          <w:tcPr>
+            <w:tcW w:type="dxa" w:w="1500"/>
+            <w:tcBorders>
+              <w:top w:val="single" w:color="D5DAE3" w:sz="4"/>
+              <w:left w:val="single" w:color="D5DAE3" w:sz="4"/>
+              <w:bottom w:val="single" w:color="D5DAE3" w:sz="4"/>
+              <w:right w:val="single" w:color="D5DAE3" w:sz="4"/>
+            </w:tcBorders>
+            <w:shd w:fill="F4F6FA" w:color="auto" w:val="clear"/>
+            <w:tcMar>
+              <w:top w:type="dxa" w:w="45"/>
+              <w:left w:type="dxa" w:w="80"/>
+              <w:bottom w:type="dxa" w:w="45"/>
+              <w:right w:type="dxa" w:w="80"/>
+            </w:tcMar>
+            <w:vAlign w:val="center"/>
+          </w:tcPr>
+          <w:p>
+            <w:pPr>
+              <w:jc w:val="center"/>
+            </w:pPr>
+            <w:r>
+              <w:rPr>
+                <w:b w:val="false"/>
+                <w:bCs w:val="false"/>
+                <w:color w:val="3C3C3C"/>
+                <w:sz w:val="16"/>
+                <w:szCs w:val="16"/>
+              </w:rPr>
+              <w:t xml:space="preserve">66 %</w:t>
+            </w:r>
+          </w:p>
+        </w:tc>
+      </w:tr>
+    </w:tbl>
+    <w:p>
+      <w:pPr>
+        <w:spacing w:after="200" w:before="60"/>
+        <w:jc w:val="center"/>
+      </w:pPr>
+      <w:r>
+        <w:rPr>
+          <w:i/>
+          <w:iCs/>
+          <w:color w:val="7A8094"/>
+          <w:sz w:val="16"/>
+          <w:szCs w:val="16"/>
+        </w:rPr>
+        <w:t xml:space="preserve">Table 16. Weak scaling: the data grows with the cores (median of three runs; t45_weak_scaling.csv). Efficiency = throughput per core relative to 2 cores.</w:t>
       </w:r>
     </w:p>
     <w:p>
@@ -18695,9 +20175,9 @@
       <w:r>
         <w:drawing>
           <wp:inline distT="0" distB="0" distL="0" distR="0">
-            <wp:extent cx="5200650" cy="2609850"/>
+            <wp:extent cx="5810250" cy="2247900"/>
             <wp:effectExtent t="0" r="0" b="0" l="0"/>
-            <wp:docPr id="7" name="fig23_scaling.png" descr="Wall time (a) and speed-up (b) of the cleaning job on 2, 4, 8 and 16 cores." title="Fig 6"/>
+            <wp:docPr id="7" name="fig23_scaling.png" descr="Strong scaling: wall time with the Amdahl fit (a) and speed-up (b); weak scaling: scaled speed-up when the years grow with the cores (c)." title="Fig 6"/>
             <wp:cNvGraphicFramePr>
               <a:graphicFrameLocks xmlns:a="http://schemas.openxmlformats.org/drawingml/2006/main" noChangeAspect="1"/>
             </wp:cNvGraphicFramePr>
@@ -18720,7 +20200,7 @@
                   <pic:spPr bwMode="auto">
                     <a:xfrm>
                       <a:off x="0" y="0"/>
-                      <a:ext cx="5200650" cy="2609850"/>
+                      <a:ext cx="5810250" cy="2247900"/>
                     </a:xfrm>
                     <a:prstGeom prst="rect">
                       <a:avLst/>
@@ -18746,7 +20226,7 @@
           <w:sz w:val="16"/>
           <w:szCs w:val="16"/>
         </w:rPr>
-        <w:t xml:space="preserve">Fig 6 – Wall time (a) and speed-up (b) of the cleaning job on 2, 4, 8 and 16 cores.</w:t>
+        <w:t xml:space="preserve">Fig 6 – Strong scaling: wall time with the Amdahl fit (a) and speed-up (b); weak scaling: scaled speed-up when the years grow with the cores (c).</w:t>
       </w:r>
     </w:p>
     <w:p>
@@ -18773,7 +20253,7 @@
         <w:t xml:space="preserve">doubling the workers cut the time from 74.8 s to 37.3 s, a 2.0× speed-up</w:t>
       </w:r>
       <w:r>
-        <w:t xml:space="preserve">, whereas on the laptop going from 4 to 8 cores gave 1.7× (13.4 s → 8.0 s).</w:t>
+        <w:t xml:space="preserve">, whereas on the laptop going from 4 to 8 cores gave 1.7× (13.5 s → 8.1 s).</w:t>
       </w:r>
     </w:p>
     <w:tbl>
@@ -19350,7 +20830,7 @@
                 <w:sz w:val="16"/>
                 <w:szCs w:val="16"/>
               </w:rPr>
-              <w:t xml:space="preserve">13.4</w:t>
+              <w:t xml:space="preserve">13.5</w:t>
             </w:r>
           </w:p>
         </w:tc>
@@ -19384,7 +20864,7 @@
                 <w:sz w:val="16"/>
                 <w:szCs w:val="16"/>
               </w:rPr>
-              <w:t xml:space="preserve">1.96×</w:t>
+              <w:t xml:space="preserve">1.95×</w:t>
             </w:r>
           </w:p>
         </w:tc>
@@ -19418,7 +20898,7 @@
                 <w:sz w:val="16"/>
                 <w:szCs w:val="16"/>
               </w:rPr>
-              <w:t xml:space="preserve">98 %</w:t>
+              <w:t xml:space="preserve">97 %</w:t>
             </w:r>
           </w:p>
         </w:tc>
@@ -19559,7 +21039,7 @@
                 <w:sz w:val="16"/>
                 <w:szCs w:val="16"/>
               </w:rPr>
-              <w:t xml:space="preserve">8.0</w:t>
+              <w:t xml:space="preserve">8.1</w:t>
             </w:r>
           </w:p>
         </w:tc>
@@ -19593,7 +21073,7 @@
                 <w:sz w:val="16"/>
                 <w:szCs w:val="16"/>
               </w:rPr>
-              <w:t xml:space="preserve">3.29×</w:t>
+              <w:t xml:space="preserve">3.25×</w:t>
             </w:r>
           </w:p>
         </w:tc>
@@ -19627,7 +21107,7 @@
                 <w:sz w:val="16"/>
                 <w:szCs w:val="16"/>
               </w:rPr>
-              <w:t xml:space="preserve">82 %</w:t>
+              <w:t xml:space="preserve">81 %</w:t>
             </w:r>
           </w:p>
         </w:tc>
@@ -20273,7 +21753,7 @@
           <w:sz w:val="16"/>
           <w:szCs w:val="16"/>
         </w:rPr>
-        <w:t xml:space="preserve">Table 16. The cleaning job on the laptop and on the Dataproc cluster (cluster: mean of three timed runs, range in brackets; t44_local_vs_cloud.csv).</w:t>
+        <w:t xml:space="preserve">Table 17. The cleaning job on the laptop and on the Dataproc cluster (cluster: mean of three timed runs, range in brackets; t44_local_vs_cloud.csv).</w:t>
       </w:r>
     </w:p>
     <w:p>
@@ -20390,7 +21870,7 @@
                 <w:sz w:val="19"/>
                 <w:szCs w:val="19"/>
               </w:rPr>
-              <w:t xml:space="preserve"> The laptop is about 5× faster than the cluster at the same core count: it has fast cores, 128 GB of memory and a local SSD, while each n2-standard-2 worker has 2 vCPUs, reads its input from Cloud Storage over the network (each request took 0.3–0.5 s in the job logs) and spills shuffles to standard disks. But adding cores to one machine shares one memory bus and one disk, so its efficiency falls (82 % at 8 cores, 56 % at 16), while adding workers adds CPU, memory and disk together, so the cluster scaled almost perfectly from 2 to 4 workers.</w:t>
+              <w:t xml:space="preserve"> The laptop is about 5× faster than the cluster at the same core count: it has fast cores, 128 GB of memory and a local SSD, while each n2-standard-2 worker has 2 vCPUs, reads its input from Cloud Storage over the network (each request took 0.3–0.5 s in the job logs) and spills shuffles to standard disks. But adding cores to one machine shares one memory bus and one disk, so its efficiency falls (81 % at 8 cores, 56 % at 16), while adding workers adds CPU, memory and disk together, so the cluster scaled almost perfectly from 2 to 4 workers.</w:t>
             </w:r>
           </w:p>
           <w:p>
@@ -20446,7 +21926,7 @@
         <w:t xml:space="preserve">whole notebook</w:t>
       </w:r>
       <w:r>
-        <w:t xml:space="preserve"> — cleaning, Task 1, both stages of Task 2 with the full cross-validation, the 2024 evaluation and predict() — was executed on a Dataproc cluster: a master and 2 workers n2-highmem-4 (4 vCPU, 32 GB; the 12-vCPU quota), Spark 3.5.3 on YARN, the data layers on HDFS. The code is the submitted notebook with only the Spark master, the storage and the laptop core benchmark changed (cloud/make_dataproc_notebook.py); the executed copy is in cloud/full_run/. It ran without errors in 290 minutes of timed work against 74 on the laptop, 3.9× slower, for the same reasons as in Section 8.5: 8 executor cores on 2.8 GHz Xeons whose shuffles cross the network, against 14 fast cores that share one memory.</w:t>
+        <w:t xml:space="preserve"> — cleaning, Task 1, both stages of Task 2 with the full cross-validation, the 2024 evaluation and predict() — was executed on a Dataproc cluster: a master and 2 workers n2-highmem-4 (4 vCPU, 32 GB; the 12-vCPU quota), Spark 3.5.3 on YARN, the data layers on HDFS. The code is the submitted notebook with only the Spark master, the storage and the laptop core benchmark changed (cloud/make_dataproc_notebook.py); the executed copy is in cloud/full_run/. It ran without errors in 290 minutes of timed work against 73 on the laptop, 4.0× slower, for the same reasons as in Section 8.5: 8 executor cores on 2.8 GHz Xeons whose shuffles cross the network, against 14 fast cores that share one memory.</w:t>
       </w:r>
     </w:p>
     <w:tbl>
@@ -20885,7 +22365,7 @@
                 <w:sz w:val="16"/>
                 <w:szCs w:val="16"/>
               </w:rPr>
-              <w:t xml:space="preserve">4.0×</w:t>
+              <w:t xml:space="preserve">4.1×</w:t>
             </w:r>
           </w:p>
         </w:tc>
@@ -21099,7 +22579,7 @@
                 <w:sz w:val="16"/>
                 <w:szCs w:val="16"/>
               </w:rPr>
-              <w:t xml:space="preserve">11.2</w:t>
+              <w:t xml:space="preserve">7.9</w:t>
             </w:r>
           </w:p>
         </w:tc>
@@ -21167,7 +22647,7 @@
                 <w:sz w:val="16"/>
                 <w:szCs w:val="16"/>
               </w:rPr>
-              <w:t xml:space="preserve">2.7×</w:t>
+              <w:t xml:space="preserve">3.8×</w:t>
             </w:r>
           </w:p>
         </w:tc>
@@ -21240,7 +22720,7 @@
                 <w:sz w:val="16"/>
                 <w:szCs w:val="16"/>
               </w:rPr>
-              <w:t xml:space="preserve">1.2</w:t>
+              <w:t xml:space="preserve">1.3</w:t>
             </w:r>
           </w:p>
         </w:tc>
@@ -21381,7 +22861,7 @@
                 <w:sz w:val="16"/>
                 <w:szCs w:val="16"/>
               </w:rPr>
-              <w:t xml:space="preserve">35.2</w:t>
+              <w:t xml:space="preserve">37.1</w:t>
             </w:r>
           </w:p>
         </w:tc>
@@ -21449,7 +22929,7 @@
                 <w:sz w:val="16"/>
                 <w:szCs w:val="16"/>
               </w:rPr>
-              <w:t xml:space="preserve">4.6×</w:t>
+              <w:t xml:space="preserve">4.4×</w:t>
             </w:r>
           </w:p>
         </w:tc>
@@ -21522,7 +23002,7 @@
                 <w:sz w:val="16"/>
                 <w:szCs w:val="16"/>
               </w:rPr>
-              <w:t xml:space="preserve">25.0</w:t>
+              <w:t xml:space="preserve">25.4</w:t>
             </w:r>
           </w:p>
         </w:tc>
@@ -21590,7 +23070,7 @@
                 <w:sz w:val="16"/>
                 <w:szCs w:val="16"/>
               </w:rPr>
-              <w:t xml:space="preserve">3.4×</w:t>
+              <w:t xml:space="preserve">3.3×</w:t>
             </w:r>
           </w:p>
         </w:tc>
@@ -21663,7 +23143,7 @@
                 <w:sz w:val="16"/>
                 <w:szCs w:val="16"/>
               </w:rPr>
-              <w:t xml:space="preserve">74</w:t>
+              <w:t xml:space="preserve">73</w:t>
             </w:r>
           </w:p>
         </w:tc>
@@ -21731,7 +23211,7 @@
                 <w:sz w:val="16"/>
                 <w:szCs w:val="16"/>
               </w:rPr>
-              <w:t xml:space="preserve">3.9×</w:t>
+              <w:t xml:space="preserve">4.0×</w:t>
             </w:r>
           </w:p>
         </w:tc>
@@ -21750,7 +23230,7 @@
           <w:sz w:val="16"/>
           <w:szCs w:val="16"/>
         </w:rPr>
-        <w:t xml:space="preserve">Table 17. The same notebook on the laptop and on the Dataproc cluster: minutes per stage (t40_stage_timings.csv of each run).</w:t>
+        <w:t xml:space="preserve">Table 18. The same notebook on the laptop and on the Dataproc cluster: minutes per stage (t40_stage_timings.csv of each run).</w:t>
       </w:r>
     </w:p>
     <w:tbl>
@@ -22373,7 +23853,7 @@
                 <w:sz w:val="16"/>
                 <w:szCs w:val="16"/>
               </w:rPr>
-              <w:t xml:space="preserve">0.667 / 0.466 / 0.186</w:t>
+              <w:t xml:space="preserve">0.666 / 0.466 / 0.185</w:t>
             </w:r>
           </w:p>
         </w:tc>
@@ -22480,7 +23960,7 @@
                 <w:sz w:val="16"/>
                 <w:szCs w:val="16"/>
               </w:rPr>
-              <w:t xml:space="preserve">0.461 vs 0.418</w:t>
+              <w:t xml:space="preserve">0.462 vs 0.418</w:t>
             </w:r>
           </w:p>
         </w:tc>
@@ -22533,7 +24013,7 @@
           <w:sz w:val="16"/>
           <w:szCs w:val="16"/>
         </w:rPr>
-        <w:t xml:space="preserve">Table 18. Results of the two runs. Everything deterministic is identical; the tree models differ only in the third decimal because their row subsampling depends on partitioning.</w:t>
+        <w:t xml:space="preserve">Table 19. Results of the two runs. Everything deterministic is identical; the tree models differ only in the third decimal because their row subsampling depends on partitioning.</w:t>
       </w:r>
     </w:p>
     <w:p>
@@ -23031,7 +24511,7 @@
                 <w:sz w:val="16"/>
                 <w:szCs w:val="16"/>
               </w:rPr>
-              <w:t xml:space="preserve">0.166</w:t>
+              <w:t xml:space="preserve">0.168</w:t>
             </w:r>
           </w:p>
         </w:tc>
@@ -23172,7 +24652,7 @@
                 <w:sz w:val="16"/>
                 <w:szCs w:val="16"/>
               </w:rPr>
-              <w:t xml:space="preserve">0.149</w:t>
+              <w:t xml:space="preserve">0.142</w:t>
             </w:r>
           </w:p>
         </w:tc>
@@ -23245,7 +24725,7 @@
                 <w:sz w:val="16"/>
                 <w:szCs w:val="16"/>
               </w:rPr>
-              <w:t xml:space="preserve">r15</w:t>
+              <w:t xml:space="preserve">min_since_rain</w:t>
             </w:r>
           </w:p>
         </w:tc>
@@ -23313,7 +24793,7 @@
                 <w:sz w:val="16"/>
                 <w:szCs w:val="16"/>
               </w:rPr>
-              <w:t xml:space="preserve">0.073</w:t>
+              <w:t xml:space="preserve">0.074</w:t>
             </w:r>
           </w:p>
         </w:tc>
@@ -23347,7 +24827,7 @@
                 <w:sz w:val="16"/>
                 <w:szCs w:val="16"/>
               </w:rPr>
-              <w:t xml:space="preserve">Rain in the last 15 minutes: is it a passing shower or a storm?</w:t>
+              <w:t xml:space="preserve">Minutes since the gauge last saw rain (capped at 24 h). A long dry spell makes rain in the next 30 minutes unlikely.</w:t>
             </w:r>
           </w:p>
         </w:tc>
@@ -23386,7 +24866,7 @@
                 <w:sz w:val="16"/>
                 <w:szCs w:val="16"/>
               </w:rPr>
-              <w:t xml:space="preserve">outer_mean</w:t>
+              <w:t xml:space="preserve">r15</w:t>
             </w:r>
           </w:p>
         </w:tc>
@@ -23420,7 +24900,7 @@
                 <w:sz w:val="16"/>
                 <w:szCs w:val="16"/>
               </w:rPr>
-              <w:t xml:space="preserve">neighbours</w:t>
+              <w:t xml:space="preserve">recent rain</w:t>
             </w:r>
           </w:p>
         </w:tc>
@@ -23454,7 +24934,7 @@
                 <w:sz w:val="16"/>
                 <w:szCs w:val="16"/>
               </w:rPr>
-              <w:t xml:space="preserve">0.069</w:t>
+              <w:t xml:space="preserve">0.068</w:t>
             </w:r>
           </w:p>
         </w:tc>
@@ -23488,7 +24968,7 @@
                 <w:sz w:val="16"/>
                 <w:szCs w:val="16"/>
               </w:rPr>
-              <w:t xml:space="preserve">Mean 30-minute rain at gauges within 10 km: is a storm nearby?</w:t>
+              <w:t xml:space="preserve">Rain in the last 15 minutes: is it a passing shower or a storm?</w:t>
             </w:r>
           </w:p>
         </w:tc>
@@ -23527,7 +25007,7 @@
                 <w:sz w:val="16"/>
                 <w:szCs w:val="16"/>
               </w:rPr>
-              <w:t xml:space="preserve">min_since_rain</w:t>
+              <w:t xml:space="preserve">outer_mean</w:t>
             </w:r>
           </w:p>
         </w:tc>
@@ -23561,7 +25041,7 @@
                 <w:sz w:val="16"/>
                 <w:szCs w:val="16"/>
               </w:rPr>
-              <w:t xml:space="preserve">recent rain</w:t>
+              <w:t xml:space="preserve">neighbours</w:t>
             </w:r>
           </w:p>
         </w:tc>
@@ -23595,7 +25075,7 @@
                 <w:sz w:val="16"/>
                 <w:szCs w:val="16"/>
               </w:rPr>
-              <w:t xml:space="preserve">0.055</w:t>
+              <w:t xml:space="preserve">0.065</w:t>
             </w:r>
           </w:p>
         </w:tc>
@@ -23629,7 +25109,7 @@
                 <w:sz w:val="16"/>
                 <w:szCs w:val="16"/>
               </w:rPr>
-              <w:t xml:space="preserve">Minutes since the gauge last saw rain (capped at 24 h). A long dry spell makes rain in the next 30 minutes unlikely.</w:t>
+              <w:t xml:space="preserve">Mean 30-minute rain at gauges within 10 km: is a storm nearby?</w:t>
             </w:r>
           </w:p>
         </w:tc>
@@ -24018,7 +25498,7 @@
                 <w:sz w:val="16"/>
                 <w:szCs w:val="16"/>
               </w:rPr>
-              <w:t xml:space="preserve">0.034</w:t>
+              <w:t xml:space="preserve">0.033</w:t>
             </w:r>
           </w:p>
         </w:tc>
@@ -24159,7 +25639,7 @@
                 <w:sz w:val="16"/>
                 <w:szCs w:val="16"/>
               </w:rPr>
-              <w:t xml:space="preserve">0.032</w:t>
+              <w:t xml:space="preserve">0.031</w:t>
             </w:r>
           </w:p>
         </w:tc>
@@ -24212,7 +25692,7 @@
           <w:sz w:val="16"/>
           <w:szCs w:val="16"/>
         </w:rPr>
-        <w:t xml:space="preserve">Table 19. Most important features of the final model (mean decrease in impurity) with a plain-English reading.</w:t>
+        <w:t xml:space="preserve">Table 20. Most important features of the final model (mean decrease in impurity) with a plain-English reading.</w:t>
       </w:r>
     </w:p>
     <w:p>
@@ -24231,7 +25711,7 @@
         <w:t xml:space="preserve">recent-rain</w:t>
       </w:r>
       <w:r>
-        <w:t xml:space="preserve"> features raises the log loss by +8.0 %, removing the </w:t>
+        <w:t xml:space="preserve"> features raises the log loss by +7.8 %, removing the </w:t>
       </w:r>
       <w:r>
         <w:rPr>
@@ -24241,7 +25721,7 @@
         <w:t xml:space="preserve">neighbours</w:t>
       </w:r>
       <w:r>
-        <w:t xml:space="preserve"> by +2.5 % and the </w:t>
+        <w:t xml:space="preserve"> by +2.6 % and the </w:t>
       </w:r>
       <w:r>
         <w:rPr>
@@ -24251,7 +25731,7 @@
         <w:t xml:space="preserve">island-wide</w:t>
       </w:r>
       <w:r>
-        <w:t xml:space="preserve"> signal by +0.8 %, whereas removing time costs +0.3 % and removing latitude/longitude nothing (the station index already carries location). Model A, with no rain observation at all, is +86.6 % worse.</w:t>
+        <w:t xml:space="preserve"> signal by +0.9 %, whereas removing time costs +0.3 % and removing latitude/longitude nothing (the station index already carries location). Model A, with no rain observation at all, is +86.7 % worse.</w:t>
       </w:r>
     </w:p>
     <w:p>
@@ -24299,7 +25779,7 @@
         <w:t xml:space="preserve">Weakest around 12:00</w:t>
       </w:r>
       <w:r>
-        <w:t xml:space="preserve"> (Brier skill 0.11) and strongest at 23:00 (0.49): afternoon convective storms often start with little warning in the gauge record, whereas night-time rain is usually part of a system already visible at other gauges.</w:t>
+        <w:t xml:space="preserve"> (Brier skill 0.12) and strongest at 23:00 (0.48): afternoon convective storms often start with little warning in the gauge record, whereas night-time rain is usually part of a system already visible at other gauges.</w:t>
       </w:r>
     </w:p>
     <w:p>
@@ -24319,7 +25799,7 @@
         <w:t xml:space="preserve">Heavy thresholds are hardest:</w:t>
       </w:r>
       <w:r>
-        <w:t xml:space="preserve"> at 20 mm (0.1 % of half-hours) PR-AUC is 0.186; ROC-AUC stays high, so the model still ranks the risky half-hours well, but it cannot say *how* heavy a storm will be.</w:t>
+        <w:t xml:space="preserve"> at 20 mm (0.1 % of half-hours) PR-AUC is 0.185; ROC-AUC stays high, so the model still ranks the risky half-hours well, but it cannot say *how* heavy a storm will be.</w:t>
       </w:r>
     </w:p>
     <w:p>
@@ -24347,107 +25827,1559 @@
         <w:pStyle w:val="Heading2"/>
       </w:pPr>
       <w:r>
-        <w:t xml:space="preserve">9.3 How Spark was used to make this scale</w:t>
+        <w:t xml:space="preserve">9.3 Spark concepts from the course in this pipeline</w:t>
       </w:r>
     </w:p>
     <w:p>
       <w:pPr>
-        <w:pStyle w:val="ListParagraph"/>
-        <w:numPr>
-          <w:ilvl w:val="0"/>
-          <w:numId w:val="2"/>
-        </w:numPr>
-        <w:spacing w:after="60" w:line="264"/>
+        <w:spacing w:after="120" w:line="276"/>
+        <w:jc w:val="both"/>
       </w:pPr>
       <w:r>
         <w:rPr>
           <w:b/>
           <w:bCs/>
         </w:rPr>
-        <w:t xml:space="preserve">Parse once, read many times:</w:t>
+        <w:t xml:space="preserve">Narrow and wide transformations.</w:t>
       </w:r>
       <w:r>
-        <w:t xml:space="preserve"> the CSVs are read once with an explicit schema into year-partitioned Parquet; every later step reads the compact columnar copy (49 MB instead of 7.5 GB).</w:t>
+        <w:t xml:space="preserve"> A narrow transformation keeps every partition separate; a wide one must bring rows with the same key together and therefore </w:t>
+      </w:r>
+      <w:r>
+        <w:rPr>
+          <w:b/>
+          <w:bCs/>
+        </w:rPr>
+        <w:t xml:space="preserve">shuffles</w:t>
+      </w:r>
+      <w:r>
+        <w:t xml:space="preserve"> data between executors. The cost of this pipeline is in its wide steps, so they were designed to shuffle as little as possible:</w:t>
+      </w:r>
+    </w:p>
+    <w:tbl>
+      <w:tblPr>
+        <w:tblW w:type="dxa" w:w="9638"/>
+        <w:tblBorders>
+          <w:top w:val="single" w:color="auto" w:sz="4"/>
+          <w:left w:val="single" w:color="auto" w:sz="4"/>
+          <w:bottom w:val="single" w:color="auto" w:sz="4"/>
+          <w:right w:val="single" w:color="auto" w:sz="4"/>
+          <w:insideH w:val="single" w:color="auto" w:sz="4"/>
+          <w:insideV w:val="single" w:color="auto" w:sz="4"/>
+        </w:tblBorders>
+      </w:tblPr>
+      <w:tblGrid>
+        <w:gridCol w:w="2700"/>
+        <w:gridCol w:w="3300"/>
+        <w:gridCol w:w="1300"/>
+        <w:gridCol w:w="2338"/>
+      </w:tblGrid>
+      <w:tr>
+        <w:trPr>
+          <w:tblHeader/>
+        </w:trPr>
+        <w:tc>
+          <w:tcPr>
+            <w:tcW w:type="dxa" w:w="2700"/>
+            <w:tcBorders>
+              <w:top w:val="single" w:color="D5DAE3" w:sz="4"/>
+              <w:left w:val="single" w:color="D5DAE3" w:sz="4"/>
+              <w:bottom w:val="single" w:color="D5DAE3" w:sz="4"/>
+              <w:right w:val="single" w:color="D5DAE3" w:sz="4"/>
+            </w:tcBorders>
+            <w:shd w:fill="1B2A4A" w:color="auto" w:val="clear"/>
+            <w:tcMar>
+              <w:top w:type="dxa" w:w="45"/>
+              <w:left w:type="dxa" w:w="80"/>
+              <w:bottom w:type="dxa" w:w="45"/>
+              <w:right w:type="dxa" w:w="80"/>
+            </w:tcMar>
+            <w:vAlign w:val="center"/>
+          </w:tcPr>
+          <w:p>
+            <w:pPr>
+              <w:jc w:val="left"/>
+            </w:pPr>
+            <w:r>
+              <w:rPr>
+                <w:b/>
+                <w:bCs/>
+                <w:color w:val="FFFFFF"/>
+                <w:sz w:val="16"/>
+                <w:szCs w:val="16"/>
+              </w:rPr>
+              <w:t xml:space="preserve">Step</w:t>
+            </w:r>
+          </w:p>
+        </w:tc>
+        <w:tc>
+          <w:tcPr>
+            <w:tcW w:type="dxa" w:w="3300"/>
+            <w:tcBorders>
+              <w:top w:val="single" w:color="D5DAE3" w:sz="4"/>
+              <w:left w:val="single" w:color="D5DAE3" w:sz="4"/>
+              <w:bottom w:val="single" w:color="D5DAE3" w:sz="4"/>
+              <w:right w:val="single" w:color="D5DAE3" w:sz="4"/>
+            </w:tcBorders>
+            <w:shd w:fill="1B2A4A" w:color="auto" w:val="clear"/>
+            <w:tcMar>
+              <w:top w:type="dxa" w:w="45"/>
+              <w:left w:type="dxa" w:w="80"/>
+              <w:bottom w:type="dxa" w:w="45"/>
+              <w:right w:type="dxa" w:w="80"/>
+            </w:tcMar>
+            <w:vAlign w:val="center"/>
+          </w:tcPr>
+          <w:p>
+            <w:pPr>
+              <w:jc w:val="left"/>
+            </w:pPr>
+            <w:r>
+              <w:rPr>
+                <w:b/>
+                <w:bCs/>
+                <w:color w:val="FFFFFF"/>
+                <w:sz w:val="16"/>
+                <w:szCs w:val="16"/>
+              </w:rPr>
+              <w:t xml:space="preserve">Spark operation</w:t>
+            </w:r>
+          </w:p>
+        </w:tc>
+        <w:tc>
+          <w:tcPr>
+            <w:tcW w:type="dxa" w:w="1300"/>
+            <w:tcBorders>
+              <w:top w:val="single" w:color="D5DAE3" w:sz="4"/>
+              <w:left w:val="single" w:color="D5DAE3" w:sz="4"/>
+              <w:bottom w:val="single" w:color="D5DAE3" w:sz="4"/>
+              <w:right w:val="single" w:color="D5DAE3" w:sz="4"/>
+            </w:tcBorders>
+            <w:shd w:fill="1B2A4A" w:color="auto" w:val="clear"/>
+            <w:tcMar>
+              <w:top w:type="dxa" w:w="45"/>
+              <w:left w:type="dxa" w:w="80"/>
+              <w:bottom w:type="dxa" w:w="45"/>
+              <w:right w:type="dxa" w:w="80"/>
+            </w:tcMar>
+            <w:vAlign w:val="center"/>
+          </w:tcPr>
+          <w:p>
+            <w:pPr>
+              <w:jc w:val="center"/>
+            </w:pPr>
+            <w:r>
+              <w:rPr>
+                <w:b/>
+                <w:bCs/>
+                <w:color w:val="FFFFFF"/>
+                <w:sz w:val="16"/>
+                <w:szCs w:val="16"/>
+              </w:rPr>
+              <w:t xml:space="preserve">Type</w:t>
+            </w:r>
+          </w:p>
+        </w:tc>
+        <w:tc>
+          <w:tcPr>
+            <w:tcW w:type="dxa" w:w="2338"/>
+            <w:tcBorders>
+              <w:top w:val="single" w:color="D5DAE3" w:sz="4"/>
+              <w:left w:val="single" w:color="D5DAE3" w:sz="4"/>
+              <w:bottom w:val="single" w:color="D5DAE3" w:sz="4"/>
+              <w:right w:val="single" w:color="D5DAE3" w:sz="4"/>
+            </w:tcBorders>
+            <w:shd w:fill="1B2A4A" w:color="auto" w:val="clear"/>
+            <w:tcMar>
+              <w:top w:type="dxa" w:w="45"/>
+              <w:left w:type="dxa" w:w="80"/>
+              <w:bottom w:type="dxa" w:w="45"/>
+              <w:right w:type="dxa" w:w="80"/>
+            </w:tcMar>
+            <w:vAlign w:val="center"/>
+          </w:tcPr>
+          <w:p>
+            <w:pPr>
+              <w:jc w:val="left"/>
+            </w:pPr>
+            <w:r>
+              <w:rPr>
+                <w:b/>
+                <w:bCs/>
+                <w:color w:val="FFFFFF"/>
+                <w:sz w:val="16"/>
+                <w:szCs w:val="16"/>
+              </w:rPr>
+              <w:t xml:space="preserve">Data movement</w:t>
+            </w:r>
+          </w:p>
+        </w:tc>
+      </w:tr>
+      <w:tr>
+        <w:trPr>
+          <w:cantSplit/>
+        </w:trPr>
+        <w:tc>
+          <w:tcPr>
+            <w:tcW w:type="dxa" w:w="2700"/>
+            <w:tcBorders>
+              <w:top w:val="single" w:color="D5DAE3" w:sz="4"/>
+              <w:left w:val="single" w:color="D5DAE3" w:sz="4"/>
+              <w:bottom w:val="single" w:color="D5DAE3" w:sz="4"/>
+              <w:right w:val="single" w:color="D5DAE3" w:sz="4"/>
+            </w:tcBorders>
+            <w:shd w:fill="FFFFFF" w:color="auto" w:val="clear"/>
+            <w:tcMar>
+              <w:top w:type="dxa" w:w="45"/>
+              <w:left w:type="dxa" w:w="80"/>
+              <w:bottom w:type="dxa" w:w="45"/>
+              <w:right w:type="dxa" w:w="80"/>
+            </w:tcMar>
+            <w:vAlign w:val="center"/>
+          </w:tcPr>
+          <w:p>
+            <w:pPr>
+              <w:jc w:val="left"/>
+            </w:pPr>
+            <w:r>
+              <w:rPr>
+                <w:b w:val="false"/>
+                <w:bCs w:val="false"/>
+                <w:color w:val="3C3C3C"/>
+                <w:sz w:val="16"/>
+                <w:szCs w:val="16"/>
+              </w:rPr>
+              <w:t xml:space="preserve">Typing, timestamp snap, range check, reading type</w:t>
+            </w:r>
+          </w:p>
+        </w:tc>
+        <w:tc>
+          <w:tcPr>
+            <w:tcW w:type="dxa" w:w="3300"/>
+            <w:tcBorders>
+              <w:top w:val="single" w:color="D5DAE3" w:sz="4"/>
+              <w:left w:val="single" w:color="D5DAE3" w:sz="4"/>
+              <w:bottom w:val="single" w:color="D5DAE3" w:sz="4"/>
+              <w:right w:val="single" w:color="D5DAE3" w:sz="4"/>
+            </w:tcBorders>
+            <w:shd w:fill="FFFFFF" w:color="auto" w:val="clear"/>
+            <w:tcMar>
+              <w:top w:type="dxa" w:w="45"/>
+              <w:left w:type="dxa" w:w="80"/>
+              <w:bottom w:type="dxa" w:w="45"/>
+              <w:right w:type="dxa" w:w="80"/>
+            </w:tcMar>
+            <w:vAlign w:val="center"/>
+          </w:tcPr>
+          <w:p>
+            <w:pPr>
+              <w:jc w:val="left"/>
+            </w:pPr>
+            <w:r>
+              <w:rPr>
+                <w:b w:val="false"/>
+                <w:bCs w:val="false"/>
+                <w:color w:val="3C3C3C"/>
+                <w:sz w:val="16"/>
+                <w:szCs w:val="16"/>
+              </w:rPr>
+              <w:t xml:space="preserve">select, withColumn, filter</w:t>
+            </w:r>
+          </w:p>
+        </w:tc>
+        <w:tc>
+          <w:tcPr>
+            <w:tcW w:type="dxa" w:w="1300"/>
+            <w:tcBorders>
+              <w:top w:val="single" w:color="D5DAE3" w:sz="4"/>
+              <w:left w:val="single" w:color="D5DAE3" w:sz="4"/>
+              <w:bottom w:val="single" w:color="D5DAE3" w:sz="4"/>
+              <w:right w:val="single" w:color="D5DAE3" w:sz="4"/>
+            </w:tcBorders>
+            <w:shd w:fill="FFFFFF" w:color="auto" w:val="clear"/>
+            <w:tcMar>
+              <w:top w:type="dxa" w:w="45"/>
+              <w:left w:type="dxa" w:w="80"/>
+              <w:bottom w:type="dxa" w:w="45"/>
+              <w:right w:type="dxa" w:w="80"/>
+            </w:tcMar>
+            <w:vAlign w:val="center"/>
+          </w:tcPr>
+          <w:p>
+            <w:pPr>
+              <w:jc w:val="center"/>
+            </w:pPr>
+            <w:r>
+              <w:rPr>
+                <w:b w:val="false"/>
+                <w:bCs w:val="false"/>
+                <w:color w:val="3C3C3C"/>
+                <w:sz w:val="16"/>
+                <w:szCs w:val="16"/>
+              </w:rPr>
+              <w:t xml:space="preserve">narrow</w:t>
+            </w:r>
+          </w:p>
+        </w:tc>
+        <w:tc>
+          <w:tcPr>
+            <w:tcW w:type="dxa" w:w="2338"/>
+            <w:tcBorders>
+              <w:top w:val="single" w:color="D5DAE3" w:sz="4"/>
+              <w:left w:val="single" w:color="D5DAE3" w:sz="4"/>
+              <w:bottom w:val="single" w:color="D5DAE3" w:sz="4"/>
+              <w:right w:val="single" w:color="D5DAE3" w:sz="4"/>
+            </w:tcBorders>
+            <w:shd w:fill="FFFFFF" w:color="auto" w:val="clear"/>
+            <w:tcMar>
+              <w:top w:type="dxa" w:w="45"/>
+              <w:left w:type="dxa" w:w="80"/>
+              <w:bottom w:type="dxa" w:w="45"/>
+              <w:right w:type="dxa" w:w="80"/>
+            </w:tcMar>
+            <w:vAlign w:val="center"/>
+          </w:tcPr>
+          <w:p>
+            <w:pPr>
+              <w:jc w:val="left"/>
+            </w:pPr>
+            <w:r>
+              <w:rPr>
+                <w:b w:val="false"/>
+                <w:bCs w:val="false"/>
+                <w:color w:val="3C3C3C"/>
+                <w:sz w:val="16"/>
+                <w:szCs w:val="16"/>
+              </w:rPr>
+              <w:t xml:space="preserve">none</w:t>
+            </w:r>
+          </w:p>
+        </w:tc>
+      </w:tr>
+      <w:tr>
+        <w:trPr>
+          <w:cantSplit/>
+        </w:trPr>
+        <w:tc>
+          <w:tcPr>
+            <w:tcW w:type="dxa" w:w="2700"/>
+            <w:tcBorders>
+              <w:top w:val="single" w:color="D5DAE3" w:sz="4"/>
+              <w:left w:val="single" w:color="D5DAE3" w:sz="4"/>
+              <w:bottom w:val="single" w:color="D5DAE3" w:sz="4"/>
+              <w:right w:val="single" w:color="D5DAE3" w:sz="4"/>
+            </w:tcBorders>
+            <w:shd w:fill="F4F6FA" w:color="auto" w:val="clear"/>
+            <w:tcMar>
+              <w:top w:type="dxa" w:w="45"/>
+              <w:left w:type="dxa" w:w="80"/>
+              <w:bottom w:type="dxa" w:w="45"/>
+              <w:right w:type="dxa" w:w="80"/>
+            </w:tcMar>
+            <w:vAlign w:val="center"/>
+          </w:tcPr>
+          <w:p>
+            <w:pPr>
+              <w:jc w:val="left"/>
+            </w:pPr>
+            <w:r>
+              <w:rPr>
+                <w:b w:val="false"/>
+                <w:bCs w:val="false"/>
+                <w:color w:val="3C3C3C"/>
+                <w:sz w:val="16"/>
+                <w:szCs w:val="16"/>
+              </w:rPr>
+              <w:t xml:space="preserve">De-duplicate station-slots</w:t>
+            </w:r>
+          </w:p>
+        </w:tc>
+        <w:tc>
+          <w:tcPr>
+            <w:tcW w:type="dxa" w:w="3300"/>
+            <w:tcBorders>
+              <w:top w:val="single" w:color="D5DAE3" w:sz="4"/>
+              <w:left w:val="single" w:color="D5DAE3" w:sz="4"/>
+              <w:bottom w:val="single" w:color="D5DAE3" w:sz="4"/>
+              <w:right w:val="single" w:color="D5DAE3" w:sz="4"/>
+            </w:tcBorders>
+            <w:shd w:fill="F4F6FA" w:color="auto" w:val="clear"/>
+            <w:tcMar>
+              <w:top w:type="dxa" w:w="45"/>
+              <w:left w:type="dxa" w:w="80"/>
+              <w:bottom w:type="dxa" w:w="45"/>
+              <w:right w:type="dxa" w:w="80"/>
+            </w:tcMar>
+            <w:vAlign w:val="center"/>
+          </w:tcPr>
+          <w:p>
+            <w:pPr>
+              <w:jc w:val="left"/>
+            </w:pPr>
+            <w:r>
+              <w:rPr>
+                <w:b w:val="false"/>
+                <w:bCs w:val="false"/>
+                <w:color w:val="3C3C3C"/>
+                <w:sz w:val="16"/>
+                <w:szCs w:val="16"/>
+              </w:rPr>
+              <w:t xml:space="preserve">groupBy(station, slot).agg(max(struct(update, value)))</w:t>
+            </w:r>
+          </w:p>
+        </w:tc>
+        <w:tc>
+          <w:tcPr>
+            <w:tcW w:type="dxa" w:w="1300"/>
+            <w:tcBorders>
+              <w:top w:val="single" w:color="D5DAE3" w:sz="4"/>
+              <w:left w:val="single" w:color="D5DAE3" w:sz="4"/>
+              <w:bottom w:val="single" w:color="D5DAE3" w:sz="4"/>
+              <w:right w:val="single" w:color="D5DAE3" w:sz="4"/>
+            </w:tcBorders>
+            <w:shd w:fill="F4F6FA" w:color="auto" w:val="clear"/>
+            <w:tcMar>
+              <w:top w:type="dxa" w:w="45"/>
+              <w:left w:type="dxa" w:w="80"/>
+              <w:bottom w:type="dxa" w:w="45"/>
+              <w:right w:type="dxa" w:w="80"/>
+            </w:tcMar>
+            <w:vAlign w:val="center"/>
+          </w:tcPr>
+          <w:p>
+            <w:pPr>
+              <w:jc w:val="center"/>
+            </w:pPr>
+            <w:r>
+              <w:rPr>
+                <w:b w:val="false"/>
+                <w:bCs w:val="false"/>
+                <w:color w:val="3C3C3C"/>
+                <w:sz w:val="16"/>
+                <w:szCs w:val="16"/>
+              </w:rPr>
+              <w:t xml:space="preserve">wide</w:t>
+            </w:r>
+          </w:p>
+        </w:tc>
+        <w:tc>
+          <w:tcPr>
+            <w:tcW w:type="dxa" w:w="2338"/>
+            <w:tcBorders>
+              <w:top w:val="single" w:color="D5DAE3" w:sz="4"/>
+              <w:left w:val="single" w:color="D5DAE3" w:sz="4"/>
+              <w:bottom w:val="single" w:color="D5DAE3" w:sz="4"/>
+              <w:right w:val="single" w:color="D5DAE3" w:sz="4"/>
+            </w:tcBorders>
+            <w:shd w:fill="F4F6FA" w:color="auto" w:val="clear"/>
+            <w:tcMar>
+              <w:top w:type="dxa" w:w="45"/>
+              <w:left w:type="dxa" w:w="80"/>
+              <w:bottom w:type="dxa" w:w="45"/>
+              <w:right w:type="dxa" w:w="80"/>
+            </w:tcMar>
+            <w:vAlign w:val="center"/>
+          </w:tcPr>
+          <w:p>
+            <w:pPr>
+              <w:jc w:val="left"/>
+            </w:pPr>
+            <w:r>
+              <w:rPr>
+                <w:b w:val="false"/>
+                <w:bCs w:val="false"/>
+                <w:color w:val="3C3C3C"/>
+                <w:sz w:val="16"/>
+                <w:szCs w:val="16"/>
+              </w:rPr>
+              <w:t xml:space="preserve">one hash shuffle (no sort)</w:t>
+            </w:r>
+          </w:p>
+        </w:tc>
+      </w:tr>
+      <w:tr>
+        <w:trPr>
+          <w:cantSplit/>
+        </w:trPr>
+        <w:tc>
+          <w:tcPr>
+            <w:tcW w:type="dxa" w:w="2700"/>
+            <w:tcBorders>
+              <w:top w:val="single" w:color="D5DAE3" w:sz="4"/>
+              <w:left w:val="single" w:color="D5DAE3" w:sz="4"/>
+              <w:bottom w:val="single" w:color="D5DAE3" w:sz="4"/>
+              <w:right w:val="single" w:color="D5DAE3" w:sz="4"/>
+            </w:tcBorders>
+            <w:shd w:fill="FFFFFF" w:color="auto" w:val="clear"/>
+            <w:tcMar>
+              <w:top w:type="dxa" w:w="45"/>
+              <w:left w:type="dxa" w:w="80"/>
+              <w:bottom w:type="dxa" w:w="45"/>
+              <w:right w:type="dxa" w:w="80"/>
+            </w:tcMar>
+            <w:vAlign w:val="center"/>
+          </w:tcPr>
+          <w:p>
+            <w:pPr>
+              <w:jc w:val="left"/>
+            </w:pPr>
+            <w:r>
+              <w:rPr>
+                <w:b w:val="false"/>
+                <w:bCs w:val="false"/>
+                <w:color w:val="3C3C3C"/>
+                <w:sz w:val="16"/>
+                <w:szCs w:val="16"/>
+              </w:rPr>
+              <w:t xml:space="preserve">Station-days, island-days, monthly and annual totals</w:t>
+            </w:r>
+          </w:p>
+        </w:tc>
+        <w:tc>
+          <w:tcPr>
+            <w:tcW w:type="dxa" w:w="3300"/>
+            <w:tcBorders>
+              <w:top w:val="single" w:color="D5DAE3" w:sz="4"/>
+              <w:left w:val="single" w:color="D5DAE3" w:sz="4"/>
+              <w:bottom w:val="single" w:color="D5DAE3" w:sz="4"/>
+              <w:right w:val="single" w:color="D5DAE3" w:sz="4"/>
+            </w:tcBorders>
+            <w:shd w:fill="FFFFFF" w:color="auto" w:val="clear"/>
+            <w:tcMar>
+              <w:top w:type="dxa" w:w="45"/>
+              <w:left w:type="dxa" w:w="80"/>
+              <w:bottom w:type="dxa" w:w="45"/>
+              <w:right w:type="dxa" w:w="80"/>
+            </w:tcMar>
+            <w:vAlign w:val="center"/>
+          </w:tcPr>
+          <w:p>
+            <w:pPr>
+              <w:jc w:val="left"/>
+            </w:pPr>
+            <w:r>
+              <w:rPr>
+                <w:b w:val="false"/>
+                <w:bCs w:val="false"/>
+                <w:color w:val="3C3C3C"/>
+                <w:sz w:val="16"/>
+                <w:szCs w:val="16"/>
+              </w:rPr>
+              <w:t xml:space="preserve">groupBy aggregations</w:t>
+            </w:r>
+          </w:p>
+        </w:tc>
+        <w:tc>
+          <w:tcPr>
+            <w:tcW w:type="dxa" w:w="1300"/>
+            <w:tcBorders>
+              <w:top w:val="single" w:color="D5DAE3" w:sz="4"/>
+              <w:left w:val="single" w:color="D5DAE3" w:sz="4"/>
+              <w:bottom w:val="single" w:color="D5DAE3" w:sz="4"/>
+              <w:right w:val="single" w:color="D5DAE3" w:sz="4"/>
+            </w:tcBorders>
+            <w:shd w:fill="FFFFFF" w:color="auto" w:val="clear"/>
+            <w:tcMar>
+              <w:top w:type="dxa" w:w="45"/>
+              <w:left w:type="dxa" w:w="80"/>
+              <w:bottom w:type="dxa" w:w="45"/>
+              <w:right w:type="dxa" w:w="80"/>
+            </w:tcMar>
+            <w:vAlign w:val="center"/>
+          </w:tcPr>
+          <w:p>
+            <w:pPr>
+              <w:jc w:val="center"/>
+            </w:pPr>
+            <w:r>
+              <w:rPr>
+                <w:b w:val="false"/>
+                <w:bCs w:val="false"/>
+                <w:color w:val="3C3C3C"/>
+                <w:sz w:val="16"/>
+                <w:szCs w:val="16"/>
+              </w:rPr>
+              <w:t xml:space="preserve">wide</w:t>
+            </w:r>
+          </w:p>
+        </w:tc>
+        <w:tc>
+          <w:tcPr>
+            <w:tcW w:type="dxa" w:w="2338"/>
+            <w:tcBorders>
+              <w:top w:val="single" w:color="D5DAE3" w:sz="4"/>
+              <w:left w:val="single" w:color="D5DAE3" w:sz="4"/>
+              <w:bottom w:val="single" w:color="D5DAE3" w:sz="4"/>
+              <w:right w:val="single" w:color="D5DAE3" w:sz="4"/>
+            </w:tcBorders>
+            <w:shd w:fill="FFFFFF" w:color="auto" w:val="clear"/>
+            <w:tcMar>
+              <w:top w:type="dxa" w:w="45"/>
+              <w:left w:type="dxa" w:w="80"/>
+              <w:bottom w:type="dxa" w:w="45"/>
+              <w:right w:type="dxa" w:w="80"/>
+            </w:tcMar>
+            <w:vAlign w:val="center"/>
+          </w:tcPr>
+          <w:p>
+            <w:pPr>
+              <w:jc w:val="left"/>
+            </w:pPr>
+            <w:r>
+              <w:rPr>
+                <w:b w:val="false"/>
+                <w:bCs w:val="false"/>
+                <w:color w:val="3C3C3C"/>
+                <w:sz w:val="16"/>
+                <w:szCs w:val="16"/>
+              </w:rPr>
+              <w:t xml:space="preserve">partial aggregation, then a shuffle of small partial results</w:t>
+            </w:r>
+          </w:p>
+        </w:tc>
+      </w:tr>
+      <w:tr>
+        <w:trPr>
+          <w:cantSplit/>
+        </w:trPr>
+        <w:tc>
+          <w:tcPr>
+            <w:tcW w:type="dxa" w:w="2700"/>
+            <w:tcBorders>
+              <w:top w:val="single" w:color="D5DAE3" w:sz="4"/>
+              <w:left w:val="single" w:color="D5DAE3" w:sz="4"/>
+              <w:bottom w:val="single" w:color="D5DAE3" w:sz="4"/>
+              <w:right w:val="single" w:color="D5DAE3" w:sz="4"/>
+            </w:tcBorders>
+            <w:shd w:fill="F4F6FA" w:color="auto" w:val="clear"/>
+            <w:tcMar>
+              <w:top w:type="dxa" w:w="45"/>
+              <w:left w:type="dxa" w:w="80"/>
+              <w:bottom w:type="dxa" w:w="45"/>
+              <w:right w:type="dxa" w:w="80"/>
+            </w:tcMar>
+            <w:vAlign w:val="center"/>
+          </w:tcPr>
+          <w:p>
+            <w:pPr>
+              <w:jc w:val="left"/>
+            </w:pPr>
+            <w:r>
+              <w:rPr>
+                <w:b w:val="false"/>
+                <w:bCs w:val="false"/>
+                <w:color w:val="3C3C3C"/>
+                <w:sz w:val="16"/>
+                <w:szCs w:val="16"/>
+              </w:rPr>
+              <w:t xml:space="preserve">Rolling rain windows, time since rain, storm trend</w:t>
+            </w:r>
+          </w:p>
+        </w:tc>
+        <w:tc>
+          <w:tcPr>
+            <w:tcW w:type="dxa" w:w="3300"/>
+            <w:tcBorders>
+              <w:top w:val="single" w:color="D5DAE3" w:sz="4"/>
+              <w:left w:val="single" w:color="D5DAE3" w:sz="4"/>
+              <w:bottom w:val="single" w:color="D5DAE3" w:sz="4"/>
+              <w:right w:val="single" w:color="D5DAE3" w:sz="4"/>
+            </w:tcBorders>
+            <w:shd w:fill="F4F6FA" w:color="auto" w:val="clear"/>
+            <w:tcMar>
+              <w:top w:type="dxa" w:w="45"/>
+              <w:left w:type="dxa" w:w="80"/>
+              <w:bottom w:type="dxa" w:w="45"/>
+              <w:right w:type="dxa" w:w="80"/>
+            </w:tcMar>
+            <w:vAlign w:val="center"/>
+          </w:tcPr>
+          <w:p>
+            <w:pPr>
+              <w:jc w:val="left"/>
+            </w:pPr>
+            <w:r>
+              <w:rPr>
+                <w:b w:val="false"/>
+                <w:bCs w:val="false"/>
+                <w:color w:val="3C3C3C"/>
+                <w:sz w:val="16"/>
+                <w:szCs w:val="16"/>
+              </w:rPr>
+              <w:t xml:space="preserve">Window.partitionBy(station).orderBy(time).rangeBetween</w:t>
+            </w:r>
+          </w:p>
+        </w:tc>
+        <w:tc>
+          <w:tcPr>
+            <w:tcW w:type="dxa" w:w="1300"/>
+            <w:tcBorders>
+              <w:top w:val="single" w:color="D5DAE3" w:sz="4"/>
+              <w:left w:val="single" w:color="D5DAE3" w:sz="4"/>
+              <w:bottom w:val="single" w:color="D5DAE3" w:sz="4"/>
+              <w:right w:val="single" w:color="D5DAE3" w:sz="4"/>
+            </w:tcBorders>
+            <w:shd w:fill="F4F6FA" w:color="auto" w:val="clear"/>
+            <w:tcMar>
+              <w:top w:type="dxa" w:w="45"/>
+              <w:left w:type="dxa" w:w="80"/>
+              <w:bottom w:type="dxa" w:w="45"/>
+              <w:right w:type="dxa" w:w="80"/>
+            </w:tcMar>
+            <w:vAlign w:val="center"/>
+          </w:tcPr>
+          <w:p>
+            <w:pPr>
+              <w:jc w:val="center"/>
+            </w:pPr>
+            <w:r>
+              <w:rPr>
+                <w:b w:val="false"/>
+                <w:bCs w:val="false"/>
+                <w:color w:val="3C3C3C"/>
+                <w:sz w:val="16"/>
+                <w:szCs w:val="16"/>
+              </w:rPr>
+              <w:t xml:space="preserve">wide</w:t>
+            </w:r>
+          </w:p>
+        </w:tc>
+        <w:tc>
+          <w:tcPr>
+            <w:tcW w:type="dxa" w:w="2338"/>
+            <w:tcBorders>
+              <w:top w:val="single" w:color="D5DAE3" w:sz="4"/>
+              <w:left w:val="single" w:color="D5DAE3" w:sz="4"/>
+              <w:bottom w:val="single" w:color="D5DAE3" w:sz="4"/>
+              <w:right w:val="single" w:color="D5DAE3" w:sz="4"/>
+            </w:tcBorders>
+            <w:shd w:fill="F4F6FA" w:color="auto" w:val="clear"/>
+            <w:tcMar>
+              <w:top w:type="dxa" w:w="45"/>
+              <w:left w:type="dxa" w:w="80"/>
+              <w:bottom w:type="dxa" w:w="45"/>
+              <w:right w:type="dxa" w:w="80"/>
+            </w:tcMar>
+            <w:vAlign w:val="center"/>
+          </w:tcPr>
+          <w:p>
+            <w:pPr>
+              <w:jc w:val="left"/>
+            </w:pPr>
+            <w:r>
+              <w:rPr>
+                <w:b w:val="false"/>
+                <w:bCs w:val="false"/>
+                <w:color w:val="3C3C3C"/>
+                <w:sz w:val="16"/>
+                <w:szCs w:val="16"/>
+              </w:rPr>
+              <w:t xml:space="preserve">shuffle by station, sort within partitions</w:t>
+            </w:r>
+          </w:p>
+        </w:tc>
+      </w:tr>
+      <w:tr>
+        <w:trPr>
+          <w:cantSplit/>
+        </w:trPr>
+        <w:tc>
+          <w:tcPr>
+            <w:tcW w:type="dxa" w:w="2700"/>
+            <w:tcBorders>
+              <w:top w:val="single" w:color="D5DAE3" w:sz="4"/>
+              <w:left w:val="single" w:color="D5DAE3" w:sz="4"/>
+              <w:bottom w:val="single" w:color="D5DAE3" w:sz="4"/>
+              <w:right w:val="single" w:color="D5DAE3" w:sz="4"/>
+            </w:tcBorders>
+            <w:shd w:fill="FFFFFF" w:color="auto" w:val="clear"/>
+            <w:tcMar>
+              <w:top w:type="dxa" w:w="45"/>
+              <w:left w:type="dxa" w:w="80"/>
+              <w:bottom w:type="dxa" w:w="45"/>
+              <w:right w:type="dxa" w:w="80"/>
+            </w:tcMar>
+            <w:vAlign w:val="center"/>
+          </w:tcPr>
+          <w:p>
+            <w:pPr>
+              <w:jc w:val="left"/>
+            </w:pPr>
+            <w:r>
+              <w:rPr>
+                <w:b w:val="false"/>
+                <w:bCs w:val="false"/>
+                <w:color w:val="3C3C3C"/>
+                <w:sz w:val="16"/>
+                <w:szCs w:val="16"/>
+              </w:rPr>
+              <w:t xml:space="preserve">Neighbour rings and gauge-fault checks</w:t>
+            </w:r>
+          </w:p>
+        </w:tc>
+        <w:tc>
+          <w:tcPr>
+            <w:tcW w:type="dxa" w:w="3300"/>
+            <w:tcBorders>
+              <w:top w:val="single" w:color="D5DAE3" w:sz="4"/>
+              <w:left w:val="single" w:color="D5DAE3" w:sz="4"/>
+              <w:bottom w:val="single" w:color="D5DAE3" w:sz="4"/>
+              <w:right w:val="single" w:color="D5DAE3" w:sz="4"/>
+            </w:tcBorders>
+            <w:shd w:fill="FFFFFF" w:color="auto" w:val="clear"/>
+            <w:tcMar>
+              <w:top w:type="dxa" w:w="45"/>
+              <w:left w:type="dxa" w:w="80"/>
+              <w:bottom w:type="dxa" w:w="45"/>
+              <w:right w:type="dxa" w:w="80"/>
+            </w:tcMar>
+            <w:vAlign w:val="center"/>
+          </w:tcPr>
+          <w:p>
+            <w:pPr>
+              <w:jc w:val="left"/>
+            </w:pPr>
+            <w:r>
+              <w:rPr>
+                <w:b w:val="false"/>
+                <w:bCs w:val="false"/>
+                <w:color w:val="3C3C3C"/>
+                <w:sz w:val="16"/>
+                <w:szCs w:val="16"/>
+              </w:rPr>
+              <w:t xml:space="preserve">join with a broadcast station-pair table</w:t>
+            </w:r>
+          </w:p>
+        </w:tc>
+        <w:tc>
+          <w:tcPr>
+            <w:tcW w:type="dxa" w:w="1300"/>
+            <w:tcBorders>
+              <w:top w:val="single" w:color="D5DAE3" w:sz="4"/>
+              <w:left w:val="single" w:color="D5DAE3" w:sz="4"/>
+              <w:bottom w:val="single" w:color="D5DAE3" w:sz="4"/>
+              <w:right w:val="single" w:color="D5DAE3" w:sz="4"/>
+            </w:tcBorders>
+            <w:shd w:fill="FFFFFF" w:color="auto" w:val="clear"/>
+            <w:tcMar>
+              <w:top w:type="dxa" w:w="45"/>
+              <w:left w:type="dxa" w:w="80"/>
+              <w:bottom w:type="dxa" w:w="45"/>
+              <w:right w:type="dxa" w:w="80"/>
+            </w:tcMar>
+            <w:vAlign w:val="center"/>
+          </w:tcPr>
+          <w:p>
+            <w:pPr>
+              <w:jc w:val="center"/>
+            </w:pPr>
+            <w:r>
+              <w:rPr>
+                <w:b w:val="false"/>
+                <w:bCs w:val="false"/>
+                <w:color w:val="3C3C3C"/>
+                <w:sz w:val="16"/>
+                <w:szCs w:val="16"/>
+              </w:rPr>
+              <w:t xml:space="preserve">narrow on the large side</w:t>
+            </w:r>
+          </w:p>
+        </w:tc>
+        <w:tc>
+          <w:tcPr>
+            <w:tcW w:type="dxa" w:w="2338"/>
+            <w:tcBorders>
+              <w:top w:val="single" w:color="D5DAE3" w:sz="4"/>
+              <w:left w:val="single" w:color="D5DAE3" w:sz="4"/>
+              <w:bottom w:val="single" w:color="D5DAE3" w:sz="4"/>
+              <w:right w:val="single" w:color="D5DAE3" w:sz="4"/>
+            </w:tcBorders>
+            <w:shd w:fill="FFFFFF" w:color="auto" w:val="clear"/>
+            <w:tcMar>
+              <w:top w:type="dxa" w:w="45"/>
+              <w:left w:type="dxa" w:w="80"/>
+              <w:bottom w:type="dxa" w:w="45"/>
+              <w:right w:type="dxa" w:w="80"/>
+            </w:tcMar>
+            <w:vAlign w:val="center"/>
+          </w:tcPr>
+          <w:p>
+            <w:pPr>
+              <w:jc w:val="left"/>
+            </w:pPr>
+            <w:r>
+              <w:rPr>
+                <w:b w:val="false"/>
+                <w:bCs w:val="false"/>
+                <w:color w:val="3C3C3C"/>
+                <w:sz w:val="16"/>
+                <w:szCs w:val="16"/>
+              </w:rPr>
+              <w:t xml:space="preserve">the small table is copied; the 48 M rows stay put</w:t>
+            </w:r>
+          </w:p>
+        </w:tc>
+      </w:tr>
+      <w:tr>
+        <w:trPr>
+          <w:cantSplit/>
+        </w:trPr>
+        <w:tc>
+          <w:tcPr>
+            <w:tcW w:type="dxa" w:w="2700"/>
+            <w:tcBorders>
+              <w:top w:val="single" w:color="D5DAE3" w:sz="4"/>
+              <w:left w:val="single" w:color="D5DAE3" w:sz="4"/>
+              <w:bottom w:val="single" w:color="D5DAE3" w:sz="4"/>
+              <w:right w:val="single" w:color="D5DAE3" w:sz="4"/>
+            </w:tcBorders>
+            <w:shd w:fill="F4F6FA" w:color="auto" w:val="clear"/>
+            <w:tcMar>
+              <w:top w:type="dxa" w:w="45"/>
+              <w:left w:type="dxa" w:w="80"/>
+              <w:bottom w:type="dxa" w:w="45"/>
+              <w:right w:type="dxa" w:w="80"/>
+            </w:tcMar>
+            <w:vAlign w:val="center"/>
+          </w:tcPr>
+          <w:p>
+            <w:pPr>
+              <w:jc w:val="left"/>
+            </w:pPr>
+            <w:r>
+              <w:rPr>
+                <w:b w:val="false"/>
+                <w:bCs w:val="false"/>
+                <w:color w:val="3C3C3C"/>
+                <w:sz w:val="16"/>
+                <w:szCs w:val="16"/>
+              </w:rPr>
+              <w:t xml:space="preserve">Station features × neighbour features</w:t>
+            </w:r>
+          </w:p>
+        </w:tc>
+        <w:tc>
+          <w:tcPr>
+            <w:tcW w:type="dxa" w:w="3300"/>
+            <w:tcBorders>
+              <w:top w:val="single" w:color="D5DAE3" w:sz="4"/>
+              <w:left w:val="single" w:color="D5DAE3" w:sz="4"/>
+              <w:bottom w:val="single" w:color="D5DAE3" w:sz="4"/>
+              <w:right w:val="single" w:color="D5DAE3" w:sz="4"/>
+            </w:tcBorders>
+            <w:shd w:fill="F4F6FA" w:color="auto" w:val="clear"/>
+            <w:tcMar>
+              <w:top w:type="dxa" w:w="45"/>
+              <w:left w:type="dxa" w:w="80"/>
+              <w:bottom w:type="dxa" w:w="45"/>
+              <w:right w:type="dxa" w:w="80"/>
+            </w:tcMar>
+            <w:vAlign w:val="center"/>
+          </w:tcPr>
+          <w:p>
+            <w:pPr>
+              <w:jc w:val="left"/>
+            </w:pPr>
+            <w:r>
+              <w:rPr>
+                <w:b w:val="false"/>
+                <w:bCs w:val="false"/>
+                <w:color w:val="3C3C3C"/>
+                <w:sz w:val="16"/>
+                <w:szCs w:val="16"/>
+              </w:rPr>
+              <w:t xml:space="preserve">join on (station, slot)</w:t>
+            </w:r>
+          </w:p>
+        </w:tc>
+        <w:tc>
+          <w:tcPr>
+            <w:tcW w:type="dxa" w:w="1300"/>
+            <w:tcBorders>
+              <w:top w:val="single" w:color="D5DAE3" w:sz="4"/>
+              <w:left w:val="single" w:color="D5DAE3" w:sz="4"/>
+              <w:bottom w:val="single" w:color="D5DAE3" w:sz="4"/>
+              <w:right w:val="single" w:color="D5DAE3" w:sz="4"/>
+            </w:tcBorders>
+            <w:shd w:fill="F4F6FA" w:color="auto" w:val="clear"/>
+            <w:tcMar>
+              <w:top w:type="dxa" w:w="45"/>
+              <w:left w:type="dxa" w:w="80"/>
+              <w:bottom w:type="dxa" w:w="45"/>
+              <w:right w:type="dxa" w:w="80"/>
+            </w:tcMar>
+            <w:vAlign w:val="center"/>
+          </w:tcPr>
+          <w:p>
+            <w:pPr>
+              <w:jc w:val="center"/>
+            </w:pPr>
+            <w:r>
+              <w:rPr>
+                <w:b w:val="false"/>
+                <w:bCs w:val="false"/>
+                <w:color w:val="3C3C3C"/>
+                <w:sz w:val="16"/>
+                <w:szCs w:val="16"/>
+              </w:rPr>
+              <w:t xml:space="preserve">wide</w:t>
+            </w:r>
+          </w:p>
+        </w:tc>
+        <w:tc>
+          <w:tcPr>
+            <w:tcW w:type="dxa" w:w="2338"/>
+            <w:tcBorders>
+              <w:top w:val="single" w:color="D5DAE3" w:sz="4"/>
+              <w:left w:val="single" w:color="D5DAE3" w:sz="4"/>
+              <w:bottom w:val="single" w:color="D5DAE3" w:sz="4"/>
+              <w:right w:val="single" w:color="D5DAE3" w:sz="4"/>
+            </w:tcBorders>
+            <w:shd w:fill="F4F6FA" w:color="auto" w:val="clear"/>
+            <w:tcMar>
+              <w:top w:type="dxa" w:w="45"/>
+              <w:left w:type="dxa" w:w="80"/>
+              <w:bottom w:type="dxa" w:w="45"/>
+              <w:right w:type="dxa" w:w="80"/>
+            </w:tcMar>
+            <w:vAlign w:val="center"/>
+          </w:tcPr>
+          <w:p>
+            <w:pPr>
+              <w:jc w:val="left"/>
+            </w:pPr>
+            <w:r>
+              <w:rPr>
+                <w:b w:val="false"/>
+                <w:bCs w:val="false"/>
+                <w:color w:val="3C3C3C"/>
+                <w:sz w:val="16"/>
+                <w:szCs w:val="16"/>
+              </w:rPr>
+              <w:t xml:space="preserve">sort-merge join: both sides shuffled</w:t>
+            </w:r>
+          </w:p>
+        </w:tc>
+      </w:tr>
+      <w:tr>
+        <w:trPr>
+          <w:cantSplit/>
+        </w:trPr>
+        <w:tc>
+          <w:tcPr>
+            <w:tcW w:type="dxa" w:w="2700"/>
+            <w:tcBorders>
+              <w:top w:val="single" w:color="D5DAE3" w:sz="4"/>
+              <w:left w:val="single" w:color="D5DAE3" w:sz="4"/>
+              <w:bottom w:val="single" w:color="D5DAE3" w:sz="4"/>
+              <w:right w:val="single" w:color="D5DAE3" w:sz="4"/>
+            </w:tcBorders>
+            <w:shd w:fill="FFFFFF" w:color="auto" w:val="clear"/>
+            <w:tcMar>
+              <w:top w:type="dxa" w:w="45"/>
+              <w:left w:type="dxa" w:w="80"/>
+              <w:bottom w:type="dxa" w:w="45"/>
+              <w:right w:type="dxa" w:w="80"/>
+            </w:tcMar>
+            <w:vAlign w:val="center"/>
+          </w:tcPr>
+          <w:p>
+            <w:pPr>
+              <w:jc w:val="left"/>
+            </w:pPr>
+            <w:r>
+              <w:rPr>
+                <w:b w:val="false"/>
+                <w:bCs w:val="false"/>
+                <w:color w:val="3C3C3C"/>
+                <w:sz w:val="16"/>
+                <w:szCs w:val="16"/>
+              </w:rPr>
+              <w:t xml:space="preserve">Hash sampling, threshold expansion</w:t>
+            </w:r>
+          </w:p>
+        </w:tc>
+        <w:tc>
+          <w:tcPr>
+            <w:tcW w:type="dxa" w:w="3300"/>
+            <w:tcBorders>
+              <w:top w:val="single" w:color="D5DAE3" w:sz="4"/>
+              <w:left w:val="single" w:color="D5DAE3" w:sz="4"/>
+              <w:bottom w:val="single" w:color="D5DAE3" w:sz="4"/>
+              <w:right w:val="single" w:color="D5DAE3" w:sz="4"/>
+            </w:tcBorders>
+            <w:shd w:fill="FFFFFF" w:color="auto" w:val="clear"/>
+            <w:tcMar>
+              <w:top w:type="dxa" w:w="45"/>
+              <w:left w:type="dxa" w:w="80"/>
+              <w:bottom w:type="dxa" w:w="45"/>
+              <w:right w:type="dxa" w:w="80"/>
+            </w:tcMar>
+            <w:vAlign w:val="center"/>
+          </w:tcPr>
+          <w:p>
+            <w:pPr>
+              <w:jc w:val="left"/>
+            </w:pPr>
+            <w:r>
+              <w:rPr>
+                <w:b w:val="false"/>
+                <w:bCs w:val="false"/>
+                <w:color w:val="3C3C3C"/>
+                <w:sz w:val="16"/>
+                <w:szCs w:val="16"/>
+              </w:rPr>
+              <w:t xml:space="preserve">filter, explode</w:t>
+            </w:r>
+          </w:p>
+        </w:tc>
+        <w:tc>
+          <w:tcPr>
+            <w:tcW w:type="dxa" w:w="1300"/>
+            <w:tcBorders>
+              <w:top w:val="single" w:color="D5DAE3" w:sz="4"/>
+              <w:left w:val="single" w:color="D5DAE3" w:sz="4"/>
+              <w:bottom w:val="single" w:color="D5DAE3" w:sz="4"/>
+              <w:right w:val="single" w:color="D5DAE3" w:sz="4"/>
+            </w:tcBorders>
+            <w:shd w:fill="FFFFFF" w:color="auto" w:val="clear"/>
+            <w:tcMar>
+              <w:top w:type="dxa" w:w="45"/>
+              <w:left w:type="dxa" w:w="80"/>
+              <w:bottom w:type="dxa" w:w="45"/>
+              <w:right w:type="dxa" w:w="80"/>
+            </w:tcMar>
+            <w:vAlign w:val="center"/>
+          </w:tcPr>
+          <w:p>
+            <w:pPr>
+              <w:jc w:val="center"/>
+            </w:pPr>
+            <w:r>
+              <w:rPr>
+                <w:b w:val="false"/>
+                <w:bCs w:val="false"/>
+                <w:color w:val="3C3C3C"/>
+                <w:sz w:val="16"/>
+                <w:szCs w:val="16"/>
+              </w:rPr>
+              <w:t xml:space="preserve">narrow</w:t>
+            </w:r>
+          </w:p>
+        </w:tc>
+        <w:tc>
+          <w:tcPr>
+            <w:tcW w:type="dxa" w:w="2338"/>
+            <w:tcBorders>
+              <w:top w:val="single" w:color="D5DAE3" w:sz="4"/>
+              <w:left w:val="single" w:color="D5DAE3" w:sz="4"/>
+              <w:bottom w:val="single" w:color="D5DAE3" w:sz="4"/>
+              <w:right w:val="single" w:color="D5DAE3" w:sz="4"/>
+            </w:tcBorders>
+            <w:shd w:fill="FFFFFF" w:color="auto" w:val="clear"/>
+            <w:tcMar>
+              <w:top w:type="dxa" w:w="45"/>
+              <w:left w:type="dxa" w:w="80"/>
+              <w:bottom w:type="dxa" w:w="45"/>
+              <w:right w:type="dxa" w:w="80"/>
+            </w:tcMar>
+            <w:vAlign w:val="center"/>
+          </w:tcPr>
+          <w:p>
+            <w:pPr>
+              <w:jc w:val="left"/>
+            </w:pPr>
+            <w:r>
+              <w:rPr>
+                <w:b w:val="false"/>
+                <w:bCs w:val="false"/>
+                <w:color w:val="3C3C3C"/>
+                <w:sz w:val="16"/>
+                <w:szCs w:val="16"/>
+              </w:rPr>
+              <w:t xml:space="preserve">none</w:t>
+            </w:r>
+          </w:p>
+        </w:tc>
+      </w:tr>
+    </w:tbl>
+    <w:p>
+      <w:pPr>
+        <w:spacing w:after="200" w:before="60"/>
+        <w:jc w:val="center"/>
+      </w:pPr>
+      <w:r>
+        <w:rPr>
+          <w:i/>
+          <w:iCs/>
+          <w:color w:val="7A8094"/>
+          <w:sz w:val="16"/>
+          <w:szCs w:val="16"/>
+        </w:rPr>
+        <w:t xml:space="preserve">Table 21. Narrow and wide transformations in the pipeline.</w:t>
       </w:r>
     </w:p>
     <w:p>
       <w:pPr>
-        <w:pStyle w:val="ListParagraph"/>
-        <w:numPr>
-          <w:ilvl w:val="0"/>
-          <w:numId w:val="2"/>
-        </w:numPr>
-        <w:spacing w:after="60" w:line="264"/>
+        <w:spacing w:after="120" w:line="276"/>
+        <w:jc w:val="both"/>
       </w:pPr>
       <w:r>
         <w:rPr>
           <w:b/>
           <w:bCs/>
         </w:rPr>
-        <w:t xml:space="preserve">One shuffle where a sort would do two:</w:t>
+        <w:t xml:space="preserve">Join strategies and adaptive query execution.</w:t>
       </w:r>
       <w:r>
-        <w:t xml:space="preserve"> de-duplication with a struct-max aggregate; station-days and island-days as grouped aggregates; time-range window functions for every rolling feature.</w:t>
+        <w:t xml:space="preserve"> Spark broadcasts the smaller side of a join when it is below the broadcast threshold (10 MB) and otherwise uses a sort-merge join. The physical plans (Section 12.4 of the notebook) confirm the design: the station-pair table is joined with a </w:t>
       </w:r>
+      <w:r>
+        <w:rPr>
+          <w:b/>
+          <w:bCs/>
+        </w:rPr>
+        <w:t xml:space="preserve">BroadcastHashJoin</w:t>
+      </w:r>
+      <w:r>
+        <w:t xml:space="preserve">, and Spark chooses the same </w:t>
+      </w:r>
+      <w:r>
+        <w:rPr>
+          <w:b/>
+          <w:bCs/>
+        </w:rPr>
+        <w:t xml:space="preserve">BroadcastHashJoin</w:t>
+      </w:r>
+      <w:r>
+        <w:t xml:space="preserve"> even without our hint, while the join of the two large feature tables is a </w:t>
+      </w:r>
+      <w:r>
+        <w:rPr>
+          <w:b/>
+          <w:bCs/>
+        </w:rPr>
+        <w:t xml:space="preserve">SortMergeJoin</w:t>
+      </w:r>
+      <w:r>
+        <w:t xml:space="preserve"> with both sides shuffled. </w:t>
+      </w:r>
+      <w:r>
+        <w:rPr>
+          <w:b/>
+          <w:bCs/>
+        </w:rPr>
+        <w:t xml:space="preserve">Adaptive query execution</w:t>
+      </w:r>
+      <w:r>
+        <w:t xml:space="preserve"> re-plans at run time: after a grouped aggregation ran, its final plan shows the 64 post-shuffle partitions merged by AQEShuffleRead coalesced, because the real data needed far fewer.</w:t>
+      </w:r>
+    </w:p>
+    <w:tbl>
+      <w:tblPr>
+        <w:tblW w:type="dxa" w:w="9638"/>
+        <w:tblBorders>
+          <w:top w:val="single" w:color="auto" w:sz="4"/>
+          <w:left w:val="single" w:color="auto" w:sz="4"/>
+          <w:bottom w:val="single" w:color="auto" w:sz="4"/>
+          <w:right w:val="single" w:color="auto" w:sz="4"/>
+          <w:insideH w:val="single" w:color="auto" w:sz="4"/>
+          <w:insideV w:val="single" w:color="auto" w:sz="4"/>
+        </w:tblBorders>
+      </w:tblPr>
+      <w:tblGrid>
+        <w:gridCol w:w="9638"/>
+      </w:tblGrid>
+      <w:tr>
+        <w:tc>
+          <w:tcPr>
+            <w:tcW w:type="dxa" w:w="9638"/>
+            <w:tcBorders>
+              <w:top w:val="single" w:color="D5DAE3" w:sz="4"/>
+              <w:left w:val="single" w:color="D5DAE3" w:sz="4"/>
+              <w:bottom w:val="single" w:color="D5DAE3" w:sz="4"/>
+              <w:right w:val="single" w:color="D5DAE3" w:sz="4"/>
+            </w:tcBorders>
+            <w:shd w:fill="F4F6FA" w:color="auto" w:val="clear"/>
+            <w:tcMar>
+              <w:top w:type="dxa" w:w="70"/>
+              <w:left w:type="dxa" w:w="140"/>
+              <w:bottom w:type="dxa" w:w="70"/>
+              <w:right w:type="dxa" w:w="140"/>
+            </w:tcMar>
+          </w:tcPr>
+          <w:p>
+            <w:pPr>
+              <w:spacing w:after="0"/>
+            </w:pPr>
+            <w:r>
+              <w:rPr>
+                <w:rFonts w:ascii="Courier New" w:cs="Courier New" w:eastAsia="Courier New" w:hAnsi="Courier New"/>
+                <w:color w:val="1D7874"/>
+                <w:sz w:val="16"/>
+                <w:szCs w:val="16"/>
+              </w:rPr>
+              <w:t xml:space="preserve">-- small x large, F.broadcast hint (neighbour rings)</w:t>
+            </w:r>
+          </w:p>
+          <w:p>
+            <w:pPr>
+              <w:spacing w:after="0"/>
+            </w:pPr>
+            <w:r>
+              <w:rPr>
+                <w:rFonts w:ascii="Courier New" w:cs="Courier New" w:eastAsia="Courier New" w:hAnsi="Courier New"/>
+                <w:color w:val="1D7874"/>
+                <w:sz w:val="16"/>
+                <w:szCs w:val="16"/>
+              </w:rPr>
+              <w:t xml:space="preserve">   AdaptiveSparkPlan isFinalPlan=false</w:t>
+            </w:r>
+          </w:p>
+          <w:p>
+            <w:pPr>
+              <w:spacing w:after="0"/>
+            </w:pPr>
+            <w:r>
+              <w:rPr>
+                <w:rFonts w:ascii="Courier New" w:cs="Courier New" w:eastAsia="Courier New" w:hAnsi="Courier New"/>
+                <w:color w:val="1D7874"/>
+                <w:sz w:val="16"/>
+                <w:szCs w:val="16"/>
+              </w:rPr>
+              <w:t xml:space="preserve">   +- BroadcastHashJoin [nb_id], [nb_id], Inner, BuildRight, false</w:t>
+            </w:r>
+          </w:p>
+          <w:p>
+            <w:pPr>
+              <w:spacing w:after="0"/>
+            </w:pPr>
+            <w:r>
+              <w:rPr>
+                <w:rFonts w:ascii="Courier New" w:cs="Courier New" w:eastAsia="Courier New" w:hAnsi="Courier New"/>
+                <w:color w:val="1D7874"/>
+                <w:sz w:val="16"/>
+                <w:szCs w:val="16"/>
+              </w:rPr>
+              <w:t xml:space="preserve">   +- BroadcastExchange   (copies the small table to every executor)</w:t>
+            </w:r>
+          </w:p>
+          <w:p>
+            <w:pPr>
+              <w:spacing w:after="0"/>
+            </w:pPr>
+            <w:r>
+              <w:rPr>
+                <w:rFonts w:ascii="Courier New" w:cs="Courier New" w:eastAsia="Courier New" w:hAnsi="Courier New"/>
+                <w:color w:val="1D7874"/>
+                <w:sz w:val="16"/>
+                <w:szCs w:val="16"/>
+              </w:rPr>
+              <w:t xml:space="preserve">-- small x large, no hint (Spark decides)</w:t>
+            </w:r>
+          </w:p>
+          <w:p>
+            <w:pPr>
+              <w:spacing w:after="0"/>
+            </w:pPr>
+            <w:r>
+              <w:rPr>
+                <w:rFonts w:ascii="Courier New" w:cs="Courier New" w:eastAsia="Courier New" w:hAnsi="Courier New"/>
+                <w:color w:val="1D7874"/>
+                <w:sz w:val="16"/>
+                <w:szCs w:val="16"/>
+              </w:rPr>
+              <w:t xml:space="preserve">   AdaptiveSparkPlan isFinalPlan=false</w:t>
+            </w:r>
+          </w:p>
+          <w:p>
+            <w:pPr>
+              <w:spacing w:after="0"/>
+            </w:pPr>
+            <w:r>
+              <w:rPr>
+                <w:rFonts w:ascii="Courier New" w:cs="Courier New" w:eastAsia="Courier New" w:hAnsi="Courier New"/>
+                <w:color w:val="1D7874"/>
+                <w:sz w:val="16"/>
+                <w:szCs w:val="16"/>
+              </w:rPr>
+              <w:t xml:space="preserve">   +- BroadcastHashJoin [nb_id], [nb_id], Inner, BuildRight, false</w:t>
+            </w:r>
+          </w:p>
+          <w:p>
+            <w:pPr>
+              <w:spacing w:after="0"/>
+            </w:pPr>
+            <w:r>
+              <w:rPr>
+                <w:rFonts w:ascii="Courier New" w:cs="Courier New" w:eastAsia="Courier New" w:hAnsi="Courier New"/>
+                <w:color w:val="1D7874"/>
+                <w:sz w:val="16"/>
+                <w:szCs w:val="16"/>
+              </w:rPr>
+              <w:t xml:space="preserve">   +- BroadcastExchange   (copies the small table to every executor)</w:t>
+            </w:r>
+          </w:p>
+          <w:p>
+            <w:pPr>
+              <w:spacing w:after="0"/>
+            </w:pPr>
+            <w:r>
+              <w:rPr>
+                <w:rFonts w:ascii="Courier New" w:cs="Courier New" w:eastAsia="Courier New" w:hAnsi="Courier New"/>
+                <w:color w:val="1D7874"/>
+                <w:sz w:val="16"/>
+                <w:szCs w:val="16"/>
+              </w:rPr>
+              <w:t xml:space="preserve">-- large x large (station features x neighbour features)</w:t>
+            </w:r>
+          </w:p>
+          <w:p>
+            <w:pPr>
+              <w:spacing w:after="0"/>
+            </w:pPr>
+            <w:r>
+              <w:rPr>
+                <w:rFonts w:ascii="Courier New" w:cs="Courier New" w:eastAsia="Courier New" w:hAnsi="Courier New"/>
+                <w:color w:val="1D7874"/>
+                <w:sz w:val="16"/>
+                <w:szCs w:val="16"/>
+              </w:rPr>
+              <w:t xml:space="preserve">   AdaptiveSparkPlan isFinalPlan=false</w:t>
+            </w:r>
+          </w:p>
+          <w:p>
+            <w:pPr>
+              <w:spacing w:after="0"/>
+            </w:pPr>
+            <w:r>
+              <w:rPr>
+                <w:rFonts w:ascii="Courier New" w:cs="Courier New" w:eastAsia="Courier New" w:hAnsi="Courier New"/>
+                <w:color w:val="1D7874"/>
+                <w:sz w:val="16"/>
+                <w:szCs w:val="16"/>
+              </w:rPr>
+              <w:t xml:space="preserve">   +- SortMergeJoin [station_id, slot_epoch], [station_id, slot_epoch], LeftOuter</w:t>
+            </w:r>
+          </w:p>
+          <w:p>
+            <w:pPr>
+              <w:spacing w:after="0"/>
+            </w:pPr>
+            <w:r>
+              <w:rPr>
+                <w:rFonts w:ascii="Courier New" w:cs="Courier New" w:eastAsia="Courier New" w:hAnsi="Courier New"/>
+                <w:color w:val="1D7874"/>
+                <w:sz w:val="16"/>
+                <w:szCs w:val="16"/>
+              </w:rPr>
+              <w:t xml:space="preserve">   :  +- Exchange hashpartitioning(station_id, slot_epoch, 64)   (shuffle)</w:t>
+            </w:r>
+          </w:p>
+          <w:p>
+            <w:pPr>
+              <w:spacing w:after="0"/>
+            </w:pPr>
+            <w:r>
+              <w:rPr>
+                <w:rFonts w:ascii="Courier New" w:cs="Courier New" w:eastAsia="Courier New" w:hAnsi="Courier New"/>
+                <w:color w:val="1D7874"/>
+                <w:sz w:val="16"/>
+                <w:szCs w:val="16"/>
+              </w:rPr>
+              <w:t xml:space="preserve">-- grouped aggregation after it ran (AQE final plan)</w:t>
+            </w:r>
+          </w:p>
+          <w:p>
+            <w:pPr>
+              <w:spacing w:after="0"/>
+            </w:pPr>
+            <w:r>
+              <w:rPr>
+                <w:rFonts w:ascii="Courier New" w:cs="Courier New" w:eastAsia="Courier New" w:hAnsi="Courier New"/>
+                <w:color w:val="1D7874"/>
+                <w:sz w:val="16"/>
+                <w:szCs w:val="16"/>
+              </w:rPr>
+              <w:t xml:space="preserve">   AdaptiveSparkPlan isFinalPlan=true</w:t>
+            </w:r>
+          </w:p>
+          <w:p>
+            <w:pPr>
+              <w:spacing w:after="0"/>
+            </w:pPr>
+            <w:r>
+              <w:rPr>
+                <w:rFonts w:ascii="Courier New" w:cs="Courier New" w:eastAsia="Courier New" w:hAnsi="Courier New"/>
+                <w:color w:val="1D7874"/>
+                <w:sz w:val="16"/>
+                <w:szCs w:val="16"/>
+              </w:rPr>
+              <w:t xml:space="preserve">   *(2) HashAggregate(keys=[year], functions=[sum(rain_mm)], output=[year, mm])</w:t>
+            </w:r>
+          </w:p>
+          <w:p>
+            <w:pPr>
+              <w:spacing w:after="0"/>
+            </w:pPr>
+            <w:r>
+              <w:rPr>
+                <w:rFonts w:ascii="Courier New" w:cs="Courier New" w:eastAsia="Courier New" w:hAnsi="Courier New"/>
+                <w:color w:val="1D7874"/>
+                <w:sz w:val="16"/>
+                <w:szCs w:val="16"/>
+              </w:rPr>
+              <w:t xml:space="preserve">   +- AQEShuffleRead coalesced</w:t>
+            </w:r>
+          </w:p>
+        </w:tc>
+      </w:tr>
+    </w:tbl>
+    <w:p>
+      <w:pPr>
+        <w:spacing w:after="140"/>
+      </w:pPr>
     </w:p>
     <w:p>
       <w:pPr>
-        <w:pStyle w:val="ListParagraph"/>
-        <w:numPr>
-          <w:ilvl w:val="0"/>
-          <w:numId w:val="2"/>
-        </w:numPr>
-        <w:spacing w:after="60" w:line="264"/>
+        <w:spacing w:after="120" w:line="276"/>
+        <w:jc w:val="both"/>
       </w:pPr>
       <w:r>
         <w:rPr>
           <w:b/>
           <w:bCs/>
         </w:rPr>
-        <w:t xml:space="preserve">Broadcast the small side:</w:t>
+        <w:t xml:space="preserve">How MLlib trains these models across executors.</w:t>
       </w:r>
       <w:r>
-        <w:t xml:space="preserve"> the station-pair tables (neighbours, rings, spike checks) are broadcast and joined to the readings, so the large table is shuffled only by (station, slot).</w:t>
+        <w:t xml:space="preserve"> The logistic regression is fitted with L-BFGS: in every iteration each partition computes the loss and gradient of its own rows, and </w:t>
+      </w:r>
+      <w:r>
+        <w:rPr>
+          <w:b/>
+          <w:bCs/>
+        </w:rPr>
+        <w:t xml:space="preserve">treeAggregate</w:t>
+      </w:r>
+      <w:r>
+        <w:t xml:space="preserve"> adds the partial results up in a tree before the driver takes the step — the same pattern as the distributed ridge regression in the lectures, where each partition contributes Xᵀ_pX_p and Xᵀ_py_p. The random forest and the GBT bin each feature (maxBins = 128); each partition builds histograms of the label per bin for every tree node being split, the histograms are aggregated, and the driver chooses the best split. The CrossValidator fits four models in parallel (parallelism = 4) on the year-blocked folds, and the sample weights reach the learners through weightCol.</w:t>
       </w:r>
     </w:p>
     <w:p>
       <w:pPr>
-        <w:pStyle w:val="ListParagraph"/>
-        <w:numPr>
-          <w:ilvl w:val="0"/>
-          <w:numId w:val="2"/>
-        </w:numPr>
-        <w:spacing w:after="60" w:line="264"/>
+        <w:spacing w:after="120" w:line="276"/>
+        <w:jc w:val="both"/>
       </w:pPr>
       <w:r>
         <w:rPr>
           <w:b/>
           <w:bCs/>
         </w:rPr>
-        <w:t xml:space="preserve">Cache what is reused, release what is not:</w:t>
+        <w:t xml:space="preserve">Cloud optimisation.</w:t>
       </w:r>
       <w:r>
-        <w:t xml:space="preserve"> the de-duplicated table, the silver readings and the training sample are persisted while several steps read them and released before the next stage.</w:t>
-      </w:r>
-    </w:p>
-    <w:p>
-      <w:pPr>
-        <w:pStyle w:val="ListParagraph"/>
-        <w:numPr>
-          <w:ilvl w:val="0"/>
-          <w:numId w:val="2"/>
-        </w:numPr>
-        <w:spacing w:after="60" w:line="264"/>
-      </w:pPr>
-      <w:r>
-        <w:rPr>
-          <w:b/>
-          <w:bCs/>
-        </w:rPr>
-        <w:t xml:space="preserve">Deterministic sampling:</w:t>
-      </w:r>
-      <w:r>
-        <w:t xml:space="preserve"> hash-based sampling gives identical training and evaluation sets on every run and on any cluster, without a global sort.</w:t>
+        <w:t xml:space="preserve"> The lectures recommend Spot VMs, local SSDs and autoscaling. We did not use them, for reasons specific to this project: secondary (Spot) workers would count against the same 12-vCPU quota as the primary workers; one local SSD is 375 GB, more than the project's 250 GB SSD quota; and autoscaling is not intended for a cluster that keeps its data on HDFS, as the complete run did. Parquet's column layout already gives the benefit the lectures attribute to column-based storage: each step reads only the columns it needs, and the year partitioning lets Spark skip whole years (partition pruning, used by the weak-scaling runs).</w:t>
       </w:r>
     </w:p>
     <w:p>
@@ -24999,7 +27931,7 @@
           <w:sz w:val="16"/>
           <w:szCs w:val="16"/>
         </w:rPr>
-        <w:t xml:space="preserve">Table 20. Data and model limitations.</w:t>
+        <w:t xml:space="preserve">Table 22. Data and model limitations.</w:t>
       </w:r>
     </w:p>
     <w:p>
@@ -25015,7 +27947,7 @@
         <w:t xml:space="preserve">Future work:</w:t>
       </w:r>
       <w:r>
-        <w:t xml:space="preserve"> add radar or satellite inputs; tune beyond the grid edges; run the model training on a larger Dataproc cluster with local SSDs; and recalibrate the model each season as the gauge network changes.</w:t>
+        <w:t xml:space="preserve"> add radar or satellite inputs; tune beyond the grid edges; run the model training on a larger Dataproc cluster with local SSDs; try the RAPIDS accelerator for Apache Spark on a GPU cluster, which runs filters, projections, sorts and joins on the GPU's columnar memory; and recalibrate the model each season as the gauge network changes.</w:t>
       </w:r>
     </w:p>
     <w:p>
@@ -25032,7 +27964,7 @@
         <w:jc w:val="both"/>
       </w:pPr>
       <w:r>
-        <w:t xml:space="preserve">Starting from 7.5 GB of raw five-minute readings, a disciplined Spark pipeline — explicit schema, Parquet layers, neighbour-based gauge-fault detection and completeness rules — produced a clean, trustworthy record of Singapore's rainfall. Task 1 showed two wet seasons, two daily rhythms, a 2× west–east gradient and dry years caused by fewer events. Task 2 turned those findings into features and delivered a single Spark MLlib model for any station, time and threshold: a random forest chosen by year-blocked cross-validation that reaches a PR-AUC of 0.466 at 5 mm on the untouched 2024 year, beats the interpretable logistic baseline at every threshold on identical rows, and gives probabilities one can act on.</w:t>
+        <w:t xml:space="preserve">Starting from 7.5 GB of raw five-minute readings, a disciplined Spark pipeline — explicit schema, Parquet layers, neighbour-based gauge-fault detection and completeness rules — produced a clean, trustworthy record of Singapore's rainfall. Task 1 showed two wet seasons, two daily rhythms, a 2× west–east gradient and dry years caused by fewer events. Task 2 turned those findings into features and delivered a single Spark MLlib model for any station, time and threshold: a random forest chosen by year-blocked cross-validation that reaches a PR-AUC of 0.466 at 5 mm on the untouched 2024 year, beats the interpretable logistic baseline on identical rows in ranking and log loss at every threshold, and in PR-AUC at all but the rarest, and gives probabilities one can act on.</w:t>
       </w:r>
     </w:p>
     <w:p>

</xml_diff>

<commit_message>
"final rerun with some changes in predit function
</commit_message>
<xml_diff>
--- a/DSA5208_Project2_Report.docx
+++ b/DSA5208_Project2_Report.docx
@@ -168,7 +168,7 @@
           <w:sz w:val="20"/>
           <w:szCs w:val="20"/>
         </w:rPr>
-        <w:t xml:space="preserve">Date: 13 October 2026</w:t>
+        <w:t xml:space="preserve">Date: 17 October 2026</w:t>
       </w:r>
     </w:p>
     <w:tbl>
@@ -222,7 +222,7 @@
                 <w:sz w:val="19"/>
                 <w:szCs w:val="19"/>
               </w:rPr>
-              <w:t xml:space="preserve"> This report analyses eight years (2017–2024) of five-minute rainfall readings from Singapore's gauge network — 48.5 million records from 91 stations — using Apache Spark. Task 1 explores how rainfall varies within a year and from year to year; Task 2 builds a model that estimates the probability that a station records more than a chosen amount of rain in the next 30 minutes, taking the station, the time and the threshold as inputs. After a data-quality stage that caught two kinds of faulty gauge a range check cannot see, we built an interpretable logistic-regression baseline and then a cross-validated </w:t>
+              <w:t xml:space="preserve"> This report analyses eight years (2017–2024) of five-minute rainfall readings from Singapore's gauge network — 48.5 million records from 91 stations — using Apache Spark. Task 1 explores how rainfall varies within a year and from year to year; Task 2 builds a model that estimates the probability that a station records more than a chosen amount of rain in the next 30 minutes, taking the station, the time and the threshold as inputs. After a data-quality stage that caught two kinds of faulty gauge that a range check cannot see, we built an interpretable logistic-regression baseline and then a cross-validated </w:t>
             </w:r>
             <w:r>
               <w:rPr>
@@ -263,14 +263,14 @@
                 <w:sz w:val="19"/>
                 <w:szCs w:val="19"/>
               </w:rPr>
-              <w:t xml:space="preserve">0.968</w:t>
+              <w:t xml:space="preserve">0.969</w:t>
             </w:r>
             <w:r>
               <w:rPr>
                 <w:sz w:val="19"/>
                 <w:szCs w:val="19"/>
               </w:rPr>
-              <w:t xml:space="preserve">, beats the logistic baseline at every threshold on identical rows, and gives calibrated probabilities. The complete notebook was also executed on a Google Cloud Dataproc cluster with identical conclusions, and doubling the cluster's workers halved the run time of the core Spark job.</w:t>
+              <w:t xml:space="preserve">, beats the logistic baseline at every threshold on identical rows, and gives calibrated probabilities. An earlier version of the complete notebook was also executed on a Google Cloud Dataproc cluster with identical conclusions, and doubling the cluster's workers halved the run time of the core Spark job.</w:t>
             </w:r>
           </w:p>
         </w:tc>
@@ -646,7 +646,7 @@
                 <w:sz w:val="16"/>
                 <w:szCs w:val="16"/>
               </w:rPr>
-              <w:t xml:space="preserve">0.449</w:t>
+              <w:t xml:space="preserve">0.450</w:t>
             </w:r>
           </w:p>
         </w:tc>
@@ -3418,7 +3418,7 @@
                 <w:sz w:val="16"/>
                 <w:szCs w:val="16"/>
               </w:rPr>
-              <w:t xml:space="preserve">0.7</w:t>
+              <w:t xml:space="preserve">0.6</w:t>
             </w:r>
           </w:p>
         </w:tc>
@@ -3564,7 +3564,7 @@
                 <w:sz w:val="16"/>
                 <w:szCs w:val="16"/>
               </w:rPr>
-              <w:t xml:space="preserve">8.0</w:t>
+              <w:t xml:space="preserve">7.9</w:t>
             </w:r>
           </w:p>
         </w:tc>
@@ -3710,7 +3710,7 @@
                 <w:sz w:val="16"/>
                 <w:szCs w:val="16"/>
               </w:rPr>
-              <w:t xml:space="preserve">37.0</w:t>
+              <w:t xml:space="preserve">37.4</w:t>
             </w:r>
           </w:p>
         </w:tc>
@@ -3783,7 +3783,7 @@
                 <w:sz w:val="16"/>
                 <w:szCs w:val="16"/>
               </w:rPr>
-              <w:t xml:space="preserve">24.7</w:t>
+              <w:t xml:space="preserve">24.5</w:t>
             </w:r>
           </w:p>
         </w:tc>
@@ -3856,7 +3856,7 @@
                 <w:sz w:val="16"/>
                 <w:szCs w:val="16"/>
               </w:rPr>
-              <w:t xml:space="preserve">72.5</w:t>
+              <w:t xml:space="preserve">72.6</w:t>
             </w:r>
           </w:p>
         </w:tc>
@@ -3875,7 +3875,7 @@
           <w:sz w:val="16"/>
           <w:szCs w:val="16"/>
         </w:rPr>
-        <w:t xml:space="preserve">Table 5. Wall-clock time of the notebook's stages on this machine in the submitted run (t40_stage_timings.csv). The laptop slept for about 10 minutes during two of the Stage 1 logistic fits (45 s and 168 s instead of the usual 10–11 s); every other stage ran uninterrupted.</w:t>
+        <w:t xml:space="preserve">Table 5. Wall-clock time of the notebook's stages on this machine in the submitted run (t40_stage_timings.csv).</w:t>
       </w:r>
     </w:p>
     <w:p>
@@ -4794,7 +4794,7 @@
                 <w:sz w:val="16"/>
                 <w:szCs w:val="16"/>
               </w:rPr>
-              <w:t xml:space="preserve">               +- SortAggregate(key=[station_id, ts], functions=[max(struct(upd, upd, rain_mm, rain_mm)), count(1), fi</w:t>
+              <w:t xml:space="preserve">+- SortAggregate(key=[station_id, ts], functions=[max(struct(upd, upd, rain_mm, rain_mm)), count(1), …</w:t>
             </w:r>
           </w:p>
           <w:p>
@@ -4808,7 +4808,7 @@
                 <w:sz w:val="16"/>
                 <w:szCs w:val="16"/>
               </w:rPr>
-              <w:t xml:space="preserve">                  +- Sort [station_id ASC NULLS FIRST, ts ASC NULLS FIRST], false, 0</w:t>
+              <w:t xml:space="preserve">   +- Sort [station_id ASC NULLS FIRST, ts ASC NULLS FIRST], false, 0</w:t>
             </w:r>
           </w:p>
           <w:p>
@@ -4822,7 +4822,7 @@
                 <w:sz w:val="16"/>
                 <w:szCs w:val="16"/>
               </w:rPr>
-              <w:t xml:space="preserve">                     +- Exchange hashpartitioning(station_id, ts, 96)</w:t>
+              <w:t xml:space="preserve">      +- Exchange hashpartitioning(station_id, ts, 96)</w:t>
             </w:r>
           </w:p>
           <w:p>
@@ -4836,7 +4836,7 @@
                 <w:sz w:val="16"/>
                 <w:szCs w:val="16"/>
               </w:rPr>
-              <w:t xml:space="preserve">                        +- SortAggregate(key=[station_id, ts], functions=[partial_max(struct(upd, upd, rain_mm, rain_m</w:t>
+              <w:t xml:space="preserve">         +- SortAggregate(key=[station_id, ts], functions=[partial_max(struct(upd, upd, rain_mm, rain_mm)), …</w:t>
             </w:r>
           </w:p>
           <w:p>
@@ -4850,7 +4850,7 @@
                 <w:sz w:val="16"/>
                 <w:szCs w:val="16"/>
               </w:rPr>
-              <w:t xml:space="preserve">                           +- Sort [station_id ASC NULLS FIRST, ts ASC NULLS FIRST], false, 0</w:t>
+              <w:t xml:space="preserve">            +- Sort [station_id ASC NULLS FIRST, ts ASC NULLS FIRST], false, 0</w:t>
             </w:r>
           </w:p>
         </w:tc>
@@ -6900,27 +6900,27 @@
         <w:jc w:val="both"/>
       </w:pPr>
       <w:r>
-        <w:t xml:space="preserve">The monthly climatology has two wet seasons — </w:t>
+        <w:t xml:space="preserve">The monthly climatology has two wet seasons, </w:t>
       </w:r>
       <w:r>
         <w:rPr>
           <w:b/>
           <w:bCs/>
         </w:rPr>
-        <w:t xml:space="preserve">Nov (315 mm), Dec (261 mm), Apr (248 mm)</w:t>
+        <w:t xml:space="preserve">November–January</w:t>
       </w:r>
       <w:r>
-        <w:t xml:space="preserve"> — and the driest months are </w:t>
+        <w:t xml:space="preserve"> (north-east monsoon) and </w:t>
       </w:r>
       <w:r>
         <w:rPr>
           <w:b/>
           <w:bCs/>
         </w:rPr>
-        <w:t xml:space="preserve">Jul (147 mm), Feb (145 mm)</w:t>
+        <w:t xml:space="preserve">April–May</w:t>
       </w:r>
       <w:r>
-        <w:t xml:space="preserve">. The same calendar month can differ tenfold between years, so the calendar alone predicts little. Within the day, Singapore has two rainfall clocks (Fig 2): from June to September the mean rain rate peaks at about </w:t>
+        <w:t xml:space="preserve"> (inter-monsoon): the wettest months are Nov (315 mm), Dec (261 mm), Apr (248 mm) and the driest are Jul (147 mm), Feb (145 mm). The same calendar month can differ tenfold between years, so the calendar alone predicts little. Within the day, Singapore has two rainfall clocks (Fig 2): from June to September the mean rain rate peaks at about </w:t>
       </w:r>
       <w:r>
         <w:rPr>
@@ -6937,7 +6937,7 @@
           <w:b/>
           <w:bCs/>
         </w:rPr>
-        <w:t xml:space="preserve">16:00–15:00</w:t>
+        <w:t xml:space="preserve">15:00–16:00</w:t>
       </w:r>
       <w:r>
         <w:t xml:space="preserve"> with afternoon convection. Rain is also extremely concentrated: the wettest 10 % of wet five-minute slots deliver </w:t>
@@ -7047,7 +7047,7 @@
           <w:b/>
           <w:bCs/>
         </w:rPr>
-        <w:t xml:space="preserve">9 km</w:t>
+        <w:t xml:space="preserve">8.5 km</w:t>
       </w:r>
       <w:r>
         <w:t xml:space="preserve">. A single island-wide forecast cannot be right everywhere, so Task 2 predicts per station and uses neighbouring gauges within 10 km.</w:t>
@@ -7137,10 +7137,10 @@
           <w:b/>
           <w:bCs/>
         </w:rPr>
-        <w:t xml:space="preserve">+24 % more frequent in 2020–2024 than in 2017–2019</w:t>
+        <w:t xml:space="preserve">about 23 % more frequent in 2020–2024 than in 2017–2019</w:t>
       </w:r>
       <w:r>
-        <w:t xml:space="preserve"> (+20 % on the fixed 21-gauge network, so the 2020 network expansion explains little of it). With only eight annual values, however, an exact Mann–Kendall test finds </w:t>
+        <w:t xml:space="preserve"> (20 % on the fixed 21-gauge network, so the 2020 network expansion explains little of it). With only eight annual values, however, an exact Mann–Kendall test finds </w:t>
       </w:r>
       <w:r>
         <w:rPr>
@@ -8627,14 +8627,14 @@
                 <w:sz w:val="19"/>
                 <w:szCs w:val="19"/>
               </w:rPr>
-              <w:t xml:space="preserve">Two limits of this guarantee:</w:t>
+              <w:t xml:space="preserve">Two limits of this guarantee.</w:t>
             </w:r>
             <w:r>
               <w:rPr>
                 <w:sz w:val="19"/>
                 <w:szCs w:val="19"/>
               </w:rPr>
-              <w:t xml:space="preserve"> the checks run on the cleaned data, so they verify the time boundary of the window computations, not that every input was *published* by t (readings arrive 2–10 minutes after their stamp) or that the cleaning decisions could have been made live (the dead-gauge and spike rules use a whole month or day). An operational version would use a larger lag — anchor t − 10 or t − 15 min, with the same features and a retrained model — and causal quality rules.</w:t>
+              <w:t xml:space="preserve"> The checks run on the cleaned data, so they verify the time boundary of the window computations. They do not show that every input was *published* by t (readings arrive 2–10 minutes after their stamp), nor that the cleaning decisions could have been made live (the dead-gauge and spike rules use a whole month or day). An operational version would use a larger lag (anchor t − 10 or t − 15 min, with the same features and a retrained model) and causal quality rules.</w:t>
             </w:r>
           </w:p>
         </w:tc>
@@ -9640,7 +9640,7 @@
                 <w:sz w:val="19"/>
                 <w:szCs w:val="19"/>
               </w:rPr>
-              <w:t xml:space="preserve"> (2017–18, 2019–20, 2021–22, 2023), refits on 2017–2023, and is tested once on 2024. The test year is never used for any choice.</w:t>
+              <w:t xml:space="preserve"> (2017–18, 2019–20, 2021–22, 2023), refits on 2017–2023, and is tested once on 2024. The test year is never used for any choice. The final 2024 boundary is purged (Section 8.1); the three boundaries between folds are not: about 369 of the 13.7 M prediction rows, all at 23:30 and 23:45 on a 31 December, have target windows that reach up to 20 minutes into the next fold — a negligible but real weakening of the isolation between folds.</w:t>
             </w:r>
           </w:p>
         </w:tc>
@@ -9685,7 +9685,7 @@
         <w:t xml:space="preserve">Stage 2</w:t>
       </w:r>
       <w:r>
-        <w:t xml:space="preserve"> keeps every row with rain in the last 3 hours *or in the next 30 minutes* and only 3 % of the remaining quiet rows. That rule looks at the outcome, so the sample over-represents rain; it is made unbiased by inverse inclusion weights — 1 for the always-kept rows, 1 / 0.03 = 33 for the kept quiet rows — which MLlib's learners and evaluators apply through weightCol (a Horvitz–Thompson estimator). The notebook verifies that the weighted positive rate equals the population rate. Each Stage 2 row is then paired with three thresholds drawn log-uniformly from 0.2–60 mm, independently of the outcome.</w:t>
+        <w:t xml:space="preserve"> keeps every row with rain in the last 3 hours *or in the next 30 minutes* and only 3 % of the remaining quiet rows. That rule looks at the outcome, so the sample over-represents rain; it is made unbiased by inverse inclusion weights — 1 for the always-kept rows, 1 / 0.03 ≈ 33.3 for the kept quiet rows — which MLlib's learners and evaluators apply through weightCol (a Horvitz–Thompson estimator). The notebook verifies that the weighted positive rate equals the population rate. Each Stage 2 row is then paired with three thresholds drawn log-uniformly from 0.2–60 mm, independently of the outcome.</w:t>
       </w:r>
     </w:p>
     <w:p>
@@ -11611,7 +11611,7 @@
                 <w:sz w:val="16"/>
                 <w:szCs w:val="16"/>
               </w:rPr>
-              <w:t xml:space="preserve">0.0393 ± 0.0023</w:t>
+              <w:t xml:space="preserve">0.0391 ± 0.0022</w:t>
             </w:r>
           </w:p>
         </w:tc>
@@ -11752,7 +11752,7 @@
                 <w:sz w:val="16"/>
                 <w:szCs w:val="16"/>
               </w:rPr>
-              <w:t xml:space="preserve">0.0321 ± 0.0018</w:t>
+              <w:t xml:space="preserve">0.0319 ± 0.0018</w:t>
             </w:r>
           </w:p>
         </w:tc>
@@ -11893,7 +11893,7 @@
                 <w:sz w:val="16"/>
                 <w:szCs w:val="16"/>
               </w:rPr>
-              <w:t xml:space="preserve">0.0405 ± 0.0018</w:t>
+              <w:t xml:space="preserve">0.0403 ± 0.0018</w:t>
             </w:r>
           </w:p>
         </w:tc>
@@ -11912,7 +11912,7 @@
           <w:sz w:val="16"/>
           <w:szCs w:val="16"/>
         </w:rPr>
-        <w:t xml:space="preserve">Table 11. Stage 2: best cross-validated setting per model family (4 year-blocked folds, weighted log loss, 22 settings in total). The selector size k was tuned first with logistic regression (k=33: 0.0427, k=16: 0.0451, k=8: 0.0586); all 33 candidates were kept.</w:t>
+        <w:t xml:space="preserve">Table 11. Stage 2: best cross-validated setting per model family (4 year-blocked folds, weighted log loss, 22 settings in total). The selector size k was tuned first with logistic regression (k=33: 0.0425, k=16: 0.0454, k=8: 0.0585); all 33 candidates were kept.</w:t>
       </w:r>
     </w:p>
     <w:p>
@@ -11929,7 +11929,7 @@
         <w:jc w:val="both"/>
       </w:pPr>
       <w:r>
-        <w:t xml:space="preserve">Tree probabilities are not automatically calibrated. A Platt-style calibrator (an MLlib logistic regression on logit p, log h and their product) is fitted on the first half of 2023 and judged on the second half; it is kept only if it lowers the held-out log loss. For the random forest it was kept (held-out log loss 0.0294 → 0.0288); for the GBT it reduced the held-out log loss from 0.0382 to 0.0310. Finally, because a tree model does not guarantee P(&gt; 10 mm) ≤ P(&gt; 5 mm), the probabilities of each station-time are made non-increasing across thresholds with a running minimum, which changed at most 0.015 % of the 2024 predictions. The Stage 1 logistic model is monotone by construction (0 violations in 25,771,260 adjacent pairs).</w:t>
+        <w:t xml:space="preserve">Tree probabilities are not automatically calibrated. A Platt-style calibrator (an MLlib logistic regression on logit p, log h and their product) is fitted on the first half of 2023 and judged on the second half; it is kept only if it lowers the held-out log loss. For the random forest it was kept (held-out log loss 0.0294 → 0.0288); for the GBT it reduced the held-out log loss from 0.0381 to 0.0311. A tree model also does not guarantee that P(&gt; 10 mm) ≤ P(&gt; 5 mm). So, for each station and time, the probabilities at the six evaluated thresholds are made non-increasing with a running minimum; this changed at most 0.055 % of the 2024 predictions. The delivered predict() function applies the same correction: it scores the same six thresholds and applies the same running minimum, so it returns exactly the evaluated probability at any of them. For any other threshold it interpolates in log h between those six points; the curve is extended to 0.2 mm and to 30 and 60 mm from the model's values there and clipped so that it never increases. The reported metrics therefore describe the same probability function that the predictor delivers. The Stage 1 logistic model needs no correction: it showed no violation in the 25,771,260 adjacent threshold pairs checked, and monotonicity is guaranteed whenever its threshold coefficient (−1.23 on log(1 + h)) outweighs the two positive threshold interactions, which holds for every physically valid input because a 30-minute total cannot exceed the 180-minute total and a neighbour maximum cannot exceed four times the neighbour mean.</w:t>
       </w:r>
     </w:p>
     <w:p>
@@ -12540,7 +12540,7 @@
                 <w:sz w:val="16"/>
                 <w:szCs w:val="16"/>
               </w:rPr>
-              <w:t xml:space="preserve">0.493</w:t>
+              <w:t xml:space="preserve">0.492</w:t>
             </w:r>
           </w:p>
         </w:tc>
@@ -12574,7 +12574,7 @@
                 <w:sz w:val="16"/>
                 <w:szCs w:val="16"/>
               </w:rPr>
-              <w:t xml:space="preserve">0.35</w:t>
+              <w:t xml:space="preserve">0.40</w:t>
             </w:r>
           </w:p>
         </w:tc>
@@ -12608,7 +12608,7 @@
                 <w:sz w:val="16"/>
                 <w:szCs w:val="16"/>
               </w:rPr>
-              <w:t xml:space="preserve">0.68</w:t>
+              <w:t xml:space="preserve">0.71</w:t>
             </w:r>
           </w:p>
         </w:tc>
@@ -12642,7 +12642,7 @@
                 <w:sz w:val="16"/>
                 <w:szCs w:val="16"/>
               </w:rPr>
-              <w:t xml:space="preserve">0.62</w:t>
+              <w:t xml:space="preserve">0.59</w:t>
             </w:r>
           </w:p>
         </w:tc>
@@ -12783,7 +12783,7 @@
                 <w:sz w:val="16"/>
                 <w:szCs w:val="16"/>
               </w:rPr>
-              <w:t xml:space="preserve">0.666</w:t>
+              <w:t xml:space="preserve">0.667</w:t>
             </w:r>
           </w:p>
         </w:tc>
@@ -12817,7 +12817,7 @@
                 <w:sz w:val="16"/>
                 <w:szCs w:val="16"/>
               </w:rPr>
-              <w:t xml:space="preserve">0.967</w:t>
+              <w:t xml:space="preserve">0.966</w:t>
             </w:r>
           </w:p>
         </w:tc>
@@ -12851,7 +12851,7 @@
                 <w:sz w:val="16"/>
                 <w:szCs w:val="16"/>
               </w:rPr>
-              <w:t xml:space="preserve">0.0515</w:t>
+              <w:t xml:space="preserve">0.0516</w:t>
             </w:r>
           </w:p>
         </w:tc>
@@ -12885,7 +12885,7 @@
                 <w:sz w:val="16"/>
                 <w:szCs w:val="16"/>
               </w:rPr>
-              <w:t xml:space="preserve">0.450</w:t>
+              <w:t xml:space="preserve">0.448</w:t>
             </w:r>
           </w:p>
         </w:tc>
@@ -12919,7 +12919,7 @@
                 <w:sz w:val="16"/>
                 <w:szCs w:val="16"/>
               </w:rPr>
-              <w:t xml:space="preserve">0.40</w:t>
+              <w:t xml:space="preserve">0.35</w:t>
             </w:r>
           </w:p>
         </w:tc>
@@ -12953,7 +12953,7 @@
                 <w:sz w:val="16"/>
                 <w:szCs w:val="16"/>
               </w:rPr>
-              <w:t xml:space="preserve">0.69</w:t>
+              <w:t xml:space="preserve">0.65</w:t>
             </w:r>
           </w:p>
         </w:tc>
@@ -12987,7 +12987,7 @@
                 <w:sz w:val="16"/>
                 <w:szCs w:val="16"/>
               </w:rPr>
-              <w:t xml:space="preserve">0.55</w:t>
+              <w:t xml:space="preserve">0.58</w:t>
             </w:r>
           </w:p>
         </w:tc>
@@ -13162,7 +13162,7 @@
                 <w:sz w:val="16"/>
                 <w:szCs w:val="16"/>
               </w:rPr>
-              <w:t xml:space="preserve">0.965</w:t>
+              <w:t xml:space="preserve">0.966</w:t>
             </w:r>
           </w:p>
         </w:tc>
@@ -13196,7 +13196,7 @@
                 <w:sz w:val="16"/>
                 <w:szCs w:val="16"/>
               </w:rPr>
-              <w:t xml:space="preserve">0.0396</w:t>
+              <w:t xml:space="preserve">0.0395</w:t>
             </w:r>
           </w:p>
         </w:tc>
@@ -13298,7 +13298,7 @@
                 <w:sz w:val="16"/>
                 <w:szCs w:val="16"/>
               </w:rPr>
-              <w:t xml:space="preserve">0.58</w:t>
+              <w:t xml:space="preserve">0.57</w:t>
             </w:r>
           </w:p>
         </w:tc>
@@ -13332,7 +13332,7 @@
                 <w:sz w:val="16"/>
                 <w:szCs w:val="16"/>
               </w:rPr>
-              <w:t xml:space="preserve">0.53</w:t>
+              <w:t xml:space="preserve">0.54</w:t>
             </w:r>
           </w:p>
         </w:tc>
@@ -13507,7 +13507,7 @@
                 <w:sz w:val="16"/>
                 <w:szCs w:val="16"/>
               </w:rPr>
-              <w:t xml:space="preserve">0.968</w:t>
+              <w:t xml:space="preserve">0.969</w:t>
             </w:r>
           </w:p>
         </w:tc>
@@ -13643,7 +13643,7 @@
                 <w:sz w:val="16"/>
                 <w:szCs w:val="16"/>
               </w:rPr>
-              <w:t xml:space="preserve">0.49</w:t>
+              <w:t xml:space="preserve">0.48</w:t>
             </w:r>
           </w:p>
         </w:tc>
@@ -13677,7 +13677,7 @@
                 <w:sz w:val="16"/>
                 <w:szCs w:val="16"/>
               </w:rPr>
-              <w:t xml:space="preserve">0.45</w:t>
+              <w:t xml:space="preserve">0.46</w:t>
             </w:r>
           </w:p>
         </w:tc>
@@ -13818,7 +13818,7 @@
                 <w:sz w:val="16"/>
                 <w:szCs w:val="16"/>
               </w:rPr>
-              <w:t xml:space="preserve">0.348</w:t>
+              <w:t xml:space="preserve">0.351</w:t>
             </w:r>
           </w:p>
         </w:tc>
@@ -13886,7 +13886,7 @@
                 <w:sz w:val="16"/>
                 <w:szCs w:val="16"/>
               </w:rPr>
-              <w:t xml:space="preserve">0.0129</w:t>
+              <w:t xml:space="preserve">0.0130</w:t>
             </w:r>
           </w:p>
         </w:tc>
@@ -13920,7 +13920,7 @@
                 <w:sz w:val="16"/>
                 <w:szCs w:val="16"/>
               </w:rPr>
-              <w:t xml:space="preserve">0.213</w:t>
+              <w:t xml:space="preserve">0.211</w:t>
             </w:r>
           </w:p>
         </w:tc>
@@ -13988,7 +13988,7 @@
                 <w:sz w:val="16"/>
                 <w:szCs w:val="16"/>
               </w:rPr>
-              <w:t xml:space="preserve">0.40</w:t>
+              <w:t xml:space="preserve">0.42</w:t>
             </w:r>
           </w:p>
         </w:tc>
@@ -14022,7 +14022,7 @@
                 <w:sz w:val="16"/>
                 <w:szCs w:val="16"/>
               </w:rPr>
-              <w:t xml:space="preserve">0.40</w:t>
+              <w:t xml:space="preserve">0.38</w:t>
             </w:r>
           </w:p>
         </w:tc>
@@ -14163,7 +14163,7 @@
                 <w:sz w:val="16"/>
                 <w:szCs w:val="16"/>
               </w:rPr>
-              <w:t xml:space="preserve">0.183</w:t>
+              <w:t xml:space="preserve">0.185</w:t>
             </w:r>
           </w:p>
         </w:tc>
@@ -14197,7 +14197,7 @@
                 <w:sz w:val="16"/>
                 <w:szCs w:val="16"/>
               </w:rPr>
-              <w:t xml:space="preserve">0.981</w:t>
+              <w:t xml:space="preserve">0.982</w:t>
             </w:r>
           </w:p>
         </w:tc>
@@ -14231,7 +14231,7 @@
                 <w:sz w:val="16"/>
                 <w:szCs w:val="16"/>
               </w:rPr>
-              <w:t xml:space="preserve">0.0046</w:t>
+              <w:t xml:space="preserve">0.0045</w:t>
             </w:r>
           </w:p>
         </w:tc>
@@ -14265,7 +14265,7 @@
                 <w:sz w:val="16"/>
                 <w:szCs w:val="16"/>
               </w:rPr>
-              <w:t xml:space="preserve">0.096</w:t>
+              <w:t xml:space="preserve">0.101</w:t>
             </w:r>
           </w:p>
         </w:tc>
@@ -14333,7 +14333,7 @@
                 <w:sz w:val="16"/>
                 <w:szCs w:val="16"/>
               </w:rPr>
-              <w:t xml:space="preserve">0.29</w:t>
+              <w:t xml:space="preserve">0.26</w:t>
             </w:r>
           </w:p>
         </w:tc>
@@ -14367,7 +14367,7 @@
                 <w:sz w:val="16"/>
                 <w:szCs w:val="16"/>
               </w:rPr>
-              <w:t xml:space="preserve">0.26</w:t>
+              <w:t xml:space="preserve">0.28</w:t>
             </w:r>
           </w:p>
         </w:tc>
@@ -14439,7 +14439,7 @@
         <w:t xml:space="preserve">PR-AUC 0.465</w:t>
       </w:r>
       <w:r>
-        <w:t xml:space="preserve">, 55 times the event rate, with ROC-AUC 0.968, and removes 29 % of the climatology error; at its 2023 cut-off it catches 45 % of the events with 49 % precision. Skill falls as events get rarer (PR-AUC 0.721 at 0.5 mm, 0.183 at 20 mm) while ROC-AUC stays above 0.96 throughout. Calibration at 5 mm is good on average but not uniform: pooled over the bins below 10 % (98.6 % of all forecasts) the observed frequency exceeds the forecast by only +0.13 points, and the expected calibration error is 0.0017 — but that average is dominated by the dry rows. Bin by bin, the model under-forecasts in the 1–25 % range (worst bin: 13.9 % forecast, 17.8 % observed) and over-forecasts around 45–65 % (65.1 % forecast, 61.8 % observed), as Fig. 20 of the notebook shows.</w:t>
+        <w:t xml:space="preserve">, 55 times the event rate, with ROC-AUC 0.969, and removes 29 % of the climatology error; at its 2023 cut-off it catches 46 % of the events with 48 % precision. Skill falls as events get rarer (PR-AUC 0.721 at 0.5 mm, 0.185 at 20 mm) while ROC-AUC stays above 0.96 throughout. Calibration at 5 mm is good on average but not uniform. Over the bins below 10 %, which hold 98.6 % of all forecasts, the observed frequency is only 0.12 points above the forecast, and the expected calibration error is 0.0016; that average is dominated by the dry rows. Bin by bin, the model under-forecasts between 2 % and 35 % (worst bin: 14.0 % forecast, 17.6 % observed) and over-forecasts between 45 % and 75 % (65.0 % forecast, 60.8 % observed); see Fig. 20 of the notebook.</w:t>
       </w:r>
     </w:p>
     <w:p>
@@ -15018,7 +15018,7 @@
                 <w:sz w:val="16"/>
                 <w:szCs w:val="16"/>
               </w:rPr>
-              <w:t xml:space="preserve">0.0474</w:t>
+              <w:t xml:space="preserve">0.0473</w:t>
             </w:r>
           </w:p>
         </w:tc>
@@ -15300,7 +15300,7 @@
                 <w:sz w:val="16"/>
                 <w:szCs w:val="16"/>
               </w:rPr>
-              <w:t xml:space="preserve">0.461</w:t>
+              <w:t xml:space="preserve">0.460</w:t>
             </w:r>
           </w:p>
         </w:tc>
@@ -15334,7 +15334,7 @@
                 <w:sz w:val="16"/>
                 <w:szCs w:val="16"/>
               </w:rPr>
-              <w:t xml:space="preserve">0.965</w:t>
+              <w:t xml:space="preserve">0.966</w:t>
             </w:r>
           </w:p>
         </w:tc>
@@ -15402,7 +15402,7 @@
                 <w:sz w:val="16"/>
                 <w:szCs w:val="16"/>
               </w:rPr>
-              <w:t xml:space="preserve">0.264</w:t>
+              <w:t xml:space="preserve">0.256</w:t>
             </w:r>
           </w:p>
         </w:tc>
@@ -15509,7 +15509,7 @@
                 <w:sz w:val="16"/>
                 <w:szCs w:val="16"/>
               </w:rPr>
-              <w:t xml:space="preserve">0.968</w:t>
+              <w:t xml:space="preserve">0.969</w:t>
             </w:r>
           </w:p>
         </w:tc>
@@ -15684,7 +15684,7 @@
                 <w:sz w:val="16"/>
                 <w:szCs w:val="16"/>
               </w:rPr>
-              <w:t xml:space="preserve">0.968</w:t>
+              <w:t xml:space="preserve">0.969</w:t>
             </w:r>
           </w:p>
         </w:tc>
@@ -16295,7 +16295,7 @@
                 <w:sz w:val="16"/>
                 <w:szCs w:val="16"/>
               </w:rPr>
-              <w:t xml:space="preserve">0.662</w:t>
+              <w:t xml:space="preserve">0.663</w:t>
             </w:r>
           </w:p>
         </w:tc>
@@ -16431,7 +16431,7 @@
                 <w:sz w:val="16"/>
                 <w:szCs w:val="16"/>
               </w:rPr>
-              <w:t xml:space="preserve">0.0520</w:t>
+              <w:t xml:space="preserve">0.0521</w:t>
             </w:r>
           </w:p>
         </w:tc>
@@ -16742,7 +16742,7 @@
                 <w:sz w:val="16"/>
                 <w:szCs w:val="16"/>
               </w:rPr>
-              <w:t xml:space="preserve">0.0396</w:t>
+              <w:t xml:space="preserve">0.0395</w:t>
             </w:r>
           </w:p>
         </w:tc>
@@ -17053,7 +17053,7 @@
                 <w:sz w:val="16"/>
                 <w:szCs w:val="16"/>
               </w:rPr>
-              <w:t xml:space="preserve">0.0239</w:t>
+              <w:t xml:space="preserve">0.0238</w:t>
             </w:r>
           </w:p>
         </w:tc>
@@ -17228,7 +17228,7 @@
                 <w:sz w:val="16"/>
                 <w:szCs w:val="16"/>
               </w:rPr>
-              <w:t xml:space="preserve">0.350</w:t>
+              <w:t xml:space="preserve">0.352</w:t>
             </w:r>
           </w:p>
         </w:tc>
@@ -17364,7 +17364,7 @@
                 <w:sz w:val="16"/>
                 <w:szCs w:val="16"/>
               </w:rPr>
-              <w:t xml:space="preserve">0.0128</w:t>
+              <w:t xml:space="preserve">0.0129</w:t>
             </w:r>
           </w:p>
         </w:tc>
@@ -17539,7 +17539,7 @@
                 <w:sz w:val="16"/>
                 <w:szCs w:val="16"/>
               </w:rPr>
-              <w:t xml:space="preserve">0.187</w:t>
+              <w:t xml:space="preserve">0.191</w:t>
             </w:r>
           </w:p>
         </w:tc>
@@ -17791,10 +17791,10 @@
           <w:b/>
           <w:bCs/>
         </w:rPr>
-        <w:t xml:space="preserve">4.4× faster than 2</w:t>
+        <w:t xml:space="preserve">4.9× faster than 2</w:t>
       </w:r>
       <w:r>
-        <w:t xml:space="preserve"> (26 s → 6 s), a parallel efficiency of 54 %. </w:t>
+        <w:t xml:space="preserve"> (28 s → 6 s), a parallel efficiency of 61 %. </w:t>
       </w:r>
       <w:r>
         <w:rPr>
@@ -17804,17 +17804,17 @@
         <w:t xml:space="preserve">Amdahl's law</w:t>
       </w:r>
       <w:r>
-        <w:t xml:space="preserve">, Speedup = 1 / (S + P/n), explains why the gain flattens: fitting T(n) = a + b/n to the timings gives T(n) = 2.45 + 46.6/n seconds, so the serial part S — work that does not divide across cores, such as task scheduling, the shuffle exchange and the final single-row result — is </w:t>
+        <w:t xml:space="preserve">, Speedup = 1 / (S + P/n), explains why the gain flattens: fitting T(n) = a + b/n to the timings gives T(n) = 1.79 + 51.1/n seconds, so the serial part S — work that does not divide across cores, such as task scheduling, the shuffle exchange and the final single-row result — is </w:t>
       </w:r>
       <w:r>
         <w:rPr>
           <w:b/>
           <w:bCs/>
         </w:rPr>
-        <w:t xml:space="preserve">5.0 %</w:t>
+        <w:t xml:space="preserve">3.4 %</w:t>
       </w:r>
       <w:r>
-        <w:t xml:space="preserve"> of the one-core time. No number of cores could then make this job more than 20× faster than one core (10.5× faster than two).</w:t>
+        <w:t xml:space="preserve"> of the one-core time. Under that fitted model the ceiling is 30× over one core (15.3× over two) — an extrapolation of a two-parameter fit to four points (RMSE 0.65 s), not a measurement.</w:t>
       </w:r>
     </w:p>
     <w:tbl>
@@ -18114,7 +18114,7 @@
                 <w:sz w:val="16"/>
                 <w:szCs w:val="16"/>
               </w:rPr>
-              <w:t xml:space="preserve">26.1</w:t>
+              <w:t xml:space="preserve">27.8</w:t>
             </w:r>
           </w:p>
         </w:tc>
@@ -18323,7 +18323,7 @@
                 <w:sz w:val="16"/>
                 <w:szCs w:val="16"/>
               </w:rPr>
-              <w:t xml:space="preserve">13.4</w:t>
+              <w:t xml:space="preserve">13.6</w:t>
             </w:r>
           </w:p>
         </w:tc>
@@ -18357,7 +18357,7 @@
                 <w:sz w:val="16"/>
                 <w:szCs w:val="16"/>
               </w:rPr>
-              <w:t xml:space="preserve">1.95×</w:t>
+              <w:t xml:space="preserve">2.04×</w:t>
             </w:r>
           </w:p>
         </w:tc>
@@ -18391,7 +18391,7 @@
                 <w:sz w:val="16"/>
                 <w:szCs w:val="16"/>
               </w:rPr>
-              <w:t xml:space="preserve">1.83×</w:t>
+              <w:t xml:space="preserve">1.88×</w:t>
             </w:r>
           </w:p>
         </w:tc>
@@ -18459,7 +18459,7 @@
                 <w:sz w:val="16"/>
                 <w:szCs w:val="16"/>
               </w:rPr>
-              <w:t xml:space="preserve">97 %</w:t>
+              <w:t xml:space="preserve">102 %</w:t>
             </w:r>
           </w:p>
         </w:tc>
@@ -18566,7 +18566,7 @@
                 <w:sz w:val="16"/>
                 <w:szCs w:val="16"/>
               </w:rPr>
-              <w:t xml:space="preserve">3.26×</w:t>
+              <w:t xml:space="preserve">3.48×</w:t>
             </w:r>
           </w:p>
         </w:tc>
@@ -18600,7 +18600,7 @@
                 <w:sz w:val="16"/>
                 <w:szCs w:val="16"/>
               </w:rPr>
-              <w:t xml:space="preserve">3.11×</w:t>
+              <w:t xml:space="preserve">3.34×</w:t>
             </w:r>
           </w:p>
         </w:tc>
@@ -18668,7 +18668,7 @@
                 <w:sz w:val="16"/>
                 <w:szCs w:val="16"/>
               </w:rPr>
-              <w:t xml:space="preserve">82 %</w:t>
+              <w:t xml:space="preserve">87 %</w:t>
             </w:r>
           </w:p>
         </w:tc>
@@ -18741,7 +18741,7 @@
                 <w:sz w:val="16"/>
                 <w:szCs w:val="16"/>
               </w:rPr>
-              <w:t xml:space="preserve">6.0</w:t>
+              <w:t xml:space="preserve">5.7</w:t>
             </w:r>
           </w:p>
         </w:tc>
@@ -18775,7 +18775,7 @@
                 <w:sz w:val="16"/>
                 <w:szCs w:val="16"/>
               </w:rPr>
-              <w:t xml:space="preserve">4.35×</w:t>
+              <w:t xml:space="preserve">4.88×</w:t>
             </w:r>
           </w:p>
         </w:tc>
@@ -18809,7 +18809,7 @@
                 <w:sz w:val="16"/>
                 <w:szCs w:val="16"/>
               </w:rPr>
-              <w:t xml:space="preserve">4.80×</w:t>
+              <w:t xml:space="preserve">5.49×</w:t>
             </w:r>
           </w:p>
         </w:tc>
@@ -18877,7 +18877,7 @@
                 <w:sz w:val="16"/>
                 <w:szCs w:val="16"/>
               </w:rPr>
-              <w:t xml:space="preserve">54 %</w:t>
+              <w:t xml:space="preserve">61 %</w:t>
             </w:r>
           </w:p>
         </w:tc>
@@ -18896,7 +18896,7 @@
           <w:sz w:val="16"/>
           <w:szCs w:val="16"/>
         </w:rPr>
-        <w:t xml:space="preserve">Table 15. Strong scaling: all 8 years on 2–16 cores (median of three runs; t42_scaling.csv, t47_amdahl_fit.csv).</w:t>
+        <w:t xml:space="preserve">Table 15. Strong scaling: all 8 years on 2–16 cores (median of three runs; t42_scaling.csv, t47_amdahl_fit.csv). An efficiency slightly above 100 % is run-to-run noise in the medians.</w:t>
       </w:r>
     </w:p>
     <w:p>
@@ -18922,7 +18922,7 @@
         <w:t xml:space="preserve">Gustafson's law</w:t>
       </w:r>
       <w:r>
-        <w:t xml:space="preserve">). The time rises only from 3.4 s to 5.9 s while the data grows 9.2-fold, a scaled speed-up of 5.3× on 16 cores (ideal 8×, efficiency 67 %). Both experiments point to the same limit: the cores of one machine share one memory bus and one SSD, and 4 of the 16 are slower efficiency cores — which is what a cluster, with its own CPU, memory and disk per node, avoids (Section 8.5).</w:t>
+        <w:t xml:space="preserve">). The time rises only from 3.3 s to 5.8 s while the data grows 9.2-fold, a scaled speed-up of 5.3× on 16 cores (ideal 8×, efficiency 66 %). Both experiments point to the same limit: the cores of one machine share one memory bus and one SSD, and 4 of the 16 are slower efficiency cores — which is what a cluster, with its own CPU, memory and disk per node, avoids (Section 8.5).</w:t>
       </w:r>
     </w:p>
     <w:tbl>
@@ -19325,7 +19325,7 @@
                 <w:sz w:val="16"/>
                 <w:szCs w:val="16"/>
               </w:rPr>
-              <w:t xml:space="preserve">3.4</w:t>
+              <w:t xml:space="preserve">3.3</w:t>
             </w:r>
           </w:p>
         </w:tc>
@@ -19568,7 +19568,7 @@
                 <w:sz w:val="16"/>
                 <w:szCs w:val="16"/>
               </w:rPr>
-              <w:t xml:space="preserve">3.4</w:t>
+              <w:t xml:space="preserve">3.5</w:t>
             </w:r>
           </w:p>
         </w:tc>
@@ -19602,7 +19602,7 @@
                 <w:sz w:val="16"/>
                 <w:szCs w:val="16"/>
               </w:rPr>
-              <w:t xml:space="preserve">1.87×</w:t>
+              <w:t xml:space="preserve">1.77×</w:t>
             </w:r>
           </w:p>
         </w:tc>
@@ -19670,7 +19670,7 @@
                 <w:sz w:val="16"/>
                 <w:szCs w:val="16"/>
               </w:rPr>
-              <w:t xml:space="preserve">94 %</w:t>
+              <w:t xml:space="preserve">88 %</w:t>
             </w:r>
           </w:p>
         </w:tc>
@@ -19811,7 +19811,7 @@
                 <w:sz w:val="16"/>
                 <w:szCs w:val="16"/>
               </w:rPr>
-              <w:t xml:space="preserve">3.7</w:t>
+              <w:t xml:space="preserve">3.9</w:t>
             </w:r>
           </w:p>
         </w:tc>
@@ -19845,7 +19845,7 @@
                 <w:sz w:val="16"/>
                 <w:szCs w:val="16"/>
               </w:rPr>
-              <w:t xml:space="preserve">3.71×</w:t>
+              <w:t xml:space="preserve">3.41×</w:t>
             </w:r>
           </w:p>
         </w:tc>
@@ -19913,7 +19913,7 @@
                 <w:sz w:val="16"/>
                 <w:szCs w:val="16"/>
               </w:rPr>
-              <w:t xml:space="preserve">93 %</w:t>
+              <w:t xml:space="preserve">85 %</w:t>
             </w:r>
           </w:p>
         </w:tc>
@@ -20054,7 +20054,7 @@
                 <w:sz w:val="16"/>
                 <w:szCs w:val="16"/>
               </w:rPr>
-              <w:t xml:space="preserve">5.9</w:t>
+              <w:t xml:space="preserve">5.8</w:t>
             </w:r>
           </w:p>
         </w:tc>
@@ -20088,7 +20088,7 @@
                 <w:sz w:val="16"/>
                 <w:szCs w:val="16"/>
               </w:rPr>
-              <w:t xml:space="preserve">5.32×</w:t>
+              <w:t xml:space="preserve">5.25×</w:t>
             </w:r>
           </w:p>
         </w:tc>
@@ -20156,7 +20156,7 @@
                 <w:sz w:val="16"/>
                 <w:szCs w:val="16"/>
               </w:rPr>
-              <w:t xml:space="preserve">67 %</w:t>
+              <w:t xml:space="preserve">66 %</w:t>
             </w:r>
           </w:p>
         </w:tc>
@@ -20265,7 +20265,7 @@
         <w:t xml:space="preserve">doubling the workers cut the time from 74.8 s to 37.3 s, a 2.0× speed-up</w:t>
       </w:r>
       <w:r>
-        <w:t xml:space="preserve">, whereas on the laptop going from 4 to 8 cores gave 1.7× (13.4 s → 8.0 s).</w:t>
+        <w:t xml:space="preserve">, whereas on the laptop going from 4 to 8 cores gave 1.7× (13.6 s → 8.0 s).</w:t>
       </w:r>
     </w:p>
     <w:tbl>
@@ -20633,7 +20633,7 @@
                 <w:sz w:val="16"/>
                 <w:szCs w:val="16"/>
               </w:rPr>
-              <w:t xml:space="preserve">26.1</w:t>
+              <w:t xml:space="preserve">27.8</w:t>
             </w:r>
           </w:p>
         </w:tc>
@@ -20842,7 +20842,7 @@
                 <w:sz w:val="16"/>
                 <w:szCs w:val="16"/>
               </w:rPr>
-              <w:t xml:space="preserve">13.4</w:t>
+              <w:t xml:space="preserve">13.6</w:t>
             </w:r>
           </w:p>
         </w:tc>
@@ -20876,7 +20876,7 @@
                 <w:sz w:val="16"/>
                 <w:szCs w:val="16"/>
               </w:rPr>
-              <w:t xml:space="preserve">1.95×</w:t>
+              <w:t xml:space="preserve">2.04×</w:t>
             </w:r>
           </w:p>
         </w:tc>
@@ -20910,7 +20910,7 @@
                 <w:sz w:val="16"/>
                 <w:szCs w:val="16"/>
               </w:rPr>
-              <w:t xml:space="preserve">97 %</w:t>
+              <w:t xml:space="preserve">102 %</w:t>
             </w:r>
           </w:p>
         </w:tc>
@@ -21085,7 +21085,7 @@
                 <w:sz w:val="16"/>
                 <w:szCs w:val="16"/>
               </w:rPr>
-              <w:t xml:space="preserve">3.26×</w:t>
+              <w:t xml:space="preserve">3.48×</w:t>
             </w:r>
           </w:p>
         </w:tc>
@@ -21119,7 +21119,7 @@
                 <w:sz w:val="16"/>
                 <w:szCs w:val="16"/>
               </w:rPr>
-              <w:t xml:space="preserve">82 %</w:t>
+              <w:t xml:space="preserve">87 %</w:t>
             </w:r>
           </w:p>
         </w:tc>
@@ -21260,7 +21260,7 @@
                 <w:sz w:val="16"/>
                 <w:szCs w:val="16"/>
               </w:rPr>
-              <w:t xml:space="preserve">6.0</w:t>
+              <w:t xml:space="preserve">5.7</w:t>
             </w:r>
           </w:p>
         </w:tc>
@@ -21294,7 +21294,7 @@
                 <w:sz w:val="16"/>
                 <w:szCs w:val="16"/>
               </w:rPr>
-              <w:t xml:space="preserve">4.35×</w:t>
+              <w:t xml:space="preserve">4.88×</w:t>
             </w:r>
           </w:p>
         </w:tc>
@@ -21328,7 +21328,7 @@
                 <w:sz w:val="16"/>
                 <w:szCs w:val="16"/>
               </w:rPr>
-              <w:t xml:space="preserve">54 %</w:t>
+              <w:t xml:space="preserve">61 %</w:t>
             </w:r>
           </w:p>
         </w:tc>
@@ -21882,7 +21882,7 @@
                 <w:sz w:val="19"/>
                 <w:szCs w:val="19"/>
               </w:rPr>
-              <w:t xml:space="preserve"> The laptop is about 5× faster than the cluster at the same core count: it has fast cores, 128 GB of memory and a local SSD, while each n2-standard-2 worker has 2 vCPUs, reads its input from Cloud Storage over the network (each request took 0.3–0.5 s in the job logs) and spills shuffles to standard disks. But adding cores to one machine shares one memory bus and one disk, so its efficiency falls (82 % at 8 cores, 54 % at 16), while adding workers adds CPU, memory and disk together, so the cluster scaled almost perfectly from 2 to 4 workers.</w:t>
+              <w:t xml:space="preserve"> The laptop is about 5× faster than the cluster at the same core count: it has fast cores, 128 GB of memory and a local SSD, while each n2-standard-2 worker has 2 vCPUs, reads its input from Cloud Storage over the network (each request took 0.3–0.5 s in the job logs) and spills shuffles to standard disks. But adding cores to one machine shares one memory bus and one disk, so its efficiency falls (87 % at 8 cores, 61 % at 16), while adding workers adds CPU, memory and disk together, so the cluster scaled almost perfectly from 2 to 4 workers.</w:t>
             </w:r>
           </w:p>
           <w:p>
@@ -21938,7 +21938,17 @@
         <w:t xml:space="preserve">whole notebook</w:t>
       </w:r>
       <w:r>
-        <w:t xml:space="preserve"> — cleaning, Task 1, both stages of Task 2 with the full cross-validation, the 2024 evaluation and predict() — was executed on a Dataproc cluster: a master and 2 workers n2-highmem-4 (4 vCPU, 32 GB; the 12-vCPU quota), Spark 3.5.3 on YARN, the data layers on HDFS. The code is the submitted notebook with only the Spark master, the storage and the laptop core benchmark changed (cloud/make_dataproc_notebook.py); the executed copy is in cloud/full_run/. It ran without errors in 290 minutes of timed work against 73 on the laptop, 4.0× slower, for the same reasons as in Section 8.5: 8 executor cores on 2.8 GHz Xeons whose shuffles cross the network, against 14 fast cores that share one memory.</w:t>
+        <w:t xml:space="preserve"> — cleaning, Task 1, both stages of Task 2 with the full cross-validation, the 2024 evaluation and predict() — was executed on a Dataproc cluster: a master and 2 workers n2-highmem-4 (4 vCPU, 32 GB; the 12-vCPU quota), Spark 3.5.3 on YARN, the data layers on HDFS. The code is the notebook </w:t>
+      </w:r>
+      <w:r>
+        <w:rPr>
+          <w:b/>
+          <w:bCs/>
+        </w:rPr>
+        <w:t xml:space="preserve">as it stood on 14 October 2026</w:t>
+      </w:r>
+      <w:r>
+        <w:t xml:space="preserve">, converted by cloud/make_dataproc_notebook.py (only the Spark master, the storage and the laptop core benchmark change). That version predates four later revisions: the Spark-plan cell, the strong/weak-scaling rewrite, the Stage 2 train/test boundary purge and the fixed-grid predict(). The executed copy and a note on these differences are in cloud/full_run/. It ran without errors in 290 minutes of timed work against 73 on the laptop, 4.0× slower, for the same reasons as in Section 8.5: 8 executor cores on 2.8 GHz Xeons whose shuffles cross the network, against 14 fast cores that share one memory.</w:t>
       </w:r>
     </w:p>
     <w:tbl>
@@ -22236,7 +22246,7 @@
                 <w:sz w:val="16"/>
                 <w:szCs w:val="16"/>
               </w:rPr>
-              <w:t xml:space="preserve">6.0×</w:t>
+              <w:t xml:space="preserve">6.7×</w:t>
             </w:r>
           </w:p>
         </w:tc>
@@ -22309,7 +22319,7 @@
                 <w:sz w:val="16"/>
                 <w:szCs w:val="16"/>
               </w:rPr>
-              <w:t xml:space="preserve">0.7</w:t>
+              <w:t xml:space="preserve">0.6</w:t>
             </w:r>
           </w:p>
         </w:tc>
@@ -22377,7 +22387,7 @@
                 <w:sz w:val="16"/>
                 <w:szCs w:val="16"/>
               </w:rPr>
-              <w:t xml:space="preserve">3.8×</w:t>
+              <w:t xml:space="preserve">4.0×</w:t>
             </w:r>
           </w:p>
         </w:tc>
@@ -22518,7 +22528,7 @@
                 <w:sz w:val="16"/>
                 <w:szCs w:val="16"/>
               </w:rPr>
-              <w:t xml:space="preserve">4.8×</w:t>
+              <w:t xml:space="preserve">4.6×</w:t>
             </w:r>
           </w:p>
         </w:tc>
@@ -22591,7 +22601,7 @@
                 <w:sz w:val="16"/>
                 <w:szCs w:val="16"/>
               </w:rPr>
-              <w:t xml:space="preserve">8.0</w:t>
+              <w:t xml:space="preserve">7.9</w:t>
             </w:r>
           </w:p>
         </w:tc>
@@ -22873,7 +22883,7 @@
                 <w:sz w:val="16"/>
                 <w:szCs w:val="16"/>
               </w:rPr>
-              <w:t xml:space="preserve">37.0</w:t>
+              <w:t xml:space="preserve">37.4</w:t>
             </w:r>
           </w:p>
         </w:tc>
@@ -22941,7 +22951,7 @@
                 <w:sz w:val="16"/>
                 <w:szCs w:val="16"/>
               </w:rPr>
-              <w:t xml:space="preserve">4.4×</w:t>
+              <w:t xml:space="preserve">4.3×</w:t>
             </w:r>
           </w:p>
         </w:tc>
@@ -23014,7 +23024,7 @@
                 <w:sz w:val="16"/>
                 <w:szCs w:val="16"/>
               </w:rPr>
-              <w:t xml:space="preserve">24.7</w:t>
+              <w:t xml:space="preserve">24.5</w:t>
             </w:r>
           </w:p>
         </w:tc>
@@ -23082,7 +23092,7 @@
                 <w:sz w:val="16"/>
                 <w:szCs w:val="16"/>
               </w:rPr>
-              <w:t xml:space="preserve">3.4×</w:t>
+              <w:t xml:space="preserve">3.5×</w:t>
             </w:r>
           </w:p>
         </w:tc>
@@ -23758,7 +23768,7 @@
                 <w:sz w:val="16"/>
                 <w:szCs w:val="16"/>
               </w:rPr>
-              <w:t xml:space="preserve">0.0321</w:t>
+              <w:t xml:space="preserve">0.0319</w:t>
             </w:r>
           </w:p>
         </w:tc>
@@ -23865,7 +23875,7 @@
                 <w:sz w:val="16"/>
                 <w:szCs w:val="16"/>
               </w:rPr>
-              <w:t xml:space="preserve">0.666 / 0.465 / 0.183</w:t>
+              <w:t xml:space="preserve">0.667 / 0.465 / 0.185</w:t>
             </w:r>
           </w:p>
         </w:tc>
@@ -24382,7 +24392,7 @@
                 <w:sz w:val="16"/>
                 <w:szCs w:val="16"/>
               </w:rPr>
-              <w:t xml:space="preserve">0.195</w:t>
+              <w:t xml:space="preserve">0.193</w:t>
             </w:r>
           </w:p>
         </w:tc>
@@ -24523,7 +24533,7 @@
                 <w:sz w:val="16"/>
                 <w:szCs w:val="16"/>
               </w:rPr>
-              <w:t xml:space="preserve">0.164</w:t>
+              <w:t xml:space="preserve">0.167</w:t>
             </w:r>
           </w:p>
         </w:tc>
@@ -25087,7 +25097,7 @@
                 <w:sz w:val="16"/>
                 <w:szCs w:val="16"/>
               </w:rPr>
-              <w:t xml:space="preserve">0.067</w:t>
+              <w:t xml:space="preserve">0.065</w:t>
             </w:r>
           </w:p>
         </w:tc>
@@ -25510,7 +25520,7 @@
                 <w:sz w:val="16"/>
                 <w:szCs w:val="16"/>
               </w:rPr>
-              <w:t xml:space="preserve">0.033</w:t>
+              <w:t xml:space="preserve">0.034</w:t>
             </w:r>
           </w:p>
         </w:tc>
@@ -25723,7 +25733,7 @@
         <w:t xml:space="preserve">recent-rain</w:t>
       </w:r>
       <w:r>
-        <w:t xml:space="preserve"> features raises the log loss by +7.5 %, removing the </w:t>
+        <w:t xml:space="preserve"> features raises the log loss by +7.8 %, removing the </w:t>
       </w:r>
       <w:r>
         <w:rPr>
@@ -25733,7 +25743,7 @@
         <w:t xml:space="preserve">neighbours</w:t>
       </w:r>
       <w:r>
-        <w:t xml:space="preserve"> by +2.7 % and the </w:t>
+        <w:t xml:space="preserve"> by +2.9 % and the </w:t>
       </w:r>
       <w:r>
         <w:rPr>
@@ -25743,7 +25753,7 @@
         <w:t xml:space="preserve">island-wide</w:t>
       </w:r>
       <w:r>
-        <w:t xml:space="preserve"> signal by +0.7 %, whereas removing time costs +0.4 % and removing latitude/longitude nothing (the station index already carries location). Model A, with no rain observation at all, is +87.1 % worse.</w:t>
+        <w:t xml:space="preserve"> signal by +0.7 %, whereas removing time costs +0.2 % and removing latitude/longitude nothing (the station index already carries location). Model A, with no rain observation at all, is +87.3 % worse.</w:t>
       </w:r>
     </w:p>
     <w:p>
@@ -25811,7 +25821,7 @@
         <w:t xml:space="preserve">Heavy thresholds are hardest:</w:t>
       </w:r>
       <w:r>
-        <w:t xml:space="preserve"> at 20 mm (0.1 % of half-hours) PR-AUC is 0.183; ROC-AUC stays high, so the model still ranks the risky half-hours well, but it cannot say *how* heavy a storm will be.</w:t>
+        <w:t xml:space="preserve"> at 20 mm (0.1 % of half-hours) PR-AUC is 0.185; ROC-AUC stays high, so the model still ranks the risky half-hours well, but it cannot say *how* heavy a storm will be.</w:t>
       </w:r>
     </w:p>
     <w:p>
@@ -27808,7 +27818,7 @@
         <w:jc w:val="both"/>
       </w:pPr>
       <w:r>
-        <w:t xml:space="preserve">Starting from 7.5 GB of raw five-minute readings, a disciplined Spark pipeline — explicit schema, Parquet layers, neighbour-based gauge-fault detection and completeness rules — produced a clean, trustworthy record of Singapore's rainfall. Task 1 showed two wet seasons, two daily rhythms, a 2× west–east gradient and dry years caused by fewer events. Task 2 turned those findings into features and delivered a single Spark MLlib model for any station, time and threshold: a random forest chosen by year-blocked cross-validation that reaches a PR-AUC of 0.465 at 5 mm on the untouched 2024 year, beats the interpretable logistic baseline at every threshold on identical rows, and gives probabilities one can act on.</w:t>
+        <w:t xml:space="preserve">Starting from 7.5 GB of raw five-minute readings, a carefully built Spark pipeline (explicit schema, Parquet layers, neighbour-based gauge-fault detection and completeness rules) produced a clean, trustworthy record of Singapore's rainfall. Task 1 showed two wet seasons, two daily rhythms, a 2× west–east gradient and dry years caused by fewer events. Task 2 turned those findings into features and delivered a single Spark MLlib model for any station, time and threshold: a random forest chosen by year-blocked cross-validation that reaches a PR-AUC of 0.465 at 5 mm on the untouched 2024 year, beats the interpretable logistic baseline at every threshold on identical rows, and gives probabilities one can act on.</w:t>
       </w:r>
     </w:p>
     <w:p>

</xml_diff>